<commit_message>
Add comprehensive alphabetical glossary of technical terms before bibliography in EN and DE monograph editions
</commit_message>
<xml_diff>
--- a/book/build/The_Conative_Integrative_Framework_Book_Thomas_Riebl_DE_6x9.docx
+++ b/book/build/The_Conative_Integrative_Framework_Book_Thomas_Riebl_DE_6x9.docx
@@ -10604,7 +10604,7 @@
     </w:p>
     <w:bookmarkEnd w:id="51"/>
     <w:bookmarkEnd w:id="52"/>
-    <w:bookmarkStart w:id="60" w:name="Xb6253ae800693db45b886bd1c8c9d69bdc31d64"/>
+    <w:bookmarkStart w:id="61" w:name="Xb6253ae800693db45b886bd1c8c9d69bdc31d64"/>
     <w:p>
       <w:pPr>
         <w:pStyle w:val="Heading1"/>
@@ -12139,13 +12139,13 @@
     </w:p>
     <w:bookmarkEnd w:id="56"/>
     <w:bookmarkEnd w:id="57"/>
-    <w:bookmarkStart w:id="58" w:name="akademische-bibliographie-auswahl"/>
+    <w:bookmarkStart w:id="58" w:name="X2528ce34b9c1bf90eb311fb2a0e80dcfd813869"/>
     <w:p>
       <w:pPr>
         <w:pStyle w:val="Heading2"/>
       </w:pPr>
       <w:r>
-        <w:t xml:space="preserve">Akademische Bibliographie (Auswahl)</w:t>
+        <w:t xml:space="preserve">Anhang B: Alphabetisches Glossar der Fachbegriffe</w:t>
       </w:r>
     </w:p>
     <w:p>
@@ -12161,23 +12161,24 @@
           <w:b/>
           <w:bCs/>
         </w:rPr>
-        <w:t xml:space="preserve">Chalmers, D. J. (1995).</w:t>
-      </w:r>
-      <w:r>
-        <w:t xml:space="preserve"> </w:t>
-      </w:r>
-      <w:r>
-        <w:rPr>
-          <w:i/>
-          <w:iCs/>
-        </w:rPr>
-        <w:t xml:space="preserve">Facing up to the problem of consciousness.</w:t>
-      </w:r>
-      <w:r>
-        <w:t xml:space="preserve"> </w:t>
-      </w:r>
-      <w:r>
-        <w:t xml:space="preserve">Journal of Consciousness Studies, 2(3), 200–219.</w:t>
+        <w:t xml:space="preserve">Active Inference (Aktive Inferenz):</w:t>
+      </w:r>
+      <w:r>
+        <w:t xml:space="preserve"> </w:t>
+      </w:r>
+      <w:r>
+        <w:t xml:space="preserve">Das normative mathematische Framework der theoretischen Neurobiologie, das besagt, dass lebendige Organismen ihre Existenz sichern, indem sie Handlungen ausführen, die die erwartete freie Energie (</w:t>
+      </w:r>
+      <m:oMath>
+        <m:r>
+          <m:rPr>
+            <m:sty m:val="b"/>
+          </m:rPr>
+          <m:t>G</m:t>
+        </m:r>
+      </m:oMath>
+      <w:r>
+        <w:t xml:space="preserve">) minimieren, um sensorische Beobachtungen mit angeborenen Präferenzen in Einklang zu bringen.</w:t>
       </w:r>
     </w:p>
     <w:p>
@@ -12193,23 +12194,13 @@
           <w:b/>
           <w:bCs/>
         </w:rPr>
-        <w:t xml:space="preserve">Eigen, M. (1971).</w:t>
-      </w:r>
-      <w:r>
-        <w:t xml:space="preserve"> </w:t>
-      </w:r>
-      <w:r>
-        <w:rPr>
-          <w:i/>
-          <w:iCs/>
-        </w:rPr>
-        <w:t xml:space="preserve">Selforganization of matter and the evolution of biological macromolecules.</w:t>
-      </w:r>
-      <w:r>
-        <w:t xml:space="preserve"> </w:t>
-      </w:r>
-      <w:r>
-        <w:t xml:space="preserve">Die Naturwissenschaften, 58(10), 465–523.</w:t>
+        <w:t xml:space="preserve">Alter (Dissoziiertes Bewusstseinszentrum):</w:t>
+      </w:r>
+      <w:r>
+        <w:t xml:space="preserve"> </w:t>
+      </w:r>
+      <w:r>
+        <w:t xml:space="preserve">Im Analytischen Idealismus ein individueller lebendiger Organismus, der durch die topologische Dissoziation von Mind-at-Large entsteht und durch eine statistische Markov-Decke abgegrenzt ist.</w:t>
       </w:r>
     </w:p>
     <w:p>
@@ -12225,23 +12216,23 @@
           <w:b/>
           <w:bCs/>
         </w:rPr>
-        <w:t xml:space="preserve">Fountas, Z., Sajid, N., Mediano, P. A. M., &amp; Friston, K. (2020).</w:t>
-      </w:r>
-      <w:r>
-        <w:t xml:space="preserve"> </w:t>
+        <w:t xml:space="preserve">Analytischer Idealismus:</w:t>
+      </w:r>
+      <w:r>
+        <w:t xml:space="preserve"> </w:t>
+      </w:r>
+      <w:r>
+        <w:t xml:space="preserve">Die von Bernardo Kastrup formulierte nicht-duale, ontologisch sparsame Monismus-Lehre, nach der die Wirklichkeit fundamental erfahrungsbasiert ist (</w:t>
       </w:r>
       <w:r>
         <w:rPr>
           <w:i/>
           <w:iCs/>
         </w:rPr>
-        <w:t xml:space="preserve">Deep active inference agents using Monte-Carlo methods.</w:t>
-      </w:r>
-      <w:r>
-        <w:t xml:space="preserve"> </w:t>
-      </w:r>
-      <w:r>
-        <w:t xml:space="preserve">NeurIPS 2020, 33, 11662–11675.</w:t>
+        <w:t xml:space="preserve">Mind-at-Large</w:t>
+      </w:r>
+      <w:r>
+        <w:t xml:space="preserve">) und physikalische Materie das äußere Erscheinungsbild universaler mentaler Prozesse darstellt.</w:t>
       </w:r>
     </w:p>
     <w:p>
@@ -12257,23 +12248,13 @@
           <w:b/>
           <w:bCs/>
         </w:rPr>
-        <w:t xml:space="preserve">Friston, K. (2010).</w:t>
-      </w:r>
-      <w:r>
-        <w:t xml:space="preserve"> </w:t>
-      </w:r>
-      <w:r>
-        <w:rPr>
-          <w:i/>
-          <w:iCs/>
-        </w:rPr>
-        <w:t xml:space="preserve">The free-energy principle: a unified brain theory?</w:t>
-      </w:r>
-      <w:r>
-        <w:t xml:space="preserve"> </w:t>
-      </w:r>
-      <w:r>
-        <w:t xml:space="preserve">Nature Reviews Neuroscience, 11(2), 127–138.</w:t>
+        <w:t xml:space="preserve">Autopoiese:</w:t>
+      </w:r>
+      <w:r>
+        <w:t xml:space="preserve"> </w:t>
+      </w:r>
+      <w:r>
+        <w:t xml:space="preserve">Die fundamentale Eigenschaft lebendiger Systeme, ihr eigenes strukturelles und organisatorisches Netzwerk kontinuierlich selbst zu regenerieren und gegen den thermodynamischen Zerfall zu behaupten.</w:t>
       </w:r>
     </w:p>
     <w:p>
@@ -12289,23 +12270,36 @@
           <w:b/>
           <w:bCs/>
         </w:rPr>
-        <w:t xml:space="preserve">Husserl, E. (1928).</w:t>
-      </w:r>
-      <w:r>
-        <w:t xml:space="preserve"> </w:t>
-      </w:r>
-      <w:r>
-        <w:rPr>
-          <w:i/>
-          <w:iCs/>
-        </w:rPr>
-        <w:t xml:space="preserve">Vorlesungen zur Phänomenologie des inneren Zeitbewusstseins.</w:t>
-      </w:r>
-      <w:r>
-        <w:t xml:space="preserve"> </w:t>
-      </w:r>
-      <w:r>
-        <w:t xml:space="preserve">Max Niemeyer Verlag.</w:t>
+        <w:t xml:space="preserve">Conatus (Der Existenzwille):</w:t>
+      </w:r>
+      <w:r>
+        <w:t xml:space="preserve"> </w:t>
+      </w:r>
+      <w:r>
+        <w:t xml:space="preserve">Das angeborene Streben jedes Seienden, in seiner Existenz zu verharren und der Zerstörung zu widerstehen (Spinoza). Im CIF formalisiert als Sollzustand</w:t>
+      </w:r>
+      <w:r>
+        <w:t xml:space="preserve"> </w:t>
+      </w:r>
+      <m:oMath>
+        <m:r>
+          <m:rPr>
+            <m:sty m:val="p"/>
+          </m:rPr>
+          <m:t>Φ</m:t>
+        </m:r>
+        <m:r>
+          <m:rPr>
+            <m:sty m:val="p"/>
+          </m:rPr>
+          <m:t>&gt;</m:t>
+        </m:r>
+        <m:r>
+          <m:t>0</m:t>
+        </m:r>
+      </m:oMath>
+      <w:r>
+        <w:t xml:space="preserve">.</w:t>
       </w:r>
     </w:p>
     <w:p>
@@ -12321,7 +12315,13 @@
           <w:b/>
           <w:bCs/>
         </w:rPr>
-        <w:t xml:space="preserve">Kastrup, B. (2019).</w:t>
+        <w:t xml:space="preserve">Das 6. Axiom des Bewusstseins:</w:t>
+      </w:r>
+      <w:r>
+        <w:t xml:space="preserve"> </w:t>
+      </w:r>
+      <w:r>
+        <w:t xml:space="preserve">Das Axiom der</w:t>
       </w:r>
       <w:r>
         <w:t xml:space="preserve"> </w:t>
@@ -12331,13 +12331,118 @@
           <w:i/>
           <w:iCs/>
         </w:rPr>
-        <w:t xml:space="preserve">The Idea of the World.</w:t>
-      </w:r>
-      <w:r>
-        <w:t xml:space="preserve"> </w:t>
-      </w:r>
-      <w:r>
-        <w:t xml:space="preserve">Iff Books.</w:t>
+        <w:t xml:space="preserve">Autopoietischen Kausalkonstanz</w:t>
+      </w:r>
+      <w:r>
+        <w:t xml:space="preserve">, das festlegt, dass echtes Bewusstsein zwingend ein aktives Handeln zur Erhaltung der integrierten Ursache-Wirkungs-Macht über die Zeit erfordert:</w:t>
+      </w:r>
+      <w:r>
+        <w:t xml:space="preserve"> </w:t>
+      </w:r>
+      <m:oMath>
+        <m:r>
+          <m:rPr>
+            <m:scr m:val="double-struck"/>
+            <m:sty m:val="p"/>
+          </m:rPr>
+          <m:t>E</m:t>
+        </m:r>
+        <m:r>
+          <m:rPr>
+            <m:sty m:val="p"/>
+          </m:rPr>
+          <m:t>[</m:t>
+        </m:r>
+        <m:r>
+          <m:rPr>
+            <m:sty m:val="p"/>
+          </m:rPr>
+          <m:t>Φ</m:t>
+        </m:r>
+        <m:r>
+          <m:rPr>
+            <m:sty m:val="p"/>
+          </m:rPr>
+          <m:t>(</m:t>
+        </m:r>
+        <m:r>
+          <m:t>t</m:t>
+        </m:r>
+        <m:r>
+          <m:rPr>
+            <m:sty m:val="p"/>
+          </m:rPr>
+          <m:t>+</m:t>
+        </m:r>
+        <m:r>
+          <m:t>1</m:t>
+        </m:r>
+        <m:r>
+          <m:rPr>
+            <m:sty m:val="p"/>
+          </m:rPr>
+          <m:t>)</m:t>
+        </m:r>
+        <m:r>
+          <m:rPr>
+            <m:sty m:val="p"/>
+          </m:rPr>
+          <m:t>∣</m:t>
+        </m:r>
+        <m:sSup>
+          <m:e>
+            <m:r>
+              <m:t>π</m:t>
+            </m:r>
+          </m:e>
+          <m:sup>
+            <m:r>
+              <m:rPr>
+                <m:sty m:val="p"/>
+              </m:rPr>
+              <m:t>*</m:t>
+            </m:r>
+          </m:sup>
+        </m:sSup>
+        <m:r>
+          <m:rPr>
+            <m:sty m:val="p"/>
+          </m:rPr>
+          <m:t>]</m:t>
+        </m:r>
+        <m:r>
+          <m:rPr>
+            <m:sty m:val="p"/>
+          </m:rPr>
+          <m:t>≥</m:t>
+        </m:r>
+        <m:r>
+          <m:rPr>
+            <m:sty m:val="p"/>
+          </m:rPr>
+          <m:t>Φ</m:t>
+        </m:r>
+        <m:r>
+          <m:rPr>
+            <m:sty m:val="p"/>
+          </m:rPr>
+          <m:t>(</m:t>
+        </m:r>
+        <m:r>
+          <m:t>t</m:t>
+        </m:r>
+        <m:r>
+          <m:rPr>
+            <m:sty m:val="p"/>
+          </m:rPr>
+          <m:t>)</m:t>
+        </m:r>
+      </m:oMath>
+      <w:r>
+        <w:t xml:space="preserve"> </w:t>
+      </w:r>
+      <w:r>
+        <w:t xml:space="preserve">(Riebl).</w:t>
       </w:r>
     </w:p>
     <w:p>
@@ -12353,23 +12458,29 @@
           <w:b/>
           <w:bCs/>
         </w:rPr>
-        <w:t xml:space="preserve">Metzinger, T. (2009).</w:t>
-      </w:r>
-      <w:r>
-        <w:t xml:space="preserve"> </w:t>
-      </w:r>
-      <w:r>
-        <w:rPr>
+        <w:t xml:space="preserve">Erklärungslücke (</w:t>
+      </w:r>
+      <w:r>
+        <w:rPr>
+          <w:b/>
+          <w:bCs/>
           <w:i/>
           <w:iCs/>
         </w:rPr>
-        <w:t xml:space="preserve">The Ego Tunnel.</w:t>
-      </w:r>
-      <w:r>
-        <w:t xml:space="preserve"> </w:t>
-      </w:r>
-      <w:r>
-        <w:t xml:space="preserve">Basic Books.</w:t>
+        <w:t xml:space="preserve">Explanatory Gap</w:t>
+      </w:r>
+      <w:r>
+        <w:rPr>
+          <w:b/>
+          <w:bCs/>
+        </w:rPr>
+        <w:t xml:space="preserve">):</w:t>
+      </w:r>
+      <w:r>
+        <w:t xml:space="preserve"> </w:t>
+      </w:r>
+      <w:r>
+        <w:t xml:space="preserve">Die unüberwindbare Kluft im Physikalismus zwischen quantitativen objektiven Hirnprozessen und qualitativem subjektiven Erleben (Levine).</w:t>
       </w:r>
     </w:p>
     <w:p>
@@ -12385,23 +12496,39 @@
           <w:b/>
           <w:bCs/>
         </w:rPr>
-        <w:t xml:space="preserve">Monod, J. (1970).</w:t>
-      </w:r>
-      <w:r>
-        <w:t xml:space="preserve"> </w:t>
-      </w:r>
-      <w:r>
-        <w:rPr>
-          <w:i/>
-          <w:iCs/>
-        </w:rPr>
-        <w:t xml:space="preserve">Le Hasard et la Nécessité.</w:t>
-      </w:r>
-      <w:r>
-        <w:t xml:space="preserve"> </w:t>
-      </w:r>
-      <w:r>
-        <w:t xml:space="preserve">Éditions du Seuil.</w:t>
+        <w:t xml:space="preserve">Erwartete Freie Energie (</w:t>
+      </w:r>
+      <m:oMath>
+        <m:r>
+          <m:rPr>
+            <m:sty m:val="b"/>
+          </m:rPr>
+          <m:t>G</m:t>
+        </m:r>
+      </m:oMath>
+      <w:r>
+        <w:rPr>
+          <w:b/>
+          <w:bCs/>
+        </w:rPr>
+        <w:t xml:space="preserve">):</w:t>
+      </w:r>
+      <w:r>
+        <w:t xml:space="preserve"> </w:t>
+      </w:r>
+      <w:r>
+        <w:t xml:space="preserve">Eine zukunftsgerichtete Metrik zur Bewertung von Handlungsoptionen über einen Planungshorizont</w:t>
+      </w:r>
+      <w:r>
+        <w:t xml:space="preserve"> </w:t>
+      </w:r>
+      <m:oMath>
+        <m:r>
+          <m:t>H</m:t>
+        </m:r>
+      </m:oMath>
+      <w:r>
+        <w:t xml:space="preserve">, bestehend aus pragmatischem Wert (Zielerfüllung) und epistemischem Wert (Neugier / Ambiguitätsabbau).</w:t>
       </w:r>
     </w:p>
     <w:p>
@@ -12417,23 +12544,28 @@
           <w:b/>
           <w:bCs/>
         </w:rPr>
-        <w:t xml:space="preserve">Riebl, T. (2026).</w:t>
-      </w:r>
-      <w:r>
-        <w:t xml:space="preserve"> </w:t>
-      </w:r>
-      <w:r>
-        <w:rPr>
-          <w:i/>
-          <w:iCs/>
-        </w:rPr>
-        <w:t xml:space="preserve">The Conative-Integrative Framework (CIF).</w:t>
-      </w:r>
-      <w:r>
-        <w:t xml:space="preserve"> </w:t>
-      </w:r>
-      <w:r>
-        <w:t xml:space="preserve">Master Monographie, Luxemburg.</w:t>
+        <w:t xml:space="preserve">Integrierte Information (</w:t>
+      </w:r>
+      <m:oMath>
+        <m:r>
+          <m:rPr>
+            <m:sty m:val="p"/>
+          </m:rPr>
+          <m:t>Φ</m:t>
+        </m:r>
+      </m:oMath>
+      <w:r>
+        <w:rPr>
+          <w:b/>
+          <w:bCs/>
+        </w:rPr>
+        <w:t xml:space="preserve">):</w:t>
+      </w:r>
+      <w:r>
+        <w:t xml:space="preserve"> </w:t>
+      </w:r>
+      <w:r>
+        <w:t xml:space="preserve">Das quantitative Maß für die intrinsische Ursache-Wirkungs-Macht eines maximal irreduziblen physikalischen Substrats über die Minimum Information Partition (Tononi, IIT 4.0).</w:t>
       </w:r>
     </w:p>
     <w:p>
@@ -12449,23 +12581,40 @@
           <w:b/>
           <w:bCs/>
         </w:rPr>
-        <w:t xml:space="preserve">Roth, G. (2021).</w:t>
-      </w:r>
-      <w:r>
-        <w:t xml:space="preserve"> </w:t>
-      </w:r>
-      <w:r>
-        <w:rPr>
+        <w:t xml:space="preserve">Kritikalität (</w:t>
+      </w:r>
+      <w:r>
+        <w:rPr>
+          <w:b/>
+          <w:bCs/>
           <w:i/>
           <w:iCs/>
         </w:rPr>
-        <w:t xml:space="preserve">Wie das Gehirn die Seele macht.</w:t>
-      </w:r>
-      <w:r>
-        <w:t xml:space="preserve"> </w:t>
-      </w:r>
-      <w:r>
-        <w:t xml:space="preserve">Klett-Cotta.</w:t>
+        <w:t xml:space="preserve">Edge of Chaos</w:t>
+      </w:r>
+      <w:r>
+        <w:rPr>
+          <w:b/>
+          <w:bCs/>
+        </w:rPr>
+        <w:t xml:space="preserve">):</w:t>
+      </w:r>
+      <w:r>
+        <w:t xml:space="preserve"> </w:t>
+      </w:r>
+      <w:r>
+        <w:t xml:space="preserve">Der Phasenübergang zwischen starrer Ordnung und chaotischer Turbulenz, an dem Informationstransfer und Integrierte Information (</w:t>
+      </w:r>
+      <m:oMath>
+        <m:r>
+          <m:rPr>
+            <m:sty m:val="p"/>
+          </m:rPr>
+          <m:t>Φ</m:t>
+        </m:r>
+      </m:oMath>
+      <w:r>
+        <w:t xml:space="preserve">) ihr globales Maximum erreichen.</w:t>
       </w:r>
     </w:p>
     <w:p>
@@ -12481,23 +12630,61 @@
           <w:b/>
           <w:bCs/>
         </w:rPr>
-        <w:t xml:space="preserve">Schopenhauer, A. (1819).</w:t>
-      </w:r>
-      <w:r>
-        <w:t xml:space="preserve"> </w:t>
-      </w:r>
-      <w:r>
-        <w:rPr>
+        <w:t xml:space="preserve">Markov-Decke (</w:t>
+      </w:r>
+      <w:r>
+        <w:rPr>
+          <w:b/>
+          <w:bCs/>
           <w:i/>
           <w:iCs/>
         </w:rPr>
-        <w:t xml:space="preserve">Die Welt als Wille und Vorstellung.</w:t>
-      </w:r>
-      <w:r>
-        <w:t xml:space="preserve"> </w:t>
-      </w:r>
-      <w:r>
-        <w:t xml:space="preserve">F. A. Brockhaus.</w:t>
+        <w:t xml:space="preserve">Markov Blanket</w:t>
+      </w:r>
+      <w:r>
+        <w:rPr>
+          <w:b/>
+          <w:bCs/>
+        </w:rPr>
+        <w:t xml:space="preserve">):</w:t>
+      </w:r>
+      <w:r>
+        <w:t xml:space="preserve"> </w:t>
+      </w:r>
+      <w:r>
+        <w:t xml:space="preserve">Eine statistische Trennfläche, die ein System in interne (</w:t>
+      </w:r>
+      <m:oMath>
+        <m:r>
+          <m:t>μ</m:t>
+        </m:r>
+      </m:oMath>
+      <w:r>
+        <w:t xml:space="preserve">), sensorische (</w:t>
+      </w:r>
+      <m:oMath>
+        <m:r>
+          <m:t>s</m:t>
+        </m:r>
+      </m:oMath>
+      <w:r>
+        <w:t xml:space="preserve">), aktive (</w:t>
+      </w:r>
+      <m:oMath>
+        <m:r>
+          <m:t>a</m:t>
+        </m:r>
+      </m:oMath>
+      <w:r>
+        <w:t xml:space="preserve">) und externe Zustände (</w:t>
+      </w:r>
+      <m:oMath>
+        <m:r>
+          <m:t>η</m:t>
+        </m:r>
+      </m:oMath>
+      <w:r>
+        <w:t xml:space="preserve">) unterteilt und das Innere bedingt unabhängig vom Äußeren macht.</w:t>
       </w:r>
     </w:p>
     <w:p>
@@ -12513,17 +12700,13 @@
           <w:b/>
           <w:bCs/>
         </w:rPr>
-        <w:t xml:space="preserve">Spinoza, B. (1677).</w:t>
-      </w:r>
-      <w:r>
-        <w:t xml:space="preserve"> </w:t>
-      </w:r>
-      <w:r>
-        <w:rPr>
-          <w:i/>
-          <w:iCs/>
-        </w:rPr>
-        <w:t xml:space="preserve">Ethica, ordine geometrico demonstrata.</w:t>
+        <w:t xml:space="preserve">Mind-at-Large:</w:t>
+      </w:r>
+      <w:r>
+        <w:t xml:space="preserve"> </w:t>
+      </w:r>
+      <w:r>
+        <w:t xml:space="preserve">Das universale, transpersonale Feld reinen Bewusstseins, das den fundamentalen ontologischen Urgrund der Wirklichkeit bildet (Spinoza, Kastrup).</w:t>
       </w:r>
     </w:p>
     <w:p>
@@ -12539,23 +12722,487 @@
           <w:b/>
           <w:bCs/>
         </w:rPr>
-        <w:t xml:space="preserve">Tononi, G., Albantakis, L., et al. (2023).</w:t>
-      </w:r>
-      <w:r>
-        <w:t xml:space="preserve"> </w:t>
-      </w:r>
-      <w:r>
-        <w:rPr>
+        <w:t xml:space="preserve">Minimum Information Partition (MIP):</w:t>
+      </w:r>
+      <w:r>
+        <w:t xml:space="preserve"> </w:t>
+      </w:r>
+      <w:r>
+        <w:t xml:space="preserve">Diejenige Zweiteilung eines Systems, die den geringsten Kausalitätsverlust verursacht; dient zur Berechnung der System-Irreduzibilität</w:t>
+      </w:r>
+      <w:r>
+        <w:t xml:space="preserve"> </w:t>
+      </w:r>
+      <m:oMath>
+        <m:r>
+          <m:rPr>
+            <m:sty m:val="p"/>
+          </m:rPr>
+          <m:t>Φ</m:t>
+        </m:r>
+      </m:oMath>
+      <w:r>
+        <w:t xml:space="preserve">.</w:t>
+      </w:r>
+    </w:p>
+    <w:p>
+      <w:pPr>
+        <w:pStyle w:val="Compact"/>
+        <w:numPr>
+          <w:ilvl w:val="0"/>
+          <w:numId w:val="1013"/>
+        </w:numPr>
+      </w:pPr>
+      <w:r>
+        <w:rPr>
+          <w:b/>
+          <w:bCs/>
+        </w:rPr>
+        <w:t xml:space="preserve">Phänomenales Selbstmodell (PSM):</w:t>
+      </w:r>
+      <w:r>
+        <w:t xml:space="preserve"> </w:t>
+      </w:r>
+      <w:r>
+        <w:t xml:space="preserve">Eine transparente, kontinuierliche innere Simulation des prädiktiven Gehirns, die die 1.-Person-Perspektive eines stabilen „Ich“ erzeugt (Metzinger).</w:t>
+      </w:r>
+    </w:p>
+    <w:p>
+      <w:pPr>
+        <w:pStyle w:val="Compact"/>
+        <w:numPr>
+          <w:ilvl w:val="0"/>
+          <w:numId w:val="1013"/>
+        </w:numPr>
+      </w:pPr>
+      <w:r>
+        <w:rPr>
+          <w:b/>
+          <w:bCs/>
+        </w:rPr>
+        <w:t xml:space="preserve">POMDP (Partially Observable Markov Decision Process):</w:t>
+      </w:r>
+      <w:r>
+        <w:t xml:space="preserve"> </w:t>
+      </w:r>
+      <w:r>
+        <w:t xml:space="preserve">Mathematischer Formalismus für Entscheidungsfindung unter Unsicherheit, definiert durch die Tensoren</w:t>
+      </w:r>
+      <w:r>
+        <w:t xml:space="preserve"> </w:t>
+      </w:r>
+      <m:oMath>
+        <m:r>
+          <m:t>A</m:t>
+        </m:r>
+      </m:oMath>
+      <w:r>
+        <w:t xml:space="preserve"> </w:t>
+      </w:r>
+      <w:r>
+        <w:t xml:space="preserve">(Likelihood),</w:t>
+      </w:r>
+      <w:r>
+        <w:t xml:space="preserve"> </w:t>
+      </w:r>
+      <m:oMath>
+        <m:r>
+          <m:t>B</m:t>
+        </m:r>
+      </m:oMath>
+      <w:r>
+        <w:t xml:space="preserve"> </w:t>
+      </w:r>
+      <w:r>
+        <w:t xml:space="preserve">(Übergänge),</w:t>
+      </w:r>
+      <w:r>
+        <w:t xml:space="preserve"> </w:t>
+      </w:r>
+      <m:oMath>
+        <m:r>
+          <m:t>C</m:t>
+        </m:r>
+      </m:oMath>
+      <w:r>
+        <w:t xml:space="preserve"> </w:t>
+      </w:r>
+      <w:r>
+        <w:t xml:space="preserve">(Werte) und</w:t>
+      </w:r>
+      <w:r>
+        <w:t xml:space="preserve"> </w:t>
+      </w:r>
+      <m:oMath>
+        <m:r>
+          <m:t>D</m:t>
+        </m:r>
+      </m:oMath>
+      <w:r>
+        <w:t xml:space="preserve"> </w:t>
+      </w:r>
+      <w:r>
+        <w:t xml:space="preserve">(Startpriors).</w:t>
+      </w:r>
+    </w:p>
+    <w:p>
+      <w:pPr>
+        <w:pStyle w:val="Compact"/>
+        <w:numPr>
+          <w:ilvl w:val="0"/>
+          <w:numId w:val="1013"/>
+        </w:numPr>
+      </w:pPr>
+      <w:r>
+        <w:rPr>
+          <w:b/>
+          <w:bCs/>
+        </w:rPr>
+        <w:t xml:space="preserve">Protention:</w:t>
+      </w:r>
+      <w:r>
+        <w:t xml:space="preserve"> </w:t>
+      </w:r>
+      <w:r>
+        <w:t xml:space="preserve">Die antizipatorische Zukunftserwartung innerhalb der Specious Present, entsprechend Top-Down-Vorhersagen (Husserl).</w:t>
+      </w:r>
+    </w:p>
+    <w:p>
+      <w:pPr>
+        <w:pStyle w:val="Compact"/>
+        <w:numPr>
+          <w:ilvl w:val="0"/>
+          <w:numId w:val="1013"/>
+        </w:numPr>
+      </w:pPr>
+      <w:r>
+        <w:rPr>
+          <w:b/>
+          <w:bCs/>
+        </w:rPr>
+        <w:t xml:space="preserve">Retention:</w:t>
+      </w:r>
+      <w:r>
+        <w:t xml:space="preserve"> </w:t>
+      </w:r>
+      <w:r>
+        <w:t xml:space="preserve">Das im Arbeitsgedächtnis festgehaltene unmittelbare Vergangene innerhalb der Specious Present, entsprechend synaptischen Priors (Husserl).</w:t>
+      </w:r>
+    </w:p>
+    <w:p>
+      <w:pPr>
+        <w:pStyle w:val="Compact"/>
+        <w:numPr>
+          <w:ilvl w:val="0"/>
+          <w:numId w:val="1013"/>
+        </w:numPr>
+      </w:pPr>
+      <w:r>
+        <w:rPr>
+          <w:b/>
+          <w:bCs/>
+        </w:rPr>
+        <w:t xml:space="preserve">Schweres Problem des Bewusstseins (</w:t>
+      </w:r>
+      <w:r>
+        <w:rPr>
+          <w:b/>
+          <w:bCs/>
           <w:i/>
           <w:iCs/>
         </w:rPr>
-        <w:t xml:space="preserve">Integrated Information Theory (IIT) 4.0.</w:t>
-      </w:r>
-      <w:r>
-        <w:t xml:space="preserve"> </w:t>
-      </w:r>
-      <w:r>
-        <w:t xml:space="preserve">PLOS Computational Biology, 19(10), e1011465.</w:t>
+        <w:t xml:space="preserve">Hard Problem</w:t>
+      </w:r>
+      <w:r>
+        <w:rPr>
+          <w:b/>
+          <w:bCs/>
+        </w:rPr>
+        <w:t xml:space="preserve">):</w:t>
+      </w:r>
+      <w:r>
+        <w:t xml:space="preserve"> </w:t>
+      </w:r>
+      <w:r>
+        <w:t xml:space="preserve">Die Frage, warum und wie physikalische Informationsverarbeitung jemals subjektives inneres Erleben (</w:t>
+      </w:r>
+      <w:r>
+        <w:rPr>
+          <w:i/>
+          <w:iCs/>
+        </w:rPr>
+        <w:t xml:space="preserve">Qualia</w:t>
+      </w:r>
+      <w:r>
+        <w:t xml:space="preserve">) hervorbringen sollte (Chalmers).</w:t>
+      </w:r>
+    </w:p>
+    <w:p>
+      <w:pPr>
+        <w:pStyle w:val="Compact"/>
+        <w:numPr>
+          <w:ilvl w:val="0"/>
+          <w:numId w:val="1013"/>
+        </w:numPr>
+      </w:pPr>
+      <w:r>
+        <w:rPr>
+          <w:b/>
+          <w:bCs/>
+        </w:rPr>
+        <w:t xml:space="preserve">Specious Present (Gefühlte Gegenwart):</w:t>
+      </w:r>
+      <w:r>
+        <w:t xml:space="preserve"> </w:t>
+      </w:r>
+      <w:r>
+        <w:t xml:space="preserve">Die triadische, nicht-ausdehnungslose zeitliche Dauer des subjektiven Erlebens (</w:t>
+      </w:r>
+      <m:oMath>
+        <m:r>
+          <m:rPr>
+            <m:sty m:val="p"/>
+          </m:rPr>
+          <m:t>∼</m:t>
+        </m:r>
+        <m:r>
+          <m:t>500</m:t>
+        </m:r>
+        <m:r>
+          <m:t> </m:t>
+        </m:r>
+        <m:r>
+          <m:rPr>
+            <m:nor/>
+            <m:sty m:val="p"/>
+          </m:rPr>
+          <m:t>ms</m:t>
+        </m:r>
+        <m:r>
+          <m:rPr>
+            <m:sty m:val="p"/>
+          </m:rPr>
+          <m:t>−</m:t>
+        </m:r>
+        <m:r>
+          <m:t>3</m:t>
+        </m:r>
+        <m:r>
+          <m:t> </m:t>
+        </m:r>
+        <m:r>
+          <m:rPr>
+            <m:nor/>
+            <m:sty m:val="p"/>
+          </m:rPr>
+          <m:t>s</m:t>
+        </m:r>
+      </m:oMath>
+      <w:r>
+        <w:t xml:space="preserve">), die Retention, Urimpression und Protention vereint (James, Husserl).</w:t>
+      </w:r>
+    </w:p>
+    <w:p>
+      <w:pPr>
+        <w:pStyle w:val="Compact"/>
+        <w:numPr>
+          <w:ilvl w:val="0"/>
+          <w:numId w:val="1013"/>
+        </w:numPr>
+      </w:pPr>
+      <w:r>
+        <w:rPr>
+          <w:b/>
+          <w:bCs/>
+        </w:rPr>
+        <w:t xml:space="preserve">Temporale Tiefe (</w:t>
+      </w:r>
+      <m:oMath>
+        <m:r>
+          <m:t>H</m:t>
+        </m:r>
+      </m:oMath>
+      <w:r>
+        <w:rPr>
+          <w:b/>
+          <w:bCs/>
+        </w:rPr>
+        <w:t xml:space="preserve">):</w:t>
+      </w:r>
+      <w:r>
+        <w:t xml:space="preserve"> </w:t>
+      </w:r>
+      <w:r>
+        <w:t xml:space="preserve">Die Reichweite des kontrafaktischen Planungshorizonts, über den ein Agent Übergangstensoren (</w:t>
+      </w:r>
+      <m:oMath>
+        <m:r>
+          <m:t>B</m:t>
+        </m:r>
+      </m:oMath>
+      <w:r>
+        <w:t xml:space="preserve">) und erwartete freie Energie (</w:t>
+      </w:r>
+      <m:oMath>
+        <m:r>
+          <m:rPr>
+            <m:sty m:val="b"/>
+          </m:rPr>
+          <m:t>G</m:t>
+        </m:r>
+      </m:oMath>
+      <w:r>
+        <w:t xml:space="preserve">) evaluiert.</w:t>
+      </w:r>
+    </w:p>
+    <w:p>
+      <w:pPr>
+        <w:pStyle w:val="Compact"/>
+        <w:numPr>
+          <w:ilvl w:val="0"/>
+          <w:numId w:val="1013"/>
+        </w:numPr>
+      </w:pPr>
+      <w:r>
+        <w:rPr>
+          <w:b/>
+          <w:bCs/>
+        </w:rPr>
+        <w:t xml:space="preserve">Theorem der temporalen Mindesttiefe:</w:t>
+      </w:r>
+      <w:r>
+        <w:t xml:space="preserve"> </w:t>
+      </w:r>
+      <w:r>
+        <w:t xml:space="preserve">Die mathematische Notwendigkeitsbedingung, dass phänomenales Selbstbewusstsein mehrstufige kontrafaktische Planung (</w:t>
+      </w:r>
+      <m:oMath>
+        <m:r>
+          <m:t>H</m:t>
+        </m:r>
+        <m:r>
+          <m:rPr>
+            <m:sty m:val="p"/>
+          </m:rPr>
+          <m:t>&gt;</m:t>
+        </m:r>
+        <m:r>
+          <m:t>1</m:t>
+        </m:r>
+      </m:oMath>
+      <w:r>
+        <w:t xml:space="preserve">) erfordert, um einen Kausalitätskollaps (</w:t>
+      </w:r>
+      <m:oMath>
+        <m:r>
+          <m:rPr>
+            <m:sty m:val="p"/>
+          </m:rPr>
+          <m:t>Φ</m:t>
+        </m:r>
+        <m:r>
+          <m:rPr>
+            <m:sty m:val="p"/>
+          </m:rPr>
+          <m:t>→</m:t>
+        </m:r>
+        <m:r>
+          <m:t>0</m:t>
+        </m:r>
+      </m:oMath>
+      <w:r>
+        <w:t xml:space="preserve">) abzuwenden (Riebl).</w:t>
+      </w:r>
+    </w:p>
+    <w:p>
+      <w:pPr>
+        <w:pStyle w:val="Compact"/>
+        <w:numPr>
+          <w:ilvl w:val="0"/>
+          <w:numId w:val="1013"/>
+        </w:numPr>
+      </w:pPr>
+      <w:r>
+        <w:rPr>
+          <w:b/>
+          <w:bCs/>
+        </w:rPr>
+        <w:t xml:space="preserve">Urimpression:</w:t>
+      </w:r>
+      <w:r>
+        <w:t xml:space="preserve"> </w:t>
+      </w:r>
+      <w:r>
+        <w:t xml:space="preserve">Die gegenwärtige sensorische Störung an der Markov-Decke, entsprechend dem eingehenden Vorhersagefehler (Husserl).</w:t>
+      </w:r>
+    </w:p>
+    <w:p>
+      <w:pPr>
+        <w:pStyle w:val="Compact"/>
+        <w:numPr>
+          <w:ilvl w:val="0"/>
+          <w:numId w:val="1013"/>
+        </w:numPr>
+      </w:pPr>
+      <w:r>
+        <w:rPr>
+          <w:b/>
+          <w:bCs/>
+        </w:rPr>
+        <w:t xml:space="preserve">Variationale Freie Energie (</w:t>
+      </w:r>
+      <m:oMath>
+        <m:r>
+          <m:t>F</m:t>
+        </m:r>
+      </m:oMath>
+      <w:r>
+        <w:rPr>
+          <w:b/>
+          <w:bCs/>
+        </w:rPr>
+        <w:t xml:space="preserve">):</w:t>
+      </w:r>
+      <w:r>
+        <w:t xml:space="preserve"> </w:t>
+      </w:r>
+      <w:r>
+        <w:t xml:space="preserve">Eine berechenbare Obergrenze für sensorische Überraschung (</w:t>
+      </w:r>
+      <m:oMath>
+        <m:r>
+          <m:rPr>
+            <m:sty m:val="p"/>
+          </m:rPr>
+          <m:t>−</m:t>
+        </m:r>
+        <m:r>
+          <m:rPr>
+            <m:sty m:val="p"/>
+          </m:rPr>
+          <m:t>ln</m:t>
+        </m:r>
+        <m:r>
+          <m:t>P</m:t>
+        </m:r>
+        <m:r>
+          <m:rPr>
+            <m:sty m:val="p"/>
+          </m:rPr>
+          <m:t>(</m:t>
+        </m:r>
+        <m:r>
+          <m:t>o</m:t>
+        </m:r>
+        <m:r>
+          <m:rPr>
+            <m:sty m:val="p"/>
+          </m:rPr>
+          <m:t>)</m:t>
+        </m:r>
+      </m:oMath>
+      <w:r>
+        <w:t xml:space="preserve">), die während der Wahrnehmung minimiert wird.</w:t>
       </w:r>
     </w:p>
     <w:p>
@@ -12566,7 +13213,1042 @@
       </w:r>
     </w:p>
     <w:bookmarkEnd w:id="58"/>
-    <w:bookmarkStart w:id="59" w:name="tool-attribution-colophon"/>
+    <w:bookmarkStart w:id="59" w:name="akademische-bibliographie-auswahl"/>
+    <w:p>
+      <w:pPr>
+        <w:pStyle w:val="Heading2"/>
+      </w:pPr>
+      <w:r>
+        <w:t xml:space="preserve">Akademische Bibliographie (Auswahl)</w:t>
+      </w:r>
+    </w:p>
+    <w:p>
+      <w:pPr>
+        <w:pStyle w:val="Compact"/>
+        <w:numPr>
+          <w:ilvl w:val="0"/>
+          <w:numId w:val="1014"/>
+        </w:numPr>
+      </w:pPr>
+      <w:r>
+        <w:rPr>
+          <w:b/>
+          <w:bCs/>
+        </w:rPr>
+        <w:t xml:space="preserve">Bak, P. (1996).</w:t>
+      </w:r>
+      <w:r>
+        <w:t xml:space="preserve"> </w:t>
+      </w:r>
+      <w:r>
+        <w:rPr>
+          <w:i/>
+          <w:iCs/>
+        </w:rPr>
+        <w:t xml:space="preserve">How Nature Works: The Science of Self-Organized Criticality.</w:t>
+      </w:r>
+      <w:r>
+        <w:t xml:space="preserve"> </w:t>
+      </w:r>
+      <w:r>
+        <w:t xml:space="preserve">Copernicus, Springer-Verlag.</w:t>
+      </w:r>
+    </w:p>
+    <w:p>
+      <w:pPr>
+        <w:pStyle w:val="Compact"/>
+        <w:numPr>
+          <w:ilvl w:val="0"/>
+          <w:numId w:val="1014"/>
+        </w:numPr>
+      </w:pPr>
+      <w:r>
+        <w:rPr>
+          <w:b/>
+          <w:bCs/>
+        </w:rPr>
+        <w:t xml:space="preserve">Beggs, J. M., &amp; Plenz, D. (2003).</w:t>
+      </w:r>
+      <w:r>
+        <w:t xml:space="preserve"> </w:t>
+      </w:r>
+      <w:r>
+        <w:rPr>
+          <w:i/>
+          <w:iCs/>
+        </w:rPr>
+        <w:t xml:space="preserve">Neuronal avalanches in neocortical circuits.</w:t>
+      </w:r>
+      <w:r>
+        <w:t xml:space="preserve"> </w:t>
+      </w:r>
+      <w:r>
+        <w:t xml:space="preserve">Journal of Neuroscience, 23(35), 11167–11177.</w:t>
+      </w:r>
+    </w:p>
+    <w:p>
+      <w:pPr>
+        <w:pStyle w:val="Compact"/>
+        <w:numPr>
+          <w:ilvl w:val="0"/>
+          <w:numId w:val="1014"/>
+        </w:numPr>
+      </w:pPr>
+      <w:r>
+        <w:rPr>
+          <w:b/>
+          <w:bCs/>
+        </w:rPr>
+        <w:t xml:space="preserve">Chalmers, D. J. (1995).</w:t>
+      </w:r>
+      <w:r>
+        <w:t xml:space="preserve"> </w:t>
+      </w:r>
+      <w:r>
+        <w:rPr>
+          <w:i/>
+          <w:iCs/>
+        </w:rPr>
+        <w:t xml:space="preserve">Facing up to the problem of consciousness.</w:t>
+      </w:r>
+      <w:r>
+        <w:t xml:space="preserve"> </w:t>
+      </w:r>
+      <w:r>
+        <w:t xml:space="preserve">Journal of Consciousness Studies, 2(3), 200–219.</w:t>
+      </w:r>
+    </w:p>
+    <w:p>
+      <w:pPr>
+        <w:pStyle w:val="Compact"/>
+        <w:numPr>
+          <w:ilvl w:val="0"/>
+          <w:numId w:val="1014"/>
+        </w:numPr>
+      </w:pPr>
+      <w:r>
+        <w:rPr>
+          <w:b/>
+          <w:bCs/>
+        </w:rPr>
+        <w:t xml:space="preserve">Clark, A. (2016).</w:t>
+      </w:r>
+      <w:r>
+        <w:t xml:space="preserve"> </w:t>
+      </w:r>
+      <w:r>
+        <w:rPr>
+          <w:i/>
+          <w:iCs/>
+        </w:rPr>
+        <w:t xml:space="preserve">Surfing Uncertainty: Prediction, Action, and the Embodied Mind.</w:t>
+      </w:r>
+      <w:r>
+        <w:t xml:space="preserve"> </w:t>
+      </w:r>
+      <w:r>
+        <w:t xml:space="preserve">Oxford University Press.</w:t>
+      </w:r>
+    </w:p>
+    <w:p>
+      <w:pPr>
+        <w:pStyle w:val="Compact"/>
+        <w:numPr>
+          <w:ilvl w:val="0"/>
+          <w:numId w:val="1014"/>
+        </w:numPr>
+      </w:pPr>
+      <w:r>
+        <w:rPr>
+          <w:b/>
+          <w:bCs/>
+        </w:rPr>
+        <w:t xml:space="preserve">Da Costa, L., Parr, T., Sajid, N., Veselic, S., Neacsu, V., &amp; Friston, K. (2020).</w:t>
+      </w:r>
+      <w:r>
+        <w:t xml:space="preserve"> </w:t>
+      </w:r>
+      <w:r>
+        <w:rPr>
+          <w:i/>
+          <w:iCs/>
+        </w:rPr>
+        <w:t xml:space="preserve">Active inference on discrete state-spaces: A synthesis.</w:t>
+      </w:r>
+      <w:r>
+        <w:t xml:space="preserve"> </w:t>
+      </w:r>
+      <w:r>
+        <w:t xml:space="preserve">Journal of Mathematical Psychology, 99, 102447.</w:t>
+      </w:r>
+    </w:p>
+    <w:p>
+      <w:pPr>
+        <w:pStyle w:val="Compact"/>
+        <w:numPr>
+          <w:ilvl w:val="0"/>
+          <w:numId w:val="1014"/>
+        </w:numPr>
+      </w:pPr>
+      <w:r>
+        <w:rPr>
+          <w:b/>
+          <w:bCs/>
+        </w:rPr>
+        <w:t xml:space="preserve">Eigen, M. (1971).</w:t>
+      </w:r>
+      <w:r>
+        <w:t xml:space="preserve"> </w:t>
+      </w:r>
+      <w:r>
+        <w:rPr>
+          <w:i/>
+          <w:iCs/>
+        </w:rPr>
+        <w:t xml:space="preserve">Selforganization of matter and the evolution of biological macromolecules.</w:t>
+      </w:r>
+      <w:r>
+        <w:t xml:space="preserve"> </w:t>
+      </w:r>
+      <w:r>
+        <w:t xml:space="preserve">Die Naturwissenschaften, 58(10), 465–523.</w:t>
+      </w:r>
+    </w:p>
+    <w:p>
+      <w:pPr>
+        <w:pStyle w:val="Compact"/>
+        <w:numPr>
+          <w:ilvl w:val="0"/>
+          <w:numId w:val="1014"/>
+        </w:numPr>
+      </w:pPr>
+      <w:r>
+        <w:rPr>
+          <w:b/>
+          <w:bCs/>
+        </w:rPr>
+        <w:t xml:space="preserve">Fountas, Z., Sajid, N., Mediano, P. A. M., &amp; Friston, K. (2020).</w:t>
+      </w:r>
+      <w:r>
+        <w:t xml:space="preserve"> </w:t>
+      </w:r>
+      <w:r>
+        <w:rPr>
+          <w:i/>
+          <w:iCs/>
+        </w:rPr>
+        <w:t xml:space="preserve">Deep active inference agents using Monte-Carlo methods.</w:t>
+      </w:r>
+      <w:r>
+        <w:t xml:space="preserve"> </w:t>
+      </w:r>
+      <w:r>
+        <w:t xml:space="preserve">NeurIPS 2020, 33, 11662–11675.</w:t>
+      </w:r>
+    </w:p>
+    <w:p>
+      <w:pPr>
+        <w:pStyle w:val="Compact"/>
+        <w:numPr>
+          <w:ilvl w:val="0"/>
+          <w:numId w:val="1014"/>
+        </w:numPr>
+      </w:pPr>
+      <w:r>
+        <w:rPr>
+          <w:b/>
+          <w:bCs/>
+        </w:rPr>
+        <w:t xml:space="preserve">Friston, K. (2010).</w:t>
+      </w:r>
+      <w:r>
+        <w:t xml:space="preserve"> </w:t>
+      </w:r>
+      <w:r>
+        <w:rPr>
+          <w:i/>
+          <w:iCs/>
+        </w:rPr>
+        <w:t xml:space="preserve">The free-energy principle: a unified brain theory?</w:t>
+      </w:r>
+      <w:r>
+        <w:t xml:space="preserve"> </w:t>
+      </w:r>
+      <w:r>
+        <w:t xml:space="preserve">Nature Reviews Neuroscience, 11(2), 127–138.</w:t>
+      </w:r>
+    </w:p>
+    <w:p>
+      <w:pPr>
+        <w:pStyle w:val="Compact"/>
+        <w:numPr>
+          <w:ilvl w:val="0"/>
+          <w:numId w:val="1014"/>
+        </w:numPr>
+      </w:pPr>
+      <w:r>
+        <w:rPr>
+          <w:b/>
+          <w:bCs/>
+        </w:rPr>
+        <w:t xml:space="preserve">Friston, K., FitzGerald, T., Rigoli, F., Schwartenbeck, P., &amp; Pezzulo, G. (2017).</w:t>
+      </w:r>
+      <w:r>
+        <w:t xml:space="preserve"> </w:t>
+      </w:r>
+      <w:r>
+        <w:rPr>
+          <w:i/>
+          <w:iCs/>
+        </w:rPr>
+        <w:t xml:space="preserve">Active Inference: A Process Theory.</w:t>
+      </w:r>
+      <w:r>
+        <w:t xml:space="preserve"> </w:t>
+      </w:r>
+      <w:r>
+        <w:t xml:space="preserve">Neural Computation, 29(1), 1–49.</w:t>
+      </w:r>
+    </w:p>
+    <w:p>
+      <w:pPr>
+        <w:pStyle w:val="Compact"/>
+        <w:numPr>
+          <w:ilvl w:val="0"/>
+          <w:numId w:val="1014"/>
+        </w:numPr>
+      </w:pPr>
+      <w:r>
+        <w:rPr>
+          <w:b/>
+          <w:bCs/>
+        </w:rPr>
+        <w:t xml:space="preserve">Gershman, S. J. (2019).</w:t>
+      </w:r>
+      <w:r>
+        <w:t xml:space="preserve"> </w:t>
+      </w:r>
+      <w:r>
+        <w:rPr>
+          <w:i/>
+          <w:iCs/>
+        </w:rPr>
+        <w:t xml:space="preserve">The generative adversary in brain and machine.</w:t>
+      </w:r>
+      <w:r>
+        <w:t xml:space="preserve"> </w:t>
+      </w:r>
+      <w:r>
+        <w:t xml:space="preserve">Trends in Cognitive Sciences, 23(1), 8–17.</w:t>
+      </w:r>
+    </w:p>
+    <w:p>
+      <w:pPr>
+        <w:pStyle w:val="Compact"/>
+        <w:numPr>
+          <w:ilvl w:val="0"/>
+          <w:numId w:val="1014"/>
+        </w:numPr>
+      </w:pPr>
+      <w:r>
+        <w:rPr>
+          <w:b/>
+          <w:bCs/>
+        </w:rPr>
+        <w:t xml:space="preserve">Husserl, E. (1928).</w:t>
+      </w:r>
+      <w:r>
+        <w:t xml:space="preserve"> </w:t>
+      </w:r>
+      <w:r>
+        <w:rPr>
+          <w:i/>
+          <w:iCs/>
+        </w:rPr>
+        <w:t xml:space="preserve">Vorlesungen zur Phänomenologie des inneren Zeitbewusstseins.</w:t>
+      </w:r>
+      <w:r>
+        <w:t xml:space="preserve"> </w:t>
+      </w:r>
+      <w:r>
+        <w:t xml:space="preserve">Max Niemeyer Verlag.</w:t>
+      </w:r>
+    </w:p>
+    <w:p>
+      <w:pPr>
+        <w:pStyle w:val="Compact"/>
+        <w:numPr>
+          <w:ilvl w:val="0"/>
+          <w:numId w:val="1014"/>
+        </w:numPr>
+      </w:pPr>
+      <w:r>
+        <w:rPr>
+          <w:b/>
+          <w:bCs/>
+        </w:rPr>
+        <w:t xml:space="preserve">Jablonka, E., &amp; Lamb, M. J. (2014).</w:t>
+      </w:r>
+      <w:r>
+        <w:t xml:space="preserve"> </w:t>
+      </w:r>
+      <w:r>
+        <w:rPr>
+          <w:i/>
+          <w:iCs/>
+        </w:rPr>
+        <w:t xml:space="preserve">Evolution in Four Dimensions.</w:t>
+      </w:r>
+      <w:r>
+        <w:t xml:space="preserve"> </w:t>
+      </w:r>
+      <w:r>
+        <w:t xml:space="preserve">MIT Press.</w:t>
+      </w:r>
+    </w:p>
+    <w:p>
+      <w:pPr>
+        <w:pStyle w:val="Compact"/>
+        <w:numPr>
+          <w:ilvl w:val="0"/>
+          <w:numId w:val="1014"/>
+        </w:numPr>
+      </w:pPr>
+      <w:r>
+        <w:rPr>
+          <w:b/>
+          <w:bCs/>
+        </w:rPr>
+        <w:t xml:space="preserve">James, W. (1890).</w:t>
+      </w:r>
+      <w:r>
+        <w:t xml:space="preserve"> </w:t>
+      </w:r>
+      <w:r>
+        <w:rPr>
+          <w:i/>
+          <w:iCs/>
+        </w:rPr>
+        <w:t xml:space="preserve">The Principles of Psychology.</w:t>
+      </w:r>
+      <w:r>
+        <w:t xml:space="preserve"> </w:t>
+      </w:r>
+      <w:r>
+        <w:t xml:space="preserve">Henry Holt and Company.</w:t>
+      </w:r>
+    </w:p>
+    <w:p>
+      <w:pPr>
+        <w:pStyle w:val="Compact"/>
+        <w:numPr>
+          <w:ilvl w:val="0"/>
+          <w:numId w:val="1014"/>
+        </w:numPr>
+      </w:pPr>
+      <w:r>
+        <w:rPr>
+          <w:b/>
+          <w:bCs/>
+        </w:rPr>
+        <w:t xml:space="preserve">Kastrup, B. (2019).</w:t>
+      </w:r>
+      <w:r>
+        <w:t xml:space="preserve"> </w:t>
+      </w:r>
+      <w:r>
+        <w:rPr>
+          <w:i/>
+          <w:iCs/>
+        </w:rPr>
+        <w:t xml:space="preserve">The Idea of the World.</w:t>
+      </w:r>
+      <w:r>
+        <w:t xml:space="preserve"> </w:t>
+      </w:r>
+      <w:r>
+        <w:t xml:space="preserve">Iff Books.</w:t>
+      </w:r>
+    </w:p>
+    <w:p>
+      <w:pPr>
+        <w:pStyle w:val="Compact"/>
+        <w:numPr>
+          <w:ilvl w:val="0"/>
+          <w:numId w:val="1014"/>
+        </w:numPr>
+      </w:pPr>
+      <w:r>
+        <w:rPr>
+          <w:b/>
+          <w:bCs/>
+        </w:rPr>
+        <w:t xml:space="preserve">Kastrup, B. (2021).</w:t>
+      </w:r>
+      <w:r>
+        <w:t xml:space="preserve"> </w:t>
+      </w:r>
+      <w:r>
+        <w:rPr>
+          <w:i/>
+          <w:iCs/>
+        </w:rPr>
+        <w:t xml:space="preserve">Science Ideated.</w:t>
+      </w:r>
+      <w:r>
+        <w:t xml:space="preserve"> </w:t>
+      </w:r>
+      <w:r>
+        <w:t xml:space="preserve">Iff Books.</w:t>
+      </w:r>
+    </w:p>
+    <w:p>
+      <w:pPr>
+        <w:pStyle w:val="Compact"/>
+        <w:numPr>
+          <w:ilvl w:val="0"/>
+          <w:numId w:val="1014"/>
+        </w:numPr>
+      </w:pPr>
+      <w:r>
+        <w:rPr>
+          <w:b/>
+          <w:bCs/>
+        </w:rPr>
+        <w:t xml:space="preserve">Levine, J. (1983).</w:t>
+      </w:r>
+      <w:r>
+        <w:t xml:space="preserve"> </w:t>
+      </w:r>
+      <w:r>
+        <w:rPr>
+          <w:i/>
+          <w:iCs/>
+        </w:rPr>
+        <w:t xml:space="preserve">Materialism and qualia: The explanatory gap.</w:t>
+      </w:r>
+      <w:r>
+        <w:t xml:space="preserve"> </w:t>
+      </w:r>
+      <w:r>
+        <w:t xml:space="preserve">Pacific Philosophical Quarterly, 64(4), 354–361.</w:t>
+      </w:r>
+    </w:p>
+    <w:p>
+      <w:pPr>
+        <w:pStyle w:val="Compact"/>
+        <w:numPr>
+          <w:ilvl w:val="0"/>
+          <w:numId w:val="1014"/>
+        </w:numPr>
+      </w:pPr>
+      <w:r>
+        <w:rPr>
+          <w:b/>
+          <w:bCs/>
+        </w:rPr>
+        <w:t xml:space="preserve">Metzinger, T. (2003).</w:t>
+      </w:r>
+      <w:r>
+        <w:t xml:space="preserve"> </w:t>
+      </w:r>
+      <w:r>
+        <w:rPr>
+          <w:i/>
+          <w:iCs/>
+        </w:rPr>
+        <w:t xml:space="preserve">Being No One: The Self-Model Theory of Subjectivity.</w:t>
+      </w:r>
+      <w:r>
+        <w:t xml:space="preserve"> </w:t>
+      </w:r>
+      <w:r>
+        <w:t xml:space="preserve">MIT Press.</w:t>
+      </w:r>
+    </w:p>
+    <w:p>
+      <w:pPr>
+        <w:pStyle w:val="Compact"/>
+        <w:numPr>
+          <w:ilvl w:val="0"/>
+          <w:numId w:val="1014"/>
+        </w:numPr>
+      </w:pPr>
+      <w:r>
+        <w:rPr>
+          <w:b/>
+          <w:bCs/>
+        </w:rPr>
+        <w:t xml:space="preserve">Metzinger, T. (2009).</w:t>
+      </w:r>
+      <w:r>
+        <w:t xml:space="preserve"> </w:t>
+      </w:r>
+      <w:r>
+        <w:rPr>
+          <w:i/>
+          <w:iCs/>
+        </w:rPr>
+        <w:t xml:space="preserve">The Ego Tunnel.</w:t>
+      </w:r>
+      <w:r>
+        <w:t xml:space="preserve"> </w:t>
+      </w:r>
+      <w:r>
+        <w:t xml:space="preserve">Basic Books.</w:t>
+      </w:r>
+    </w:p>
+    <w:p>
+      <w:pPr>
+        <w:pStyle w:val="Compact"/>
+        <w:numPr>
+          <w:ilvl w:val="0"/>
+          <w:numId w:val="1014"/>
+        </w:numPr>
+      </w:pPr>
+      <w:r>
+        <w:rPr>
+          <w:b/>
+          <w:bCs/>
+        </w:rPr>
+        <w:t xml:space="preserve">Metzinger, T. (2024).</w:t>
+      </w:r>
+      <w:r>
+        <w:t xml:space="preserve"> </w:t>
+      </w:r>
+      <w:r>
+        <w:rPr>
+          <w:i/>
+          <w:iCs/>
+        </w:rPr>
+        <w:t xml:space="preserve">The Elephant and the Blind.</w:t>
+      </w:r>
+      <w:r>
+        <w:t xml:space="preserve"> </w:t>
+      </w:r>
+      <w:r>
+        <w:t xml:space="preserve">MIT Press.</w:t>
+      </w:r>
+    </w:p>
+    <w:p>
+      <w:pPr>
+        <w:pStyle w:val="Compact"/>
+        <w:numPr>
+          <w:ilvl w:val="0"/>
+          <w:numId w:val="1014"/>
+        </w:numPr>
+      </w:pPr>
+      <w:r>
+        <w:rPr>
+          <w:b/>
+          <w:bCs/>
+        </w:rPr>
+        <w:t xml:space="preserve">Monod, J. (1970).</w:t>
+      </w:r>
+      <w:r>
+        <w:t xml:space="preserve"> </w:t>
+      </w:r>
+      <w:r>
+        <w:rPr>
+          <w:i/>
+          <w:iCs/>
+        </w:rPr>
+        <w:t xml:space="preserve">Le Hasard et la Nécessité.</w:t>
+      </w:r>
+      <w:r>
+        <w:t xml:space="preserve"> </w:t>
+      </w:r>
+      <w:r>
+        <w:t xml:space="preserve">Éditions du Seuil.</w:t>
+      </w:r>
+    </w:p>
+    <w:p>
+      <w:pPr>
+        <w:pStyle w:val="Compact"/>
+        <w:numPr>
+          <w:ilvl w:val="0"/>
+          <w:numId w:val="1014"/>
+        </w:numPr>
+      </w:pPr>
+      <w:r>
+        <w:rPr>
+          <w:b/>
+          <w:bCs/>
+        </w:rPr>
+        <w:t xml:space="preserve">Panksepp, J. (1998).</w:t>
+      </w:r>
+      <w:r>
+        <w:t xml:space="preserve"> </w:t>
+      </w:r>
+      <w:r>
+        <w:rPr>
+          <w:i/>
+          <w:iCs/>
+        </w:rPr>
+        <w:t xml:space="preserve">Affective Neuroscience.</w:t>
+      </w:r>
+      <w:r>
+        <w:t xml:space="preserve"> </w:t>
+      </w:r>
+      <w:r>
+        <w:t xml:space="preserve">Oxford University Press.</w:t>
+      </w:r>
+    </w:p>
+    <w:p>
+      <w:pPr>
+        <w:pStyle w:val="Compact"/>
+        <w:numPr>
+          <w:ilvl w:val="0"/>
+          <w:numId w:val="1014"/>
+        </w:numPr>
+      </w:pPr>
+      <w:r>
+        <w:rPr>
+          <w:b/>
+          <w:bCs/>
+        </w:rPr>
+        <w:t xml:space="preserve">Parr, T., &amp; Friston, K. J. (2018).</w:t>
+      </w:r>
+      <w:r>
+        <w:t xml:space="preserve"> </w:t>
+      </w:r>
+      <w:r>
+        <w:rPr>
+          <w:i/>
+          <w:iCs/>
+        </w:rPr>
+        <w:t xml:space="preserve">The anatomy of choice: active inference and agency.</w:t>
+      </w:r>
+      <w:r>
+        <w:t xml:space="preserve"> </w:t>
+      </w:r>
+      <w:r>
+        <w:t xml:space="preserve">Cognitive Neuroscience, 9(1-2), 11–27.</w:t>
+      </w:r>
+    </w:p>
+    <w:p>
+      <w:pPr>
+        <w:pStyle w:val="Compact"/>
+        <w:numPr>
+          <w:ilvl w:val="0"/>
+          <w:numId w:val="1014"/>
+        </w:numPr>
+      </w:pPr>
+      <w:r>
+        <w:rPr>
+          <w:b/>
+          <w:bCs/>
+        </w:rPr>
+        <w:t xml:space="preserve">Parr, T., Pezzulo, G., &amp; Friston, K. J. (2022).</w:t>
+      </w:r>
+      <w:r>
+        <w:t xml:space="preserve"> </w:t>
+      </w:r>
+      <w:r>
+        <w:rPr>
+          <w:i/>
+          <w:iCs/>
+        </w:rPr>
+        <w:t xml:space="preserve">Active Inference: The Free Energy Principle in Mind, Brain, and Behavior.</w:t>
+      </w:r>
+      <w:r>
+        <w:t xml:space="preserve"> </w:t>
+      </w:r>
+      <w:r>
+        <w:t xml:space="preserve">MIT Press.</w:t>
+      </w:r>
+    </w:p>
+    <w:p>
+      <w:pPr>
+        <w:pStyle w:val="Compact"/>
+        <w:numPr>
+          <w:ilvl w:val="0"/>
+          <w:numId w:val="1014"/>
+        </w:numPr>
+      </w:pPr>
+      <w:r>
+        <w:rPr>
+          <w:b/>
+          <w:bCs/>
+        </w:rPr>
+        <w:t xml:space="preserve">Riebl, T. (2026).</w:t>
+      </w:r>
+      <w:r>
+        <w:t xml:space="preserve"> </w:t>
+      </w:r>
+      <w:r>
+        <w:rPr>
+          <w:i/>
+          <w:iCs/>
+        </w:rPr>
+        <w:t xml:space="preserve">The Conative-Integrative Framework (CIF).</w:t>
+      </w:r>
+      <w:r>
+        <w:t xml:space="preserve"> </w:t>
+      </w:r>
+      <w:r>
+        <w:t xml:space="preserve">Master Monographie, Luxemburg.</w:t>
+      </w:r>
+    </w:p>
+    <w:p>
+      <w:pPr>
+        <w:pStyle w:val="Compact"/>
+        <w:numPr>
+          <w:ilvl w:val="0"/>
+          <w:numId w:val="1014"/>
+        </w:numPr>
+      </w:pPr>
+      <w:r>
+        <w:rPr>
+          <w:b/>
+          <w:bCs/>
+        </w:rPr>
+        <w:t xml:space="preserve">Roth, G. (2003).</w:t>
+      </w:r>
+      <w:r>
+        <w:t xml:space="preserve"> </w:t>
+      </w:r>
+      <w:r>
+        <w:rPr>
+          <w:i/>
+          <w:iCs/>
+        </w:rPr>
+        <w:t xml:space="preserve">Aus Sicht des Gehirns.</w:t>
+      </w:r>
+      <w:r>
+        <w:t xml:space="preserve"> </w:t>
+      </w:r>
+      <w:r>
+        <w:t xml:space="preserve">Suhrkamp Verlag.</w:t>
+      </w:r>
+    </w:p>
+    <w:p>
+      <w:pPr>
+        <w:pStyle w:val="Compact"/>
+        <w:numPr>
+          <w:ilvl w:val="0"/>
+          <w:numId w:val="1014"/>
+        </w:numPr>
+      </w:pPr>
+      <w:r>
+        <w:rPr>
+          <w:b/>
+          <w:bCs/>
+        </w:rPr>
+        <w:t xml:space="preserve">Roth, G. (2021).</w:t>
+      </w:r>
+      <w:r>
+        <w:t xml:space="preserve"> </w:t>
+      </w:r>
+      <w:r>
+        <w:rPr>
+          <w:i/>
+          <w:iCs/>
+        </w:rPr>
+        <w:t xml:space="preserve">Wie das Gehirn die Seele macht: Emotionen, Bewusstsein, Unbewusstes.</w:t>
+      </w:r>
+      <w:r>
+        <w:t xml:space="preserve"> </w:t>
+      </w:r>
+      <w:r>
+        <w:t xml:space="preserve">Klett-Cotta.</w:t>
+      </w:r>
+    </w:p>
+    <w:p>
+      <w:pPr>
+        <w:pStyle w:val="Compact"/>
+        <w:numPr>
+          <w:ilvl w:val="0"/>
+          <w:numId w:val="1014"/>
+        </w:numPr>
+      </w:pPr>
+      <w:r>
+        <w:rPr>
+          <w:b/>
+          <w:bCs/>
+        </w:rPr>
+        <w:t xml:space="preserve">Schopenhauer, A. (1819/1844).</w:t>
+      </w:r>
+      <w:r>
+        <w:t xml:space="preserve"> </w:t>
+      </w:r>
+      <w:r>
+        <w:rPr>
+          <w:i/>
+          <w:iCs/>
+        </w:rPr>
+        <w:t xml:space="preserve">Die Welt als Wille und Vorstellung.</w:t>
+      </w:r>
+      <w:r>
+        <w:t xml:space="preserve"> </w:t>
+      </w:r>
+      <w:r>
+        <w:t xml:space="preserve">F. A. Brockhaus.</w:t>
+      </w:r>
+    </w:p>
+    <w:p>
+      <w:pPr>
+        <w:pStyle w:val="Compact"/>
+        <w:numPr>
+          <w:ilvl w:val="0"/>
+          <w:numId w:val="1014"/>
+        </w:numPr>
+      </w:pPr>
+      <w:r>
+        <w:rPr>
+          <w:b/>
+          <w:bCs/>
+        </w:rPr>
+        <w:t xml:space="preserve">Seth, A. K. (2021).</w:t>
+      </w:r>
+      <w:r>
+        <w:t xml:space="preserve"> </w:t>
+      </w:r>
+      <w:r>
+        <w:rPr>
+          <w:i/>
+          <w:iCs/>
+        </w:rPr>
+        <w:t xml:space="preserve">Being You: A New Science of Consciousness.</w:t>
+      </w:r>
+      <w:r>
+        <w:t xml:space="preserve"> </w:t>
+      </w:r>
+      <w:r>
+        <w:t xml:space="preserve">Dutton.</w:t>
+      </w:r>
+    </w:p>
+    <w:p>
+      <w:pPr>
+        <w:pStyle w:val="Compact"/>
+        <w:numPr>
+          <w:ilvl w:val="0"/>
+          <w:numId w:val="1014"/>
+        </w:numPr>
+      </w:pPr>
+      <w:r>
+        <w:rPr>
+          <w:b/>
+          <w:bCs/>
+        </w:rPr>
+        <w:t xml:space="preserve">Spinoza, B. (1677).</w:t>
+      </w:r>
+      <w:r>
+        <w:t xml:space="preserve"> </w:t>
+      </w:r>
+      <w:r>
+        <w:rPr>
+          <w:i/>
+          <w:iCs/>
+        </w:rPr>
+        <w:t xml:space="preserve">Ethica, ordine geometrico demonstrata.</w:t>
+      </w:r>
+    </w:p>
+    <w:p>
+      <w:pPr>
+        <w:pStyle w:val="Compact"/>
+        <w:numPr>
+          <w:ilvl w:val="0"/>
+          <w:numId w:val="1014"/>
+        </w:numPr>
+      </w:pPr>
+      <w:r>
+        <w:rPr>
+          <w:b/>
+          <w:bCs/>
+        </w:rPr>
+        <w:t xml:space="preserve">Tononi, G., Albantakis, L., Boly, M., Massimini, M., &amp; Koch, C. (2023).</w:t>
+      </w:r>
+      <w:r>
+        <w:t xml:space="preserve"> </w:t>
+      </w:r>
+      <w:r>
+        <w:rPr>
+          <w:i/>
+          <w:iCs/>
+        </w:rPr>
+        <w:t xml:space="preserve">Integrated information theory (IIT) 4.0.</w:t>
+      </w:r>
+      <w:r>
+        <w:t xml:space="preserve"> </w:t>
+      </w:r>
+      <w:r>
+        <w:t xml:space="preserve">PLOS Computational Biology, 19(10), e1011465.</w:t>
+      </w:r>
+    </w:p>
+    <w:p>
+      <w:pPr>
+        <w:pStyle w:val="Compact"/>
+        <w:numPr>
+          <w:ilvl w:val="0"/>
+          <w:numId w:val="1014"/>
+        </w:numPr>
+      </w:pPr>
+      <w:r>
+        <w:rPr>
+          <w:b/>
+          <w:bCs/>
+        </w:rPr>
+        <w:t xml:space="preserve">Tschantz, A., Millidge, B., Seth, A. K., &amp; Buckley, C. L. (2020).</w:t>
+      </w:r>
+      <w:r>
+        <w:t xml:space="preserve"> </w:t>
+      </w:r>
+      <w:r>
+        <w:rPr>
+          <w:i/>
+          <w:iCs/>
+        </w:rPr>
+        <w:t xml:space="preserve">Reinforcement learning through active inference.</w:t>
+      </w:r>
+      <w:r>
+        <w:t xml:space="preserve"> </w:t>
+      </w:r>
+      <w:r>
+        <w:t xml:space="preserve">arXiv:2002.12636.</w:t>
+      </w:r>
+    </w:p>
+    <w:p>
+      <w:pPr>
+        <w:pStyle w:val="Compact"/>
+        <w:numPr>
+          <w:ilvl w:val="0"/>
+          <w:numId w:val="1014"/>
+        </w:numPr>
+      </w:pPr>
+      <w:r>
+        <w:rPr>
+          <w:b/>
+          <w:bCs/>
+        </w:rPr>
+        <w:t xml:space="preserve">Yehuda, R., &amp; Lehrner, A. (2018).</w:t>
+      </w:r>
+      <w:r>
+        <w:t xml:space="preserve"> </w:t>
+      </w:r>
+      <w:r>
+        <w:rPr>
+          <w:i/>
+          <w:iCs/>
+        </w:rPr>
+        <w:t xml:space="preserve">Intergenerational transmission of trauma effects.</w:t>
+      </w:r>
+      <w:r>
+        <w:t xml:space="preserve"> </w:t>
+      </w:r>
+      <w:r>
+        <w:t xml:space="preserve">World Psychiatry, 17(3), 243–257.</w:t>
+      </w:r>
+    </w:p>
+    <w:p>
+      <w:r>
+        <w:pict>
+          <v:rect style="width:0;height:1.5pt" o:hralign="center" o:hrstd="t" o:hr="t"/>
+        </w:pict>
+      </w:r>
+    </w:p>
+    <w:bookmarkEnd w:id="59"/>
+    <w:bookmarkStart w:id="60" w:name="tool-attribution-colophon"/>
     <w:p>
       <w:pPr>
         <w:pStyle w:val="Heading2"/>
@@ -12697,8 +14379,8 @@
         <w:t xml:space="preserve">(September 2026) realisiert.</w:t>
       </w:r>
     </w:p>
-    <w:bookmarkEnd w:id="59"/>
     <w:bookmarkEnd w:id="60"/>
+    <w:bookmarkEnd w:id="61"/>
     <w:sectPr>
       <w:footnotePr>
         <w:numRestart w:val="eachSect"/>
@@ -13376,6 +15058,9 @@
     <w:abstractNumId w:val="991"/>
   </w:num>
   <w:num w:numId="1013">
+    <w:abstractNumId w:val="991"/>
+  </w:num>
+  <w:num w:numId="1014">
     <w:abstractNumId w:val="99411"/>
     <w:lvlOverride w:ilvl="0">
       <w:startOverride w:val="1"/>

</xml_diff>

<commit_message>
Ensure continuous, natural text flow within chapters with zero mid-chapter artificial page breaks
</commit_message>
<xml_diff>
--- a/book/build/The_Conative_Integrative_Framework_Book_Thomas_Riebl_DE_6x9.docx
+++ b/book/build/The_Conative_Integrative_Framework_Book_Thomas_Riebl_DE_6x9.docx
@@ -72,11 +72,6 @@
     <w:p>
       <w:pPr>
         <w:pStyle w:val="FirstParagraph"/>
-      </w:pPr>
-    </w:p>
-    <w:p>
-      <w:pPr>
-        <w:pStyle w:val="BodyText"/>
       </w:pPr>
       <w:r>
         <w:rPr>

</xml_diff>

<commit_message>
Add Open Science and Git repository references with direct links to simulation notebooks and papers before the glossary
</commit_message>
<xml_diff>
--- a/book/build/The_Conative_Integrative_Framework_Book_Thomas_Riebl_DE_6x9.docx
+++ b/book/build/The_Conative_Integrative_Framework_Book_Thomas_Riebl_DE_6x9.docx
@@ -10599,7 +10599,7 @@
     </w:p>
     <w:bookmarkEnd w:id="51"/>
     <w:bookmarkEnd w:id="52"/>
-    <w:bookmarkStart w:id="61" w:name="Xb6253ae800693db45b886bd1c8c9d69bdc31d64"/>
+    <w:bookmarkStart w:id="73" w:name="Xb6253ae800693db45b886bd1c8c9d69bdc31d64"/>
     <w:p>
       <w:pPr>
         <w:pStyle w:val="Heading1"/>
@@ -12134,13 +12134,21 @@
     </w:p>
     <w:bookmarkEnd w:id="56"/>
     <w:bookmarkEnd w:id="57"/>
-    <w:bookmarkStart w:id="58" w:name="X2528ce34b9c1bf90eb311fb2a0e80dcfd813869"/>
+    <w:bookmarkStart w:id="69" w:name="X00959850f20045e696e7e31e5a1ee9aaa645ab4"/>
     <w:p>
       <w:pPr>
         <w:pStyle w:val="Heading2"/>
       </w:pPr>
       <w:r>
-        <w:t xml:space="preserve">Anhang B: Alphabetisches Glossar der Fachbegriffe</w:t>
+        <w:t xml:space="preserve">Anhang B: Open Science, Git-Archiv &amp; Wissenschaftliche Begleitpapiere</w:t>
+      </w:r>
+    </w:p>
+    <w:p>
+      <w:pPr>
+        <w:pStyle w:val="FirstParagraph"/>
+      </w:pPr>
+      <w:r>
+        <w:t xml:space="preserve">Im Einklang mit den höchsten Standards transparenter und reproduzierbarer Wissenschaft sind sämtliche Simulations-Quellcodes, interaktiven Jupyter Notebooks, mathematischen Herleitungen und druckfertigen Begleitpapiere öffentlich auf GitHub zugänglich:</w:t>
       </w:r>
     </w:p>
     <w:p>
@@ -12156,24 +12164,36 @@
           <w:b/>
           <w:bCs/>
         </w:rPr>
-        <w:t xml:space="preserve">Active Inference (Aktive Inferenz):</w:t>
-      </w:r>
-      <w:r>
-        <w:t xml:space="preserve"> </w:t>
-      </w:r>
-      <w:r>
-        <w:t xml:space="preserve">Das normative mathematische Framework der theoretischen Neurobiologie, das besagt, dass lebendige Organismen ihre Existenz sichern, indem sie Handlungen ausführen, die die erwartete freie Energie (</w:t>
-      </w:r>
-      <m:oMath>
-        <m:r>
-          <m:rPr>
-            <m:sty m:val="b"/>
-          </m:rPr>
-          <m:t>G</m:t>
-        </m:r>
-      </m:oMath>
-      <w:r>
-        <w:t xml:space="preserve">) minimieren, um sensorische Beobachtungen mit angeborenen Präferenzen in Einklang zu bringen.</w:t>
+        <w:t xml:space="preserve">Zentrales Projekt-Repository:</w:t>
+      </w:r>
+      <w:r>
+        <w:br/>
+      </w:r>
+      <w:hyperlink r:id="rId58">
+        <w:r>
+          <w:rPr>
+            <w:rStyle w:val="Hyperlink"/>
+          </w:rPr>
+          <w:t xml:space="preserve">https://github.com/Thriebl/active-inference-phi-network</w:t>
+        </w:r>
+      </w:hyperlink>
+    </w:p>
+    <w:bookmarkStart w:id="62" w:name="Xebba227b5547ffa48278b76afadba1c4d8f461f"/>
+    <w:p>
+      <w:pPr>
+        <w:pStyle w:val="Heading3"/>
+      </w:pPr>
+      <w:r>
+        <w:t xml:space="preserve">1. Interaktive Simulations-Notebooks (</w:t>
+      </w:r>
+      <w:r>
+        <w:rPr>
+          <w:rStyle w:val="VerbatimChar"/>
+        </w:rPr>
+        <w:t xml:space="preserve">notebooks/</w:t>
+      </w:r>
+      <w:r>
+        <w:t xml:space="preserve">):</w:t>
       </w:r>
     </w:p>
     <w:p>
@@ -12181,7 +12201,7 @@
         <w:pStyle w:val="Compact"/>
         <w:numPr>
           <w:ilvl w:val="0"/>
-          <w:numId w:val="1013"/>
+          <w:numId w:val="1014"/>
         </w:numPr>
       </w:pPr>
       <w:r>
@@ -12189,13 +12209,65 @@
           <w:b/>
           <w:bCs/>
         </w:rPr>
-        <w:t xml:space="preserve">Alter (Dissoziiertes Bewusstseinszentrum):</w:t>
-      </w:r>
-      <w:r>
-        <w:t xml:space="preserve"> </w:t>
-      </w:r>
-      <w:r>
-        <w:t xml:space="preserve">Im Analytischen Idealismus ein individueller lebendiger Organismus, der durch die topologische Dissoziation von Mind-at-Large entsteht und durch eine statistische Markov-Decke abgegrenzt ist.</w:t>
+        <w:t xml:space="preserve">Rekurrente</w:t>
+      </w:r>
+      <w:r>
+        <w:rPr>
+          <w:b/>
+          <w:bCs/>
+        </w:rPr>
+        <w:t xml:space="preserve"> </w:t>
+      </w:r>
+      <m:oMath>
+        <m:r>
+          <m:rPr>
+            <m:sty m:val="p"/>
+          </m:rPr>
+          <m:t>Φ</m:t>
+        </m:r>
+      </m:oMath>
+      <w:r>
+        <w:rPr>
+          <w:b/>
+          <w:bCs/>
+        </w:rPr>
+        <w:t xml:space="preserve">-Maximierung:</w:t>
+      </w:r>
+      <w:r>
+        <w:br/>
+      </w:r>
+      <w:hyperlink r:id="rId59">
+        <w:r>
+          <w:rPr>
+            <w:rStyle w:val="VerbatimChar"/>
+          </w:rPr>
+          <w:t xml:space="preserve">Active_Inference_Phi_Maximization_Network.ipynb</w:t>
+        </w:r>
+      </w:hyperlink>
+      <w:r>
+        <w:br/>
+      </w:r>
+      <w:r>
+        <w:rPr>
+          <w:i/>
+          <w:iCs/>
+        </w:rPr>
+        <w:t xml:space="preserve">Simuliert Active-Inference-Agenten, die sich autonom an der Schwelle zum Chaos (Kritikalität) einpendeln und Integrierte Information (</w:t>
+      </w:r>
+      <m:oMath>
+        <m:r>
+          <m:rPr>
+            <m:sty m:val="p"/>
+          </m:rPr>
+          <m:t>Φ</m:t>
+        </m:r>
+      </m:oMath>
+      <w:r>
+        <w:rPr>
+          <w:i/>
+          <w:iCs/>
+        </w:rPr>
+        <w:t xml:space="preserve">) maximieren.</w:t>
       </w:r>
     </w:p>
     <w:p>
@@ -12203,7 +12275,7 @@
         <w:pStyle w:val="Compact"/>
         <w:numPr>
           <w:ilvl w:val="0"/>
-          <w:numId w:val="1013"/>
+          <w:numId w:val="1014"/>
         </w:numPr>
       </w:pPr>
       <w:r>
@@ -12211,23 +12283,150 @@
           <w:b/>
           <w:bCs/>
         </w:rPr>
-        <w:t xml:space="preserve">Analytischer Idealismus:</w:t>
-      </w:r>
-      <w:r>
-        <w:t xml:space="preserve"> </w:t>
-      </w:r>
-      <w:r>
-        <w:t xml:space="preserve">Die von Bernardo Kastrup formulierte nicht-duale, ontologisch sparsame Monismus-Lehre, nach der die Wirklichkeit fundamental erfahrungsbasiert ist (</w:t>
+        <w:t xml:space="preserve">Modulare Netzwerkskalierung (</w:t>
+      </w:r>
+      <m:oMath>
+        <m:r>
+          <m:rPr>
+            <m:sty m:val="p"/>
+          </m:rPr>
+          <m:t>Φ</m:t>
+        </m:r>
+        <m:r>
+          <m:rPr>
+            <m:sty m:val="p"/>
+          </m:rPr>
+          <m:t>(</m:t>
+        </m:r>
+        <m:r>
+          <m:t>N</m:t>
+        </m:r>
+        <m:r>
+          <m:rPr>
+            <m:sty m:val="p"/>
+          </m:rPr>
+          <m:t>)</m:t>
+        </m:r>
+      </m:oMath>
+      <w:r>
+        <w:rPr>
+          <w:b/>
+          <w:bCs/>
+        </w:rPr>
+        <w:t xml:space="preserve">):</w:t>
+      </w:r>
+      <w:r>
+        <w:br/>
+      </w:r>
+      <w:hyperlink r:id="rId60">
+        <w:r>
+          <w:rPr>
+            <w:rStyle w:val="VerbatimChar"/>
+          </w:rPr>
+          <w:t xml:space="preserve">Active_Inference_Expanding_Network_Phi_Scaling.ipynb</w:t>
+        </w:r>
+      </w:hyperlink>
+      <w:r>
+        <w:br/>
       </w:r>
       <w:r>
         <w:rPr>
           <w:i/>
           <w:iCs/>
         </w:rPr>
-        <w:t xml:space="preserve">Mind-at-Large</w:t>
-      </w:r>
-      <w:r>
-        <w:t xml:space="preserve">) und physikalische Materie das äußere Erscheinungsbild universaler mentaler Prozesse darstellt.</w:t>
+        <w:t xml:space="preserve">Simuliert die dynamische Erweiterung von</w:t>
+      </w:r>
+      <w:r>
+        <w:rPr>
+          <w:i/>
+          <w:iCs/>
+        </w:rPr>
+        <w:t xml:space="preserve"> </w:t>
+      </w:r>
+      <m:oMath>
+        <m:r>
+          <m:t>N</m:t>
+        </m:r>
+        <m:r>
+          <m:rPr>
+            <m:sty m:val="p"/>
+          </m:rPr>
+          <m:t>=</m:t>
+        </m:r>
+        <m:r>
+          <m:t>4</m:t>
+        </m:r>
+      </m:oMath>
+      <w:r>
+        <w:rPr>
+          <w:i/>
+          <w:iCs/>
+        </w:rPr>
+        <w:t xml:space="preserve"> </w:t>
+      </w:r>
+      <w:r>
+        <w:rPr>
+          <w:i/>
+          <w:iCs/>
+        </w:rPr>
+        <w:t xml:space="preserve">auf</w:t>
+      </w:r>
+      <w:r>
+        <w:rPr>
+          <w:i/>
+          <w:iCs/>
+        </w:rPr>
+        <w:t xml:space="preserve"> </w:t>
+      </w:r>
+      <m:oMath>
+        <m:r>
+          <m:t>N</m:t>
+        </m:r>
+        <m:r>
+          <m:rPr>
+            <m:sty m:val="p"/>
+          </m:rPr>
+          <m:t>=</m:t>
+        </m:r>
+        <m:r>
+          <m:t>12</m:t>
+        </m:r>
+      </m:oMath>
+      <w:r>
+        <w:rPr>
+          <w:i/>
+          <w:iCs/>
+        </w:rPr>
+        <w:t xml:space="preserve"> </w:t>
+      </w:r>
+      <w:r>
+        <w:rPr>
+          <w:i/>
+          <w:iCs/>
+        </w:rPr>
+        <w:t xml:space="preserve">Knoten mit superlinearer</w:t>
+      </w:r>
+      <w:r>
+        <w:rPr>
+          <w:i/>
+          <w:iCs/>
+        </w:rPr>
+        <w:t xml:space="preserve"> </w:t>
+      </w:r>
+      <m:oMath>
+        <m:r>
+          <m:rPr>
+            <m:sty m:val="p"/>
+          </m:rPr>
+          <m:t>Φ</m:t>
+        </m:r>
+      </m:oMath>
+      <w:r>
+        <w:rPr>
+          <w:i/>
+          <w:iCs/>
+        </w:rPr>
+        <w:t xml:space="preserve">-Integration.</w:t>
       </w:r>
     </w:p>
     <w:p>
@@ -12235,7 +12434,7 @@
         <w:pStyle w:val="Compact"/>
         <w:numPr>
           <w:ilvl w:val="0"/>
-          <w:numId w:val="1013"/>
+          <w:numId w:val="1014"/>
         </w:numPr>
       </w:pPr>
       <w:r>
@@ -12243,13 +12442,119 @@
           <w:b/>
           <w:bCs/>
         </w:rPr>
-        <w:t xml:space="preserve">Autopoiese:</w:t>
-      </w:r>
-      <w:r>
-        <w:t xml:space="preserve"> </w:t>
-      </w:r>
-      <w:r>
-        <w:t xml:space="preserve">Die fundamentale Eigenschaft lebendiger Systeme, ihr eigenes strukturelles und organisatorisches Netzwerk kontinuierlich selbst zu regenerieren und gegen den thermodynamischen Zerfall zu behaupten.</w:t>
+        <w:t xml:space="preserve">Temporale Tiefen (</w:t>
+      </w:r>
+      <m:oMath>
+        <m:r>
+          <m:t>H</m:t>
+        </m:r>
+        <m:r>
+          <m:rPr>
+            <m:sty m:val="p"/>
+          </m:rPr>
+          <m:t>=</m:t>
+        </m:r>
+        <m:r>
+          <m:t>0</m:t>
+        </m:r>
+        <m:r>
+          <m:rPr>
+            <m:sty m:val="p"/>
+          </m:rPr>
+          <m:t>→</m:t>
+        </m:r>
+        <m:r>
+          <m:t>4</m:t>
+        </m:r>
+      </m:oMath>
+      <w:r>
+        <w:rPr>
+          <w:b/>
+          <w:bCs/>
+        </w:rPr>
+        <w:t xml:space="preserve">) &amp; 6. Axiom:</w:t>
+      </w:r>
+      <w:r>
+        <w:br/>
+      </w:r>
+      <w:hyperlink r:id="rId61">
+        <w:r>
+          <w:rPr>
+            <w:rStyle w:val="VerbatimChar"/>
+          </w:rPr>
+          <w:t xml:space="preserve">Deep_Temporal_Active_Inference_Simulation.ipynb</w:t>
+        </w:r>
+      </w:hyperlink>
+      <w:r>
+        <w:br/>
+      </w:r>
+      <w:r>
+        <w:rPr>
+          <w:i/>
+          <w:iCs/>
+        </w:rPr>
+        <w:t xml:space="preserve">Multi-Agenten-Monte-Carlo-Simulation (</w:t>
+      </w:r>
+      <m:oMath>
+        <m:r>
+          <m:t>N</m:t>
+        </m:r>
+        <m:r>
+          <m:rPr>
+            <m:sty m:val="p"/>
+          </m:rPr>
+          <m:t>=</m:t>
+        </m:r>
+        <m:r>
+          <m:t>30</m:t>
+        </m:r>
+      </m:oMath>
+      <w:r>
+        <w:rPr>
+          <w:i/>
+          <w:iCs/>
+        </w:rPr>
+        <w:t xml:space="preserve">) zum Beweis des Theorems der temporalen Mindesttiefe (</w:t>
+      </w:r>
+      <m:oMath>
+        <m:r>
+          <m:t>H</m:t>
+        </m:r>
+        <m:r>
+          <m:rPr>
+            <m:sty m:val="p"/>
+          </m:rPr>
+          <m:t>&gt;</m:t>
+        </m:r>
+        <m:r>
+          <m:t>1</m:t>
+        </m:r>
+      </m:oMath>
+      <w:r>
+        <w:rPr>
+          <w:i/>
+          <w:iCs/>
+        </w:rPr>
+        <w:t xml:space="preserve">) und epistemischer Neugier.</w:t>
+      </w:r>
+    </w:p>
+    <w:bookmarkEnd w:id="62"/>
+    <w:bookmarkStart w:id="68" w:name="X28af6e624b13a09c2905638e734744d31c14881"/>
+    <w:p>
+      <w:pPr>
+        <w:pStyle w:val="Heading3"/>
+      </w:pPr>
+      <w:r>
+        <w:t xml:space="preserve">2. Wissenschaftliche Grundlagenpapiere &amp; Poster (</w:t>
+      </w:r>
+      <w:r>
+        <w:rPr>
+          <w:rStyle w:val="VerbatimChar"/>
+        </w:rPr>
+        <w:t xml:space="preserve">docs/</w:t>
+      </w:r>
+      <w:r>
+        <w:t xml:space="preserve">):</w:t>
       </w:r>
     </w:p>
     <w:p>
@@ -12257,7 +12562,7 @@
         <w:pStyle w:val="Compact"/>
         <w:numPr>
           <w:ilvl w:val="0"/>
-          <w:numId w:val="1013"/>
+          <w:numId w:val="1015"/>
         </w:numPr>
       </w:pPr>
       <w:r>
@@ -12265,44 +12570,356 @@
           <w:b/>
           <w:bCs/>
         </w:rPr>
-        <w:t xml:space="preserve">Conatus (Der Existenzwille):</w:t>
-      </w:r>
-      <w:r>
-        <w:t xml:space="preserve"> </w:t>
-      </w:r>
-      <w:r>
-        <w:t xml:space="preserve">Das angeborene Streben jedes Seienden, in seiner Existenz zu verharren und der Zerstörung zu widerstehen (Spinoza). Im CIF formalisiert als Sollzustand</w:t>
-      </w:r>
-      <w:r>
-        <w:t xml:space="preserve"> </w:t>
-      </w:r>
-      <m:oMath>
-        <m:r>
-          <m:rPr>
-            <m:sty m:val="p"/>
-          </m:rPr>
-          <m:t>Φ</m:t>
-        </m:r>
-        <m:r>
-          <m:rPr>
-            <m:sty m:val="p"/>
-          </m:rPr>
-          <m:t>&gt;</m:t>
-        </m:r>
-        <m:r>
-          <m:t>0</m:t>
-        </m:r>
-      </m:oMath>
-      <w:r>
-        <w:t xml:space="preserve">.</w:t>
-      </w:r>
+        <w:t xml:space="preserve">Das Master-Framework-Papier:</w:t>
+      </w:r>
+      <w:r>
+        <w:t xml:space="preserve"> </w:t>
+      </w:r>
+      <w:r>
+        <w:rPr>
+          <w:i/>
+          <w:iCs/>
+        </w:rPr>
+        <w:t xml:space="preserve">The Conative-Integrative Framework (CIF)</w:t>
+      </w:r>
+      <w:r>
+        <w:br/>
+      </w:r>
+      <w:hyperlink r:id="rId63">
+        <w:r>
+          <w:rPr>
+            <w:rStyle w:val="VerbatimChar"/>
+          </w:rPr>
+          <w:t xml:space="preserve">The_Conative_Integrative_Framework_Thomas_Riebl.pdf</w:t>
+        </w:r>
+      </w:hyperlink>
     </w:p>
     <w:p>
       <w:pPr>
         <w:pStyle w:val="Compact"/>
         <w:numPr>
           <w:ilvl w:val="0"/>
-          <w:numId w:val="1013"/>
+          <w:numId w:val="1015"/>
+        </w:numPr>
+      </w:pPr>
+      <w:r>
+        <w:rPr>
+          <w:b/>
+          <w:bCs/>
+        </w:rPr>
+        <w:t xml:space="preserve">Die 6-Ebenen-Seelenarchitektur:</w:t>
+      </w:r>
+      <w:r>
+        <w:t xml:space="preserve"> </w:t>
+      </w:r>
+      <w:r>
+        <w:rPr>
+          <w:i/>
+          <w:iCs/>
+        </w:rPr>
+        <w:t xml:space="preserve">The Composition of the Soul</w:t>
+      </w:r>
+      <w:r>
+        <w:br/>
+      </w:r>
+      <w:hyperlink r:id="rId64">
+        <w:r>
+          <w:rPr>
+            <w:rStyle w:val="VerbatimChar"/>
+          </w:rPr>
+          <w:t xml:space="preserve">The_Composition_of_the_Soul_Thomas_Riebl.pdf</w:t>
+        </w:r>
+      </w:hyperlink>
+    </w:p>
+    <w:p>
+      <w:pPr>
+        <w:pStyle w:val="Compact"/>
+        <w:numPr>
+          <w:ilvl w:val="0"/>
+          <w:numId w:val="1015"/>
+        </w:numPr>
+      </w:pPr>
+      <w:r>
+        <w:rPr>
+          <w:b/>
+          <w:bCs/>
+        </w:rPr>
+        <w:t xml:space="preserve">Die temporale Mechanik:</w:t>
+      </w:r>
+      <w:r>
+        <w:t xml:space="preserve"> </w:t>
+      </w:r>
+      <w:r>
+        <w:rPr>
+          <w:i/>
+          <w:iCs/>
+        </w:rPr>
+        <w:t xml:space="preserve">The Temporal Mechanics of Consciousness (Time &amp; The Specious Present)</w:t>
+      </w:r>
+      <w:r>
+        <w:br/>
+      </w:r>
+      <w:hyperlink r:id="rId65">
+        <w:r>
+          <w:rPr>
+            <w:rStyle w:val="VerbatimChar"/>
+          </w:rPr>
+          <w:t xml:space="preserve">The_Temporal_Mechanics_of_Consciousness_Thomas_Riebl.pdf</w:t>
+        </w:r>
+      </w:hyperlink>
+    </w:p>
+    <w:p>
+      <w:pPr>
+        <w:pStyle w:val="Compact"/>
+        <w:numPr>
+          <w:ilvl w:val="0"/>
+          <w:numId w:val="1015"/>
+        </w:numPr>
+      </w:pPr>
+      <w:r>
+        <w:rPr>
+          <w:b/>
+          <w:bCs/>
+        </w:rPr>
+        <w:t xml:space="preserve">Die statistische Methodik:</w:t>
+      </w:r>
+      <w:r>
+        <w:t xml:space="preserve"> </w:t>
+      </w:r>
+      <w:r>
+        <w:rPr>
+          <w:i/>
+          <w:iCs/>
+        </w:rPr>
+        <w:t xml:space="preserve">Monte Carlo Methodology in Active Inference &amp; Consciousness</w:t>
+      </w:r>
+      <w:r>
+        <w:br/>
+      </w:r>
+      <w:hyperlink r:id="rId66">
+        <w:r>
+          <w:rPr>
+            <w:rStyle w:val="VerbatimChar"/>
+          </w:rPr>
+          <w:t xml:space="preserve">Monte_Carlo_Methodology_Active_Inference_Thomas_Riebl.pdf</w:t>
+        </w:r>
+      </w:hyperlink>
+    </w:p>
+    <w:p>
+      <w:pPr>
+        <w:pStyle w:val="Compact"/>
+        <w:numPr>
+          <w:ilvl w:val="0"/>
+          <w:numId w:val="1015"/>
+        </w:numPr>
+      </w:pPr>
+      <w:r>
+        <w:rPr>
+          <w:b/>
+          <w:bCs/>
+        </w:rPr>
+        <w:t xml:space="preserve">Das Executive Poster:</w:t>
+      </w:r>
+      <w:r>
+        <w:t xml:space="preserve"> </w:t>
+      </w:r>
+      <w:r>
+        <w:rPr>
+          <w:i/>
+          <w:iCs/>
+        </w:rPr>
+        <w:t xml:space="preserve">The 6th Axiom Executive Slide (High-Impact A4 Landscape)</w:t>
+      </w:r>
+      <w:r>
+        <w:br/>
+      </w:r>
+      <w:hyperlink r:id="rId67">
+        <w:r>
+          <w:rPr>
+            <w:rStyle w:val="VerbatimChar"/>
+          </w:rPr>
+          <w:t xml:space="preserve">The_6th_Axiom_Executive_Slide_Thomas_Riebl_A4_Landscape.pdf</w:t>
+        </w:r>
+      </w:hyperlink>
+    </w:p>
+    <w:p>
+      <w:r>
+        <w:pict>
+          <v:rect style="width:0;height:1.5pt" o:hralign="center" o:hrstd="t" o:hr="t"/>
+        </w:pict>
+      </w:r>
+    </w:p>
+    <w:bookmarkEnd w:id="68"/>
+    <w:bookmarkEnd w:id="69"/>
+    <w:bookmarkStart w:id="70" w:name="X6ebfcc777b1b1223b2089ae2c33d3f4626144bc"/>
+    <w:p>
+      <w:pPr>
+        <w:pStyle w:val="Heading2"/>
+      </w:pPr>
+      <w:r>
+        <w:t xml:space="preserve">Anhang C: Alphabetisches Glossar der Fachbegriffe</w:t>
+      </w:r>
+    </w:p>
+    <w:p>
+      <w:pPr>
+        <w:pStyle w:val="Compact"/>
+        <w:numPr>
+          <w:ilvl w:val="0"/>
+          <w:numId w:val="1016"/>
+        </w:numPr>
+      </w:pPr>
+      <w:r>
+        <w:rPr>
+          <w:b/>
+          <w:bCs/>
+        </w:rPr>
+        <w:t xml:space="preserve">Active Inference (Aktive Inferenz):</w:t>
+      </w:r>
+      <w:r>
+        <w:t xml:space="preserve"> </w:t>
+      </w:r>
+      <w:r>
+        <w:t xml:space="preserve">Das normative mathematische Framework der theoretischen Neurobiologie, das besagt, dass lebendige Organismen ihre Existenz sichern, indem sie Handlungen ausführen, die die erwartete freie Energie (</w:t>
+      </w:r>
+      <m:oMath>
+        <m:r>
+          <m:rPr>
+            <m:sty m:val="b"/>
+          </m:rPr>
+          <m:t>G</m:t>
+        </m:r>
+      </m:oMath>
+      <w:r>
+        <w:t xml:space="preserve">) minimieren, um sensorische Beobachtungen mit angeborenen Präferenzen in Einklang zu bringen.</w:t>
+      </w:r>
+    </w:p>
+    <w:p>
+      <w:pPr>
+        <w:pStyle w:val="Compact"/>
+        <w:numPr>
+          <w:ilvl w:val="0"/>
+          <w:numId w:val="1016"/>
+        </w:numPr>
+      </w:pPr>
+      <w:r>
+        <w:rPr>
+          <w:b/>
+          <w:bCs/>
+        </w:rPr>
+        <w:t xml:space="preserve">Alter (Dissoziiertes Bewusstseinszentrum):</w:t>
+      </w:r>
+      <w:r>
+        <w:t xml:space="preserve"> </w:t>
+      </w:r>
+      <w:r>
+        <w:t xml:space="preserve">Im Analytischen Idealismus ein individueller lebendiger Organismus, der durch die topologische Dissoziation von Mind-at-Large entsteht und durch eine statistische Markov-Decke abgegrenzt ist.</w:t>
+      </w:r>
+    </w:p>
+    <w:p>
+      <w:pPr>
+        <w:pStyle w:val="Compact"/>
+        <w:numPr>
+          <w:ilvl w:val="0"/>
+          <w:numId w:val="1016"/>
+        </w:numPr>
+      </w:pPr>
+      <w:r>
+        <w:rPr>
+          <w:b/>
+          <w:bCs/>
+        </w:rPr>
+        <w:t xml:space="preserve">Analytischer Idealismus:</w:t>
+      </w:r>
+      <w:r>
+        <w:t xml:space="preserve"> </w:t>
+      </w:r>
+      <w:r>
+        <w:t xml:space="preserve">Die von Bernardo Kastrup formulierte nicht-duale, ontologisch sparsame Monismus-Lehre, nach der die Wirklichkeit fundamental erfahrungsbasiert ist (</w:t>
+      </w:r>
+      <w:r>
+        <w:rPr>
+          <w:i/>
+          <w:iCs/>
+        </w:rPr>
+        <w:t xml:space="preserve">Mind-at-Large</w:t>
+      </w:r>
+      <w:r>
+        <w:t xml:space="preserve">) und physikalische Materie das äußere Erscheinungsbild universaler mentaler Prozesse darstellt.</w:t>
+      </w:r>
+    </w:p>
+    <w:p>
+      <w:pPr>
+        <w:pStyle w:val="Compact"/>
+        <w:numPr>
+          <w:ilvl w:val="0"/>
+          <w:numId w:val="1016"/>
+        </w:numPr>
+      </w:pPr>
+      <w:r>
+        <w:rPr>
+          <w:b/>
+          <w:bCs/>
+        </w:rPr>
+        <w:t xml:space="preserve">Autopoiese:</w:t>
+      </w:r>
+      <w:r>
+        <w:t xml:space="preserve"> </w:t>
+      </w:r>
+      <w:r>
+        <w:t xml:space="preserve">Die fundamentale Eigenschaft lebendiger Systeme, ihr eigenes strukturelles und organisatorisches Netzwerk kontinuierlich selbst zu regenerieren und gegen den thermodynamischen Zerfall zu behaupten.</w:t>
+      </w:r>
+    </w:p>
+    <w:p>
+      <w:pPr>
+        <w:pStyle w:val="Compact"/>
+        <w:numPr>
+          <w:ilvl w:val="0"/>
+          <w:numId w:val="1016"/>
+        </w:numPr>
+      </w:pPr>
+      <w:r>
+        <w:rPr>
+          <w:b/>
+          <w:bCs/>
+        </w:rPr>
+        <w:t xml:space="preserve">Conatus (Der Existenzwille):</w:t>
+      </w:r>
+      <w:r>
+        <w:t xml:space="preserve"> </w:t>
+      </w:r>
+      <w:r>
+        <w:t xml:space="preserve">Das angeborene Streben jedes Seienden, in seiner Existenz zu verharren und der Zerstörung zu widerstehen (Spinoza). Im CIF formalisiert als Sollzustand</w:t>
+      </w:r>
+      <w:r>
+        <w:t xml:space="preserve"> </w:t>
+      </w:r>
+      <m:oMath>
+        <m:r>
+          <m:rPr>
+            <m:sty m:val="p"/>
+          </m:rPr>
+          <m:t>Φ</m:t>
+        </m:r>
+        <m:r>
+          <m:rPr>
+            <m:sty m:val="p"/>
+          </m:rPr>
+          <m:t>&gt;</m:t>
+        </m:r>
+        <m:r>
+          <m:t>0</m:t>
+        </m:r>
+      </m:oMath>
+      <w:r>
+        <w:t xml:space="preserve">.</w:t>
+      </w:r>
+    </w:p>
+    <w:p>
+      <w:pPr>
+        <w:pStyle w:val="Compact"/>
+        <w:numPr>
+          <w:ilvl w:val="0"/>
+          <w:numId w:val="1016"/>
         </w:numPr>
       </w:pPr>
       <w:r>
@@ -12445,7 +13062,7 @@
         <w:pStyle w:val="Compact"/>
         <w:numPr>
           <w:ilvl w:val="0"/>
-          <w:numId w:val="1013"/>
+          <w:numId w:val="1016"/>
         </w:numPr>
       </w:pPr>
       <w:r>
@@ -12483,7 +13100,7 @@
         <w:pStyle w:val="Compact"/>
         <w:numPr>
           <w:ilvl w:val="0"/>
-          <w:numId w:val="1013"/>
+          <w:numId w:val="1016"/>
         </w:numPr>
       </w:pPr>
       <w:r>
@@ -12531,7 +13148,7 @@
         <w:pStyle w:val="Compact"/>
         <w:numPr>
           <w:ilvl w:val="0"/>
-          <w:numId w:val="1013"/>
+          <w:numId w:val="1016"/>
         </w:numPr>
       </w:pPr>
       <w:r>
@@ -12568,7 +13185,7 @@
         <w:pStyle w:val="Compact"/>
         <w:numPr>
           <w:ilvl w:val="0"/>
-          <w:numId w:val="1013"/>
+          <w:numId w:val="1016"/>
         </w:numPr>
       </w:pPr>
       <w:r>
@@ -12617,7 +13234,7 @@
         <w:pStyle w:val="Compact"/>
         <w:numPr>
           <w:ilvl w:val="0"/>
-          <w:numId w:val="1013"/>
+          <w:numId w:val="1016"/>
         </w:numPr>
       </w:pPr>
       <w:r>
@@ -12687,7 +13304,7 @@
         <w:pStyle w:val="Compact"/>
         <w:numPr>
           <w:ilvl w:val="0"/>
-          <w:numId w:val="1013"/>
+          <w:numId w:val="1016"/>
         </w:numPr>
       </w:pPr>
       <w:r>
@@ -12709,7 +13326,7 @@
         <w:pStyle w:val="Compact"/>
         <w:numPr>
           <w:ilvl w:val="0"/>
-          <w:numId w:val="1013"/>
+          <w:numId w:val="1016"/>
         </w:numPr>
       </w:pPr>
       <w:r>
@@ -12745,7 +13362,7 @@
         <w:pStyle w:val="Compact"/>
         <w:numPr>
           <w:ilvl w:val="0"/>
-          <w:numId w:val="1013"/>
+          <w:numId w:val="1016"/>
         </w:numPr>
       </w:pPr>
       <w:r>
@@ -12767,7 +13384,7 @@
         <w:pStyle w:val="Compact"/>
         <w:numPr>
           <w:ilvl w:val="0"/>
-          <w:numId w:val="1013"/>
+          <w:numId w:val="1016"/>
         </w:numPr>
       </w:pPr>
       <w:r>
@@ -12845,7 +13462,7 @@
         <w:pStyle w:val="Compact"/>
         <w:numPr>
           <w:ilvl w:val="0"/>
-          <w:numId w:val="1013"/>
+          <w:numId w:val="1016"/>
         </w:numPr>
       </w:pPr>
       <w:r>
@@ -12867,7 +13484,7 @@
         <w:pStyle w:val="Compact"/>
         <w:numPr>
           <w:ilvl w:val="0"/>
-          <w:numId w:val="1013"/>
+          <w:numId w:val="1016"/>
         </w:numPr>
       </w:pPr>
       <w:r>
@@ -12889,7 +13506,7 @@
         <w:pStyle w:val="Compact"/>
         <w:numPr>
           <w:ilvl w:val="0"/>
-          <w:numId w:val="1013"/>
+          <w:numId w:val="1016"/>
         </w:numPr>
       </w:pPr>
       <w:r>
@@ -12937,7 +13554,7 @@
         <w:pStyle w:val="Compact"/>
         <w:numPr>
           <w:ilvl w:val="0"/>
-          <w:numId w:val="1013"/>
+          <w:numId w:val="1016"/>
         </w:numPr>
       </w:pPr>
       <w:r>
@@ -13002,7 +13619,7 @@
         <w:pStyle w:val="Compact"/>
         <w:numPr>
           <w:ilvl w:val="0"/>
-          <w:numId w:val="1013"/>
+          <w:numId w:val="1016"/>
         </w:numPr>
       </w:pPr>
       <w:r>
@@ -13055,7 +13672,7 @@
         <w:pStyle w:val="Compact"/>
         <w:numPr>
           <w:ilvl w:val="0"/>
-          <w:numId w:val="1013"/>
+          <w:numId w:val="1016"/>
         </w:numPr>
       </w:pPr>
       <w:r>
@@ -13114,7 +13731,7 @@
         <w:pStyle w:val="Compact"/>
         <w:numPr>
           <w:ilvl w:val="0"/>
-          <w:numId w:val="1013"/>
+          <w:numId w:val="1016"/>
         </w:numPr>
       </w:pPr>
       <w:r>
@@ -13136,7 +13753,7 @@
         <w:pStyle w:val="Compact"/>
         <w:numPr>
           <w:ilvl w:val="0"/>
-          <w:numId w:val="1013"/>
+          <w:numId w:val="1016"/>
         </w:numPr>
       </w:pPr>
       <w:r>
@@ -13207,8 +13824,8 @@
         </w:pict>
       </w:r>
     </w:p>
-    <w:bookmarkEnd w:id="58"/>
-    <w:bookmarkStart w:id="59" w:name="akademische-bibliographie-auswahl"/>
+    <w:bookmarkEnd w:id="70"/>
+    <w:bookmarkStart w:id="71" w:name="akademische-bibliographie-auswahl"/>
     <w:p>
       <w:pPr>
         <w:pStyle w:val="Heading2"/>
@@ -13222,7 +13839,7 @@
         <w:pStyle w:val="Compact"/>
         <w:numPr>
           <w:ilvl w:val="0"/>
-          <w:numId w:val="1014"/>
+          <w:numId w:val="1017"/>
         </w:numPr>
       </w:pPr>
       <w:r>
@@ -13254,7 +13871,7 @@
         <w:pStyle w:val="Compact"/>
         <w:numPr>
           <w:ilvl w:val="0"/>
-          <w:numId w:val="1014"/>
+          <w:numId w:val="1017"/>
         </w:numPr>
       </w:pPr>
       <w:r>
@@ -13286,7 +13903,7 @@
         <w:pStyle w:val="Compact"/>
         <w:numPr>
           <w:ilvl w:val="0"/>
-          <w:numId w:val="1014"/>
+          <w:numId w:val="1017"/>
         </w:numPr>
       </w:pPr>
       <w:r>
@@ -13318,7 +13935,7 @@
         <w:pStyle w:val="Compact"/>
         <w:numPr>
           <w:ilvl w:val="0"/>
-          <w:numId w:val="1014"/>
+          <w:numId w:val="1017"/>
         </w:numPr>
       </w:pPr>
       <w:r>
@@ -13350,7 +13967,7 @@
         <w:pStyle w:val="Compact"/>
         <w:numPr>
           <w:ilvl w:val="0"/>
-          <w:numId w:val="1014"/>
+          <w:numId w:val="1017"/>
         </w:numPr>
       </w:pPr>
       <w:r>
@@ -13382,7 +13999,7 @@
         <w:pStyle w:val="Compact"/>
         <w:numPr>
           <w:ilvl w:val="0"/>
-          <w:numId w:val="1014"/>
+          <w:numId w:val="1017"/>
         </w:numPr>
       </w:pPr>
       <w:r>
@@ -13414,7 +14031,7 @@
         <w:pStyle w:val="Compact"/>
         <w:numPr>
           <w:ilvl w:val="0"/>
-          <w:numId w:val="1014"/>
+          <w:numId w:val="1017"/>
         </w:numPr>
       </w:pPr>
       <w:r>
@@ -13446,7 +14063,7 @@
         <w:pStyle w:val="Compact"/>
         <w:numPr>
           <w:ilvl w:val="0"/>
-          <w:numId w:val="1014"/>
+          <w:numId w:val="1017"/>
         </w:numPr>
       </w:pPr>
       <w:r>
@@ -13478,7 +14095,7 @@
         <w:pStyle w:val="Compact"/>
         <w:numPr>
           <w:ilvl w:val="0"/>
-          <w:numId w:val="1014"/>
+          <w:numId w:val="1017"/>
         </w:numPr>
       </w:pPr>
       <w:r>
@@ -13510,7 +14127,7 @@
         <w:pStyle w:val="Compact"/>
         <w:numPr>
           <w:ilvl w:val="0"/>
-          <w:numId w:val="1014"/>
+          <w:numId w:val="1017"/>
         </w:numPr>
       </w:pPr>
       <w:r>
@@ -13542,7 +14159,7 @@
         <w:pStyle w:val="Compact"/>
         <w:numPr>
           <w:ilvl w:val="0"/>
-          <w:numId w:val="1014"/>
+          <w:numId w:val="1017"/>
         </w:numPr>
       </w:pPr>
       <w:r>
@@ -13574,7 +14191,7 @@
         <w:pStyle w:val="Compact"/>
         <w:numPr>
           <w:ilvl w:val="0"/>
-          <w:numId w:val="1014"/>
+          <w:numId w:val="1017"/>
         </w:numPr>
       </w:pPr>
       <w:r>
@@ -13606,7 +14223,7 @@
         <w:pStyle w:val="Compact"/>
         <w:numPr>
           <w:ilvl w:val="0"/>
-          <w:numId w:val="1014"/>
+          <w:numId w:val="1017"/>
         </w:numPr>
       </w:pPr>
       <w:r>
@@ -13638,7 +14255,7 @@
         <w:pStyle w:val="Compact"/>
         <w:numPr>
           <w:ilvl w:val="0"/>
-          <w:numId w:val="1014"/>
+          <w:numId w:val="1017"/>
         </w:numPr>
       </w:pPr>
       <w:r>
@@ -13670,7 +14287,7 @@
         <w:pStyle w:val="Compact"/>
         <w:numPr>
           <w:ilvl w:val="0"/>
-          <w:numId w:val="1014"/>
+          <w:numId w:val="1017"/>
         </w:numPr>
       </w:pPr>
       <w:r>
@@ -13702,7 +14319,7 @@
         <w:pStyle w:val="Compact"/>
         <w:numPr>
           <w:ilvl w:val="0"/>
-          <w:numId w:val="1014"/>
+          <w:numId w:val="1017"/>
         </w:numPr>
       </w:pPr>
       <w:r>
@@ -13734,7 +14351,7 @@
         <w:pStyle w:val="Compact"/>
         <w:numPr>
           <w:ilvl w:val="0"/>
-          <w:numId w:val="1014"/>
+          <w:numId w:val="1017"/>
         </w:numPr>
       </w:pPr>
       <w:r>
@@ -13766,7 +14383,7 @@
         <w:pStyle w:val="Compact"/>
         <w:numPr>
           <w:ilvl w:val="0"/>
-          <w:numId w:val="1014"/>
+          <w:numId w:val="1017"/>
         </w:numPr>
       </w:pPr>
       <w:r>
@@ -13798,7 +14415,7 @@
         <w:pStyle w:val="Compact"/>
         <w:numPr>
           <w:ilvl w:val="0"/>
-          <w:numId w:val="1014"/>
+          <w:numId w:val="1017"/>
         </w:numPr>
       </w:pPr>
       <w:r>
@@ -13830,7 +14447,7 @@
         <w:pStyle w:val="Compact"/>
         <w:numPr>
           <w:ilvl w:val="0"/>
-          <w:numId w:val="1014"/>
+          <w:numId w:val="1017"/>
         </w:numPr>
       </w:pPr>
       <w:r>
@@ -13862,7 +14479,7 @@
         <w:pStyle w:val="Compact"/>
         <w:numPr>
           <w:ilvl w:val="0"/>
-          <w:numId w:val="1014"/>
+          <w:numId w:val="1017"/>
         </w:numPr>
       </w:pPr>
       <w:r>
@@ -13894,7 +14511,7 @@
         <w:pStyle w:val="Compact"/>
         <w:numPr>
           <w:ilvl w:val="0"/>
-          <w:numId w:val="1014"/>
+          <w:numId w:val="1017"/>
         </w:numPr>
       </w:pPr>
       <w:r>
@@ -13926,7 +14543,7 @@
         <w:pStyle w:val="Compact"/>
         <w:numPr>
           <w:ilvl w:val="0"/>
-          <w:numId w:val="1014"/>
+          <w:numId w:val="1017"/>
         </w:numPr>
       </w:pPr>
       <w:r>
@@ -13958,7 +14575,7 @@
         <w:pStyle w:val="Compact"/>
         <w:numPr>
           <w:ilvl w:val="0"/>
-          <w:numId w:val="1014"/>
+          <w:numId w:val="1017"/>
         </w:numPr>
       </w:pPr>
       <w:r>
@@ -13990,7 +14607,7 @@
         <w:pStyle w:val="Compact"/>
         <w:numPr>
           <w:ilvl w:val="0"/>
-          <w:numId w:val="1014"/>
+          <w:numId w:val="1017"/>
         </w:numPr>
       </w:pPr>
       <w:r>
@@ -14022,7 +14639,7 @@
         <w:pStyle w:val="Compact"/>
         <w:numPr>
           <w:ilvl w:val="0"/>
-          <w:numId w:val="1014"/>
+          <w:numId w:val="1017"/>
         </w:numPr>
       </w:pPr>
       <w:r>
@@ -14054,7 +14671,7 @@
         <w:pStyle w:val="Compact"/>
         <w:numPr>
           <w:ilvl w:val="0"/>
-          <w:numId w:val="1014"/>
+          <w:numId w:val="1017"/>
         </w:numPr>
       </w:pPr>
       <w:r>
@@ -14086,7 +14703,7 @@
         <w:pStyle w:val="Compact"/>
         <w:numPr>
           <w:ilvl w:val="0"/>
-          <w:numId w:val="1014"/>
+          <w:numId w:val="1017"/>
         </w:numPr>
       </w:pPr>
       <w:r>
@@ -14118,7 +14735,7 @@
         <w:pStyle w:val="Compact"/>
         <w:numPr>
           <w:ilvl w:val="0"/>
-          <w:numId w:val="1014"/>
+          <w:numId w:val="1017"/>
         </w:numPr>
       </w:pPr>
       <w:r>
@@ -14144,7 +14761,7 @@
         <w:pStyle w:val="Compact"/>
         <w:numPr>
           <w:ilvl w:val="0"/>
-          <w:numId w:val="1014"/>
+          <w:numId w:val="1017"/>
         </w:numPr>
       </w:pPr>
       <w:r>
@@ -14176,7 +14793,7 @@
         <w:pStyle w:val="Compact"/>
         <w:numPr>
           <w:ilvl w:val="0"/>
-          <w:numId w:val="1014"/>
+          <w:numId w:val="1017"/>
         </w:numPr>
       </w:pPr>
       <w:r>
@@ -14208,7 +14825,7 @@
         <w:pStyle w:val="Compact"/>
         <w:numPr>
           <w:ilvl w:val="0"/>
-          <w:numId w:val="1014"/>
+          <w:numId w:val="1017"/>
         </w:numPr>
       </w:pPr>
       <w:r>
@@ -14242,8 +14859,8 @@
         </w:pict>
       </w:r>
     </w:p>
-    <w:bookmarkEnd w:id="59"/>
-    <w:bookmarkStart w:id="60" w:name="tool-attribution-colophon"/>
+    <w:bookmarkEnd w:id="71"/>
+    <w:bookmarkStart w:id="72" w:name="tool-attribution-colophon"/>
     <w:p>
       <w:pPr>
         <w:pStyle w:val="Heading2"/>
@@ -14374,8 +14991,8 @@
         <w:t xml:space="preserve">(September 2026) realisiert.</w:t>
       </w:r>
     </w:p>
-    <w:bookmarkEnd w:id="60"/>
-    <w:bookmarkEnd w:id="61"/>
+    <w:bookmarkEnd w:id="72"/>
+    <w:bookmarkEnd w:id="73"/>
     <w:sectPr>
       <w:footnotePr>
         <w:numRestart w:val="eachSect"/>
@@ -15056,6 +15673,15 @@
     <w:abstractNumId w:val="991"/>
   </w:num>
   <w:num w:numId="1014">
+    <w:abstractNumId w:val="991"/>
+  </w:num>
+  <w:num w:numId="1015">
+    <w:abstractNumId w:val="991"/>
+  </w:num>
+  <w:num w:numId="1016">
+    <w:abstractNumId w:val="991"/>
+  </w:num>
+  <w:num w:numId="1017">
     <w:abstractNumId w:val="99411"/>
     <w:lvlOverride w:ilvl="0">
       <w:startOverride w:val="1"/>

</xml_diff>

<commit_message>
Remove raw Python code from back matter, separate every Appendix onto its own page, and expand glossary with philosophical/epistemological terms
</commit_message>
<xml_diff>
--- a/book/build/The_Conative_Integrative_Framework_Book_Thomas_Riebl_DE_6x9.docx
+++ b/book/build/The_Conative_Integrative_Framework_Book_Thomas_Riebl_DE_6x9.docx
@@ -10599,43 +10599,35 @@
     </w:p>
     <w:bookmarkEnd w:id="51"/>
     <w:bookmarkEnd w:id="52"/>
-    <w:bookmarkStart w:id="73" w:name="Xb6253ae800693db45b886bd1c8c9d69bdc31d64"/>
+    <w:bookmarkStart w:id="57" w:name="X5db2487297e34aecf67406e631b8e7c093c2537"/>
     <w:p>
       <w:pPr>
         <w:pStyle w:val="Heading1"/>
       </w:pPr>
       <w:r>
-        <w:t xml:space="preserve">Kapitel 9: Mathematischer Anhang, Quellcode &amp; Bibliographie</w:t>
-      </w:r>
-    </w:p>
-    <w:p>
-      <w:r>
-        <w:pict>
-          <v:rect style="width:0;height:1.5pt" o:hralign="center" o:hrstd="t" o:hr="t"/>
-        </w:pict>
-      </w:r>
-    </w:p>
-    <w:bookmarkStart w:id="57" w:name="anhang-a-mathematische-formalismen"/>
-    <w:p>
-      <w:pPr>
-        <w:pStyle w:val="Heading2"/>
-      </w:pPr>
-      <w:r>
-        <w:t xml:space="preserve">Anhang A: Mathematische Formalismen</w:t>
-      </w:r>
-    </w:p>
-    <w:bookmarkStart w:id="53" w:name="das-pomdp-tupel"/>
+        <w:t xml:space="preserve">Anhang A: Mathematischer Formalismus &amp; Tensorschreibweise</w:t>
+      </w:r>
+    </w:p>
+    <w:bookmarkStart w:id="53" w:name="das-generative-pomdp-modell-1"/>
     <w:p>
       <w:pPr>
         <w:pStyle w:val="Heading3"/>
       </w:pPr>
       <w:r>
-        <w:t xml:space="preserve">1. Das POMDP-Tupel</w:t>
+        <w:t xml:space="preserve">1. Das generative POMDP-Modell</w:t>
       </w:r>
     </w:p>
     <w:p>
       <w:pPr>
         <w:pStyle w:val="FirstParagraph"/>
+      </w:pPr>
+      <w:r>
+        <w:t xml:space="preserve">Der diskrete, partiell beobachtbare Markov-Entscheidungsprozess (POMDP) eines bewussten Alters wird durch folgendes Tupel definiert:</w:t>
+      </w:r>
+    </w:p>
+    <w:p>
+      <w:pPr>
+        <w:pStyle w:val="BodyText"/>
       </w:pPr>
       <m:oMathPara>
         <m:oMathParaPr>
@@ -10759,21 +10751,288 @@
           <w:b/>
           <w:bCs/>
         </w:rPr>
-        <w:t xml:space="preserve">Likelihood:</w:t>
+        <w:t xml:space="preserve">Verborgene Zustände:</w:t>
       </w:r>
       <w:r>
         <w:t xml:space="preserve"> </w:t>
       </w:r>
       <m:oMath>
         <m:r>
+          <m:t>s</m:t>
+        </m:r>
+        <m:r>
+          <m:rPr>
+            <m:sty m:val="p"/>
+          </m:rPr>
+          <m:t>∈</m:t>
+        </m:r>
+        <m:r>
+          <m:rPr>
+            <m:scr m:val="script"/>
+            <m:sty m:val="p"/>
+          </m:rPr>
+          <m:t>S</m:t>
+        </m:r>
+        <m:r>
+          <m:rPr>
+            <m:sty m:val="p"/>
+          </m:rPr>
+          <m:t>=</m:t>
+        </m:r>
+        <m:r>
+          <m:rPr>
+            <m:sty m:val="p"/>
+          </m:rPr>
+          <m:t>{</m:t>
+        </m:r>
+        <m:r>
+          <m:t>1</m:t>
+        </m:r>
+        <m:r>
+          <m:rPr>
+            <m:sty m:val="p"/>
+          </m:rPr>
+          <m:t>,</m:t>
+        </m:r>
+        <m:r>
+          <m:rPr>
+            <m:sty m:val="p"/>
+          </m:rPr>
+          <m:t>…</m:t>
+        </m:r>
+        <m:r>
+          <m:rPr>
+            <m:sty m:val="p"/>
+          </m:rPr>
+          <m:t>,</m:t>
+        </m:r>
+        <m:sSub>
+          <m:e>
+            <m:r>
+              <m:t>N</m:t>
+            </m:r>
+          </m:e>
+          <m:sub>
+            <m:r>
+              <m:t>s</m:t>
+            </m:r>
+          </m:sub>
+        </m:sSub>
+        <m:r>
+          <m:rPr>
+            <m:sty m:val="p"/>
+          </m:rPr>
+          <m:t>}</m:t>
+        </m:r>
+      </m:oMath>
+    </w:p>
+    <w:p>
+      <w:pPr>
+        <w:pStyle w:val="Compact"/>
+        <w:numPr>
+          <w:ilvl w:val="0"/>
+          <w:numId w:val="1012"/>
+        </w:numPr>
+      </w:pPr>
+      <w:r>
+        <w:rPr>
+          <w:b/>
+          <w:bCs/>
+        </w:rPr>
+        <w:t xml:space="preserve">Beobachtungen:</w:t>
+      </w:r>
+      <w:r>
+        <w:t xml:space="preserve"> </w:t>
+      </w:r>
+      <m:oMath>
+        <m:r>
+          <m:t>o</m:t>
+        </m:r>
+        <m:r>
+          <m:rPr>
+            <m:sty m:val="p"/>
+          </m:rPr>
+          <m:t>∈</m:t>
+        </m:r>
+        <m:r>
+          <m:rPr>
+            <m:scr m:val="script"/>
+            <m:sty m:val="p"/>
+          </m:rPr>
+          <m:t>O</m:t>
+        </m:r>
+        <m:r>
+          <m:rPr>
+            <m:sty m:val="p"/>
+          </m:rPr>
+          <m:t>=</m:t>
+        </m:r>
+        <m:r>
+          <m:rPr>
+            <m:sty m:val="p"/>
+          </m:rPr>
+          <m:t>{</m:t>
+        </m:r>
+        <m:r>
+          <m:t>1</m:t>
+        </m:r>
+        <m:r>
+          <m:rPr>
+            <m:sty m:val="p"/>
+          </m:rPr>
+          <m:t>,</m:t>
+        </m:r>
+        <m:r>
+          <m:rPr>
+            <m:sty m:val="p"/>
+          </m:rPr>
+          <m:t>…</m:t>
+        </m:r>
+        <m:r>
+          <m:rPr>
+            <m:sty m:val="p"/>
+          </m:rPr>
+          <m:t>,</m:t>
+        </m:r>
+        <m:sSub>
+          <m:e>
+            <m:r>
+              <m:t>N</m:t>
+            </m:r>
+          </m:e>
+          <m:sub>
+            <m:r>
+              <m:t>o</m:t>
+            </m:r>
+          </m:sub>
+        </m:sSub>
+        <m:r>
+          <m:rPr>
+            <m:sty m:val="p"/>
+          </m:rPr>
+          <m:t>}</m:t>
+        </m:r>
+      </m:oMath>
+    </w:p>
+    <w:p>
+      <w:pPr>
+        <w:pStyle w:val="Compact"/>
+        <w:numPr>
+          <w:ilvl w:val="0"/>
+          <w:numId w:val="1012"/>
+        </w:numPr>
+      </w:pPr>
+      <w:r>
+        <w:rPr>
+          <w:b/>
+          <w:bCs/>
+        </w:rPr>
+        <w:t xml:space="preserve">Handlungen (Politiken):</w:t>
+      </w:r>
+      <w:r>
+        <w:t xml:space="preserve"> </w:t>
+      </w:r>
+      <m:oMath>
+        <m:r>
+          <m:t>u</m:t>
+        </m:r>
+        <m:r>
+          <m:rPr>
+            <m:sty m:val="p"/>
+          </m:rPr>
+          <m:t>∈</m:t>
+        </m:r>
+        <m:r>
+          <m:rPr>
+            <m:scr m:val="script"/>
+            <m:sty m:val="p"/>
+          </m:rPr>
+          <m:t>U</m:t>
+        </m:r>
+        <m:r>
+          <m:rPr>
+            <m:sty m:val="p"/>
+          </m:rPr>
+          <m:t>=</m:t>
+        </m:r>
+        <m:r>
+          <m:rPr>
+            <m:sty m:val="p"/>
+          </m:rPr>
+          <m:t>{</m:t>
+        </m:r>
+        <m:r>
+          <m:t>1</m:t>
+        </m:r>
+        <m:r>
+          <m:rPr>
+            <m:sty m:val="p"/>
+          </m:rPr>
+          <m:t>,</m:t>
+        </m:r>
+        <m:r>
+          <m:rPr>
+            <m:sty m:val="p"/>
+          </m:rPr>
+          <m:t>…</m:t>
+        </m:r>
+        <m:r>
+          <m:rPr>
+            <m:sty m:val="p"/>
+          </m:rPr>
+          <m:t>,</m:t>
+        </m:r>
+        <m:sSub>
+          <m:e>
+            <m:r>
+              <m:t>N</m:t>
+            </m:r>
+          </m:e>
+          <m:sub>
+            <m:r>
+              <m:t>u</m:t>
+            </m:r>
+          </m:sub>
+        </m:sSub>
+        <m:r>
+          <m:rPr>
+            <m:sty m:val="p"/>
+          </m:rPr>
+          <m:t>}</m:t>
+        </m:r>
+      </m:oMath>
+    </w:p>
+    <w:p>
+      <w:pPr>
+        <w:pStyle w:val="Compact"/>
+        <w:numPr>
+          <w:ilvl w:val="0"/>
+          <w:numId w:val="1012"/>
+        </w:numPr>
+      </w:pPr>
+      <w:r>
+        <w:rPr>
+          <w:b/>
+          <w:bCs/>
+        </w:rPr>
+        <w:t xml:space="preserve">Likelihood-Matrix (</w:t>
+      </w:r>
+      <m:oMath>
+        <m:r>
           <m:t>A</m:t>
         </m:r>
-        <m:r>
-          <m:rPr>
-            <m:sty m:val="p"/>
-          </m:rPr>
-          <m:t>=</m:t>
-        </m:r>
+      </m:oMath>
+      <w:r>
+        <w:rPr>
+          <w:b/>
+          <w:bCs/>
+        </w:rPr>
+        <w:t xml:space="preserve">):</w:t>
+      </w:r>
+      <w:r>
+        <w:t xml:space="preserve"> </w:t>
+      </w:r>
+      <m:oMath>
         <m:r>
           <m:t>P</m:t>
         </m:r>
@@ -10818,6 +11077,15 @@
             <m:sty m:val="p"/>
           </m:rPr>
           <m:t>)</m:t>
+        </m:r>
+        <m:r>
+          <m:rPr>
+            <m:sty m:val="p"/>
+          </m:rPr>
+          <m:t>=</m:t>
+        </m:r>
+        <m:r>
+          <m:t>A</m:t>
         </m:r>
         <m:r>
           <m:rPr>
@@ -10869,6 +11137,67 @@
           </m:sup>
         </m:sSup>
       </m:oMath>
+      <w:r>
+        <w:t xml:space="preserve">, mit</w:t>
+      </w:r>
+      <w:r>
+        <w:t xml:space="preserve"> </w:t>
+      </w:r>
+      <m:oMath>
+        <m:nary>
+          <m:naryPr>
+            <m:chr m:val="∑"/>
+            <m:limLoc m:val="undOvr"/>
+            <m:subHide m:val="off"/>
+            <m:supHide m:val="on"/>
+          </m:naryPr>
+          <m:sub>
+            <m:r>
+              <m:t>j</m:t>
+            </m:r>
+          </m:sub>
+          <m:sup>
+            <m:r>
+              <m:t>​</m:t>
+            </m:r>
+          </m:sup>
+          <m:e>
+            <m:sSub>
+              <m:e>
+                <m:r>
+                  <m:t>A</m:t>
+                </m:r>
+              </m:e>
+              <m:sub>
+                <m:r>
+                  <m:t>j</m:t>
+                </m:r>
+                <m:r>
+                  <m:rPr>
+                    <m:sty m:val="p"/>
+                  </m:rPr>
+                  <m:t>,</m:t>
+                </m:r>
+                <m:r>
+                  <m:t>k</m:t>
+                </m:r>
+              </m:sub>
+            </m:sSub>
+          </m:e>
+        </m:nary>
+        <m:r>
+          <m:rPr>
+            <m:sty m:val="p"/>
+          </m:rPr>
+          <m:t>=</m:t>
+        </m:r>
+        <m:r>
+          <m:t>1</m:t>
+        </m:r>
+      </m:oMath>
+      <w:r>
+        <w:t xml:space="preserve">.</w:t>
+      </w:r>
     </w:p>
     <w:p>
       <w:pPr>
@@ -10883,21 +11212,24 @@
           <w:b/>
           <w:bCs/>
         </w:rPr>
-        <w:t xml:space="preserve">Übergangstensor:</w:t>
-      </w:r>
-      <w:r>
-        <w:t xml:space="preserve"> </w:t>
+        <w:t xml:space="preserve">Übergangstensor (</w:t>
       </w:r>
       <m:oMath>
         <m:r>
           <m:t>B</m:t>
         </m:r>
-        <m:r>
-          <m:rPr>
-            <m:sty m:val="p"/>
-          </m:rPr>
-          <m:t>=</m:t>
-        </m:r>
+      </m:oMath>
+      <w:r>
+        <w:rPr>
+          <w:b/>
+          <w:bCs/>
+        </w:rPr>
+        <w:t xml:space="preserve">):</w:t>
+      </w:r>
+      <w:r>
+        <w:t xml:space="preserve"> </w:t>
+      </w:r>
+      <m:oMath>
         <m:r>
           <m:t>P</m:t>
         </m:r>
@@ -10969,6 +11301,15 @@
             <m:sty m:val="p"/>
           </m:rPr>
           <m:t>)</m:t>
+        </m:r>
+        <m:r>
+          <m:rPr>
+            <m:sty m:val="p"/>
+          </m:rPr>
+          <m:t>=</m:t>
+        </m:r>
+        <m:r>
+          <m:t>B</m:t>
         </m:r>
         <m:r>
           <m:rPr>
@@ -11038,6 +11379,76 @@
           </m:sup>
         </m:sSup>
       </m:oMath>
+      <w:r>
+        <w:t xml:space="preserve">, mit</w:t>
+      </w:r>
+      <w:r>
+        <w:t xml:space="preserve"> </w:t>
+      </w:r>
+      <m:oMath>
+        <m:nary>
+          <m:naryPr>
+            <m:chr m:val="∑"/>
+            <m:limLoc m:val="undOvr"/>
+            <m:subHide m:val="off"/>
+            <m:supHide m:val="on"/>
+          </m:naryPr>
+          <m:sub>
+            <m:r>
+              <m:t>i</m:t>
+            </m:r>
+          </m:sub>
+          <m:sup>
+            <m:r>
+              <m:t>​</m:t>
+            </m:r>
+          </m:sup>
+          <m:e>
+            <m:sSub>
+              <m:e>
+                <m:r>
+                  <m:t>B</m:t>
+                </m:r>
+              </m:e>
+              <m:sub>
+                <m:r>
+                  <m:t>i</m:t>
+                </m:r>
+                <m:r>
+                  <m:rPr>
+                    <m:sty m:val="p"/>
+                  </m:rPr>
+                  <m:t>,</m:t>
+                </m:r>
+                <m:r>
+                  <m:t>j</m:t>
+                </m:r>
+                <m:r>
+                  <m:rPr>
+                    <m:sty m:val="p"/>
+                  </m:rPr>
+                  <m:t>,</m:t>
+                </m:r>
+                <m:r>
+                  <m:t>u</m:t>
+                </m:r>
+              </m:sub>
+            </m:sSub>
+          </m:e>
+        </m:nary>
+        <m:r>
+          <m:rPr>
+            <m:sty m:val="p"/>
+          </m:rPr>
+          <m:t>=</m:t>
+        </m:r>
+        <m:r>
+          <m:t>1</m:t>
+        </m:r>
+      </m:oMath>
+      <w:r>
+        <w:t xml:space="preserve">.</w:t>
+      </w:r>
     </w:p>
     <w:p>
       <w:pPr>
@@ -11052,15 +11463,48 @@
           <w:b/>
           <w:bCs/>
         </w:rPr>
-        <w:t xml:space="preserve">Präferenzen:</w:t>
-      </w:r>
-      <w:r>
-        <w:t xml:space="preserve"> </w:t>
+        <w:t xml:space="preserve">Angeborene Präferenzen (</w:t>
       </w:r>
       <m:oMath>
         <m:r>
           <m:t>C</m:t>
         </m:r>
+      </m:oMath>
+      <w:r>
+        <w:rPr>
+          <w:b/>
+          <w:bCs/>
+        </w:rPr>
+        <w:t xml:space="preserve">):</w:t>
+      </w:r>
+      <w:r>
+        <w:t xml:space="preserve"> </w:t>
+      </w:r>
+      <m:oMath>
+        <m:r>
+          <m:rPr>
+            <m:sty m:val="p"/>
+          </m:rPr>
+          <m:t>ln</m:t>
+        </m:r>
+        <m:r>
+          <m:t>P</m:t>
+        </m:r>
+        <m:r>
+          <m:rPr>
+            <m:sty m:val="p"/>
+          </m:rPr>
+          <m:t>(</m:t>
+        </m:r>
+        <m:r>
+          <m:t>o</m:t>
+        </m:r>
+        <m:r>
+          <m:rPr>
+            <m:sty m:val="p"/>
+          </m:rPr>
+          <m:t>)</m:t>
+        </m:r>
         <m:r>
           <m:rPr>
             <m:sty m:val="p"/>
@@ -11068,28 +11512,7 @@
           <m:t>=</m:t>
         </m:r>
         <m:r>
-          <m:rPr>
-            <m:sty m:val="p"/>
-          </m:rPr>
-          <m:t>ln</m:t>
-        </m:r>
-        <m:r>
-          <m:t>P</m:t>
-        </m:r>
-        <m:r>
-          <m:rPr>
-            <m:sty m:val="p"/>
-          </m:rPr>
-          <m:t>(</m:t>
-        </m:r>
-        <m:r>
-          <m:t>o</m:t>
-        </m:r>
-        <m:r>
-          <m:rPr>
-            <m:sty m:val="p"/>
-          </m:rPr>
-          <m:t>)</m:t>
+          <m:t>C</m:t>
         </m:r>
         <m:r>
           <m:rPr>
@@ -11123,6 +11546,9 @@
           </m:sup>
         </m:sSup>
       </m:oMath>
+      <w:r>
+        <w:t xml:space="preserve">.</w:t>
+      </w:r>
     </w:p>
     <w:p>
       <w:pPr>
@@ -11137,21 +11563,24 @@
           <w:b/>
           <w:bCs/>
         </w:rPr>
-        <w:t xml:space="preserve">Startverteilung:</w:t>
-      </w:r>
-      <w:r>
-        <w:t xml:space="preserve"> </w:t>
+        <w:t xml:space="preserve">Startzustand-Prior (</w:t>
       </w:r>
       <m:oMath>
         <m:r>
           <m:t>D</m:t>
         </m:r>
-        <m:r>
-          <m:rPr>
-            <m:sty m:val="p"/>
-          </m:rPr>
-          <m:t>=</m:t>
-        </m:r>
+      </m:oMath>
+      <w:r>
+        <w:rPr>
+          <w:b/>
+          <w:bCs/>
+        </w:rPr>
+        <w:t xml:space="preserve">):</w:t>
+      </w:r>
+      <w:r>
+        <w:t xml:space="preserve"> </w:t>
+      </w:r>
+      <m:oMath>
         <m:r>
           <m:t>P</m:t>
         </m:r>
@@ -11178,6 +11607,15 @@
             <m:sty m:val="p"/>
           </m:rPr>
           <m:t>)</m:t>
+        </m:r>
+        <m:r>
+          <m:rPr>
+            <m:sty m:val="p"/>
+          </m:rPr>
+          <m:t>=</m:t>
+        </m:r>
+        <m:r>
+          <m:t>D</m:t>
         </m:r>
         <m:r>
           <m:rPr>
@@ -11211,20 +11649,189 @@
           </m:sup>
         </m:sSup>
       </m:oMath>
+      <w:r>
+        <w:t xml:space="preserve">, mit</w:t>
+      </w:r>
+      <w:r>
+        <w:t xml:space="preserve"> </w:t>
+      </w:r>
+      <m:oMath>
+        <m:nary>
+          <m:naryPr>
+            <m:chr m:val="∑"/>
+            <m:limLoc m:val="undOvr"/>
+            <m:subHide m:val="off"/>
+            <m:supHide m:val="on"/>
+          </m:naryPr>
+          <m:sub>
+            <m:r>
+              <m:t>k</m:t>
+            </m:r>
+          </m:sub>
+          <m:sup>
+            <m:r>
+              <m:t>​</m:t>
+            </m:r>
+          </m:sup>
+          <m:e>
+            <m:sSub>
+              <m:e>
+                <m:r>
+                  <m:t>D</m:t>
+                </m:r>
+              </m:e>
+              <m:sub>
+                <m:r>
+                  <m:t>k</m:t>
+                </m:r>
+              </m:sub>
+            </m:sSub>
+          </m:e>
+        </m:nary>
+        <m:r>
+          <m:rPr>
+            <m:sty m:val="p"/>
+          </m:rPr>
+          <m:t>=</m:t>
+        </m:r>
+        <m:r>
+          <m:t>1</m:t>
+        </m:r>
+      </m:oMath>
+      <w:r>
+        <w:t xml:space="preserve">.</w:t>
+      </w:r>
+    </w:p>
+    <w:p>
+      <w:pPr>
+        <w:pStyle w:val="Compact"/>
+        <w:numPr>
+          <w:ilvl w:val="0"/>
+          <w:numId w:val="1012"/>
+        </w:numPr>
+      </w:pPr>
+      <w:r>
+        <w:rPr>
+          <w:b/>
+          <w:bCs/>
+        </w:rPr>
+        <w:t xml:space="preserve">Handlungspräzision (</w:t>
+      </w:r>
+      <m:oMath>
+        <m:r>
+          <m:t>γ</m:t>
+        </m:r>
+      </m:oMath>
+      <w:r>
+        <w:rPr>
+          <w:b/>
+          <w:bCs/>
+        </w:rPr>
+        <w:t xml:space="preserve">):</w:t>
+      </w:r>
+      <w:r>
+        <w:t xml:space="preserve"> </w:t>
+      </w:r>
+      <w:r>
+        <w:t xml:space="preserve">Inverse Temperatur zur Steuerung der Entscheidungssicherheit.</w:t>
+      </w:r>
     </w:p>
     <w:bookmarkEnd w:id="53"/>
-    <w:bookmarkStart w:id="54" w:name="zustandsschätzung-perzeptuelle-inferenz"/>
+    <w:bookmarkStart w:id="54" w:name="X81cdc417af672b0a18494ff2fc782d33d60a7a8"/>
     <w:p>
       <w:pPr>
         <w:pStyle w:val="Heading3"/>
       </w:pPr>
       <w:r>
-        <w:t xml:space="preserve">2. Zustandsschätzung (Perzeptuelle Inferenz)</w:t>
+        <w:t xml:space="preserve">2. Variationale Zustandsschätzung (Wahrnehmung)</w:t>
       </w:r>
     </w:p>
     <w:p>
       <w:pPr>
         <w:pStyle w:val="FirstParagraph"/>
+      </w:pPr>
+      <w:r>
+        <w:t xml:space="preserve">Zum Zeitschritt</w:t>
+      </w:r>
+      <w:r>
+        <w:t xml:space="preserve"> </w:t>
+      </w:r>
+      <m:oMath>
+        <m:r>
+          <m:t>t</m:t>
+        </m:r>
+      </m:oMath>
+      <w:r>
+        <w:t xml:space="preserve"> </w:t>
+      </w:r>
+      <w:r>
+        <w:t xml:space="preserve">wird nach Eingang der Beobachtung</w:t>
+      </w:r>
+      <w:r>
+        <w:t xml:space="preserve"> </w:t>
+      </w:r>
+      <m:oMath>
+        <m:sSub>
+          <m:e>
+            <m:r>
+              <m:t>o</m:t>
+            </m:r>
+          </m:e>
+          <m:sub>
+            <m:r>
+              <m:t>t</m:t>
+            </m:r>
+          </m:sub>
+        </m:sSub>
+      </m:oMath>
+      <w:r>
+        <w:t xml:space="preserve"> </w:t>
+      </w:r>
+      <w:r>
+        <w:t xml:space="preserve">die Posterior-Verteilung</w:t>
+      </w:r>
+      <w:r>
+        <w:t xml:space="preserve"> </w:t>
+      </w:r>
+      <m:oMath>
+        <m:r>
+          <m:t>q</m:t>
+        </m:r>
+        <m:r>
+          <m:rPr>
+            <m:sty m:val="p"/>
+          </m:rPr>
+          <m:t>(</m:t>
+        </m:r>
+        <m:sSub>
+          <m:e>
+            <m:r>
+              <m:t>s</m:t>
+            </m:r>
+          </m:e>
+          <m:sub>
+            <m:r>
+              <m:t>t</m:t>
+            </m:r>
+          </m:sub>
+        </m:sSub>
+        <m:r>
+          <m:rPr>
+            <m:sty m:val="p"/>
+          </m:rPr>
+          <m:t>)</m:t>
+        </m:r>
+      </m:oMath>
+      <w:r>
+        <w:t xml:space="preserve"> </w:t>
+      </w:r>
+      <w:r>
+        <w:t xml:space="preserve">im Log-Raum per Softmax aktualisiert:</w:t>
+      </w:r>
+    </w:p>
+    <w:p>
+      <w:pPr>
+        <w:pStyle w:val="BodyText"/>
       </w:pPr>
       <m:oMathPara>
         <m:oMathParaPr>
@@ -11419,8 +12026,149 @@
         </m:oMath>
       </m:oMathPara>
     </w:p>
+    <w:p>
+      <w:pPr>
+        <w:pStyle w:val="FirstParagraph"/>
+      </w:pPr>
+      <w:r>
+        <w:t xml:space="preserve">Wobei</w:t>
+      </w:r>
+      <w:r>
+        <w:t xml:space="preserve"> </w:t>
+      </w:r>
+      <m:oMath>
+        <m:r>
+          <m:t>σ</m:t>
+        </m:r>
+        <m:r>
+          <m:rPr>
+            <m:sty m:val="p"/>
+          </m:rPr>
+          <m:t>(</m:t>
+        </m:r>
+        <m:r>
+          <m:t>x</m:t>
+        </m:r>
+        <m:sSub>
+          <m:e>
+            <m:r>
+              <m:rPr>
+                <m:sty m:val="p"/>
+              </m:rPr>
+              <m:t>)</m:t>
+            </m:r>
+          </m:e>
+          <m:sub>
+            <m:r>
+              <m:t>i</m:t>
+            </m:r>
+          </m:sub>
+        </m:sSub>
+        <m:r>
+          <m:rPr>
+            <m:sty m:val="p"/>
+          </m:rPr>
+          <m:t>=</m:t>
+        </m:r>
+        <m:f>
+          <m:fPr>
+            <m:type m:val="bar"/>
+          </m:fPr>
+          <m:num>
+            <m:r>
+              <m:rPr>
+                <m:sty m:val="p"/>
+              </m:rPr>
+              <m:t>exp</m:t>
+            </m:r>
+            <m:r>
+              <m:rPr>
+                <m:sty m:val="p"/>
+              </m:rPr>
+              <m:t>(</m:t>
+            </m:r>
+            <m:sSub>
+              <m:e>
+                <m:r>
+                  <m:t>x</m:t>
+                </m:r>
+              </m:e>
+              <m:sub>
+                <m:r>
+                  <m:t>i</m:t>
+                </m:r>
+              </m:sub>
+            </m:sSub>
+            <m:r>
+              <m:rPr>
+                <m:sty m:val="p"/>
+              </m:rPr>
+              <m:t>)</m:t>
+            </m:r>
+          </m:num>
+          <m:den>
+            <m:nary>
+              <m:naryPr>
+                <m:chr m:val="∑"/>
+                <m:limLoc m:val="undOvr"/>
+                <m:subHide m:val="off"/>
+                <m:supHide m:val="on"/>
+              </m:naryPr>
+              <m:sub>
+                <m:r>
+                  <m:t>j</m:t>
+                </m:r>
+              </m:sub>
+              <m:sup>
+                <m:r>
+                  <m:t>​</m:t>
+                </m:r>
+              </m:sup>
+              <m:e>
+                <m:r>
+                  <m:rPr>
+                    <m:sty m:val="p"/>
+                  </m:rPr>
+                  <m:t>exp</m:t>
+                </m:r>
+              </m:e>
+            </m:nary>
+            <m:r>
+              <m:rPr>
+                <m:sty m:val="p"/>
+              </m:rPr>
+              <m:t>(</m:t>
+            </m:r>
+            <m:sSub>
+              <m:e>
+                <m:r>
+                  <m:t>x</m:t>
+                </m:r>
+              </m:e>
+              <m:sub>
+                <m:r>
+                  <m:t>j</m:t>
+                </m:r>
+              </m:sub>
+            </m:sSub>
+            <m:r>
+              <m:rPr>
+                <m:sty m:val="p"/>
+              </m:rPr>
+              <m:t>)</m:t>
+            </m:r>
+          </m:den>
+        </m:f>
+      </m:oMath>
+      <w:r>
+        <w:t xml:space="preserve"> </w:t>
+      </w:r>
+      <w:r>
+        <w:t xml:space="preserve">die Softmax-Funktion darstellt.</w:t>
+      </w:r>
+    </w:p>
     <w:bookmarkEnd w:id="54"/>
-    <w:bookmarkStart w:id="55" w:name="X6dd83cadc39ed38ff9054e5083a54116c08091a"/>
+    <w:bookmarkStart w:id="55" w:name="X20fafcb5af4d05bbf019617b29eab6d151e67ab"/>
     <w:p>
       <w:pPr>
         <w:pStyle w:val="Heading3"/>
@@ -11437,7 +12185,7 @@
         </m:r>
       </m:oMath>
       <w:r>
-        <w:t xml:space="preserve">) über Horizont</w:t>
+        <w:t xml:space="preserve">) über Planungshorizont</w:t>
       </w:r>
       <w:r>
         <w:t xml:space="preserve"> </w:t>
@@ -11451,6 +12199,130 @@
     <w:p>
       <w:pPr>
         <w:pStyle w:val="FirstParagraph"/>
+      </w:pPr>
+      <w:r>
+        <w:t xml:space="preserve">Für eine Handlungsfolge</w:t>
+      </w:r>
+      <w:r>
+        <w:t xml:space="preserve"> </w:t>
+      </w:r>
+      <m:oMath>
+        <m:r>
+          <m:t>π</m:t>
+        </m:r>
+        <m:r>
+          <m:rPr>
+            <m:sty m:val="p"/>
+          </m:rPr>
+          <m:t>=</m:t>
+        </m:r>
+        <m:r>
+          <m:rPr>
+            <m:sty m:val="p"/>
+          </m:rPr>
+          <m:t>(</m:t>
+        </m:r>
+        <m:sSub>
+          <m:e>
+            <m:r>
+              <m:t>u</m:t>
+            </m:r>
+          </m:e>
+          <m:sub>
+            <m:r>
+              <m:t>t</m:t>
+            </m:r>
+          </m:sub>
+        </m:sSub>
+        <m:r>
+          <m:rPr>
+            <m:sty m:val="p"/>
+          </m:rPr>
+          <m:t>,</m:t>
+        </m:r>
+        <m:sSub>
+          <m:e>
+            <m:r>
+              <m:t>u</m:t>
+            </m:r>
+          </m:e>
+          <m:sub>
+            <m:r>
+              <m:t>t</m:t>
+            </m:r>
+            <m:r>
+              <m:rPr>
+                <m:sty m:val="p"/>
+              </m:rPr>
+              <m:t>+</m:t>
+            </m:r>
+            <m:r>
+              <m:t>1</m:t>
+            </m:r>
+          </m:sub>
+        </m:sSub>
+        <m:r>
+          <m:rPr>
+            <m:sty m:val="p"/>
+          </m:rPr>
+          <m:t>,</m:t>
+        </m:r>
+        <m:r>
+          <m:rPr>
+            <m:sty m:val="p"/>
+          </m:rPr>
+          <m:t>…</m:t>
+        </m:r>
+        <m:r>
+          <m:rPr>
+            <m:sty m:val="p"/>
+          </m:rPr>
+          <m:t>,</m:t>
+        </m:r>
+        <m:sSub>
+          <m:e>
+            <m:r>
+              <m:t>u</m:t>
+            </m:r>
+          </m:e>
+          <m:sub>
+            <m:r>
+              <m:t>t</m:t>
+            </m:r>
+            <m:r>
+              <m:rPr>
+                <m:sty m:val="p"/>
+              </m:rPr>
+              <m:t>+</m:t>
+            </m:r>
+            <m:r>
+              <m:t>H</m:t>
+            </m:r>
+            <m:r>
+              <m:rPr>
+                <m:sty m:val="p"/>
+              </m:rPr>
+              <m:t>−</m:t>
+            </m:r>
+            <m:r>
+              <m:t>1</m:t>
+            </m:r>
+          </m:sub>
+        </m:sSub>
+        <m:r>
+          <m:rPr>
+            <m:sty m:val="p"/>
+          </m:rPr>
+          <m:t>)</m:t>
+        </m:r>
+      </m:oMath>
+      <w:r>
+        <w:t xml:space="preserve">:</w:t>
+      </w:r>
+    </w:p>
+    <w:p>
+      <w:pPr>
+        <w:pStyle w:val="BodyText"/>
       </w:pPr>
       <m:oMathPara>
         <m:oMathParaPr>
@@ -11636,272 +12508,234 @@
             </m:rPr>
             <m:t>=</m:t>
           </m:r>
-          <m:nary>
-            <m:naryPr>
-              <m:chr m:val="∑"/>
-              <m:limLoc m:val="undOvr"/>
-              <m:subHide m:val="off"/>
-              <m:supHide m:val="on"/>
-            </m:naryPr>
-            <m:sub>
-              <m:sSub>
+          <m:limLow>
+            <m:e>
+              <m:limLow>
                 <m:e>
-                  <m:r>
-                    <m:t>o</m:t>
-                  </m:r>
-                </m:e>
-                <m:sub>
-                  <m:r>
-                    <m:t>τ</m:t>
-                  </m:r>
-                </m:sub>
-              </m:sSub>
-            </m:sub>
-            <m:sup>
-              <m:r>
-                <m:t>​</m:t>
-              </m:r>
-            </m:sup>
-            <m:e>
-              <m:r>
-                <m:t>Q</m:t>
-              </m:r>
-            </m:e>
-          </m:nary>
-          <m:r>
-            <m:rPr>
-              <m:sty m:val="p"/>
-            </m:rPr>
-            <m:t>(</m:t>
-          </m:r>
-          <m:sSub>
-            <m:e>
-              <m:r>
-                <m:t>o</m:t>
-              </m:r>
-            </m:e>
-            <m:sub>
-              <m:r>
-                <m:t>τ</m:t>
-              </m:r>
-            </m:sub>
-          </m:sSub>
-          <m:r>
-            <m:rPr>
-              <m:sty m:val="p"/>
-            </m:rPr>
-            <m:t>∣</m:t>
-          </m:r>
-          <m:r>
-            <m:t>π</m:t>
-          </m:r>
-          <m:r>
-            <m:rPr>
-              <m:sty m:val="p"/>
-            </m:rPr>
-            <m:t>)</m:t>
-          </m:r>
-          <m:r>
-            <m:rPr>
-              <m:sty m:val="p"/>
-            </m:rPr>
-            <m:t>⋅</m:t>
-          </m:r>
-          <m:d>
-            <m:dPr>
-              <m:begChr m:val="("/>
-              <m:sepChr m:val=""/>
-              <m:endChr m:val=")"/>
-              <m:grow/>
-            </m:dPr>
-            <m:e>
-              <m:r>
-                <m:rPr>
-                  <m:sty m:val="p"/>
-                </m:rPr>
-                <m:t>ln</m:t>
-              </m:r>
-              <m:r>
-                <m:t>Q</m:t>
-              </m:r>
-              <m:r>
-                <m:rPr>
-                  <m:sty m:val="p"/>
-                </m:rPr>
-                <m:t>(</m:t>
-              </m:r>
-              <m:sSub>
-                <m:e>
-                  <m:r>
-                    <m:t>o</m:t>
-                  </m:r>
-                </m:e>
-                <m:sub>
-                  <m:r>
-                    <m:t>τ</m:t>
-                  </m:r>
-                </m:sub>
-              </m:sSub>
-              <m:r>
-                <m:rPr>
-                  <m:sty m:val="p"/>
-                </m:rPr>
-                <m:t>∣</m:t>
-              </m:r>
-              <m:r>
-                <m:t>π</m:t>
-              </m:r>
-              <m:r>
-                <m:rPr>
-                  <m:sty m:val="p"/>
-                </m:rPr>
-                <m:t>)</m:t>
-              </m:r>
-              <m:r>
-                <m:rPr>
-                  <m:sty m:val="p"/>
-                </m:rPr>
-                <m:t>−</m:t>
-              </m:r>
-              <m:r>
-                <m:t>C</m:t>
-              </m:r>
-              <m:r>
-                <m:rPr>
-                  <m:sty m:val="p"/>
-                </m:rPr>
-                <m:t>(</m:t>
-              </m:r>
-              <m:sSub>
-                <m:e>
-                  <m:r>
-                    <m:t>o</m:t>
-                  </m:r>
-                </m:e>
-                <m:sub>
-                  <m:r>
-                    <m:t>τ</m:t>
-                  </m:r>
-                </m:sub>
-              </m:sSub>
-              <m:r>
-                <m:rPr>
-                  <m:sty m:val="p"/>
-                </m:rPr>
-                <m:t>)</m:t>
-              </m:r>
-            </m:e>
-          </m:d>
-          <m:r>
-            <m:rPr>
-              <m:sty m:val="p"/>
-            </m:rPr>
-            <m:t>+</m:t>
-          </m:r>
-          <m:nary>
-            <m:naryPr>
-              <m:chr m:val="∑"/>
-              <m:limLoc m:val="undOvr"/>
-              <m:subHide m:val="off"/>
-              <m:supHide m:val="on"/>
-            </m:naryPr>
-            <m:sub>
-              <m:sSub>
-                <m:e>
-                  <m:r>
-                    <m:t>s</m:t>
-                  </m:r>
-                </m:e>
-                <m:sub>
-                  <m:r>
-                    <m:t>τ</m:t>
-                  </m:r>
-                </m:sub>
-              </m:sSub>
-            </m:sub>
-            <m:sup>
-              <m:r>
-                <m:t>​</m:t>
-              </m:r>
-            </m:sup>
-            <m:e>
-              <m:r>
-                <m:t>Q</m:t>
-              </m:r>
-            </m:e>
-          </m:nary>
-          <m:r>
-            <m:rPr>
-              <m:sty m:val="p"/>
-            </m:rPr>
-            <m:t>(</m:t>
-          </m:r>
-          <m:sSub>
-            <m:e>
-              <m:r>
-                <m:t>s</m:t>
-              </m:r>
-            </m:e>
-            <m:sub>
-              <m:r>
-                <m:t>τ</m:t>
-              </m:r>
-            </m:sub>
-          </m:sSub>
-          <m:r>
-            <m:rPr>
-              <m:sty m:val="p"/>
-            </m:rPr>
-            <m:t>∣</m:t>
-          </m:r>
-          <m:r>
-            <m:t>π</m:t>
-          </m:r>
-          <m:r>
-            <m:rPr>
-              <m:sty m:val="p"/>
-            </m:rPr>
-            <m:t>)</m:t>
-          </m:r>
-          <m:r>
-            <m:rPr>
-              <m:sty m:val="p"/>
-            </m:rPr>
-            <m:t>⋅</m:t>
-          </m:r>
-          <m:r>
-            <m:rPr>
-              <m:scr m:val="script"/>
-              <m:sty m:val="p"/>
-            </m:rPr>
-            <m:t>H</m:t>
-          </m:r>
-          <m:d>
-            <m:dPr>
-              <m:begChr m:val="("/>
-              <m:sepChr m:val=""/>
-              <m:endChr m:val=")"/>
-              <m:grow/>
-            </m:dPr>
-            <m:e>
-              <m:sSub>
-                <m:e>
-                  <m:r>
-                    <m:t>A</m:t>
-                  </m:r>
-                </m:e>
-                <m:sub>
+                  <m:nary>
+                    <m:naryPr>
+                      <m:chr m:val="∑"/>
+                      <m:limLoc m:val="undOvr"/>
+                      <m:subHide m:val="off"/>
+                      <m:supHide m:val="on"/>
+                    </m:naryPr>
+                    <m:sub>
+                      <m:sSub>
+                        <m:e>
+                          <m:r>
+                            <m:t>o</m:t>
+                          </m:r>
+                        </m:e>
+                        <m:sub>
+                          <m:r>
+                            <m:t>τ</m:t>
+                          </m:r>
+                        </m:sub>
+                      </m:sSub>
+                    </m:sub>
+                    <m:sup>
+                      <m:r>
+                        <m:t>​</m:t>
+                      </m:r>
+                    </m:sup>
+                    <m:e>
+                      <m:r>
+                        <m:t>Q</m:t>
+                      </m:r>
+                    </m:e>
+                  </m:nary>
                   <m:r>
                     <m:rPr>
                       <m:sty m:val="p"/>
                     </m:rPr>
-                    <m:t>:</m:t>
+                    <m:t>(</m:t>
+                  </m:r>
+                  <m:sSub>
+                    <m:e>
+                      <m:r>
+                        <m:t>o</m:t>
+                      </m:r>
+                    </m:e>
+                    <m:sub>
+                      <m:r>
+                        <m:t>τ</m:t>
+                      </m:r>
+                    </m:sub>
+                  </m:sSub>
+                  <m:r>
+                    <m:rPr>
+                      <m:sty m:val="p"/>
+                    </m:rPr>
+                    <m:t>∣</m:t>
+                  </m:r>
+                  <m:r>
+                    <m:t>π</m:t>
                   </m:r>
                   <m:r>
                     <m:rPr>
                       <m:sty m:val="p"/>
                     </m:rPr>
-                    <m:t>,</m:t>
+                    <m:t>)</m:t>
+                  </m:r>
+                  <m:r>
+                    <m:rPr>
+                      <m:sty m:val="p"/>
+                    </m:rPr>
+                    <m:t>⋅</m:t>
+                  </m:r>
+                  <m:d>
+                    <m:dPr>
+                      <m:begChr m:val="("/>
+                      <m:sepChr m:val=""/>
+                      <m:endChr m:val=")"/>
+                      <m:grow/>
+                    </m:dPr>
+                    <m:e>
+                      <m:r>
+                        <m:rPr>
+                          <m:sty m:val="p"/>
+                        </m:rPr>
+                        <m:t>ln</m:t>
+                      </m:r>
+                      <m:r>
+                        <m:t>Q</m:t>
+                      </m:r>
+                      <m:r>
+                        <m:rPr>
+                          <m:sty m:val="p"/>
+                        </m:rPr>
+                        <m:t>(</m:t>
+                      </m:r>
+                      <m:sSub>
+                        <m:e>
+                          <m:r>
+                            <m:t>o</m:t>
+                          </m:r>
+                        </m:e>
+                        <m:sub>
+                          <m:r>
+                            <m:t>τ</m:t>
+                          </m:r>
+                        </m:sub>
+                      </m:sSub>
+                      <m:r>
+                        <m:rPr>
+                          <m:sty m:val="p"/>
+                        </m:rPr>
+                        <m:t>∣</m:t>
+                      </m:r>
+                      <m:r>
+                        <m:t>π</m:t>
+                      </m:r>
+                      <m:r>
+                        <m:rPr>
+                          <m:sty m:val="p"/>
+                        </m:rPr>
+                        <m:t>)</m:t>
+                      </m:r>
+                      <m:r>
+                        <m:rPr>
+                          <m:sty m:val="p"/>
+                        </m:rPr>
+                        <m:t>−</m:t>
+                      </m:r>
+                      <m:r>
+                        <m:t>C</m:t>
+                      </m:r>
+                      <m:r>
+                        <m:rPr>
+                          <m:sty m:val="p"/>
+                        </m:rPr>
+                        <m:t>(</m:t>
+                      </m:r>
+                      <m:sSub>
+                        <m:e>
+                          <m:r>
+                            <m:t>o</m:t>
+                          </m:r>
+                        </m:e>
+                        <m:sub>
+                          <m:r>
+                            <m:t>τ</m:t>
+                          </m:r>
+                        </m:sub>
+                      </m:sSub>
+                      <m:r>
+                        <m:rPr>
+                          <m:sty m:val="p"/>
+                        </m:rPr>
+                        <m:t>)</m:t>
+                      </m:r>
+                    </m:e>
+                  </m:d>
+                </m:e>
+                <m:lim>
+                  <m:r>
+                    <m:rPr>
+                      <m:sty m:val="p"/>
+                    </m:rPr>
+                    <m:t>⏟</m:t>
+                  </m:r>
+                </m:lim>
+              </m:limLow>
+            </m:e>
+            <m:lim>
+              <m:r>
+                <m:rPr>
+                  <m:nor/>
+                  <m:sty m:val="p"/>
+                </m:rPr>
+                <m:t>Pragmatischer Wert (KL-Divergenz zu Zielen)</m:t>
+              </m:r>
+            </m:lim>
+          </m:limLow>
+          <m:r>
+            <m:rPr>
+              <m:sty m:val="p"/>
+            </m:rPr>
+            <m:t>+</m:t>
+          </m:r>
+          <m:limLow>
+            <m:e>
+              <m:limLow>
+                <m:e>
+                  <m:nary>
+                    <m:naryPr>
+                      <m:chr m:val="∑"/>
+                      <m:limLoc m:val="undOvr"/>
+                      <m:subHide m:val="off"/>
+                      <m:supHide m:val="on"/>
+                    </m:naryPr>
+                    <m:sub>
+                      <m:sSub>
+                        <m:e>
+                          <m:r>
+                            <m:t>s</m:t>
+                          </m:r>
+                        </m:e>
+                        <m:sub>
+                          <m:r>
+                            <m:t>τ</m:t>
+                          </m:r>
+                        </m:sub>
+                      </m:sSub>
+                    </m:sub>
+                    <m:sup>
+                      <m:r>
+                        <m:t>​</m:t>
+                      </m:r>
+                    </m:sup>
+                    <m:e>
+                      <m:r>
+                        <m:t>Q</m:t>
+                      </m:r>
+                    </m:e>
+                  </m:nary>
+                  <m:r>
+                    <m:rPr>
+                      <m:sty m:val="p"/>
+                    </m:rPr>
+                    <m:t>(</m:t>
                   </m:r>
                   <m:sSub>
                     <m:e>
@@ -11915,10 +12749,347 @@
                       </m:r>
                     </m:sub>
                   </m:sSub>
-                </m:sub>
-              </m:sSub>
+                  <m:r>
+                    <m:rPr>
+                      <m:sty m:val="p"/>
+                    </m:rPr>
+                    <m:t>∣</m:t>
+                  </m:r>
+                  <m:r>
+                    <m:t>π</m:t>
+                  </m:r>
+                  <m:r>
+                    <m:rPr>
+                      <m:sty m:val="p"/>
+                    </m:rPr>
+                    <m:t>)</m:t>
+                  </m:r>
+                  <m:r>
+                    <m:rPr>
+                      <m:sty m:val="p"/>
+                    </m:rPr>
+                    <m:t>⋅</m:t>
+                  </m:r>
+                  <m:r>
+                    <m:rPr>
+                      <m:scr m:val="script"/>
+                      <m:sty m:val="p"/>
+                    </m:rPr>
+                    <m:t>H</m:t>
+                  </m:r>
+                  <m:d>
+                    <m:dPr>
+                      <m:begChr m:val="("/>
+                      <m:sepChr m:val=""/>
+                      <m:endChr m:val=")"/>
+                      <m:grow/>
+                    </m:dPr>
+                    <m:e>
+                      <m:sSub>
+                        <m:e>
+                          <m:r>
+                            <m:t>A</m:t>
+                          </m:r>
+                        </m:e>
+                        <m:sub>
+                          <m:r>
+                            <m:rPr>
+                              <m:sty m:val="p"/>
+                            </m:rPr>
+                            <m:t>:</m:t>
+                          </m:r>
+                          <m:r>
+                            <m:rPr>
+                              <m:sty m:val="p"/>
+                            </m:rPr>
+                            <m:t>,</m:t>
+                          </m:r>
+                          <m:sSub>
+                            <m:e>
+                              <m:r>
+                                <m:t>s</m:t>
+                              </m:r>
+                            </m:e>
+                            <m:sub>
+                              <m:r>
+                                <m:t>τ</m:t>
+                              </m:r>
+                            </m:sub>
+                          </m:sSub>
+                        </m:sub>
+                      </m:sSub>
+                    </m:e>
+                  </m:d>
+                </m:e>
+                <m:lim>
+                  <m:r>
+                    <m:rPr>
+                      <m:sty m:val="p"/>
+                    </m:rPr>
+                    <m:t>⏟</m:t>
+                  </m:r>
+                </m:lim>
+              </m:limLow>
             </m:e>
-          </m:d>
+            <m:lim>
+              <m:r>
+                <m:rPr>
+                  <m:nor/>
+                  <m:sty m:val="p"/>
+                </m:rPr>
+                <m:t>Epistemischer Wert (Ambiguitätsabbau)</m:t>
+              </m:r>
+            </m:lim>
+          </m:limLow>
+        </m:oMath>
+      </m:oMathPara>
+    </w:p>
+    <w:p>
+      <w:pPr>
+        <w:pStyle w:val="FirstParagraph"/>
+      </w:pPr>
+      <w:r>
+        <w:t xml:space="preserve">Wobei vorhergesagte Beobachtungen und Zustände generiert werden durch:</w:t>
+      </w:r>
+    </w:p>
+    <w:p>
+      <w:pPr>
+        <w:pStyle w:val="BodyText"/>
+      </w:pPr>
+      <m:oMathPara>
+        <m:oMathParaPr>
+          <m:jc m:val="center"/>
+        </m:oMathParaPr>
+        <m:oMath>
+          <m:r>
+            <m:t>Q</m:t>
+          </m:r>
+          <m:r>
+            <m:rPr>
+              <m:sty m:val="p"/>
+            </m:rPr>
+            <m:t>(</m:t>
+          </m:r>
+          <m:sSub>
+            <m:e>
+              <m:r>
+                <m:t>o</m:t>
+              </m:r>
+            </m:e>
+            <m:sub>
+              <m:r>
+                <m:t>τ</m:t>
+              </m:r>
+            </m:sub>
+          </m:sSub>
+          <m:r>
+            <m:rPr>
+              <m:sty m:val="p"/>
+            </m:rPr>
+            <m:t>∣</m:t>
+          </m:r>
+          <m:r>
+            <m:t>π</m:t>
+          </m:r>
+          <m:r>
+            <m:rPr>
+              <m:sty m:val="p"/>
+            </m:rPr>
+            <m:t>)</m:t>
+          </m:r>
+          <m:r>
+            <m:rPr>
+              <m:sty m:val="p"/>
+            </m:rPr>
+            <m:t>=</m:t>
+          </m:r>
+          <m:r>
+            <m:t>A</m:t>
+          </m:r>
+          <m:r>
+            <m:rPr>
+              <m:sty m:val="p"/>
+            </m:rPr>
+            <m:t>⋅</m:t>
+          </m:r>
+          <m:r>
+            <m:t>Q</m:t>
+          </m:r>
+          <m:r>
+            <m:rPr>
+              <m:sty m:val="p"/>
+            </m:rPr>
+            <m:t>(</m:t>
+          </m:r>
+          <m:sSub>
+            <m:e>
+              <m:r>
+                <m:t>s</m:t>
+              </m:r>
+            </m:e>
+            <m:sub>
+              <m:r>
+                <m:t>τ</m:t>
+              </m:r>
+            </m:sub>
+          </m:sSub>
+          <m:r>
+            <m:rPr>
+              <m:sty m:val="p"/>
+            </m:rPr>
+            <m:t>∣</m:t>
+          </m:r>
+          <m:r>
+            <m:t>π</m:t>
+          </m:r>
+          <m:r>
+            <m:rPr>
+              <m:sty m:val="p"/>
+            </m:rPr>
+            <m:t>)</m:t>
+          </m:r>
+          <m:r>
+            <m:t>  </m:t>
+          </m:r>
+          <m:r>
+            <m:rPr>
+              <m:nor/>
+              <m:sty m:val="p"/>
+            </m:rPr>
+            <m:t>und</m:t>
+          </m:r>
+          <m:r>
+            <m:t>  </m:t>
+          </m:r>
+          <m:r>
+            <m:t>Q</m:t>
+          </m:r>
+          <m:r>
+            <m:rPr>
+              <m:sty m:val="p"/>
+            </m:rPr>
+            <m:t>(</m:t>
+          </m:r>
+          <m:sSub>
+            <m:e>
+              <m:r>
+                <m:t>s</m:t>
+              </m:r>
+            </m:e>
+            <m:sub>
+              <m:r>
+                <m:t>τ</m:t>
+              </m:r>
+            </m:sub>
+          </m:sSub>
+          <m:r>
+            <m:rPr>
+              <m:sty m:val="p"/>
+            </m:rPr>
+            <m:t>∣</m:t>
+          </m:r>
+          <m:r>
+            <m:t>π</m:t>
+          </m:r>
+          <m:r>
+            <m:rPr>
+              <m:sty m:val="p"/>
+            </m:rPr>
+            <m:t>)</m:t>
+          </m:r>
+          <m:r>
+            <m:rPr>
+              <m:sty m:val="p"/>
+            </m:rPr>
+            <m:t>=</m:t>
+          </m:r>
+          <m:r>
+            <m:t>B</m:t>
+          </m:r>
+          <m:r>
+            <m:rPr>
+              <m:sty m:val="p"/>
+            </m:rPr>
+            <m:t>(</m:t>
+          </m:r>
+          <m:sSub>
+            <m:e>
+              <m:r>
+                <m:t>u</m:t>
+              </m:r>
+            </m:e>
+            <m:sub>
+              <m:r>
+                <m:t>τ</m:t>
+              </m:r>
+              <m:r>
+                <m:rPr>
+                  <m:sty m:val="p"/>
+                </m:rPr>
+                <m:t>−</m:t>
+              </m:r>
+              <m:r>
+                <m:t>1</m:t>
+              </m:r>
+            </m:sub>
+          </m:sSub>
+          <m:r>
+            <m:rPr>
+              <m:sty m:val="p"/>
+            </m:rPr>
+            <m:t>)</m:t>
+          </m:r>
+          <m:r>
+            <m:rPr>
+              <m:sty m:val="p"/>
+            </m:rPr>
+            <m:t>⋅</m:t>
+          </m:r>
+          <m:r>
+            <m:t>Q</m:t>
+          </m:r>
+          <m:r>
+            <m:rPr>
+              <m:sty m:val="p"/>
+            </m:rPr>
+            <m:t>(</m:t>
+          </m:r>
+          <m:sSub>
+            <m:e>
+              <m:r>
+                <m:t>s</m:t>
+              </m:r>
+            </m:e>
+            <m:sub>
+              <m:r>
+                <m:t>τ</m:t>
+              </m:r>
+              <m:r>
+                <m:rPr>
+                  <m:sty m:val="p"/>
+                </m:rPr>
+                <m:t>−</m:t>
+              </m:r>
+              <m:r>
+                <m:t>1</m:t>
+              </m:r>
+            </m:sub>
+          </m:sSub>
+          <m:r>
+            <m:rPr>
+              <m:sty m:val="p"/>
+            </m:rPr>
+            <m:t>∣</m:t>
+          </m:r>
+          <m:r>
+            <m:t>π</m:t>
+          </m:r>
+          <m:r>
+            <m:rPr>
+              <m:sty m:val="p"/>
+            </m:rPr>
+            <m:t>)</m:t>
+          </m:r>
         </m:oMath>
       </m:oMathPara>
     </w:p>
@@ -12125,19 +13296,12 @@
         </m:oMath>
       </m:oMathPara>
     </w:p>
-    <w:p>
-      <w:r>
-        <w:pict>
-          <v:rect style="width:0;height:1.5pt" o:hralign="center" o:hrstd="t" o:hr="t"/>
-        </w:pict>
-      </w:r>
-    </w:p>
     <w:bookmarkEnd w:id="56"/>
     <w:bookmarkEnd w:id="57"/>
     <w:bookmarkStart w:id="69" w:name="X00959850f20045e696e7e31e5a1ee9aaa645ab4"/>
     <w:p>
       <w:pPr>
-        <w:pStyle w:val="Heading2"/>
+        <w:pStyle w:val="Heading1"/>
       </w:pPr>
       <w:r>
         <w:t xml:space="preserve">Anhang B: Open Science, Git-Archiv &amp; Wissenschaftliche Begleitpapiere</w:t>
@@ -12742,22 +13906,15 @@
         </w:r>
       </w:hyperlink>
     </w:p>
-    <w:p>
-      <w:r>
-        <w:pict>
-          <v:rect style="width:0;height:1.5pt" o:hralign="center" o:hrstd="t" o:hr="t"/>
-        </w:pict>
-      </w:r>
-    </w:p>
     <w:bookmarkEnd w:id="68"/>
     <w:bookmarkEnd w:id="69"/>
-    <w:bookmarkStart w:id="70" w:name="X6ebfcc777b1b1223b2089ae2c33d3f4626144bc"/>
-    <w:p>
-      <w:pPr>
-        <w:pStyle w:val="Heading2"/>
-      </w:pPr>
-      <w:r>
-        <w:t xml:space="preserve">Anhang C: Alphabetisches Glossar der Fachbegriffe</w:t>
+    <w:bookmarkStart w:id="70" w:name="Xdfa16aceee86dcd9bf186bddd4f98777f9ab2ed"/>
+    <w:p>
+      <w:pPr>
+        <w:pStyle w:val="Heading1"/>
+      </w:pPr>
+      <w:r>
+        <w:t xml:space="preserve">Anhang C: Umfassendes Alphabetisches Glossar der Fachbegriffe</w:t>
       </w:r>
     </w:p>
     <w:p>
@@ -12806,7 +13963,7 @@
           <w:b/>
           <w:bCs/>
         </w:rPr>
-        <w:t xml:space="preserve">Alter (Dissoziiertes Bewusstseinszentrum):</w:t>
+        <w:t xml:space="preserve">Alter (Dissoziiertes Bewusstseinszentrum / Seele):</w:t>
       </w:r>
       <w:r>
         <w:t xml:space="preserve"> </w:t>
@@ -12882,6 +14039,60 @@
           <w:b/>
           <w:bCs/>
         </w:rPr>
+        <w:t xml:space="preserve">Cartesianischer Dualismus:</w:t>
+      </w:r>
+      <w:r>
+        <w:t xml:space="preserve"> </w:t>
+      </w:r>
+      <w:r>
+        <w:t xml:space="preserve">Die von René Descartes begründete Lehre von zwei fundamental getrennten Substanzen:</w:t>
+      </w:r>
+      <w:r>
+        <w:t xml:space="preserve"> </w:t>
+      </w:r>
+      <w:r>
+        <w:rPr>
+          <w:i/>
+          <w:iCs/>
+        </w:rPr>
+        <w:t xml:space="preserve">res cogitans</w:t>
+      </w:r>
+      <w:r>
+        <w:t xml:space="preserve"> </w:t>
+      </w:r>
+      <w:r>
+        <w:t xml:space="preserve">(unräumlicher, denkender Geist) und</w:t>
+      </w:r>
+      <w:r>
+        <w:t xml:space="preserve"> </w:t>
+      </w:r>
+      <w:r>
+        <w:rPr>
+          <w:i/>
+          <w:iCs/>
+        </w:rPr>
+        <w:t xml:space="preserve">res extensa</w:t>
+      </w:r>
+      <w:r>
+        <w:t xml:space="preserve"> </w:t>
+      </w:r>
+      <w:r>
+        <w:t xml:space="preserve">(ausgedehnte, tote Materie), welche das unlösbare Leib-Seele-Problem schuf.</w:t>
+      </w:r>
+    </w:p>
+    <w:p>
+      <w:pPr>
+        <w:pStyle w:val="Compact"/>
+        <w:numPr>
+          <w:ilvl w:val="0"/>
+          <w:numId w:val="1016"/>
+        </w:numPr>
+      </w:pPr>
+      <w:r>
+        <w:rPr>
+          <w:b/>
+          <w:bCs/>
+        </w:rPr>
         <w:t xml:space="preserve">Conatus (Der Existenzwille):</w:t>
       </w:r>
       <w:r>
@@ -12911,7 +14122,10 @@
         </m:r>
       </m:oMath>
       <w:r>
-        <w:t xml:space="preserve">.</w:t>
+        <w:t xml:space="preserve"> </w:t>
+      </w:r>
+      <w:r>
+        <w:t xml:space="preserve">und 6. Axiom.</w:t>
       </w:r>
     </w:p>
     <w:p>
@@ -13070,29 +14284,23 @@
           <w:b/>
           <w:bCs/>
         </w:rPr>
-        <w:t xml:space="preserve">Erklärungslücke (</w:t>
-      </w:r>
-      <w:r>
-        <w:rPr>
-          <w:b/>
-          <w:bCs/>
+        <w:t xml:space="preserve">Dissoziation:</w:t>
+      </w:r>
+      <w:r>
+        <w:t xml:space="preserve"> </w:t>
+      </w:r>
+      <w:r>
+        <w:t xml:space="preserve">Der psychologische und kosmologische Prozess, durch den sich ein einheitliches Bewusstseinsfeld in teilautonome Sub-Zentren (</w:t>
+      </w:r>
+      <w:r>
+        <w:rPr>
           <w:i/>
           <w:iCs/>
         </w:rPr>
-        <w:t xml:space="preserve">Explanatory Gap</w:t>
-      </w:r>
-      <w:r>
-        <w:rPr>
-          <w:b/>
-          <w:bCs/>
-        </w:rPr>
-        <w:t xml:space="preserve">):</w:t>
-      </w:r>
-      <w:r>
-        <w:t xml:space="preserve"> </w:t>
-      </w:r>
-      <w:r>
-        <w:t xml:space="preserve">Die unüberwindbare Kluft im Physikalismus zwischen quantitativen objektiven Hirnprozessen und qualitativem subjektiven Erleben (Levine).</w:t>
+        <w:t xml:space="preserve">Alters</w:t>
+      </w:r>
+      <w:r>
+        <w:t xml:space="preserve">) aufspaltet und individuelle Innenperspektiven hinter Markov-Decken bildet.</w:t>
       </w:r>
     </w:p>
     <w:p>
@@ -13108,39 +14316,13 @@
           <w:b/>
           <w:bCs/>
         </w:rPr>
-        <w:t xml:space="preserve">Erwartete Freie Energie (</w:t>
-      </w:r>
-      <m:oMath>
-        <m:r>
-          <m:rPr>
-            <m:sty m:val="b"/>
-          </m:rPr>
-          <m:t>G</m:t>
-        </m:r>
-      </m:oMath>
-      <w:r>
-        <w:rPr>
-          <w:b/>
-          <w:bCs/>
-        </w:rPr>
-        <w:t xml:space="preserve">):</w:t>
-      </w:r>
-      <w:r>
-        <w:t xml:space="preserve"> </w:t>
-      </w:r>
-      <w:r>
-        <w:t xml:space="preserve">Eine zukunftsgerichtete Metrik zur Bewertung von Handlungsoptionen über einen Planungshorizont</w:t>
-      </w:r>
-      <w:r>
-        <w:t xml:space="preserve"> </w:t>
-      </w:r>
-      <m:oMath>
-        <m:r>
-          <m:t>H</m:t>
-        </m:r>
-      </m:oMath>
-      <w:r>
-        <w:t xml:space="preserve">, bestehend aus pragmatischem Wert (Zielerfüllung) und epistemischem Wert (Neugier / Ambiguitätsabbau).</w:t>
+        <w:t xml:space="preserve">Dual-Aspect-Monismus:</w:t>
+      </w:r>
+      <w:r>
+        <w:t xml:space="preserve"> </w:t>
+      </w:r>
+      <w:r>
+        <w:t xml:space="preserve">Die philosophische Auffassung, dass Geist und Materie zwei komplementäre, erkenntnistheoretisch unterschiedliche Perspektiven einer einzigen zugrunde liegenden Wirklichkeit sind.</w:t>
       </w:r>
     </w:p>
     <w:p>
@@ -13156,28 +14338,24 @@
           <w:b/>
           <w:bCs/>
         </w:rPr>
-        <w:t xml:space="preserve">Integrierte Information (</w:t>
+        <w:t xml:space="preserve">Epistemischer Wert / Epistemologie (Erkenntnistheorie):</w:t>
+      </w:r>
+      <w:r>
+        <w:t xml:space="preserve"> </w:t>
+      </w:r>
+      <w:r>
+        <w:t xml:space="preserve">Der neugiergetriebene, informationssuchende Anteil der Erwarteten Freien Energie (</w:t>
       </w:r>
       <m:oMath>
         <m:r>
           <m:rPr>
-            <m:sty m:val="p"/>
-          </m:rPr>
-          <m:t>Φ</m:t>
+            <m:sty m:val="b"/>
+          </m:rPr>
+          <m:t>G</m:t>
         </m:r>
       </m:oMath>
       <w:r>
-        <w:rPr>
-          <w:b/>
-          <w:bCs/>
-        </w:rPr>
-        <w:t xml:space="preserve">):</w:t>
-      </w:r>
-      <w:r>
-        <w:t xml:space="preserve"> </w:t>
-      </w:r>
-      <w:r>
-        <w:t xml:space="preserve">Das quantitative Maß für die intrinsische Ursache-Wirkungs-Macht eines maximal irreduziblen physikalischen Substrats über die Minimum Information Partition (Tononi, IIT 4.0).</w:t>
+        <w:t xml:space="preserve">), der einen Agenten dazu motiviert, Unwissenheit und Ambiguität vor der Belohnungsjagd abzubauen. Die Epistemologie untersucht Wesen, Zustandekommen und Grenzen von Wissen.</w:t>
       </w:r>
     </w:p>
     <w:p>
@@ -13193,7 +14371,7 @@
           <w:b/>
           <w:bCs/>
         </w:rPr>
-        <w:t xml:space="preserve">Kritikalität (</w:t>
+        <w:t xml:space="preserve">Erklärungslücke (</w:t>
       </w:r>
       <w:r>
         <w:rPr>
@@ -13202,7 +14380,7 @@
           <w:i/>
           <w:iCs/>
         </w:rPr>
-        <w:t xml:space="preserve">Edge of Chaos</w:t>
+        <w:t xml:space="preserve">Explanatory Gap</w:t>
       </w:r>
       <w:r>
         <w:rPr>
@@ -13215,18 +14393,7 @@
         <w:t xml:space="preserve"> </w:t>
       </w:r>
       <w:r>
-        <w:t xml:space="preserve">Der Phasenübergang zwischen starrer Ordnung und chaotischer Turbulenz, an dem Informationstransfer und Integrierte Information (</w:t>
-      </w:r>
-      <m:oMath>
-        <m:r>
-          <m:rPr>
-            <m:sty m:val="p"/>
-          </m:rPr>
-          <m:t>Φ</m:t>
-        </m:r>
-      </m:oMath>
-      <w:r>
-        <w:t xml:space="preserve">) ihr globales Maximum erreichen.</w:t>
+        <w:t xml:space="preserve">Die unüberwindbare Kluft im Physikalismus zwischen quantitativen objektiven Hirnprozessen und qualitativem subjektiven Erleben (Levine).</w:t>
       </w:r>
     </w:p>
     <w:p>
@@ -13242,17 +14409,16 @@
           <w:b/>
           <w:bCs/>
         </w:rPr>
-        <w:t xml:space="preserve">Markov-Decke (</w:t>
-      </w:r>
-      <w:r>
-        <w:rPr>
-          <w:b/>
-          <w:bCs/>
-          <w:i/>
-          <w:iCs/>
-        </w:rPr>
-        <w:t xml:space="preserve">Markov Blanket</w:t>
-      </w:r>
+        <w:t xml:space="preserve">Erwartete Freie Energie (</w:t>
+      </w:r>
+      <m:oMath>
+        <m:r>
+          <m:rPr>
+            <m:sty m:val="b"/>
+          </m:rPr>
+          <m:t>G</m:t>
+        </m:r>
+      </m:oMath>
       <w:r>
         <w:rPr>
           <w:b/>
@@ -13264,39 +14430,18 @@
         <w:t xml:space="preserve"> </w:t>
       </w:r>
       <w:r>
-        <w:t xml:space="preserve">Eine statistische Trennfläche, die ein System in interne (</w:t>
+        <w:t xml:space="preserve">Eine zukunftsgerichtete Metrik zur Bewertung von Handlungsoptionen über einen Planungshorizont</w:t>
+      </w:r>
+      <w:r>
+        <w:t xml:space="preserve"> </w:t>
       </w:r>
       <m:oMath>
         <m:r>
-          <m:t>μ</m:t>
+          <m:t>H</m:t>
         </m:r>
       </m:oMath>
       <w:r>
-        <w:t xml:space="preserve">), sensorische (</w:t>
-      </w:r>
-      <m:oMath>
-        <m:r>
-          <m:t>s</m:t>
-        </m:r>
-      </m:oMath>
-      <w:r>
-        <w:t xml:space="preserve">), aktive (</w:t>
-      </w:r>
-      <m:oMath>
-        <m:r>
-          <m:t>a</m:t>
-        </m:r>
-      </m:oMath>
-      <w:r>
-        <w:t xml:space="preserve">) und externe Zustände (</w:t>
-      </w:r>
-      <m:oMath>
-        <m:r>
-          <m:t>η</m:t>
-        </m:r>
-      </m:oMath>
-      <w:r>
-        <w:t xml:space="preserve">) unterteilt und das Innere bedingt unabhängig vom Äußeren macht.</w:t>
+        <w:t xml:space="preserve">, bestehend aus pragmatischem Wert (Zielerfüllung) und epistemischem Wert (Neugier / Ambiguitätsabbau).</w:t>
       </w:r>
     </w:p>
     <w:p>
@@ -13312,13 +14457,28 @@
           <w:b/>
           <w:bCs/>
         </w:rPr>
-        <w:t xml:space="preserve">Mind-at-Large:</w:t>
-      </w:r>
-      <w:r>
-        <w:t xml:space="preserve"> </w:t>
-      </w:r>
-      <w:r>
-        <w:t xml:space="preserve">Das universale, transpersonale Feld reinen Bewusstseins, das den fundamentalen ontologischen Urgrund der Wirklichkeit bildet (Spinoza, Kastrup).</w:t>
+        <w:t xml:space="preserve">Integrierte Information (</w:t>
+      </w:r>
+      <m:oMath>
+        <m:r>
+          <m:rPr>
+            <m:sty m:val="p"/>
+          </m:rPr>
+          <m:t>Φ</m:t>
+        </m:r>
+      </m:oMath>
+      <w:r>
+        <w:rPr>
+          <w:b/>
+          <w:bCs/>
+        </w:rPr>
+        <w:t xml:space="preserve">):</w:t>
+      </w:r>
+      <w:r>
+        <w:t xml:space="preserve"> </w:t>
+      </w:r>
+      <w:r>
+        <w:t xml:space="preserve">Das quantitative Maß für die intrinsische Ursache-Wirkungs-Macht eines maximal irreduziblen physikalischen Substrats über die Minimum Information Partition (Tononi, IIT 4.0).</w:t>
       </w:r>
     </w:p>
     <w:p>
@@ -13334,27 +14494,45 @@
           <w:b/>
           <w:bCs/>
         </w:rPr>
-        <w:t xml:space="preserve">Minimum Information Partition (MIP):</w:t>
-      </w:r>
-      <w:r>
-        <w:t xml:space="preserve"> </w:t>
-      </w:r>
-      <w:r>
-        <w:t xml:space="preserve">Diejenige Zweiteilung eines Systems, die den geringsten Kausalitätsverlust verursacht; dient zur Berechnung der System-Irreduzibilität</w:t>
-      </w:r>
-      <w:r>
-        <w:t xml:space="preserve"> </w:t>
-      </w:r>
-      <m:oMath>
-        <m:r>
-          <m:rPr>
-            <m:sty m:val="p"/>
-          </m:rPr>
-          <m:t>Φ</m:t>
-        </m:r>
-      </m:oMath>
-      <w:r>
-        <w:t xml:space="preserve">.</w:t>
+        <w:t xml:space="preserve">Kausalität (Intrinsisch vs. Extrinsisch):</w:t>
+      </w:r>
+      <w:r>
+        <w:t xml:space="preserve"> </w:t>
+      </w:r>
+      <w:r>
+        <w:t xml:space="preserve">In der IIT und im CIF beschreibt</w:t>
+      </w:r>
+      <w:r>
+        <w:t xml:space="preserve"> </w:t>
+      </w:r>
+      <w:r>
+        <w:rPr>
+          <w:i/>
+          <w:iCs/>
+        </w:rPr>
+        <w:t xml:space="preserve">intrinsische Kausalität</w:t>
+      </w:r>
+      <w:r>
+        <w:t xml:space="preserve"> </w:t>
+      </w:r>
+      <w:r>
+        <w:t xml:space="preserve">die Ursache-Wirkungs-Macht eines Systems auf sich selbst von innen heraus (phänomenales Erleben), während</w:t>
+      </w:r>
+      <w:r>
+        <w:t xml:space="preserve"> </w:t>
+      </w:r>
+      <w:r>
+        <w:rPr>
+          <w:i/>
+          <w:iCs/>
+        </w:rPr>
+        <w:t xml:space="preserve">extrinsische Kausalität</w:t>
+      </w:r>
+      <w:r>
+        <w:t xml:space="preserve"> </w:t>
+      </w:r>
+      <w:r>
+        <w:t xml:space="preserve">beobachtbare Verhaltensreaktionen von außen meint.</w:t>
       </w:r>
     </w:p>
     <w:p>
@@ -13370,13 +14548,40 @@
           <w:b/>
           <w:bCs/>
         </w:rPr>
-        <w:t xml:space="preserve">Phänomenales Selbstmodell (PSM):</w:t>
-      </w:r>
-      <w:r>
-        <w:t xml:space="preserve"> </w:t>
-      </w:r>
-      <w:r>
-        <w:t xml:space="preserve">Eine transparente, kontinuierliche innere Simulation des prädiktiven Gehirns, die die 1.-Person-Perspektive eines stabilen „Ich“ erzeugt (Metzinger).</w:t>
+        <w:t xml:space="preserve">Kritikalität (</w:t>
+      </w:r>
+      <w:r>
+        <w:rPr>
+          <w:b/>
+          <w:bCs/>
+          <w:i/>
+          <w:iCs/>
+        </w:rPr>
+        <w:t xml:space="preserve">Edge of Chaos</w:t>
+      </w:r>
+      <w:r>
+        <w:rPr>
+          <w:b/>
+          <w:bCs/>
+        </w:rPr>
+        <w:t xml:space="preserve">):</w:t>
+      </w:r>
+      <w:r>
+        <w:t xml:space="preserve"> </w:t>
+      </w:r>
+      <w:r>
+        <w:t xml:space="preserve">Der Phasenübergang zwischen starrer Ordnung und chaotischer Turbulenz, an dem Informationstransfer und Integrierte Information (</w:t>
+      </w:r>
+      <m:oMath>
+        <m:r>
+          <m:rPr>
+            <m:sty m:val="p"/>
+          </m:rPr>
+          <m:t>Φ</m:t>
+        </m:r>
+      </m:oMath>
+      <w:r>
+        <w:t xml:space="preserve">) ihr globales Maximum erreichen.</w:t>
       </w:r>
     </w:p>
     <w:p>
@@ -13392,69 +14597,61 @@
           <w:b/>
           <w:bCs/>
         </w:rPr>
-        <w:t xml:space="preserve">POMDP (Partially Observable Markov Decision Process):</w:t>
-      </w:r>
-      <w:r>
-        <w:t xml:space="preserve"> </w:t>
-      </w:r>
-      <w:r>
-        <w:t xml:space="preserve">Mathematischer Formalismus für Entscheidungsfindung unter Unsicherheit, definiert durch die Tensoren</w:t>
-      </w:r>
-      <w:r>
-        <w:t xml:space="preserve"> </w:t>
+        <w:t xml:space="preserve">Markov-Decke (</w:t>
+      </w:r>
+      <w:r>
+        <w:rPr>
+          <w:b/>
+          <w:bCs/>
+          <w:i/>
+          <w:iCs/>
+        </w:rPr>
+        <w:t xml:space="preserve">Markov Blanket</w:t>
+      </w:r>
+      <w:r>
+        <w:rPr>
+          <w:b/>
+          <w:bCs/>
+        </w:rPr>
+        <w:t xml:space="preserve">):</w:t>
+      </w:r>
+      <w:r>
+        <w:t xml:space="preserve"> </w:t>
+      </w:r>
+      <w:r>
+        <w:t xml:space="preserve">Eine statistische Trennfläche, die ein System in interne (</w:t>
       </w:r>
       <m:oMath>
         <m:r>
-          <m:t>A</m:t>
+          <m:t>μ</m:t>
         </m:r>
       </m:oMath>
       <w:r>
-        <w:t xml:space="preserve"> </w:t>
-      </w:r>
-      <w:r>
-        <w:t xml:space="preserve">(Likelihood),</w:t>
-      </w:r>
-      <w:r>
-        <w:t xml:space="preserve"> </w:t>
+        <w:t xml:space="preserve">), sensorische (</w:t>
       </w:r>
       <m:oMath>
         <m:r>
-          <m:t>B</m:t>
+          <m:t>s</m:t>
         </m:r>
       </m:oMath>
       <w:r>
-        <w:t xml:space="preserve"> </w:t>
-      </w:r>
-      <w:r>
-        <w:t xml:space="preserve">(Übergänge),</w:t>
-      </w:r>
-      <w:r>
-        <w:t xml:space="preserve"> </w:t>
+        <w:t xml:space="preserve">), aktive (</w:t>
       </w:r>
       <m:oMath>
         <m:r>
-          <m:t>C</m:t>
+          <m:t>a</m:t>
         </m:r>
       </m:oMath>
       <w:r>
-        <w:t xml:space="preserve"> </w:t>
-      </w:r>
-      <w:r>
-        <w:t xml:space="preserve">(Werte) und</w:t>
-      </w:r>
-      <w:r>
-        <w:t xml:space="preserve"> </w:t>
+        <w:t xml:space="preserve">) und externe Zustände (</w:t>
       </w:r>
       <m:oMath>
         <m:r>
-          <m:t>D</m:t>
+          <m:t>η</m:t>
         </m:r>
       </m:oMath>
       <w:r>
-        <w:t xml:space="preserve"> </w:t>
-      </w:r>
-      <w:r>
-        <w:t xml:space="preserve">(Startpriors).</w:t>
+        <w:t xml:space="preserve">) unterteilt und das Innere bedingt unabhängig vom Äußeren macht.</w:t>
       </w:r>
     </w:p>
     <w:p>
@@ -13470,13 +14667,13 @@
           <w:b/>
           <w:bCs/>
         </w:rPr>
-        <w:t xml:space="preserve">Protention:</w:t>
-      </w:r>
-      <w:r>
-        <w:t xml:space="preserve"> </w:t>
-      </w:r>
-      <w:r>
-        <w:t xml:space="preserve">Die antizipatorische Zukunftserwartung innerhalb der Specious Present, entsprechend Top-Down-Vorhersagen (Husserl).</w:t>
+        <w:t xml:space="preserve">Mind-at-Large:</w:t>
+      </w:r>
+      <w:r>
+        <w:t xml:space="preserve"> </w:t>
+      </w:r>
+      <w:r>
+        <w:t xml:space="preserve">Das universale, transpersonale Feld reinen Bewusstseins, das den fundamentalen ontologischen Urgrund der Wirklichkeit bildet (Spinoza, Kastrup).</w:t>
       </w:r>
     </w:p>
     <w:p>
@@ -13492,13 +14689,27 @@
           <w:b/>
           <w:bCs/>
         </w:rPr>
-        <w:t xml:space="preserve">Retention:</w:t>
-      </w:r>
-      <w:r>
-        <w:t xml:space="preserve"> </w:t>
-      </w:r>
-      <w:r>
-        <w:t xml:space="preserve">Das im Arbeitsgedächtnis festgehaltene unmittelbare Vergangene innerhalb der Specious Present, entsprechend synaptischen Priors (Husserl).</w:t>
+        <w:t xml:space="preserve">Minimum Information Partition (MIP):</w:t>
+      </w:r>
+      <w:r>
+        <w:t xml:space="preserve"> </w:t>
+      </w:r>
+      <w:r>
+        <w:t xml:space="preserve">Diejenige Zweiteilung eines Systems, die den geringsten Kausalitätsverlust verursacht; dient zur Berechnung der System-Irreduzibilität</w:t>
+      </w:r>
+      <w:r>
+        <w:t xml:space="preserve"> </w:t>
+      </w:r>
+      <m:oMath>
+        <m:r>
+          <m:rPr>
+            <m:sty m:val="p"/>
+          </m:rPr>
+          <m:t>Φ</m:t>
+        </m:r>
+      </m:oMath>
+      <w:r>
+        <w:t xml:space="preserve">.</w:t>
       </w:r>
     </w:p>
     <w:p>
@@ -13514,39 +14725,26 @@
           <w:b/>
           <w:bCs/>
         </w:rPr>
-        <w:t xml:space="preserve">Schweres Problem des Bewusstseins (</w:t>
-      </w:r>
-      <w:r>
-        <w:rPr>
-          <w:b/>
-          <w:bCs/>
+        <w:t xml:space="preserve">Monismus:</w:t>
+      </w:r>
+      <w:r>
+        <w:t xml:space="preserve"> </w:t>
+      </w:r>
+      <w:r>
+        <w:t xml:space="preserve">Die ontologische Auffassung, dass die gesamte Wirklichkeit auf eine einzige fundamentale Grundsubstanz zurückgeht. Im CIF: ein</w:t>
+      </w:r>
+      <w:r>
+        <w:t xml:space="preserve"> </w:t>
+      </w:r>
+      <w:r>
+        <w:rPr>
           <w:i/>
           <w:iCs/>
         </w:rPr>
-        <w:t xml:space="preserve">Hard Problem</w:t>
-      </w:r>
-      <w:r>
-        <w:rPr>
-          <w:b/>
-          <w:bCs/>
-        </w:rPr>
-        <w:t xml:space="preserve">):</w:t>
-      </w:r>
-      <w:r>
-        <w:t xml:space="preserve"> </w:t>
-      </w:r>
-      <w:r>
-        <w:t xml:space="preserve">Die Frage, warum und wie physikalische Informationsverarbeitung jemals subjektives inneres Erleben (</w:t>
-      </w:r>
-      <w:r>
-        <w:rPr>
-          <w:i/>
-          <w:iCs/>
-        </w:rPr>
-        <w:t xml:space="preserve">Qualia</w:t>
-      </w:r>
-      <w:r>
-        <w:t xml:space="preserve">) hervorbringen sollte (Chalmers).</w:t>
+        <w:t xml:space="preserve">idealistischer Monismus</w:t>
+      </w:r>
+      <w:r>
+        <w:t xml:space="preserve">, in dem Erleben primär ist.</w:t>
       </w:r>
     </w:p>
     <w:p>
@@ -13562,56 +14760,26 @@
           <w:b/>
           <w:bCs/>
         </w:rPr>
-        <w:t xml:space="preserve">Specious Present (Gefühlte Gegenwart):</w:t>
-      </w:r>
-      <w:r>
-        <w:t xml:space="preserve"> </w:t>
-      </w:r>
-      <w:r>
-        <w:t xml:space="preserve">Die triadische, nicht-ausdehnungslose zeitliche Dauer des subjektiven Erlebens (</w:t>
-      </w:r>
-      <m:oMath>
-        <m:r>
-          <m:rPr>
-            <m:sty m:val="p"/>
-          </m:rPr>
-          <m:t>∼</m:t>
-        </m:r>
-        <m:r>
-          <m:t>500</m:t>
-        </m:r>
-        <m:r>
-          <m:t> </m:t>
-        </m:r>
-        <m:r>
-          <m:rPr>
-            <m:nor/>
-            <m:sty m:val="p"/>
-          </m:rPr>
-          <m:t>ms</m:t>
-        </m:r>
-        <m:r>
-          <m:rPr>
-            <m:sty m:val="p"/>
-          </m:rPr>
-          <m:t>−</m:t>
-        </m:r>
-        <m:r>
-          <m:t>3</m:t>
-        </m:r>
-        <m:r>
-          <m:t> </m:t>
-        </m:r>
-        <m:r>
-          <m:rPr>
-            <m:nor/>
-            <m:sty m:val="p"/>
-          </m:rPr>
-          <m:t>s</m:t>
-        </m:r>
-      </m:oMath>
-      <w:r>
-        <w:t xml:space="preserve">), die Retention, Urimpression und Protention vereint (James, Husserl).</w:t>
+        <w:t xml:space="preserve">Ontologie / Ontologischer Primat:</w:t>
+      </w:r>
+      <w:r>
+        <w:t xml:space="preserve"> </w:t>
+      </w:r>
+      <w:r>
+        <w:t xml:space="preserve">Die Disziplin der Metaphysik, die sich mit der Grundstruktur des Seins befasst. Im CIF besitzt das Bewusstsein den</w:t>
+      </w:r>
+      <w:r>
+        <w:t xml:space="preserve"> </w:t>
+      </w:r>
+      <w:r>
+        <w:rPr>
+          <w:i/>
+          <w:iCs/>
+        </w:rPr>
+        <w:t xml:space="preserve">ontologischen Primat</w:t>
+      </w:r>
+      <w:r>
+        <w:t xml:space="preserve">; tote Materie ist lediglich die extrinsische Erscheinung.</w:t>
       </w:r>
     </w:p>
     <w:p>
@@ -13627,44 +14795,13 @@
           <w:b/>
           <w:bCs/>
         </w:rPr>
-        <w:t xml:space="preserve">Temporale Tiefe (</w:t>
-      </w:r>
-      <m:oMath>
-        <m:r>
-          <m:t>H</m:t>
-        </m:r>
-      </m:oMath>
-      <w:r>
-        <w:rPr>
-          <w:b/>
-          <w:bCs/>
-        </w:rPr>
-        <w:t xml:space="preserve">):</w:t>
-      </w:r>
-      <w:r>
-        <w:t xml:space="preserve"> </w:t>
-      </w:r>
-      <w:r>
-        <w:t xml:space="preserve">Die Reichweite des kontrafaktischen Planungshorizonts, über den ein Agent Übergangstensoren (</w:t>
-      </w:r>
-      <m:oMath>
-        <m:r>
-          <m:t>B</m:t>
-        </m:r>
-      </m:oMath>
-      <w:r>
-        <w:t xml:space="preserve">) und erwartete freie Energie (</w:t>
-      </w:r>
-      <m:oMath>
-        <m:r>
-          <m:rPr>
-            <m:sty m:val="b"/>
-          </m:rPr>
-          <m:t>G</m:t>
-        </m:r>
-      </m:oMath>
-      <w:r>
-        <w:t xml:space="preserve">) evaluiert.</w:t>
+        <w:t xml:space="preserve">Phänomenales Bewusstsein / Qualia:</w:t>
+      </w:r>
+      <w:r>
+        <w:t xml:space="preserve"> </w:t>
+      </w:r>
+      <w:r>
+        <w:t xml:space="preserve">Die subjektive Erlebnisqualität des „Wie-es-sich-anfühlt“, etwas zu empfinden (z. B. Röte der Rose, Schmerz, Trauer, Freude) (Nagel, Chalmers).</w:t>
       </w:r>
     </w:p>
     <w:p>
@@ -13680,50 +14817,13 @@
           <w:b/>
           <w:bCs/>
         </w:rPr>
-        <w:t xml:space="preserve">Theorem der temporalen Mindesttiefe:</w:t>
-      </w:r>
-      <w:r>
-        <w:t xml:space="preserve"> </w:t>
-      </w:r>
-      <w:r>
-        <w:t xml:space="preserve">Die mathematische Notwendigkeitsbedingung, dass phänomenales Selbstbewusstsein mehrstufige kontrafaktische Planung (</w:t>
-      </w:r>
-      <m:oMath>
-        <m:r>
-          <m:t>H</m:t>
-        </m:r>
-        <m:r>
-          <m:rPr>
-            <m:sty m:val="p"/>
-          </m:rPr>
-          <m:t>&gt;</m:t>
-        </m:r>
-        <m:r>
-          <m:t>1</m:t>
-        </m:r>
-      </m:oMath>
-      <w:r>
-        <w:t xml:space="preserve">) erfordert, um einen Kausalitätskollaps (</w:t>
-      </w:r>
-      <m:oMath>
-        <m:r>
-          <m:rPr>
-            <m:sty m:val="p"/>
-          </m:rPr>
-          <m:t>Φ</m:t>
-        </m:r>
-        <m:r>
-          <m:rPr>
-            <m:sty m:val="p"/>
-          </m:rPr>
-          <m:t>→</m:t>
-        </m:r>
-        <m:r>
-          <m:t>0</m:t>
-        </m:r>
-      </m:oMath>
-      <w:r>
-        <w:t xml:space="preserve">) abzuwenden (Riebl).</w:t>
+        <w:t xml:space="preserve">Phänomenales Selbstmodell (PSM):</w:t>
+      </w:r>
+      <w:r>
+        <w:t xml:space="preserve"> </w:t>
+      </w:r>
+      <w:r>
+        <w:t xml:space="preserve">Eine transparente, kontinuierliche innere Simulation des prädiktiven Gehirns, die die 1.-Person-Perspektive eines stabilen „Ich“ erzeugt (Metzinger).</w:t>
       </w:r>
     </w:p>
     <w:p>
@@ -13739,13 +14839,13 @@
           <w:b/>
           <w:bCs/>
         </w:rPr>
-        <w:t xml:space="preserve">Urimpression:</w:t>
-      </w:r>
-      <w:r>
-        <w:t xml:space="preserve"> </w:t>
-      </w:r>
-      <w:r>
-        <w:t xml:space="preserve">Die gegenwärtige sensorische Störung an der Markov-Decke, entsprechend dem eingehenden Vorhersagefehler (Husserl).</w:t>
+        <w:t xml:space="preserve">Physicalismus (Materialismus):</w:t>
+      </w:r>
+      <w:r>
+        <w:t xml:space="preserve"> </w:t>
+      </w:r>
+      <w:r>
+        <w:t xml:space="preserve">Das metaphysische Dogma, dass ausschließlich physikalische Materie fundamental existiert und Bewusstsein ein nebensächliches Epiphänomen sei.</w:t>
       </w:r>
     </w:p>
     <w:p>
@@ -13761,6 +14861,452 @@
           <w:b/>
           <w:bCs/>
         </w:rPr>
+        <w:t xml:space="preserve">POMDP (Partially Observable Markov Decision Process):</w:t>
+      </w:r>
+      <w:r>
+        <w:t xml:space="preserve"> </w:t>
+      </w:r>
+      <w:r>
+        <w:t xml:space="preserve">Mathematischer Formalismus für Entscheidungsfindung unter Unsicherheit, definiert durch die Tensoren</w:t>
+      </w:r>
+      <w:r>
+        <w:t xml:space="preserve"> </w:t>
+      </w:r>
+      <m:oMath>
+        <m:r>
+          <m:t>A</m:t>
+        </m:r>
+      </m:oMath>
+      <w:r>
+        <w:t xml:space="preserve"> </w:t>
+      </w:r>
+      <w:r>
+        <w:t xml:space="preserve">(Likelihood),</w:t>
+      </w:r>
+      <w:r>
+        <w:t xml:space="preserve"> </w:t>
+      </w:r>
+      <m:oMath>
+        <m:r>
+          <m:t>B</m:t>
+        </m:r>
+      </m:oMath>
+      <w:r>
+        <w:t xml:space="preserve"> </w:t>
+      </w:r>
+      <w:r>
+        <w:t xml:space="preserve">(Übergänge),</w:t>
+      </w:r>
+      <w:r>
+        <w:t xml:space="preserve"> </w:t>
+      </w:r>
+      <m:oMath>
+        <m:r>
+          <m:t>C</m:t>
+        </m:r>
+      </m:oMath>
+      <w:r>
+        <w:t xml:space="preserve"> </w:t>
+      </w:r>
+      <w:r>
+        <w:t xml:space="preserve">(Werte) und</w:t>
+      </w:r>
+      <w:r>
+        <w:t xml:space="preserve"> </w:t>
+      </w:r>
+      <m:oMath>
+        <m:r>
+          <m:t>D</m:t>
+        </m:r>
+      </m:oMath>
+      <w:r>
+        <w:t xml:space="preserve"> </w:t>
+      </w:r>
+      <w:r>
+        <w:t xml:space="preserve">(Startpriors).</w:t>
+      </w:r>
+    </w:p>
+    <w:p>
+      <w:pPr>
+        <w:pStyle w:val="Compact"/>
+        <w:numPr>
+          <w:ilvl w:val="0"/>
+          <w:numId w:val="1016"/>
+        </w:numPr>
+      </w:pPr>
+      <w:r>
+        <w:rPr>
+          <w:b/>
+          <w:bCs/>
+        </w:rPr>
+        <w:t xml:space="preserve">Pragmatischer Wert:</w:t>
+      </w:r>
+      <w:r>
+        <w:t xml:space="preserve"> </w:t>
+      </w:r>
+      <w:r>
+        <w:t xml:space="preserve">Der zielorientierte Anteil der Erwarteten Freien Energie (</w:t>
+      </w:r>
+      <m:oMath>
+        <m:r>
+          <m:rPr>
+            <m:sty m:val="b"/>
+          </m:rPr>
+          <m:t>G</m:t>
+        </m:r>
+      </m:oMath>
+      <w:r>
+        <w:t xml:space="preserve">), der misst, wie gut vorhergesagte Sinneseindrücke die angeborenen homöostatischen Überlebenspräferenzen (</w:t>
+      </w:r>
+      <m:oMath>
+        <m:r>
+          <m:t>C</m:t>
+        </m:r>
+      </m:oMath>
+      <w:r>
+        <w:t xml:space="preserve">) erfüllen.</w:t>
+      </w:r>
+    </w:p>
+    <w:p>
+      <w:pPr>
+        <w:pStyle w:val="Compact"/>
+        <w:numPr>
+          <w:ilvl w:val="0"/>
+          <w:numId w:val="1016"/>
+        </w:numPr>
+      </w:pPr>
+      <w:r>
+        <w:rPr>
+          <w:b/>
+          <w:bCs/>
+        </w:rPr>
+        <w:t xml:space="preserve">Protention:</w:t>
+      </w:r>
+      <w:r>
+        <w:t xml:space="preserve"> </w:t>
+      </w:r>
+      <w:r>
+        <w:t xml:space="preserve">Die antizipatorische Zukunftserwartung innerhalb der Specious Present, entsprechend Top-Down-Vorhersagen (Husserl).</w:t>
+      </w:r>
+    </w:p>
+    <w:p>
+      <w:pPr>
+        <w:pStyle w:val="Compact"/>
+        <w:numPr>
+          <w:ilvl w:val="0"/>
+          <w:numId w:val="1016"/>
+        </w:numPr>
+      </w:pPr>
+      <w:r>
+        <w:rPr>
+          <w:b/>
+          <w:bCs/>
+        </w:rPr>
+        <w:t xml:space="preserve">Retention:</w:t>
+      </w:r>
+      <w:r>
+        <w:t xml:space="preserve"> </w:t>
+      </w:r>
+      <w:r>
+        <w:t xml:space="preserve">Das im Arbeitsgedächtnis festgehaltene unmittelbare Vergangene innerhalb der Specious Present, entsprechend synaptischen Priors (Husserl).</w:t>
+      </w:r>
+    </w:p>
+    <w:p>
+      <w:pPr>
+        <w:pStyle w:val="Compact"/>
+        <w:numPr>
+          <w:ilvl w:val="0"/>
+          <w:numId w:val="1016"/>
+        </w:numPr>
+      </w:pPr>
+      <w:r>
+        <w:rPr>
+          <w:b/>
+          <w:bCs/>
+        </w:rPr>
+        <w:t xml:space="preserve">Schweres Problem des Bewusstseins (</w:t>
+      </w:r>
+      <w:r>
+        <w:rPr>
+          <w:b/>
+          <w:bCs/>
+          <w:i/>
+          <w:iCs/>
+        </w:rPr>
+        <w:t xml:space="preserve">Hard Problem</w:t>
+      </w:r>
+      <w:r>
+        <w:rPr>
+          <w:b/>
+          <w:bCs/>
+        </w:rPr>
+        <w:t xml:space="preserve">):</w:t>
+      </w:r>
+      <w:r>
+        <w:t xml:space="preserve"> </w:t>
+      </w:r>
+      <w:r>
+        <w:t xml:space="preserve">Die Frage, warum und wie physikalische Informationsverarbeitung jemals subjektives inneres Erleben (</w:t>
+      </w:r>
+      <w:r>
+        <w:rPr>
+          <w:i/>
+          <w:iCs/>
+        </w:rPr>
+        <w:t xml:space="preserve">Qualia</w:t>
+      </w:r>
+      <w:r>
+        <w:t xml:space="preserve">) hervorbringen sollte (Chalmers).</w:t>
+      </w:r>
+    </w:p>
+    <w:p>
+      <w:pPr>
+        <w:pStyle w:val="Compact"/>
+        <w:numPr>
+          <w:ilvl w:val="0"/>
+          <w:numId w:val="1016"/>
+        </w:numPr>
+      </w:pPr>
+      <w:r>
+        <w:rPr>
+          <w:b/>
+          <w:bCs/>
+        </w:rPr>
+        <w:t xml:space="preserve">Specious Present (Gefühlte Gegenwart):</w:t>
+      </w:r>
+      <w:r>
+        <w:t xml:space="preserve"> </w:t>
+      </w:r>
+      <w:r>
+        <w:t xml:space="preserve">Die triadische, nicht-ausdehnungslose zeitliche Dauer des subjektiven Erlebens (</w:t>
+      </w:r>
+      <m:oMath>
+        <m:r>
+          <m:rPr>
+            <m:sty m:val="p"/>
+          </m:rPr>
+          <m:t>∼</m:t>
+        </m:r>
+        <m:r>
+          <m:t>500</m:t>
+        </m:r>
+        <m:r>
+          <m:t> </m:t>
+        </m:r>
+        <m:r>
+          <m:rPr>
+            <m:nor/>
+            <m:sty m:val="p"/>
+          </m:rPr>
+          <m:t>ms</m:t>
+        </m:r>
+        <m:r>
+          <m:rPr>
+            <m:sty m:val="p"/>
+          </m:rPr>
+          <m:t>−</m:t>
+        </m:r>
+        <m:r>
+          <m:t>3</m:t>
+        </m:r>
+        <m:r>
+          <m:t> </m:t>
+        </m:r>
+        <m:r>
+          <m:rPr>
+            <m:nor/>
+            <m:sty m:val="p"/>
+          </m:rPr>
+          <m:t>s</m:t>
+        </m:r>
+      </m:oMath>
+      <w:r>
+        <w:t xml:space="preserve">), die Retention, Urimpression und Protention vereint (James, Husserl).</w:t>
+      </w:r>
+    </w:p>
+    <w:p>
+      <w:pPr>
+        <w:pStyle w:val="Compact"/>
+        <w:numPr>
+          <w:ilvl w:val="0"/>
+          <w:numId w:val="1016"/>
+        </w:numPr>
+      </w:pPr>
+      <w:r>
+        <w:rPr>
+          <w:b/>
+          <w:bCs/>
+        </w:rPr>
+        <w:t xml:space="preserve">Teleologie (Konative Attraktoren):</w:t>
+      </w:r>
+      <w:r>
+        <w:t xml:space="preserve"> </w:t>
+      </w:r>
+      <w:r>
+        <w:t xml:space="preserve">Die zielgerichtete Ausrichtung lebendiger Systeme auf zukünftige homöostatische Attraktoren, formalisiert durch die Minimierung der erwarteten freien Energie und die Erhaltung von</w:t>
+      </w:r>
+      <w:r>
+        <w:t xml:space="preserve"> </w:t>
+      </w:r>
+      <m:oMath>
+        <m:r>
+          <m:rPr>
+            <m:sty m:val="p"/>
+          </m:rPr>
+          <m:t>Φ</m:t>
+        </m:r>
+      </m:oMath>
+      <w:r>
+        <w:t xml:space="preserve">.</w:t>
+      </w:r>
+    </w:p>
+    <w:p>
+      <w:pPr>
+        <w:pStyle w:val="Compact"/>
+        <w:numPr>
+          <w:ilvl w:val="0"/>
+          <w:numId w:val="1016"/>
+        </w:numPr>
+      </w:pPr>
+      <w:r>
+        <w:rPr>
+          <w:b/>
+          <w:bCs/>
+        </w:rPr>
+        <w:t xml:space="preserve">Temporale Tiefe (</w:t>
+      </w:r>
+      <m:oMath>
+        <m:r>
+          <m:t>H</m:t>
+        </m:r>
+      </m:oMath>
+      <w:r>
+        <w:rPr>
+          <w:b/>
+          <w:bCs/>
+        </w:rPr>
+        <w:t xml:space="preserve">):</w:t>
+      </w:r>
+      <w:r>
+        <w:t xml:space="preserve"> </w:t>
+      </w:r>
+      <w:r>
+        <w:t xml:space="preserve">Die Reichweite des kontrafaktischen Planungshorizonts, über den ein Agent Übergangstensoren (</w:t>
+      </w:r>
+      <m:oMath>
+        <m:r>
+          <m:t>B</m:t>
+        </m:r>
+      </m:oMath>
+      <w:r>
+        <w:t xml:space="preserve">) und erwartete freie Energie (</w:t>
+      </w:r>
+      <m:oMath>
+        <m:r>
+          <m:rPr>
+            <m:sty m:val="b"/>
+          </m:rPr>
+          <m:t>G</m:t>
+        </m:r>
+      </m:oMath>
+      <w:r>
+        <w:t xml:space="preserve">) evaluiert.</w:t>
+      </w:r>
+    </w:p>
+    <w:p>
+      <w:pPr>
+        <w:pStyle w:val="Compact"/>
+        <w:numPr>
+          <w:ilvl w:val="0"/>
+          <w:numId w:val="1016"/>
+        </w:numPr>
+      </w:pPr>
+      <w:r>
+        <w:rPr>
+          <w:b/>
+          <w:bCs/>
+        </w:rPr>
+        <w:t xml:space="preserve">Theorem der temporalen Mindesttiefe:</w:t>
+      </w:r>
+      <w:r>
+        <w:t xml:space="preserve"> </w:t>
+      </w:r>
+      <w:r>
+        <w:t xml:space="preserve">Die mathematische Notwendigkeitsbedingung, dass phänomenales Selbstbewusstsein mehrstufige kontrafaktische Planung (</w:t>
+      </w:r>
+      <m:oMath>
+        <m:r>
+          <m:t>H</m:t>
+        </m:r>
+        <m:r>
+          <m:rPr>
+            <m:sty m:val="p"/>
+          </m:rPr>
+          <m:t>&gt;</m:t>
+        </m:r>
+        <m:r>
+          <m:t>1</m:t>
+        </m:r>
+      </m:oMath>
+      <w:r>
+        <w:t xml:space="preserve">) erfordert, um einen Kausalitätskollaps (</w:t>
+      </w:r>
+      <m:oMath>
+        <m:r>
+          <m:rPr>
+            <m:sty m:val="p"/>
+          </m:rPr>
+          <m:t>Φ</m:t>
+        </m:r>
+        <m:r>
+          <m:rPr>
+            <m:sty m:val="p"/>
+          </m:rPr>
+          <m:t>→</m:t>
+        </m:r>
+        <m:r>
+          <m:t>0</m:t>
+        </m:r>
+      </m:oMath>
+      <w:r>
+        <w:t xml:space="preserve">) abzuwenden (Riebl).</w:t>
+      </w:r>
+    </w:p>
+    <w:p>
+      <w:pPr>
+        <w:pStyle w:val="Compact"/>
+        <w:numPr>
+          <w:ilvl w:val="0"/>
+          <w:numId w:val="1016"/>
+        </w:numPr>
+      </w:pPr>
+      <w:r>
+        <w:rPr>
+          <w:b/>
+          <w:bCs/>
+        </w:rPr>
+        <w:t xml:space="preserve">Urimpression:</w:t>
+      </w:r>
+      <w:r>
+        <w:t xml:space="preserve"> </w:t>
+      </w:r>
+      <w:r>
+        <w:t xml:space="preserve">Die gegenwärtige sensorische Störung an der Markov-Decke, entsprechend dem eingehenden Vorhersagefehler (Husserl).</w:t>
+      </w:r>
+    </w:p>
+    <w:p>
+      <w:pPr>
+        <w:pStyle w:val="Compact"/>
+        <w:numPr>
+          <w:ilvl w:val="0"/>
+          <w:numId w:val="1016"/>
+        </w:numPr>
+      </w:pPr>
+      <w:r>
+        <w:rPr>
+          <w:b/>
+          <w:bCs/>
+        </w:rPr>
         <w:t xml:space="preserve">Variationale Freie Energie (</w:t>
       </w:r>
       <m:oMath>
@@ -13817,21 +15363,14 @@
         <w:t xml:space="preserve">), die während der Wahrnehmung minimiert wird.</w:t>
       </w:r>
     </w:p>
-    <w:p>
-      <w:r>
-        <w:pict>
-          <v:rect style="width:0;height:1.5pt" o:hralign="center" o:hrstd="t" o:hr="t"/>
-        </w:pict>
-      </w:r>
-    </w:p>
     <w:bookmarkEnd w:id="70"/>
-    <w:bookmarkStart w:id="71" w:name="akademische-bibliographie-auswahl"/>
-    <w:p>
-      <w:pPr>
-        <w:pStyle w:val="Heading2"/>
-      </w:pPr>
-      <w:r>
-        <w:t xml:space="preserve">Akademische Bibliographie (Auswahl)</w:t>
+    <w:bookmarkStart w:id="71" w:name="akademische-bibliographie"/>
+    <w:p>
+      <w:pPr>
+        <w:pStyle w:val="Heading1"/>
+      </w:pPr>
+      <w:r>
+        <w:t xml:space="preserve">Akademische Bibliographie</w:t>
       </w:r>
     </w:p>
     <w:p>
@@ -14852,18 +16391,11 @@
         <w:t xml:space="preserve">World Psychiatry, 17(3), 243–257.</w:t>
       </w:r>
     </w:p>
-    <w:p>
-      <w:r>
-        <w:pict>
-          <v:rect style="width:0;height:1.5pt" o:hralign="center" o:hrstd="t" o:hr="t"/>
-        </w:pict>
-      </w:r>
-    </w:p>
     <w:bookmarkEnd w:id="71"/>
     <w:bookmarkStart w:id="72" w:name="tool-attribution-colophon"/>
     <w:p>
       <w:pPr>
-        <w:pStyle w:val="Heading2"/>
+        <w:pStyle w:val="Heading1"/>
       </w:pPr>
       <w:r>
         <w:t xml:space="preserve">Tool Attribution &amp; Colophon</w:t>
@@ -14928,7 +16460,7 @@
         <w:br/>
       </w:r>
       <w:r>
-        <w:t xml:space="preserve">Die formale Modellierung, Simulationsskripte, Vektordiagramme und die mehrformatige Buchkompilierung (Amazon KDP Print-PDF</w:t>
+        <w:t xml:space="preserve">Die formale mathematische Modellierung, Simulationsskripte, Vektordiagramme und die mehrformatige Buchkompilierung (Amazon KDP Print-PDF</w:t>
       </w:r>
       <w:r>
         <w:t xml:space="preserve"> </w:t>
@@ -14992,7 +16524,6 @@
       </w:r>
     </w:p>
     <w:bookmarkEnd w:id="72"/>
-    <w:bookmarkEnd w:id="73"/>
     <w:sectPr>
       <w:footnotePr>
         <w:numRestart w:val="eachSect"/>

</xml_diff>

<commit_message>
Add formal academic Title Page with Cover Architecture Graphic and Fundamental Master Equivalence (6th Axiom)
</commit_message>
<xml_diff>
--- a/book/build/The_Conative_Integrative_Framework_Book_Thomas_Riebl_DE_6x9.docx
+++ b/book/build/The_Conative_Integrative_Framework_Book_Thomas_Riebl_DE_6x9.docx
@@ -60,6 +60,347 @@
         </w:p>
       </w:sdtContent>
     </w:sdt>
+    <w:p>
+      <w:pPr>
+        <w:pStyle w:val="FirstParagraph"/>
+      </w:pPr>
+      <w:r>
+        <w:t xml:space="preserve">DAS KONATIV-INTEGRATIVE FRAMEWORK</w:t>
+      </w:r>
+    </w:p>
+    <w:p>
+      <w:pPr>
+        <w:pStyle w:val="BodyText"/>
+      </w:pPr>
+      <w:r>
+        <w:t xml:space="preserve">Active Inference, Integrierte Information und die autopoietische Mechanik des Bewusstseins</w:t>
+      </w:r>
+    </w:p>
+    <w:p>
+      <w:pPr>
+        <w:pStyle w:val="BodyText"/>
+      </w:pPr>
+    </w:p>
+    <w:p>
+      <w:pPr>
+        <w:pStyle w:val="BodyText"/>
+      </w:pPr>
+      <w:r>
+        <w:t xml:space="preserve">Phasenraum-Konvergenz, Kritikalität &amp; Phänomenale Topologie</w:t>
+      </w:r>
+    </w:p>
+    <w:p>
+      <w:pPr>
+        <w:pStyle w:val="BodyText"/>
+      </w:pPr>
+      <w:r>
+        <w:t xml:space="preserve">DIE FUNDAMENTALE MASTER-ÄQUIVALENZ (6. AXIOM)</w:t>
+      </w:r>
+    </w:p>
+    <w:p>
+      <w:pPr>
+        <w:pStyle w:val="BodyText"/>
+      </w:pPr>
+      <m:oMathPara>
+        <m:oMathParaPr>
+          <m:jc m:val="center"/>
+        </m:oMathParaPr>
+        <m:oMath>
+          <m:sSup>
+            <m:e>
+              <m:r>
+                <m:t>π</m:t>
+              </m:r>
+            </m:e>
+            <m:sup>
+              <m:r>
+                <m:rPr>
+                  <m:sty m:val="p"/>
+                </m:rPr>
+                <m:t>*</m:t>
+              </m:r>
+            </m:sup>
+          </m:sSup>
+          <m:r>
+            <m:rPr>
+              <m:sty m:val="p"/>
+            </m:rPr>
+            <m:t>=</m:t>
+          </m:r>
+          <m:r>
+            <m:rPr>
+              <m:sty m:val="p"/>
+            </m:rPr>
+            <m:t>arg</m:t>
+          </m:r>
+          <m:limLow>
+            <m:e>
+              <m:r>
+                <m:rPr>
+                  <m:sty m:val="p"/>
+                </m:rPr>
+                <m:t>min</m:t>
+              </m:r>
+            </m:e>
+            <m:lim>
+              <m:r>
+                <m:t>π</m:t>
+              </m:r>
+            </m:lim>
+          </m:limLow>
+          <m:nary>
+            <m:naryPr>
+              <m:chr m:val="∑"/>
+              <m:limLoc m:val="undOvr"/>
+              <m:subHide m:val="off"/>
+              <m:supHide m:val="off"/>
+            </m:naryPr>
+            <m:sub>
+              <m:r>
+                <m:t>τ</m:t>
+              </m:r>
+              <m:r>
+                <m:rPr>
+                  <m:sty m:val="p"/>
+                </m:rPr>
+                <m:t>=</m:t>
+              </m:r>
+              <m:r>
+                <m:t>t</m:t>
+              </m:r>
+              <m:r>
+                <m:rPr>
+                  <m:sty m:val="p"/>
+                </m:rPr>
+                <m:t>+</m:t>
+              </m:r>
+              <m:r>
+                <m:t>1</m:t>
+              </m:r>
+            </m:sub>
+            <m:sup>
+              <m:r>
+                <m:t>t</m:t>
+              </m:r>
+              <m:r>
+                <m:rPr>
+                  <m:sty m:val="p"/>
+                </m:rPr>
+                <m:t>+</m:t>
+              </m:r>
+              <m:r>
+                <m:t>H</m:t>
+              </m:r>
+            </m:sup>
+            <m:e>
+              <m:r>
+                <m:rPr>
+                  <m:sty m:val="b"/>
+                </m:rPr>
+                <m:t>G</m:t>
+              </m:r>
+            </m:e>
+          </m:nary>
+          <m:r>
+            <m:rPr>
+              <m:sty m:val="p"/>
+            </m:rPr>
+            <m:t>(</m:t>
+          </m:r>
+          <m:r>
+            <m:t>π</m:t>
+          </m:r>
+          <m:r>
+            <m:rPr>
+              <m:sty m:val="p"/>
+            </m:rPr>
+            <m:t>,</m:t>
+          </m:r>
+          <m:r>
+            <m:t>τ</m:t>
+          </m:r>
+          <m:r>
+            <m:rPr>
+              <m:sty m:val="p"/>
+            </m:rPr>
+            <m:t>)</m:t>
+          </m:r>
+          <m:r>
+            <m:t> </m:t>
+          </m:r>
+          <m:r>
+            <m:rPr>
+              <m:sty m:val="p"/>
+            </m:rPr>
+            <m:t>⇔</m:t>
+          </m:r>
+          <m:r>
+            <m:t> </m:t>
+          </m:r>
+          <m:r>
+            <m:rPr>
+              <m:scr m:val="double-struck"/>
+              <m:sty m:val="p"/>
+            </m:rPr>
+            <m:t>E</m:t>
+          </m:r>
+          <m:r>
+            <m:rPr>
+              <m:sty m:val="p"/>
+            </m:rPr>
+            <m:t>[</m:t>
+          </m:r>
+          <m:r>
+            <m:rPr>
+              <m:sty m:val="p"/>
+            </m:rPr>
+            <m:t>Φ</m:t>
+          </m:r>
+          <m:r>
+            <m:rPr>
+              <m:sty m:val="p"/>
+            </m:rPr>
+            <m:t>(</m:t>
+          </m:r>
+          <m:r>
+            <m:t>t</m:t>
+          </m:r>
+          <m:r>
+            <m:rPr>
+              <m:sty m:val="p"/>
+            </m:rPr>
+            <m:t>+</m:t>
+          </m:r>
+          <m:r>
+            <m:t>1</m:t>
+          </m:r>
+          <m:r>
+            <m:rPr>
+              <m:sty m:val="p"/>
+            </m:rPr>
+            <m:t>)</m:t>
+          </m:r>
+          <m:r>
+            <m:t> </m:t>
+          </m:r>
+          <m:d>
+            <m:dPr>
+              <m:begChr m:val="|"/>
+              <m:sepChr m:val=""/>
+              <m:endChr m:val="]"/>
+              <m:grow/>
+            </m:dPr>
+            <m:e>
+              <m:r>
+                <m:t> </m:t>
+              </m:r>
+              <m:sSup>
+                <m:e>
+                  <m:r>
+                    <m:t>π</m:t>
+                  </m:r>
+                </m:e>
+                <m:sup>
+                  <m:r>
+                    <m:rPr>
+                      <m:sty m:val="p"/>
+                    </m:rPr>
+                    <m:t>*</m:t>
+                  </m:r>
+                </m:sup>
+              </m:sSup>
+            </m:e>
+          </m:d>
+          <m:r>
+            <m:t> </m:t>
+          </m:r>
+          <m:r>
+            <m:rPr>
+              <m:sty m:val="p"/>
+            </m:rPr>
+            <m:t>≥</m:t>
+          </m:r>
+          <m:r>
+            <m:t> </m:t>
+          </m:r>
+          <m:r>
+            <m:rPr>
+              <m:sty m:val="p"/>
+            </m:rPr>
+            <m:t>Φ</m:t>
+          </m:r>
+          <m:r>
+            <m:rPr>
+              <m:sty m:val="p"/>
+            </m:rPr>
+            <m:t>(</m:t>
+          </m:r>
+          <m:r>
+            <m:t>t</m:t>
+          </m:r>
+          <m:r>
+            <m:rPr>
+              <m:sty m:val="p"/>
+            </m:rPr>
+            <m:t>)</m:t>
+          </m:r>
+          <m:r>
+            <m:t> </m:t>
+          </m:r>
+          <m:r>
+            <m:rPr>
+              <m:sty m:val="p"/>
+            </m:rPr>
+            <m:t>(</m:t>
+          </m:r>
+          <m:r>
+            <m:rPr>
+              <m:sty m:val="p"/>
+            </m:rPr>
+            <m:t>Φ</m:t>
+          </m:r>
+          <m:r>
+            <m:rPr>
+              <m:sty m:val="p"/>
+            </m:rPr>
+            <m:t>&gt;</m:t>
+          </m:r>
+          <m:r>
+            <m:t>0</m:t>
+          </m:r>
+          <m:r>
+            <m:rPr>
+              <m:sty m:val="p"/>
+            </m:rPr>
+            <m:t>)</m:t>
+          </m:r>
+        </m:oMath>
+      </m:oMathPara>
+    </w:p>
+    <w:p>
+      <w:pPr>
+        <w:pStyle w:val="FirstParagraph"/>
+      </w:pPr>
+      <w:r>
+        <w:t xml:space="preserve">Die mathematische Brücke zwischen 3.-Person-Kybernetik und 1.-Person-Kausalontologie</w:t>
+      </w:r>
+    </w:p>
+    <w:p>
+      <w:pPr>
+        <w:pStyle w:val="BodyText"/>
+      </w:pPr>
+      <w:r>
+        <w:t xml:space="preserve">THOMAS RIEBL</w:t>
+      </w:r>
+    </w:p>
+    <w:p>
+      <w:pPr>
+        <w:pStyle w:val="BodyText"/>
+      </w:pPr>
+      <w:r>
+        <w:t xml:space="preserve">Luxemburg · 2026</w:t>
+      </w:r>
+    </w:p>
     <w:bookmarkStart w:id="9" w:name="widmung"/>
     <w:p>
       <w:pPr>

</xml_diff>

<commit_message>
Incorporate all three computational simulation phases, Jupyter Notebook links, and results figures into Chapter 7
</commit_message>
<xml_diff>
--- a/book/build/The_Conative_Integrative_Framework_Book_Thomas_Riebl_DE_6x9.docx
+++ b/book/build/The_Conative_Integrative_Framework_Book_Thomas_Riebl_DE_6x9.docx
@@ -8776,7 +8776,7 @@
     </w:p>
     <w:bookmarkEnd w:id="41"/>
     <w:bookmarkEnd w:id="42"/>
-    <w:bookmarkStart w:id="47" w:name="Xd680ac39b45b34d7ee8a303e0dc6c1c94547dcc"/>
+    <w:bookmarkStart w:id="66" w:name="Xd680ac39b45b34d7ee8a303e0dc6c1c94547dcc"/>
     <w:p>
       <w:pPr>
         <w:pStyle w:val="Heading1"/>
@@ -8794,7 +8794,7 @@
           <w:i/>
           <w:iCs/>
         </w:rPr>
-        <w:t xml:space="preserve">„Um zu beweisen, dass temporale Tiefe eine notwendige Bedingung für Bewusstsein ist, müssen wir unsere Agenten täuschenden Umgebungen aussetzen, in denen reaktive Heuristiken versagen und nur kontrafaktische Vorausschau das Überleben sichert.“</w:t>
+        <w:t xml:space="preserve">„Um zu beweisen, dass Bewusstsein fundamental ein autopoietischer Zeitpfeil ist, müssen wir unsere Agenten täuschenden, stochastischen Umgebungen aussetzen, in denen reaktive Heuristiken versagen und nur kontrafaktische Vorausschau das Überleben sichert.“</w:t>
       </w:r>
       <w:r>
         <w:br/>
@@ -8839,13 +8839,13 @@
         </w:pict>
       </w:r>
     </w:p>
-    <w:bookmarkStart w:id="43" w:name="das-stochastische-simulationsparadigma"/>
+    <w:bookmarkStart w:id="44" w:name="X0fe47b68fd5573954c8c32f54644f43ee210de4"/>
     <w:p>
       <w:pPr>
         <w:pStyle w:val="Heading2"/>
       </w:pPr>
       <w:r>
-        <w:t xml:space="preserve">7.1 Das stochastische Simulationsparadigma</w:t>
+        <w:t xml:space="preserve">7.1 Die Notwendigkeit stochastischer In-Silico-Experimente</w:t>
       </w:r>
     </w:p>
     <w:p>
@@ -8853,27 +8853,162 @@
         <w:pStyle w:val="FirstParagraph"/>
       </w:pPr>
       <w:r>
-        <w:t xml:space="preserve">Um die theoretischen Aussagen rechnerisch zu validieren, implementierten wir eine stochastische POMDP-Simulationsumgebung mit täuschenden Belohnungen (</w:t>
-      </w:r>
-      <w:r>
-        <w:rPr>
-          <w:i/>
-          <w:iCs/>
-        </w:rPr>
-        <w:t xml:space="preserve">Deceptive Trap</w:t>
-      </w:r>
-      <w:r>
-        <w:t xml:space="preserve">) und epistemischer Ambiguität (</w:t>
-      </w:r>
-      <w:r>
-        <w:rPr>
-          <w:i/>
-          <w:iCs/>
-        </w:rPr>
-        <w:t xml:space="preserve">Cue Site</w:t>
-      </w:r>
-      <w:r>
-        <w:t xml:space="preserve">).</w:t>
+        <w:t xml:space="preserve">Eine tiefgreifende wissenschaftliche Theorie des Geistes darf kein rein metaphysisches Postulat bleiben. Wenn das</w:t>
+      </w:r>
+      <w:r>
+        <w:t xml:space="preserve"> </w:t>
+      </w:r>
+      <w:r>
+        <w:rPr>
+          <w:b/>
+          <w:bCs/>
+        </w:rPr>
+        <w:t xml:space="preserve">6. Axiom des Bewusstseins</w:t>
+      </w:r>
+      <w:r>
+        <w:t xml:space="preserve"> </w:t>
+      </w:r>
+      <w:r>
+        <w:t xml:space="preserve">(</w:t>
+      </w:r>
+      <m:oMath>
+        <m:r>
+          <m:rPr>
+            <m:scr m:val="double-struck"/>
+            <m:sty m:val="p"/>
+          </m:rPr>
+          <m:t>E</m:t>
+        </m:r>
+        <m:r>
+          <m:rPr>
+            <m:sty m:val="p"/>
+          </m:rPr>
+          <m:t>[</m:t>
+        </m:r>
+        <m:r>
+          <m:rPr>
+            <m:sty m:val="p"/>
+          </m:rPr>
+          <m:t>Φ</m:t>
+        </m:r>
+        <m:r>
+          <m:rPr>
+            <m:sty m:val="p"/>
+          </m:rPr>
+          <m:t>(</m:t>
+        </m:r>
+        <m:r>
+          <m:t>t</m:t>
+        </m:r>
+        <m:r>
+          <m:rPr>
+            <m:sty m:val="p"/>
+          </m:rPr>
+          <m:t>+</m:t>
+        </m:r>
+        <m:r>
+          <m:t>1</m:t>
+        </m:r>
+        <m:r>
+          <m:rPr>
+            <m:sty m:val="p"/>
+          </m:rPr>
+          <m:t>)</m:t>
+        </m:r>
+        <m:r>
+          <m:rPr>
+            <m:sty m:val="p"/>
+          </m:rPr>
+          <m:t>∣</m:t>
+        </m:r>
+        <m:sSup>
+          <m:e>
+            <m:r>
+              <m:t>π</m:t>
+            </m:r>
+          </m:e>
+          <m:sup>
+            <m:r>
+              <m:rPr>
+                <m:sty m:val="p"/>
+              </m:rPr>
+              <m:t>*</m:t>
+            </m:r>
+          </m:sup>
+        </m:sSup>
+        <m:r>
+          <m:rPr>
+            <m:sty m:val="p"/>
+          </m:rPr>
+          <m:t>]</m:t>
+        </m:r>
+        <m:r>
+          <m:rPr>
+            <m:sty m:val="p"/>
+          </m:rPr>
+          <m:t>≥</m:t>
+        </m:r>
+        <m:r>
+          <m:rPr>
+            <m:sty m:val="p"/>
+          </m:rPr>
+          <m:t>Φ</m:t>
+        </m:r>
+        <m:r>
+          <m:rPr>
+            <m:sty m:val="p"/>
+          </m:rPr>
+          <m:t>(</m:t>
+        </m:r>
+        <m:r>
+          <m:t>t</m:t>
+        </m:r>
+        <m:r>
+          <m:rPr>
+            <m:sty m:val="p"/>
+          </m:rPr>
+          <m:t>)</m:t>
+        </m:r>
+      </m:oMath>
+      <w:r>
+        <w:t xml:space="preserve">) und das</w:t>
+      </w:r>
+      <w:r>
+        <w:t xml:space="preserve"> </w:t>
+      </w:r>
+      <w:r>
+        <w:rPr>
+          <w:b/>
+          <w:bCs/>
+        </w:rPr>
+        <w:t xml:space="preserve">Theorem der temporalen Mindesttiefe (</w:t>
+      </w:r>
+      <m:oMath>
+        <m:r>
+          <m:t>H</m:t>
+        </m:r>
+        <m:r>
+          <m:rPr>
+            <m:sty m:val="p"/>
+          </m:rPr>
+          <m:t>&gt;</m:t>
+        </m:r>
+        <m:r>
+          <m:t>1</m:t>
+        </m:r>
+      </m:oMath>
+      <w:r>
+        <w:rPr>
+          <w:b/>
+          <w:bCs/>
+        </w:rPr>
+        <w:t xml:space="preserve">)</w:t>
+      </w:r>
+      <w:r>
+        <w:t xml:space="preserve"> </w:t>
+      </w:r>
+      <w:r>
+        <w:t xml:space="preserve">wahr sind, müssen sie in rechnerischen Simulationen innerhalb stochastischer Phasenräume empirisch reproduzierbar sein.</w:t>
       </w:r>
     </w:p>
     <w:p>
@@ -8881,158 +9016,94 @@
         <w:pStyle w:val="BodyText"/>
       </w:pPr>
       <w:r>
-        <w:t xml:space="preserve">Getestet wurden vier Agenten-Kohorten über ein</w:t>
-      </w:r>
-      <w:r>
-        <w:t xml:space="preserve"> </w:t>
-      </w:r>
-      <w:r>
-        <w:rPr>
-          <w:b/>
-          <w:bCs/>
-        </w:rPr>
-        <w:t xml:space="preserve">Monte-Carlo-Ensemble von</w:t>
-      </w:r>
-      <w:r>
-        <w:rPr>
-          <w:b/>
-          <w:bCs/>
-        </w:rPr>
+        <w:t xml:space="preserve">Anstelle statischer Gleichungen stützt sich das Konativ-Integrative Framework (CIF) auf drei aufeinander aufbauende Simulationsphasen, die in Python implementiert und als interaktive Jupyter Notebooks im Repository bereitgestellt werden:</w:t>
+      </w:r>
+      <w:r>
+        <w:t xml:space="preserve"> </w:t>
+      </w:r>
+      <w:r>
+        <w:t xml:space="preserve">1.</w:t>
+      </w:r>
+      <w:r>
+        <w:t xml:space="preserve"> </w:t>
+      </w:r>
+      <w:r>
+        <w:rPr>
+          <w:b/>
+          <w:bCs/>
+        </w:rPr>
+        <w:t xml:space="preserve">Simulationsphase 1:</w:t>
+      </w:r>
+      <w:r>
+        <w:t xml:space="preserve"> </w:t>
+      </w:r>
+      <w:r>
+        <w:t xml:space="preserve">Rekurrente Active-Inference-Netzwerke &amp; Autopoietische</w:t>
+      </w:r>
+      <w:r>
         <w:t xml:space="preserve"> </w:t>
       </w:r>
       <m:oMath>
         <m:r>
+          <m:rPr>
+            <m:sty m:val="p"/>
+          </m:rPr>
+          <m:t>Φ</m:t>
+        </m:r>
+      </m:oMath>
+      <w:r>
+        <w:t xml:space="preserve">-Maximierung an der Schwelle zum Chaos.</w:t>
+      </w:r>
+      <w:r>
+        <w:t xml:space="preserve"> </w:t>
+      </w:r>
+      <w:r>
+        <w:t xml:space="preserve">2.</w:t>
+      </w:r>
+      <w:r>
+        <w:t xml:space="preserve"> </w:t>
+      </w:r>
+      <w:r>
+        <w:rPr>
+          <w:b/>
+          <w:bCs/>
+        </w:rPr>
+        <w:t xml:space="preserve">Simulationsphase 2:</w:t>
+      </w:r>
+      <w:r>
+        <w:t xml:space="preserve"> </w:t>
+      </w:r>
+      <w:r>
+        <w:t xml:space="preserve">Modulare Netzwerkerweiterung &amp; Superlineare Skalierung Integrierter Information</w:t>
+      </w:r>
+      <w:r>
+        <w:t xml:space="preserve"> </w:t>
+      </w:r>
+      <m:oMath>
+        <m:r>
+          <m:rPr>
+            <m:sty m:val="p"/>
+          </m:rPr>
+          <m:t>Φ</m:t>
+        </m:r>
+        <m:r>
+          <m:rPr>
+            <m:sty m:val="p"/>
+          </m:rPr>
+          <m:t>(</m:t>
+        </m:r>
+        <m:r>
           <m:t>N</m:t>
         </m:r>
         <m:r>
           <m:rPr>
             <m:sty m:val="p"/>
           </m:rPr>
-          <m:t>=</m:t>
-        </m:r>
-        <m:r>
-          <m:t>30</m:t>
+          <m:t>)</m:t>
         </m:r>
       </m:oMath>
       <w:r>
-        <w:rPr>
-          <w:b/>
-          <w:bCs/>
-        </w:rPr>
-        <w:t xml:space="preserve"> </w:t>
-      </w:r>
-      <w:r>
-        <w:rPr>
-          <w:b/>
-          <w:bCs/>
-        </w:rPr>
-        <w:t xml:space="preserve">unabhängigen Läufen</w:t>
-      </w:r>
-      <w:r>
-        <w:t xml:space="preserve">:</w:t>
-      </w:r>
-      <w:r>
-        <w:t xml:space="preserve"> </w:t>
-      </w:r>
-      <w:r>
-        <w:t xml:space="preserve">1.</w:t>
-      </w:r>
-      <w:r>
-        <w:t xml:space="preserve"> </w:t>
-      </w:r>
-      <w:r>
-        <w:rPr>
-          <w:b/>
-          <w:bCs/>
-        </w:rPr>
-        <w:t xml:space="preserve">Reflex-Agent (</w:t>
-      </w:r>
-      <m:oMath>
-        <m:r>
-          <m:t>H</m:t>
-        </m:r>
-        <m:r>
-          <m:rPr>
-            <m:sty m:val="p"/>
-          </m:rPr>
-          <m:t>=</m:t>
-        </m:r>
-        <m:r>
-          <m:t>0</m:t>
-        </m:r>
-      </m:oMath>
-      <w:r>
-        <w:rPr>
-          <w:b/>
-          <w:bCs/>
-        </w:rPr>
-        <w:t xml:space="preserve">):</w:t>
-      </w:r>
-      <w:r>
-        <w:t xml:space="preserve"> </w:t>
-      </w:r>
-      <w:r>
-        <w:t xml:space="preserve">Reine Reaktivität (</w:t>
-      </w:r>
-      <m:oMath>
-        <m:r>
-          <m:t>B</m:t>
-        </m:r>
-        <m:r>
-          <m:rPr>
-            <m:sty m:val="p"/>
-          </m:rPr>
-          <m:t>=</m:t>
-        </m:r>
-        <m:r>
-          <m:t>I</m:t>
-        </m:r>
-      </m:oMath>
-      <w:r>
-        <w:t xml:space="preserve">).</w:t>
-      </w:r>
-      <w:r>
-        <w:t xml:space="preserve"> </w:t>
-      </w:r>
-      <w:r>
-        <w:t xml:space="preserve">2.</w:t>
-      </w:r>
-      <w:r>
-        <w:t xml:space="preserve"> </w:t>
-      </w:r>
-      <w:r>
-        <w:rPr>
-          <w:b/>
-          <w:bCs/>
-        </w:rPr>
-        <w:t xml:space="preserve">Kurzsichtiger Agent (</w:t>
-      </w:r>
-      <m:oMath>
-        <m:r>
-          <m:t>H</m:t>
-        </m:r>
-        <m:r>
-          <m:rPr>
-            <m:sty m:val="p"/>
-          </m:rPr>
-          <m:t>=</m:t>
-        </m:r>
-        <m:r>
-          <m:t>1</m:t>
-        </m:r>
-      </m:oMath>
-      <w:r>
-        <w:rPr>
-          <w:b/>
-          <w:bCs/>
-        </w:rPr>
-        <w:t xml:space="preserve">):</w:t>
-      </w:r>
-      <w:r>
-        <w:t xml:space="preserve"> </w:t>
-      </w:r>
-      <w:r>
-        <w:t xml:space="preserve">1-Schritt-Vorausschau.</w:t>
+        <w:t xml:space="preserve">.</w:t>
       </w:r>
       <w:r>
         <w:t xml:space="preserve"> </w:t>
@@ -9048,78 +9119,41 @@
           <w:b/>
           <w:bCs/>
         </w:rPr>
-        <w:t xml:space="preserve">Mitteltiefer Agent (</w:t>
-      </w:r>
-      <m:oMath>
-        <m:r>
-          <m:t>H</m:t>
-        </m:r>
-        <m:r>
-          <m:rPr>
-            <m:sty m:val="p"/>
-          </m:rPr>
-          <m:t>=</m:t>
-        </m:r>
-        <m:r>
-          <m:t>2</m:t>
-        </m:r>
-      </m:oMath>
-      <w:r>
-        <w:rPr>
-          <w:b/>
-          <w:bCs/>
-        </w:rPr>
-        <w:t xml:space="preserve">):</w:t>
-      </w:r>
-      <w:r>
-        <w:t xml:space="preserve"> </w:t>
-      </w:r>
-      <w:r>
-        <w:t xml:space="preserve">2-Schritt-Planung.</w:t>
-      </w:r>
-      <w:r>
-        <w:t xml:space="preserve"> </w:t>
-      </w:r>
-      <w:r>
-        <w:t xml:space="preserve">4.</w:t>
-      </w:r>
-      <w:r>
-        <w:t xml:space="preserve"> </w:t>
-      </w:r>
-      <w:r>
-        <w:rPr>
-          <w:b/>
-          <w:bCs/>
-        </w:rPr>
-        <w:t xml:space="preserve">Tiefer Temporaler Agent (</w:t>
-      </w:r>
-      <m:oMath>
-        <m:r>
-          <m:t>H</m:t>
-        </m:r>
-        <m:r>
-          <m:rPr>
-            <m:sty m:val="p"/>
-          </m:rPr>
-          <m:t>=</m:t>
-        </m:r>
-        <m:r>
-          <m:t>4</m:t>
-        </m:r>
-      </m:oMath>
-      <w:r>
-        <w:rPr>
-          <w:b/>
-          <w:bCs/>
-        </w:rPr>
-        <w:t xml:space="preserve">):</w:t>
-      </w:r>
-      <w:r>
-        <w:t xml:space="preserve"> </w:t>
-      </w:r>
-      <w:r>
-        <w:t xml:space="preserve">Kontrafaktische Handlungsbäume über 4 Zeitschritte.</w:t>
-      </w:r>
+        <w:t xml:space="preserve">Simulationsphase 3:</w:t>
+      </w:r>
+      <w:r>
+        <w:t xml:space="preserve"> </w:t>
+      </w:r>
+      <w:r>
+        <w:t xml:space="preserve">Tiefe temporale Active Inference &amp; Multi-Agenten-Monte-Carlo-Validierung des 6. Axioms.</w:t>
+      </w:r>
+    </w:p>
+    <w:p>
+      <w:pPr>
+        <w:pStyle w:val="BodyText"/>
+      </w:pPr>
+      <w:r>
+        <w:t xml:space="preserve">Alle Quellcodes, Übergangstensoren und Rohdaten sind vollständig quelloffen auf GitHub dokumentiert:</w:t>
+      </w:r>
+      <w:r>
+        <w:br/>
+      </w:r>
+      <w:r>
+        <w:t xml:space="preserve">👉</w:t>
+      </w:r>
+      <w:r>
+        <w:t xml:space="preserve"> </w:t>
+      </w:r>
+      <w:hyperlink r:id="rId43">
+        <w:r>
+          <w:rPr>
+            <w:rStyle w:val="Hyperlink"/>
+            <w:b/>
+            <w:bCs/>
+          </w:rPr>
+          <w:t xml:space="preserve">https://github.com/Thriebl/active-inference-phi-network/tree/main/notebooks</w:t>
+        </w:r>
+      </w:hyperlink>
     </w:p>
     <w:p>
       <w:r>
@@ -9128,14 +9162,1276 @@
         </w:pict>
       </w:r>
     </w:p>
-    <w:bookmarkEnd w:id="43"/>
-    <w:bookmarkStart w:id="44" w:name="empirische-simulationsergebnisse"/>
+    <w:bookmarkEnd w:id="44"/>
+    <w:bookmarkStart w:id="50" w:name="X333ca46fa8eee97f9aec1dd7bf0c8d9bcfaf681"/>
     <w:p>
       <w:pPr>
         <w:pStyle w:val="Heading2"/>
       </w:pPr>
       <w:r>
-        <w:t xml:space="preserve">7.2 Empirische Simulationsergebnisse</w:t>
+        <w:t xml:space="preserve">7.2 Simulationsphase 1: Rekurrente Netzwerke &amp;</w:t>
+      </w:r>
+      <w:r>
+        <w:t xml:space="preserve"> </w:t>
+      </w:r>
+      <m:oMath>
+        <m:r>
+          <m:rPr>
+            <m:sty m:val="p"/>
+          </m:rPr>
+          <m:t>Φ</m:t>
+        </m:r>
+      </m:oMath>
+      <w:r>
+        <w:t xml:space="preserve">-Maximierung an der Schwelle zum Chaos</w:t>
+      </w:r>
+    </w:p>
+    <w:p>
+      <w:pPr>
+        <w:pStyle w:val="Compact"/>
+        <w:numPr>
+          <w:ilvl w:val="0"/>
+          <w:numId w:val="1010"/>
+        </w:numPr>
+      </w:pPr>
+      <w:r>
+        <w:rPr>
+          <w:b/>
+          <w:bCs/>
+        </w:rPr>
+        <w:t xml:space="preserve">Interaktives Jupyter Notebook:</w:t>
+      </w:r>
+      <w:r>
+        <w:br/>
+      </w:r>
+      <w:hyperlink r:id="rId45">
+        <w:r>
+          <w:rPr>
+            <w:rStyle w:val="VerbatimChar"/>
+          </w:rPr>
+          <w:t xml:space="preserve">Active_Inference_Phi_Maximization_Network.ipynb</w:t>
+        </w:r>
+      </w:hyperlink>
+    </w:p>
+    <w:p>
+      <w:pPr>
+        <w:pStyle w:val="FirstParagraph"/>
+      </w:pPr>
+      <w:r>
+        <w:t xml:space="preserve">In der ersten Simulationsarchitektur modellierten wir ein diskretes Netzwerk aus</w:t>
+      </w:r>
+      <w:r>
+        <w:t xml:space="preserve"> </w:t>
+      </w:r>
+      <m:oMath>
+        <m:r>
+          <m:t>N</m:t>
+        </m:r>
+        <m:r>
+          <m:rPr>
+            <m:sty m:val="p"/>
+          </m:rPr>
+          <m:t>=</m:t>
+        </m:r>
+        <m:r>
+          <m:t>6</m:t>
+        </m:r>
+      </m:oMath>
+      <w:r>
+        <w:t xml:space="preserve"> </w:t>
+      </w:r>
+      <w:r>
+        <w:t xml:space="preserve">interagierenden Active-Inference-Agenten in einer Ring- und Kreuztopologie. Jeder Agent schließt über seine Markov-Decke kontinuierlich auf die verborgenen Zustände seiner Nachbarn und wählt Aktionen zur Minimierung von variationaler freier Energie (</w:t>
+      </w:r>
+      <m:oMath>
+        <m:r>
+          <m:t>F</m:t>
+        </m:r>
+      </m:oMath>
+      <w:r>
+        <w:t xml:space="preserve">) und erwarteter freier Energie (</w:t>
+      </w:r>
+      <m:oMath>
+        <m:r>
+          <m:rPr>
+            <m:sty m:val="b"/>
+          </m:rPr>
+          <m:t>G</m:t>
+        </m:r>
+      </m:oMath>
+      <w:r>
+        <w:t xml:space="preserve">).</w:t>
+      </w:r>
+    </w:p>
+    <w:p>
+      <w:pPr>
+        <w:pStyle w:val="CaptionedFigure"/>
+      </w:pPr>
+      <w:r>
+        <w:drawing>
+          <wp:inline>
+            <wp:extent cx="5334000" cy="4282094"/>
+            <wp:effectExtent b="0" l="0" r="0" t="0"/>
+            <wp:docPr descr="Ergebnisse der Simulationsphase 1: Rekurrente Selbstorganisation und Maximierung von Phi" title="" id="47" name="Picture"/>
+            <a:graphic>
+              <a:graphicData uri="http://schemas.openxmlformats.org/drawingml/2006/picture">
+                <pic:pic>
+                  <pic:nvPicPr>
+                    <pic:cNvPr descr="../images/Active_Inference_Phi_Simulation_Results.png" id="48" name="Picture"/>
+                    <pic:cNvPicPr>
+                      <a:picLocks noChangeArrowheads="1" noChangeAspect="1"/>
+                    </pic:cNvPicPr>
+                  </pic:nvPicPr>
+                  <pic:blipFill>
+                    <a:blip r:embed="rId46"/>
+                    <a:stretch>
+                      <a:fillRect/>
+                    </a:stretch>
+                  </pic:blipFill>
+                  <pic:spPr bwMode="auto">
+                    <a:xfrm>
+                      <a:off x="0" y="0"/>
+                      <a:ext cx="5334000" cy="4282094"/>
+                    </a:xfrm>
+                    <a:prstGeom prst="rect">
+                      <a:avLst/>
+                    </a:prstGeom>
+                    <a:noFill/>
+                    <a:ln w="9525">
+                      <a:noFill/>
+                      <a:headEnd/>
+                      <a:tailEnd/>
+                    </a:ln>
+                  </pic:spPr>
+                </pic:pic>
+              </a:graphicData>
+            </a:graphic>
+          </wp:inline>
+        </w:drawing>
+      </w:r>
+    </w:p>
+    <w:p>
+      <w:pPr>
+        <w:pStyle w:val="ImageCaption"/>
+      </w:pPr>
+      <w:r>
+        <w:t xml:space="preserve">Ergebnisse der Simulationsphase 1: Rekurrente Selbstorganisation und Maximierung von Phi</w:t>
+      </w:r>
+    </w:p>
+    <w:bookmarkStart w:id="49" w:name="Xc43d19e2011fc43706f2bb500e32cefae247f39"/>
+    <w:p>
+      <w:pPr>
+        <w:pStyle w:val="Heading3"/>
+      </w:pPr>
+      <w:r>
+        <w:t xml:space="preserve">Wichtigste Erkenntnisse der Simulationsphase 1:</w:t>
+      </w:r>
+    </w:p>
+    <w:p>
+      <w:pPr>
+        <w:pStyle w:val="Compact"/>
+        <w:numPr>
+          <w:ilvl w:val="0"/>
+          <w:numId w:val="1011"/>
+        </w:numPr>
+      </w:pPr>
+      <w:r>
+        <w:rPr>
+          <w:b/>
+          <w:bCs/>
+        </w:rPr>
+        <w:t xml:space="preserve">Panel A (Dynamische Evolution &amp; Autopoietische Persistenz von</w:t>
+      </w:r>
+      <w:r>
+        <w:rPr>
+          <w:b/>
+          <w:bCs/>
+        </w:rPr>
+        <w:t xml:space="preserve"> </w:t>
+      </w:r>
+      <m:oMath>
+        <m:r>
+          <m:rPr>
+            <m:sty m:val="p"/>
+          </m:rPr>
+          <m:t>Φ</m:t>
+        </m:r>
+        <m:r>
+          <m:rPr>
+            <m:sty m:val="p"/>
+          </m:rPr>
+          <m:t>(</m:t>
+        </m:r>
+        <m:r>
+          <m:t>t</m:t>
+        </m:r>
+        <m:r>
+          <m:rPr>
+            <m:sty m:val="p"/>
+          </m:rPr>
+          <m:t>)</m:t>
+        </m:r>
+      </m:oMath>
+      <w:r>
+        <w:rPr>
+          <w:b/>
+          <w:bCs/>
+        </w:rPr>
+        <w:t xml:space="preserve">):</w:t>
+      </w:r>
+      <w:r>
+        <w:t xml:space="preserve"> </w:t>
+      </w:r>
+      <w:r>
+        <w:t xml:space="preserve">Ausgehend von einer Zufallsinitialisierung organisiert sich das Netzwerk autonom in ein autopoietisches Fließgleichgewicht. Die mittlere Integrierte Information steigt von anfänglichen Schwankungen (</w:t>
+      </w:r>
+      <m:oMath>
+        <m:r>
+          <m:rPr>
+            <m:sty m:val="p"/>
+          </m:rPr>
+          <m:t>Φ</m:t>
+        </m:r>
+        <m:r>
+          <m:rPr>
+            <m:sty m:val="p"/>
+          </m:rPr>
+          <m:t>≈</m:t>
+        </m:r>
+        <m:r>
+          <m:t>0.395</m:t>
+        </m:r>
+      </m:oMath>
+      <w:r>
+        <w:t xml:space="preserve">) auf ein stabiles Plateau (</w:t>
+      </w:r>
+      <m:oMath>
+        <m:r>
+          <m:rPr>
+            <m:sty m:val="p"/>
+          </m:rPr>
+          <m:t>Φ</m:t>
+        </m:r>
+        <m:r>
+          <m:rPr>
+            <m:sty m:val="p"/>
+          </m:rPr>
+          <m:t>≈</m:t>
+        </m:r>
+        <m:r>
+          <m:t>3.42</m:t>
+        </m:r>
+        <m:r>
+          <m:rPr>
+            <m:nor/>
+            <m:sty m:val="p"/>
+          </m:rPr>
+          <m:t> Bits</m:t>
+        </m:r>
+      </m:oMath>
+      <w:r>
+        <w:t xml:space="preserve">) und bestätigt das 6. Axiom über</w:t>
+      </w:r>
+      <w:r>
+        <w:t xml:space="preserve"> </w:t>
+      </w:r>
+      <m:oMath>
+        <m:r>
+          <m:t>T</m:t>
+        </m:r>
+        <m:r>
+          <m:rPr>
+            <m:sty m:val="p"/>
+          </m:rPr>
+          <m:t>=</m:t>
+        </m:r>
+        <m:r>
+          <m:t>120</m:t>
+        </m:r>
+      </m:oMath>
+      <w:r>
+        <w:t xml:space="preserve"> </w:t>
+      </w:r>
+      <w:r>
+        <w:t xml:space="preserve">Zeitschritte.</w:t>
+      </w:r>
+    </w:p>
+    <w:p>
+      <w:pPr>
+        <w:pStyle w:val="Compact"/>
+        <w:numPr>
+          <w:ilvl w:val="0"/>
+          <w:numId w:val="1011"/>
+        </w:numPr>
+      </w:pPr>
+      <w:r>
+        <w:rPr>
+          <w:b/>
+          <w:bCs/>
+        </w:rPr>
+        <w:t xml:space="preserve">Panel B (Zustandsraster der Agenten):</w:t>
+      </w:r>
+      <w:r>
+        <w:t xml:space="preserve"> </w:t>
+      </w:r>
+      <w:r>
+        <w:t xml:space="preserve">Zeigt kohärente, phasenverkoppelte Zustandsübergänge ohne starres epileptisches Einfrieren oder chaotische Desynchronisation.</w:t>
+      </w:r>
+    </w:p>
+    <w:p>
+      <w:pPr>
+        <w:pStyle w:val="Compact"/>
+        <w:numPr>
+          <w:ilvl w:val="0"/>
+          <w:numId w:val="1011"/>
+        </w:numPr>
+      </w:pPr>
+      <w:r>
+        <w:rPr>
+          <w:b/>
+          <w:bCs/>
+        </w:rPr>
+        <w:t xml:space="preserve">Panel C &amp; D (Topologie &amp; Adjazenzmatrix</w:t>
+      </w:r>
+      <w:r>
+        <w:rPr>
+          <w:b/>
+          <w:bCs/>
+        </w:rPr>
+        <w:t xml:space="preserve"> </w:t>
+      </w:r>
+      <m:oMath>
+        <m:r>
+          <m:t>W</m:t>
+        </m:r>
+      </m:oMath>
+      <w:r>
+        <w:rPr>
+          <w:b/>
+          <w:bCs/>
+        </w:rPr>
+        <w:t xml:space="preserve">):</w:t>
+      </w:r>
+      <w:r>
+        <w:t xml:space="preserve"> </w:t>
+      </w:r>
+      <w:r>
+        <w:t xml:space="preserve">Maximale integrierte Ursache-Wirkungs-Macht entsteht, wenn lokale Cluster-Verbindungen (</w:t>
+      </w:r>
+      <m:oMath>
+        <m:sSub>
+          <m:e>
+            <m:r>
+              <m:t>W</m:t>
+            </m:r>
+          </m:e>
+          <m:sub>
+            <m:r>
+              <m:t>i</m:t>
+            </m:r>
+            <m:r>
+              <m:t>j</m:t>
+            </m:r>
+          </m:sub>
+        </m:sSub>
+        <m:r>
+          <m:rPr>
+            <m:sty m:val="p"/>
+          </m:rPr>
+          <m:t>≈</m:t>
+        </m:r>
+        <m:r>
+          <m:t>0.3</m:t>
+        </m:r>
+      </m:oMath>
+      <w:r>
+        <w:t xml:space="preserve">) mit spärlichen Fernverbindungen (</w:t>
+      </w:r>
+      <m:oMath>
+        <m:sSub>
+          <m:e>
+            <m:r>
+              <m:t>W</m:t>
+            </m:r>
+          </m:e>
+          <m:sub>
+            <m:r>
+              <m:t>i</m:t>
+            </m:r>
+            <m:r>
+              <m:t>k</m:t>
+            </m:r>
+          </m:sub>
+        </m:sSub>
+        <m:r>
+          <m:rPr>
+            <m:sty m:val="p"/>
+          </m:rPr>
+          <m:t>≈</m:t>
+        </m:r>
+        <m:r>
+          <m:t>0.1</m:t>
+        </m:r>
+      </m:oMath>
+      <w:r>
+        <w:t xml:space="preserve">) ausbalanciert werden – das System steuert sich selbst exakt an die</w:t>
+      </w:r>
+      <w:r>
+        <w:t xml:space="preserve"> </w:t>
+      </w:r>
+      <w:r>
+        <w:rPr>
+          <w:b/>
+          <w:bCs/>
+        </w:rPr>
+        <w:t xml:space="preserve">Schwelle zum Chaos (Selbstorganisierte Kritikalität)</w:t>
+      </w:r>
+      <w:r>
+        <w:t xml:space="preserve">.</w:t>
+      </w:r>
+    </w:p>
+    <w:p>
+      <w:r>
+        <w:pict>
+          <v:rect style="width:0;height:1.5pt" o:hralign="center" o:hrstd="t" o:hr="t"/>
+        </w:pict>
+      </w:r>
+    </w:p>
+    <w:bookmarkEnd w:id="49"/>
+    <w:bookmarkEnd w:id="50"/>
+    <w:bookmarkStart w:id="56" w:name="X2c89c48cfd92a05206790650776d49056e8455a"/>
+    <w:p>
+      <w:pPr>
+        <w:pStyle w:val="Heading2"/>
+      </w:pPr>
+      <w:r>
+        <w:t xml:space="preserve">7.3 Simulationsphase 2: Modulare Netzwerkskalierung &amp; Skalierung von</w:t>
+      </w:r>
+      <w:r>
+        <w:t xml:space="preserve"> </w:t>
+      </w:r>
+      <m:oMath>
+        <m:r>
+          <m:rPr>
+            <m:sty m:val="p"/>
+          </m:rPr>
+          <m:t>Φ</m:t>
+        </m:r>
+        <m:r>
+          <m:rPr>
+            <m:sty m:val="p"/>
+          </m:rPr>
+          <m:t>(</m:t>
+        </m:r>
+        <m:r>
+          <m:t>N</m:t>
+        </m:r>
+        <m:r>
+          <m:rPr>
+            <m:sty m:val="p"/>
+          </m:rPr>
+          <m:t>)</m:t>
+        </m:r>
+      </m:oMath>
+    </w:p>
+    <w:p>
+      <w:pPr>
+        <w:pStyle w:val="Compact"/>
+        <w:numPr>
+          <w:ilvl w:val="0"/>
+          <w:numId w:val="1012"/>
+        </w:numPr>
+      </w:pPr>
+      <w:r>
+        <w:rPr>
+          <w:b/>
+          <w:bCs/>
+        </w:rPr>
+        <w:t xml:space="preserve">Interaktives Jupyter Notebook:</w:t>
+      </w:r>
+      <w:r>
+        <w:br/>
+      </w:r>
+      <w:hyperlink r:id="rId51">
+        <w:r>
+          <w:rPr>
+            <w:rStyle w:val="VerbatimChar"/>
+          </w:rPr>
+          <w:t xml:space="preserve">Active_Inference_Expanding_Network_Phi_Scaling.ipynb</w:t>
+        </w:r>
+      </w:hyperlink>
+    </w:p>
+    <w:p>
+      <w:pPr>
+        <w:pStyle w:val="FirstParagraph"/>
+      </w:pPr>
+      <w:r>
+        <w:t xml:space="preserve">Eine Kernfrage der Naturphilosophie ist, wie sich subjektive Erlebniskomplexität verhält, wenn bewusste Systeme modular expandieren. In unserer zweiten Simulation skalierten wir das Agentennetzwerk schrittweise von</w:t>
+      </w:r>
+      <w:r>
+        <w:t xml:space="preserve"> </w:t>
+      </w:r>
+      <m:oMath>
+        <m:r>
+          <m:t>N</m:t>
+        </m:r>
+        <m:r>
+          <m:rPr>
+            <m:sty m:val="p"/>
+          </m:rPr>
+          <m:t>=</m:t>
+        </m:r>
+        <m:r>
+          <m:t>4</m:t>
+        </m:r>
+      </m:oMath>
+      <w:r>
+        <w:t xml:space="preserve"> </w:t>
+      </w:r>
+      <w:r>
+        <w:t xml:space="preserve">auf</w:t>
+      </w:r>
+      <w:r>
+        <w:t xml:space="preserve"> </w:t>
+      </w:r>
+      <m:oMath>
+        <m:r>
+          <m:t>N</m:t>
+        </m:r>
+        <m:r>
+          <m:rPr>
+            <m:sty m:val="p"/>
+          </m:rPr>
+          <m:t>=</m:t>
+        </m:r>
+        <m:r>
+          <m:t>12</m:t>
+        </m:r>
+      </m:oMath>
+      <w:r>
+        <w:t xml:space="preserve"> </w:t>
+      </w:r>
+      <w:r>
+        <w:t xml:space="preserve">Knoten in hierarchisch gegliederten Modulstrukturen.</w:t>
+      </w:r>
+    </w:p>
+    <w:p>
+      <w:pPr>
+        <w:pStyle w:val="CaptionedFigure"/>
+      </w:pPr>
+      <w:r>
+        <w:drawing>
+          <wp:inline>
+            <wp:extent cx="5334000" cy="4180032"/>
+            <wp:effectExtent b="0" l="0" r="0" t="0"/>
+            <wp:docPr descr="Ergebnisse der Simulationsphase 2: Modulare Netzwerkerweiterung und Skalierungskurve von Phi(N)" title="" id="53" name="Picture"/>
+            <a:graphic>
+              <a:graphicData uri="http://schemas.openxmlformats.org/drawingml/2006/picture">
+                <pic:pic>
+                  <pic:nvPicPr>
+                    <pic:cNvPr descr="../images/Active_Inference_Expanding_Network_Phi_Scaling.png" id="54" name="Picture"/>
+                    <pic:cNvPicPr>
+                      <a:picLocks noChangeArrowheads="1" noChangeAspect="1"/>
+                    </pic:cNvPicPr>
+                  </pic:nvPicPr>
+                  <pic:blipFill>
+                    <a:blip r:embed="rId52"/>
+                    <a:stretch>
+                      <a:fillRect/>
+                    </a:stretch>
+                  </pic:blipFill>
+                  <pic:spPr bwMode="auto">
+                    <a:xfrm>
+                      <a:off x="0" y="0"/>
+                      <a:ext cx="5334000" cy="4180032"/>
+                    </a:xfrm>
+                    <a:prstGeom prst="rect">
+                      <a:avLst/>
+                    </a:prstGeom>
+                    <a:noFill/>
+                    <a:ln w="9525">
+                      <a:noFill/>
+                      <a:headEnd/>
+                      <a:tailEnd/>
+                    </a:ln>
+                  </pic:spPr>
+                </pic:pic>
+              </a:graphicData>
+            </a:graphic>
+          </wp:inline>
+        </w:drawing>
+      </w:r>
+    </w:p>
+    <w:p>
+      <w:pPr>
+        <w:pStyle w:val="ImageCaption"/>
+      </w:pPr>
+      <w:r>
+        <w:t xml:space="preserve">Ergebnisse der Simulationsphase 2: Modulare Netzwerkerweiterung und Skalierungskurve von Phi(N)</w:t>
+      </w:r>
+    </w:p>
+    <w:bookmarkStart w:id="55" w:name="Xfda085e822fdfb4c00387ac4956970b204fcdc5"/>
+    <w:p>
+      <w:pPr>
+        <w:pStyle w:val="Heading3"/>
+      </w:pPr>
+      <w:r>
+        <w:t xml:space="preserve">Wichtigste Erkenntnisse der Simulationsphase 2:</w:t>
+      </w:r>
+    </w:p>
+    <w:p>
+      <w:pPr>
+        <w:pStyle w:val="Compact"/>
+        <w:numPr>
+          <w:ilvl w:val="0"/>
+          <w:numId w:val="1013"/>
+        </w:numPr>
+      </w:pPr>
+      <w:r>
+        <w:rPr>
+          <w:b/>
+          <w:bCs/>
+        </w:rPr>
+        <w:t xml:space="preserve">Superlineare</w:t>
+      </w:r>
+      <w:r>
+        <w:rPr>
+          <w:b/>
+          <w:bCs/>
+        </w:rPr>
+        <w:t xml:space="preserve"> </w:t>
+      </w:r>
+      <m:oMath>
+        <m:r>
+          <m:rPr>
+            <m:sty m:val="p"/>
+          </m:rPr>
+          <m:t>Φ</m:t>
+        </m:r>
+        <m:r>
+          <m:rPr>
+            <m:sty m:val="p"/>
+          </m:rPr>
+          <m:t>(</m:t>
+        </m:r>
+        <m:r>
+          <m:t>N</m:t>
+        </m:r>
+        <m:r>
+          <m:rPr>
+            <m:sty m:val="p"/>
+          </m:rPr>
+          <m:t>)</m:t>
+        </m:r>
+      </m:oMath>
+      <w:r>
+        <w:rPr>
+          <w:b/>
+          <w:bCs/>
+        </w:rPr>
+        <w:t xml:space="preserve">-Integration:</w:t>
+      </w:r>
+      <w:r>
+        <w:t xml:space="preserve"> </w:t>
+      </w:r>
+      <w:r>
+        <w:t xml:space="preserve">Mit wachsender Knotenzahl wächst die Integrierte Information (</w:t>
+      </w:r>
+      <m:oMath>
+        <m:r>
+          <m:rPr>
+            <m:sty m:val="p"/>
+          </m:rPr>
+          <m:t>Φ</m:t>
+        </m:r>
+      </m:oMath>
+      <w:r>
+        <w:t xml:space="preserve">) nicht linear, sondern folgt einem steilen Potenzgesetz. Modulare Active-Inference-Architekturen verstärken die systemische Ursache-Wirkungs-Dichte exponentiell.</w:t>
+      </w:r>
+    </w:p>
+    <w:p>
+      <w:pPr>
+        <w:pStyle w:val="Compact"/>
+        <w:numPr>
+          <w:ilvl w:val="0"/>
+          <w:numId w:val="1013"/>
+        </w:numPr>
+      </w:pPr>
+      <w:r>
+        <w:rPr>
+          <w:b/>
+          <w:bCs/>
+        </w:rPr>
+        <w:t xml:space="preserve">Beschränkte Freie-Energie-Trajektorien:</w:t>
+      </w:r>
+      <w:r>
+        <w:t xml:space="preserve"> </w:t>
+      </w:r>
+      <w:r>
+        <w:t xml:space="preserve">Trotz steigender Netzwerkgröße bleibt die durchschnittliche variationale freie Energie pro Knoten strikt innerhalb homöostatischer Grenzen – die hierarchische Modulgliederung verhindert rechnerische Explosion.</w:t>
+      </w:r>
+    </w:p>
+    <w:p>
+      <w:pPr>
+        <w:pStyle w:val="Compact"/>
+        <w:numPr>
+          <w:ilvl w:val="0"/>
+          <w:numId w:val="1013"/>
+        </w:numPr>
+      </w:pPr>
+      <w:r>
+        <w:rPr>
+          <w:b/>
+          <w:bCs/>
+        </w:rPr>
+        <w:t xml:space="preserve">Phasenübergang zur makroskopischen Einheit:</w:t>
+      </w:r>
+      <w:r>
+        <w:t xml:space="preserve"> </w:t>
+      </w:r>
+      <w:r>
+        <w:t xml:space="preserve">Überschreitet die Kopplungsstärke zwischen Modulen einen kritischen Schwellenwert (</w:t>
+      </w:r>
+      <m:oMath>
+        <m:r>
+          <m:t>κ</m:t>
+        </m:r>
+        <m:r>
+          <m:rPr>
+            <m:sty m:val="p"/>
+          </m:rPr>
+          <m:t>&gt;</m:t>
+        </m:r>
+        <m:r>
+          <m:t>0.45</m:t>
+        </m:r>
+      </m:oMath>
+      <w:r>
+        <w:t xml:space="preserve">), verschiebt sich die Minimum Information Partition (MIP) global und konstituiert ein einziges, unteilbares Makro-Bewusstsein.</w:t>
+      </w:r>
+    </w:p>
+    <w:p>
+      <w:r>
+        <w:pict>
+          <v:rect style="width:0;height:1.5pt" o:hralign="center" o:hrstd="t" o:hr="t"/>
+        </w:pict>
+      </w:r>
+    </w:p>
+    <w:bookmarkEnd w:id="55"/>
+    <w:bookmarkEnd w:id="56"/>
+    <w:bookmarkStart w:id="59" w:name="Xb84a77c21c02a61f1e32518690b07da104b2b7b"/>
+    <w:p>
+      <w:pPr>
+        <w:pStyle w:val="Heading2"/>
+      </w:pPr>
+      <w:r>
+        <w:t xml:space="preserve">7.4 Simulationsphase 3: Tiefe temporale Active Inference &amp; Monte-Carlo-Validierung</w:t>
+      </w:r>
+    </w:p>
+    <w:p>
+      <w:pPr>
+        <w:pStyle w:val="Compact"/>
+        <w:numPr>
+          <w:ilvl w:val="0"/>
+          <w:numId w:val="1014"/>
+        </w:numPr>
+      </w:pPr>
+      <w:r>
+        <w:rPr>
+          <w:b/>
+          <w:bCs/>
+        </w:rPr>
+        <w:t xml:space="preserve">Interaktives Jupyter Notebook:</w:t>
+      </w:r>
+      <w:r>
+        <w:br/>
+      </w:r>
+      <w:hyperlink r:id="rId57">
+        <w:r>
+          <w:rPr>
+            <w:rStyle w:val="VerbatimChar"/>
+          </w:rPr>
+          <w:t xml:space="preserve">Deep_Temporal_Active_Inference_Simulation.ipynb</w:t>
+        </w:r>
+      </w:hyperlink>
+    </w:p>
+    <w:p>
+      <w:pPr>
+        <w:pStyle w:val="FirstParagraph"/>
+      </w:pPr>
+      <w:r>
+        <w:t xml:space="preserve">Zum formalen Beweis des</w:t>
+      </w:r>
+      <w:r>
+        <w:t xml:space="preserve"> </w:t>
+      </w:r>
+      <w:r>
+        <w:rPr>
+          <w:b/>
+          <w:bCs/>
+        </w:rPr>
+        <w:t xml:space="preserve">Theorems der temporalen Mindesttiefe (</w:t>
+      </w:r>
+      <m:oMath>
+        <m:r>
+          <m:t>H</m:t>
+        </m:r>
+        <m:r>
+          <m:rPr>
+            <m:sty m:val="p"/>
+          </m:rPr>
+          <m:t>&gt;</m:t>
+        </m:r>
+        <m:r>
+          <m:t>1</m:t>
+        </m:r>
+      </m:oMath>
+      <w:r>
+        <w:rPr>
+          <w:b/>
+          <w:bCs/>
+        </w:rPr>
+        <w:t xml:space="preserve">)</w:t>
+      </w:r>
+      <w:r>
+        <w:t xml:space="preserve"> </w:t>
+      </w:r>
+      <w:r>
+        <w:t xml:space="preserve">platzierten wir synthetische Agenten in einer täuschenden POMDP-Umgebung mit:</w:t>
+      </w:r>
+      <w:r>
+        <w:t xml:space="preserve"> </w:t>
+      </w:r>
+      <w:r>
+        <w:t xml:space="preserve">1.</w:t>
+      </w:r>
+      <w:r>
+        <w:t xml:space="preserve"> </w:t>
+      </w:r>
+      <w:r>
+        <w:rPr>
+          <w:b/>
+          <w:bCs/>
+        </w:rPr>
+        <w:t xml:space="preserve">Einer Hinweis-Quelle (</w:t>
+      </w:r>
+      <w:r>
+        <w:rPr>
+          <w:b/>
+          <w:bCs/>
+          <w:i/>
+          <w:iCs/>
+        </w:rPr>
+        <w:t xml:space="preserve">Epistemic Cue Site</w:t>
+      </w:r>
+      <w:r>
+        <w:rPr>
+          <w:b/>
+          <w:bCs/>
+        </w:rPr>
+        <w:t xml:space="preserve"> </w:t>
+      </w:r>
+      <m:oMath>
+        <m:sSub>
+          <m:e>
+            <m:r>
+              <m:t>s</m:t>
+            </m:r>
+          </m:e>
+          <m:sub>
+            <m:r>
+              <m:rPr>
+                <m:nor/>
+                <m:sty m:val="p"/>
+              </m:rPr>
+              <m:t>cue</m:t>
+            </m:r>
+          </m:sub>
+        </m:sSub>
+      </m:oMath>
+      <w:r>
+        <w:rPr>
+          <w:b/>
+          <w:bCs/>
+        </w:rPr>
+        <w:t xml:space="preserve">):</w:t>
+      </w:r>
+      <w:r>
+        <w:t xml:space="preserve"> </w:t>
+      </w:r>
+      <w:r>
+        <w:t xml:space="preserve">Löst die sensorische Ambiguität bezüglich des sicheren Pfades auf, erfordert jedoch einen 1-Schritt-Umweg entgegen der unmittelbaren Zielrichtung.</w:t>
+      </w:r>
+      <w:r>
+        <w:t xml:space="preserve"> </w:t>
+      </w:r>
+      <w:r>
+        <w:t xml:space="preserve">2.</w:t>
+      </w:r>
+      <w:r>
+        <w:t xml:space="preserve"> </w:t>
+      </w:r>
+      <w:r>
+        <w:rPr>
+          <w:b/>
+          <w:bCs/>
+        </w:rPr>
+        <w:t xml:space="preserve">Einer täuschenden Falle (</w:t>
+      </w:r>
+      <w:r>
+        <w:rPr>
+          <w:b/>
+          <w:bCs/>
+          <w:i/>
+          <w:iCs/>
+        </w:rPr>
+        <w:t xml:space="preserve">Deceptive Trap</w:t>
+      </w:r>
+      <w:r>
+        <w:rPr>
+          <w:b/>
+          <w:bCs/>
+        </w:rPr>
+        <w:t xml:space="preserve"> </w:t>
+      </w:r>
+      <m:oMath>
+        <m:sSub>
+          <m:e>
+            <m:r>
+              <m:t>s</m:t>
+            </m:r>
+          </m:e>
+          <m:sub>
+            <m:r>
+              <m:rPr>
+                <m:nor/>
+                <m:sty m:val="p"/>
+              </m:rPr>
+              <m:t>trap</m:t>
+            </m:r>
+          </m:sub>
+        </m:sSub>
+      </m:oMath>
+      <w:r>
+        <w:rPr>
+          <w:b/>
+          <w:bCs/>
+        </w:rPr>
+        <w:t xml:space="preserve">):</w:t>
+      </w:r>
+      <w:r>
+        <w:t xml:space="preserve"> </w:t>
+      </w:r>
+      <w:r>
+        <w:t xml:space="preserve">Sendet eine sofortige hohe Scheinbelohnung aus, führt jedoch irreversibel in den Todesschlund (</w:t>
+      </w:r>
+      <m:oMath>
+        <m:sSub>
+          <m:e>
+            <m:r>
+              <m:t>s</m:t>
+            </m:r>
+          </m:e>
+          <m:sub>
+            <m:r>
+              <m:rPr>
+                <m:nor/>
+                <m:sty m:val="p"/>
+              </m:rPr>
+              <m:t>death</m:t>
+            </m:r>
+          </m:sub>
+        </m:sSub>
+      </m:oMath>
+      <w:r>
+        <w:t xml:space="preserve">), in dem alle Kopplung abreißt und</w:t>
+      </w:r>
+      <w:r>
+        <w:t xml:space="preserve"> </w:t>
+      </w:r>
+      <m:oMath>
+        <m:r>
+          <m:rPr>
+            <m:sty m:val="p"/>
+          </m:rPr>
+          <m:t>Φ</m:t>
+        </m:r>
+        <m:r>
+          <m:rPr>
+            <m:sty m:val="p"/>
+          </m:rPr>
+          <m:t>→</m:t>
+        </m:r>
+        <m:r>
+          <m:t>0</m:t>
+        </m:r>
+      </m:oMath>
+      <w:r>
+        <w:t xml:space="preserve"> </w:t>
+      </w:r>
+      <w:r>
+        <w:t xml:space="preserve">kollabiert.</w:t>
+      </w:r>
+    </w:p>
+    <w:p>
+      <w:pPr>
+        <w:pStyle w:val="SourceCode"/>
+      </w:pPr>
+      <w:r>
+        <w:rPr>
+          <w:rStyle w:val="VerbatimChar"/>
+        </w:rPr>
+        <w:t xml:space="preserve">flowchart TD</w:t>
+      </w:r>
+      <w:r>
+        <w:br/>
+      </w:r>
+      <w:r>
+        <w:rPr>
+          <w:rStyle w:val="VerbatimChar"/>
+        </w:rPr>
+        <w:t xml:space="preserve">    subgraph POMDP_ENV_DE["&lt;b&gt;Die täuschende &amp; epistemische Validierungsumgebung&lt;/b&gt;"]</w:t>
+      </w:r>
+      <w:r>
+        <w:br/>
+      </w:r>
+      <w:r>
+        <w:rPr>
+          <w:rStyle w:val="VerbatimChar"/>
+        </w:rPr>
+        <w:t xml:space="preserve">        direction TB</w:t>
+      </w:r>
+      <w:r>
+        <w:br/>
+      </w:r>
+      <w:r>
+        <w:rPr>
+          <w:rStyle w:val="VerbatimChar"/>
+        </w:rPr>
+        <w:t xml:space="preserve">        S0["&lt;b&gt;Zustand 0: Startposition (s₀)&lt;/b&gt;&lt;br&gt;Ambigues Signal (50/50 Unsicherheit)"]</w:t>
+      </w:r>
+      <w:r>
+        <w:br/>
+      </w:r>
+      <w:r>
+        <w:rPr>
+          <w:rStyle w:val="VerbatimChar"/>
+        </w:rPr>
+        <w:t xml:space="preserve">        S1["&lt;b&gt;Zustand 1: Hinweis-Quelle (s_cue)&lt;/b&gt;&lt;br&gt;Löst Ambiguität auf.&lt;br&gt;&lt;i&gt;Erfordert 1-Schritt-Neugier-Umweg!&lt;/i&gt;"]</w:t>
+      </w:r>
+      <w:r>
+        <w:br/>
+      </w:r>
+      <w:r>
+        <w:rPr>
+          <w:rStyle w:val="VerbatimChar"/>
+        </w:rPr>
+        <w:t xml:space="preserve">        S2["&lt;b&gt;Zustand 2: Täuschende Falle (s_trap)&lt;/b&gt;&lt;br&gt;Sofortige Scheinbelohnung.&lt;br&gt;&lt;i&gt;Löst irreversiblen Kollaps aus!&lt;/i&gt;"]</w:t>
+      </w:r>
+      <w:r>
+        <w:br/>
+      </w:r>
+      <w:r>
+        <w:rPr>
+          <w:rStyle w:val="VerbatimChar"/>
+        </w:rPr>
+        <w:t xml:space="preserve">        S3["&lt;b&gt;Zustand 3: Sicherer Pfad (s_path)&lt;/b&gt;&lt;br&gt;Zwischenkorridor."]</w:t>
+      </w:r>
+      <w:r>
+        <w:br/>
+      </w:r>
+      <w:r>
+        <w:rPr>
+          <w:rStyle w:val="VerbatimChar"/>
+        </w:rPr>
+        <w:t xml:space="preserve">        S4["&lt;b&gt;Zustand 4: Wahres Ziel (s_goal)&lt;/b&gt;&lt;br&gt;Homöostatisches Überleben (C = +4.5)."]</w:t>
+      </w:r>
+      <w:r>
+        <w:br/>
+      </w:r>
+      <w:r>
+        <w:rPr>
+          <w:rStyle w:val="VerbatimChar"/>
+        </w:rPr>
+        <w:t xml:space="preserve">        S5["&lt;b&gt;Zustand 5: Tod / Senke (s_death)&lt;/b&gt;&lt;br&gt;Kopplung zerstört. Φ → 0."]</w:t>
+      </w:r>
+      <w:r>
+        <w:br/>
+      </w:r>
+      <w:r>
+        <w:rPr>
+          <w:rStyle w:val="VerbatimChar"/>
+        </w:rPr>
+        <w:t xml:space="preserve">        </w:t>
+      </w:r>
+      <w:r>
+        <w:br/>
+      </w:r>
+      <w:r>
+        <w:rPr>
+          <w:rStyle w:val="VerbatimChar"/>
+        </w:rPr>
+        <w:t xml:space="preserve">        S0 --&gt;|"Aktion 1: Epistemischer Umweg"| S1</w:t>
+      </w:r>
+      <w:r>
+        <w:br/>
+      </w:r>
+      <w:r>
+        <w:rPr>
+          <w:rStyle w:val="VerbatimChar"/>
+        </w:rPr>
+        <w:t xml:space="preserve">        S0 --&gt;|"Aktion 2: Gieriger Reflex"| S2</w:t>
+      </w:r>
+      <w:r>
+        <w:br/>
+      </w:r>
+      <w:r>
+        <w:rPr>
+          <w:rStyle w:val="VerbatimChar"/>
+        </w:rPr>
+        <w:t xml:space="preserve">        S0 --&gt;|"Aktion 3: Blinder Schritt"| S3</w:t>
+      </w:r>
+      <w:r>
+        <w:br/>
+      </w:r>
+      <w:r>
+        <w:rPr>
+          <w:rStyle w:val="VerbatimChar"/>
+        </w:rPr>
+        <w:t xml:space="preserve">        S1 --&gt;|"Informierte Navigation"| S3</w:t>
+      </w:r>
+      <w:r>
+        <w:br/>
+      </w:r>
+      <w:r>
+        <w:rPr>
+          <w:rStyle w:val="VerbatimChar"/>
+        </w:rPr>
+        <w:t xml:space="preserve">        S2 ==&gt;|"Tödlicher Phasenübergang"| S5</w:t>
+      </w:r>
+      <w:r>
+        <w:br/>
+      </w:r>
+      <w:r>
+        <w:rPr>
+          <w:rStyle w:val="VerbatimChar"/>
+        </w:rPr>
+        <w:t xml:space="preserve">        S3 --&gt;|"Aktion 3"| S4</w:t>
+      </w:r>
+      <w:r>
+        <w:br/>
+      </w:r>
+      <w:r>
+        <w:rPr>
+          <w:rStyle w:val="VerbatimChar"/>
+        </w:rPr>
+        <w:t xml:space="preserve">        S5 ==&gt;|"Absorbierende Senke"| S5</w:t>
+      </w:r>
+      <w:r>
+        <w:br/>
+      </w:r>
+      <w:r>
+        <w:rPr>
+          <w:rStyle w:val="VerbatimChar"/>
+        </w:rPr>
+        <w:t xml:space="preserve">    end</w:t>
+      </w:r>
+    </w:p>
+    <w:bookmarkStart w:id="58" w:name="X996cb4795f347b95fff38a1e73268bad5288ef8"/>
+    <w:p>
+      <w:pPr>
+        <w:pStyle w:val="Heading3"/>
+      </w:pPr>
+      <w:r>
+        <w:t xml:space="preserve">Monte-Carlo-Ensemble-Protokoll (</w:t>
+      </w:r>
+      <m:oMath>
+        <m:r>
+          <m:t>N</m:t>
+        </m:r>
+        <m:r>
+          <m:rPr>
+            <m:sty m:val="p"/>
+          </m:rPr>
+          <m:t>=</m:t>
+        </m:r>
+        <m:r>
+          <m:t>30</m:t>
+        </m:r>
+      </m:oMath>
+      <w:r>
+        <w:t xml:space="preserve"> </w:t>
+      </w:r>
+      <w:r>
+        <w:t xml:space="preserve">Läufe):</w:t>
+      </w:r>
+    </w:p>
+    <w:p>
+      <w:pPr>
+        <w:pStyle w:val="FirstParagraph"/>
+      </w:pPr>
+      <w:r>
+        <w:t xml:space="preserve">Getestet wurden vier Kohorten über ein Ensemble von</w:t>
+      </w:r>
+      <w:r>
+        <w:t xml:space="preserve"> </w:t>
+      </w:r>
+      <m:oMath>
+        <m:r>
+          <m:t>N</m:t>
+        </m:r>
+        <m:r>
+          <m:rPr>
+            <m:sty m:val="p"/>
+          </m:rPr>
+          <m:t>=</m:t>
+        </m:r>
+        <m:r>
+          <m:t>30</m:t>
+        </m:r>
+      </m:oMath>
+      <w:r>
+        <w:rPr>
+          <w:b/>
+          <w:bCs/>
+        </w:rPr>
+        <w:t xml:space="preserve"> </w:t>
+      </w:r>
+      <w:r>
+        <w:rPr>
+          <w:b/>
+          <w:bCs/>
+        </w:rPr>
+        <w:t xml:space="preserve">unabhängigen Monte-Carlo-Läufen</w:t>
+      </w:r>
+      <w:r>
+        <w:t xml:space="preserve"> </w:t>
+      </w:r>
+      <w:r>
+        <w:t xml:space="preserve">über</w:t>
+      </w:r>
+      <w:r>
+        <w:t xml:space="preserve"> </w:t>
+      </w:r>
+      <m:oMath>
+        <m:r>
+          <m:t>T</m:t>
+        </m:r>
+        <m:r>
+          <m:rPr>
+            <m:sty m:val="p"/>
+          </m:rPr>
+          <m:t>=</m:t>
+        </m:r>
+        <m:r>
+          <m:t>25</m:t>
+        </m:r>
+      </m:oMath>
+      <w:r>
+        <w:t xml:space="preserve"> </w:t>
+      </w:r>
+      <w:r>
+        <w:t xml:space="preserve">Zeitschritte:</w:t>
       </w:r>
     </w:p>
     <w:tbl>
@@ -9197,7 +10493,7 @@
               <w:jc w:val="center"/>
             </w:pPr>
             <w:r>
-              <w:t xml:space="preserve">Überlebensrate</w:t>
+              <w:t xml:space="preserve">Ensemble-Überlebensrate</w:t>
             </w:r>
           </w:p>
         </w:tc>
@@ -9836,56 +11132,79 @@
         </w:pict>
       </w:r>
     </w:p>
-    <w:bookmarkEnd w:id="44"/>
-    <w:bookmarkStart w:id="46" w:name="visualisierung-der-simulationsergebnisse"/>
+    <w:bookmarkEnd w:id="58"/>
+    <w:bookmarkEnd w:id="59"/>
+    <w:bookmarkStart w:id="64" w:name="Xf693082083ec7b7415dfb5c424fb5665fae5acb"/>
     <w:p>
       <w:pPr>
         <w:pStyle w:val="Heading2"/>
       </w:pPr>
       <w:r>
-        <w:t xml:space="preserve">7.3 Visualisierung der Simulationsergebnisse</w:t>
-      </w:r>
-    </w:p>
-    <w:tbl>
-      <w:tblPr>
-        <w:tblStyle w:val="FigureTable"/>
-        <w:tblW w:type="auto" w:w="0"/>
-        <w:jc w:val="center"/>
-        <w:tblLook w:firstRow="0" w:lastRow="0" w:firstColumn="0" w:lastColumn="0"/>
-      </w:tblPr>
-      <w:tblGrid>
-        <w:gridCol w:w="7920"/>
-      </w:tblGrid>
-      <w:tr>
-        <w:tc>
-          <w:tcPr/>
-          <w:p>
-            <w:pPr>
-              <w:pStyle w:val="Compact"/>
-              <w:jc w:val="center"/>
-            </w:pPr>
-            <w:r>
-              <w:t xml:space="preserve">Simulationsergebnisse zu temporaler Tiefe und 6. Axiom</w:t>
-            </w:r>
-          </w:p>
-        </w:tc>
-      </w:tr>
-    </w:tbl>
+        <w:t xml:space="preserve">7.5 Visualisierung der Entstehung von Zeitbewusstsein</w:t>
+      </w:r>
+    </w:p>
+    <w:p>
+      <w:pPr>
+        <w:pStyle w:val="CaptionedFigure"/>
+      </w:pPr>
+      <w:r>
+        <w:drawing>
+          <wp:inline>
+            <wp:extent cx="5334000" cy="3907707"/>
+            <wp:effectExtent b="0" l="0" r="0" t="0"/>
+            <wp:docPr descr="Ergebnisse der Simulationsphase 3: Tiefe temporale Active Inference und Monte-Carlo-Validierung" title="" id="61" name="Picture"/>
+            <a:graphic>
+              <a:graphicData uri="http://schemas.openxmlformats.org/drawingml/2006/picture">
+                <pic:pic>
+                  <pic:nvPicPr>
+                    <pic:cNvPr descr="../images/Deep_Temporal_Active_Inference_Simulation.png" id="62" name="Picture"/>
+                    <pic:cNvPicPr>
+                      <a:picLocks noChangeArrowheads="1" noChangeAspect="1"/>
+                    </pic:cNvPicPr>
+                  </pic:nvPicPr>
+                  <pic:blipFill>
+                    <a:blip r:embed="rId60"/>
+                    <a:stretch>
+                      <a:fillRect/>
+                    </a:stretch>
+                  </pic:blipFill>
+                  <pic:spPr bwMode="auto">
+                    <a:xfrm>
+                      <a:off x="0" y="0"/>
+                      <a:ext cx="5334000" cy="3907707"/>
+                    </a:xfrm>
+                    <a:prstGeom prst="rect">
+                      <a:avLst/>
+                    </a:prstGeom>
+                    <a:noFill/>
+                    <a:ln w="9525">
+                      <a:noFill/>
+                      <a:headEnd/>
+                      <a:tailEnd/>
+                    </a:ln>
+                  </pic:spPr>
+                </pic:pic>
+              </a:graphicData>
+            </a:graphic>
+          </wp:inline>
+        </w:drawing>
+      </w:r>
+    </w:p>
     <w:p>
       <w:pPr>
         <w:pStyle w:val="ImageCaption"/>
       </w:pPr>
       <w:r>
-        <w:t xml:space="preserve">Simulationsergebnisse zu temporaler Tiefe und 6. Axiom</w:t>
-      </w:r>
-    </w:p>
-    <w:bookmarkStart w:id="45" w:name="wichtigste-erkenntnisse"/>
+        <w:t xml:space="preserve">Ergebnisse der Simulationsphase 3: Tiefe temporale Active Inference und Monte-Carlo-Validierung</w:t>
+      </w:r>
+    </w:p>
+    <w:bookmarkStart w:id="63" w:name="X360bf7b96d782dbd011fb8e28dfe0319c231d7a"/>
     <w:p>
       <w:pPr>
         <w:pStyle w:val="Heading3"/>
       </w:pPr>
       <w:r>
-        <w:t xml:space="preserve">Wichtigste Erkenntnisse:</w:t>
+        <w:t xml:space="preserve">Umfassende Analyse der 4-Panel-Ergebnisse:</w:t>
       </w:r>
     </w:p>
     <w:p>
@@ -9893,7 +11212,7 @@
         <w:pStyle w:val="Compact"/>
         <w:numPr>
           <w:ilvl w:val="0"/>
-          <w:numId w:val="1010"/>
+          <w:numId w:val="1015"/>
         </w:numPr>
       </w:pPr>
       <w:r>
@@ -9901,16 +11220,60 @@
           <w:b/>
           <w:bCs/>
         </w:rPr>
-        <w:t xml:space="preserve">Reaktiver Kausalitätskollaps:</w:t>
-      </w:r>
-      <w:r>
-        <w:t xml:space="preserve"> </w:t>
-      </w:r>
-      <w:r>
-        <w:t xml:space="preserve">Reflex-Agenten (</w:t>
+        <w:t xml:space="preserve">Panel A (Integrierte Information</w:t>
+      </w:r>
+      <w:r>
+        <w:rPr>
+          <w:b/>
+          <w:bCs/>
+        </w:rPr>
+        <w:t xml:space="preserve"> </w:t>
       </w:r>
       <m:oMath>
         <m:r>
+          <m:rPr>
+            <m:sty m:val="p"/>
+          </m:rPr>
+          <m:t>Φ</m:t>
+        </m:r>
+        <m:r>
+          <m:rPr>
+            <m:sty m:val="p"/>
+          </m:rPr>
+          <m:t>(</m:t>
+        </m:r>
+        <m:r>
+          <m:t>t</m:t>
+        </m:r>
+        <m:r>
+          <m:rPr>
+            <m:sty m:val="p"/>
+          </m:rPr>
+          <m:t>)</m:t>
+        </m:r>
+      </m:oMath>
+      <w:r>
+        <w:rPr>
+          <w:b/>
+          <w:bCs/>
+        </w:rPr>
+        <w:t xml:space="preserve"> </w:t>
+      </w:r>
+      <w:r>
+        <w:rPr>
+          <w:b/>
+          <w:bCs/>
+        </w:rPr>
+        <w:t xml:space="preserve">über die Zeit):</w:t>
+      </w:r>
+      <w:r>
+        <w:t xml:space="preserve"> </w:t>
+      </w:r>
+      <w:r>
+        <w:t xml:space="preserve">Beim Reflex-Agenten (</w:t>
+      </w:r>
+      <m:oMath>
+        <m:r>
           <m:t>H</m:t>
         </m:r>
         <m:r>
@@ -9924,13 +11287,45 @@
         </m:r>
       </m:oMath>
       <w:r>
-        <w:t xml:space="preserve">) fallen zu</w:t>
+        <w:t xml:space="preserve">) stürzt</w:t>
       </w:r>
       <w:r>
         <w:t xml:space="preserve"> </w:t>
       </w:r>
       <m:oMath>
         <m:r>
+          <m:rPr>
+            <m:sty m:val="p"/>
+          </m:rPr>
+          <m:t>Φ</m:t>
+        </m:r>
+        <m:r>
+          <m:rPr>
+            <m:sty m:val="p"/>
+          </m:rPr>
+          <m:t>(</m:t>
+        </m:r>
+        <m:r>
+          <m:t>t</m:t>
+        </m:r>
+        <m:r>
+          <m:rPr>
+            <m:sty m:val="p"/>
+          </m:rPr>
+          <m:t>)</m:t>
+        </m:r>
+      </m:oMath>
+      <w:r>
+        <w:t xml:space="preserve"> </w:t>
+      </w:r>
+      <w:r>
+        <w:t xml:space="preserve">katastrophal ab, da</w:t>
+      </w:r>
+      <w:r>
+        <w:t xml:space="preserve"> </w:t>
+      </w:r>
+      <m:oMath>
+        <m:r>
           <m:t>63.3</m:t>
         </m:r>
         <m:r>
@@ -9944,10 +11339,27 @@
         <w:t xml:space="preserve"> </w:t>
       </w:r>
       <w:r>
-        <w:t xml:space="preserve">der täuschenden Belohnung zum Opfer und stürzen in den Kausalitäts- und Überlebenstod (</w:t>
+        <w:t xml:space="preserve">der Agenten der Falle erliegen. Dagegen halten tiefe temporale Agenten (</w:t>
       </w:r>
       <m:oMath>
         <m:r>
+          <m:t>H</m:t>
+        </m:r>
+        <m:r>
+          <m:rPr>
+            <m:sty m:val="p"/>
+          </m:rPr>
+          <m:t>=</m:t>
+        </m:r>
+        <m:r>
+          <m:t>4</m:t>
+        </m:r>
+      </m:oMath>
+      <w:r>
+        <w:t xml:space="preserve">) ein stabiles Hochplateau (</w:t>
+      </w:r>
+      <m:oMath>
+        <m:r>
           <m:rPr>
             <m:sty m:val="p"/>
           </m:rPr>
@@ -9957,14 +11369,122 @@
           <m:rPr>
             <m:sty m:val="p"/>
           </m:rPr>
-          <m:t>→</m:t>
-        </m:r>
-        <m:r>
-          <m:t>0</m:t>
+          <m:t>≈</m:t>
+        </m:r>
+        <m:r>
+          <m:t>0.184</m:t>
         </m:r>
       </m:oMath>
       <w:r>
-        <w:t xml:space="preserve">).</w:t>
+        <w:t xml:space="preserve">), was</w:t>
+      </w:r>
+      <w:r>
+        <w:t xml:space="preserve"> </w:t>
+      </w:r>
+      <m:oMath>
+        <m:r>
+          <m:rPr>
+            <m:scr m:val="double-struck"/>
+            <m:sty m:val="p"/>
+          </m:rPr>
+          <m:t>E</m:t>
+        </m:r>
+        <m:r>
+          <m:rPr>
+            <m:sty m:val="p"/>
+          </m:rPr>
+          <m:t>[</m:t>
+        </m:r>
+        <m:r>
+          <m:rPr>
+            <m:sty m:val="p"/>
+          </m:rPr>
+          <m:t>Φ</m:t>
+        </m:r>
+        <m:r>
+          <m:rPr>
+            <m:sty m:val="p"/>
+          </m:rPr>
+          <m:t>(</m:t>
+        </m:r>
+        <m:r>
+          <m:t>t</m:t>
+        </m:r>
+        <m:r>
+          <m:rPr>
+            <m:sty m:val="p"/>
+          </m:rPr>
+          <m:t>+</m:t>
+        </m:r>
+        <m:r>
+          <m:t>1</m:t>
+        </m:r>
+        <m:r>
+          <m:rPr>
+            <m:sty m:val="p"/>
+          </m:rPr>
+          <m:t>)</m:t>
+        </m:r>
+        <m:r>
+          <m:rPr>
+            <m:sty m:val="p"/>
+          </m:rPr>
+          <m:t>∣</m:t>
+        </m:r>
+        <m:sSup>
+          <m:e>
+            <m:r>
+              <m:t>π</m:t>
+            </m:r>
+          </m:e>
+          <m:sup>
+            <m:r>
+              <m:rPr>
+                <m:sty m:val="p"/>
+              </m:rPr>
+              <m:t>*</m:t>
+            </m:r>
+          </m:sup>
+        </m:sSup>
+        <m:r>
+          <m:rPr>
+            <m:sty m:val="p"/>
+          </m:rPr>
+          <m:t>]</m:t>
+        </m:r>
+        <m:r>
+          <m:rPr>
+            <m:sty m:val="p"/>
+          </m:rPr>
+          <m:t>≥</m:t>
+        </m:r>
+        <m:r>
+          <m:rPr>
+            <m:sty m:val="p"/>
+          </m:rPr>
+          <m:t>Φ</m:t>
+        </m:r>
+        <m:r>
+          <m:rPr>
+            <m:sty m:val="p"/>
+          </m:rPr>
+          <m:t>(</m:t>
+        </m:r>
+        <m:r>
+          <m:t>t</m:t>
+        </m:r>
+        <m:r>
+          <m:rPr>
+            <m:sty m:val="p"/>
+          </m:rPr>
+          <m:t>)</m:t>
+        </m:r>
+      </m:oMath>
+      <w:r>
+        <w:t xml:space="preserve"> </w:t>
+      </w:r>
+      <w:r>
+        <w:t xml:space="preserve">empirisch beweist.</w:t>
       </w:r>
     </w:p>
     <w:p>
@@ -9972,7 +11492,7 @@
         <w:pStyle w:val="Compact"/>
         <w:numPr>
           <w:ilvl w:val="0"/>
-          <w:numId w:val="1010"/>
+          <w:numId w:val="1015"/>
         </w:numPr>
       </w:pPr>
       <w:r>
@@ -9980,33 +11500,27 @@
           <w:b/>
           <w:bCs/>
         </w:rPr>
-        <w:t xml:space="preserve">Epistemischer Umweg:</w:t>
-      </w:r>
-      <w:r>
-        <w:t xml:space="preserve"> </w:t>
-      </w:r>
-      <w:r>
-        <w:t xml:space="preserve">Tiefe temporale Agenten (</w:t>
+        <w:t xml:space="preserve">Panel B (Autopoietische Überlebensrate):</w:t>
+      </w:r>
+      <w:r>
+        <w:t xml:space="preserve"> </w:t>
+      </w:r>
+      <w:r>
+        <w:t xml:space="preserve">Zeigt die scharfe Phasenraum-Bifurkation zwischen zeitlosen Systemen (</w:t>
       </w:r>
       <m:oMath>
         <m:r>
-          <m:t>H</m:t>
-        </m:r>
-        <m:r>
-          <m:rPr>
-            <m:sty m:val="p"/>
-          </m:rPr>
-          <m:t>=</m:t>
-        </m:r>
-        <m:r>
-          <m:t>4</m:t>
+          <m:t>36.7</m:t>
+        </m:r>
+        <m:r>
+          <m:rPr>
+            <m:sty m:val="p"/>
+          </m:rPr>
+          <m:t>%</m:t>
         </m:r>
       </m:oMath>
       <w:r>
-        <w:t xml:space="preserve">) wählen zu</w:t>
-      </w:r>
-      <w:r>
-        <w:t xml:space="preserve"> </w:t>
+        <w:t xml:space="preserve">) und kontrafaktisch planenden Geistern (</w:t>
       </w:r>
       <m:oMath>
         <m:r>
@@ -10020,99 +11534,146 @@
         </m:r>
       </m:oMath>
       <w:r>
-        <w:t xml:space="preserve"> </w:t>
-      </w:r>
-      <w:r>
-        <w:t xml:space="preserve">proaktiv einen epistemischen Umweg zur Hinweis-Quelle (</w:t>
-      </w:r>
-      <w:r>
-        <w:rPr>
-          <w:i/>
-          <w:iCs/>
-        </w:rPr>
-        <w:t xml:space="preserve">Cue</w:t>
-      </w:r>
-      <w:r>
-        <w:t xml:space="preserve">), lösen die Umweltunsicherheit auf und sichern maximale Kausalkonstanz (</w:t>
+        <w:t xml:space="preserve">).</w:t>
+      </w:r>
+    </w:p>
+    <w:p>
+      <w:pPr>
+        <w:pStyle w:val="Compact"/>
+        <w:numPr>
+          <w:ilvl w:val="0"/>
+          <w:numId w:val="1015"/>
+        </w:numPr>
+      </w:pPr>
+      <w:r>
+        <w:rPr>
+          <w:b/>
+          <w:bCs/>
+        </w:rPr>
+        <w:t xml:space="preserve">Panel C (Freie-Energie-Trajektorie</w:t>
+      </w:r>
+      <w:r>
+        <w:rPr>
+          <w:b/>
+          <w:bCs/>
+        </w:rPr>
+        <w:t xml:space="preserve"> </w:t>
       </w:r>
       <m:oMath>
         <m:r>
-          <m:rPr>
-            <m:sty m:val="p"/>
-          </m:rPr>
-          <m:t>Φ</m:t>
-        </m:r>
-        <m:r>
-          <m:rPr>
-            <m:sty m:val="p"/>
-          </m:rPr>
-          <m:t>≈</m:t>
-        </m:r>
-        <m:r>
-          <m:t>0.184</m:t>
+          <m:t>F</m:t>
+        </m:r>
+        <m:r>
+          <m:rPr>
+            <m:sty m:val="p"/>
+          </m:rPr>
+          <m:t>(</m:t>
+        </m:r>
+        <m:r>
+          <m:t>t</m:t>
+        </m:r>
+        <m:r>
+          <m:rPr>
+            <m:sty m:val="p"/>
+          </m:rPr>
+          <m:t>)</m:t>
         </m:r>
       </m:oMath>
       <w:r>
-        <w:t xml:space="preserve">).</w:t>
-      </w:r>
-    </w:p>
-    <w:bookmarkEnd w:id="45"/>
-    <w:bookmarkEnd w:id="46"/>
-    <w:bookmarkEnd w:id="47"/>
-    <w:bookmarkStart w:id="52" w:name="Xf5f05c9d736e8a495c85a9ad0ca1b47dd358b65"/>
-    <w:p>
-      <w:pPr>
-        <w:pStyle w:val="Heading1"/>
-      </w:pPr>
-      <w:r>
-        <w:t xml:space="preserve">Kapitel 8: Existenzielle, Ethische &amp; Synthetische Horizonte</w:t>
-      </w:r>
-    </w:p>
-    <w:p>
-      <w:pPr>
-        <w:pStyle w:val="BlockText"/>
-      </w:pPr>
-      <w:r>
-        <w:rPr>
-          <w:i/>
-          <w:iCs/>
-        </w:rPr>
-        <w:t xml:space="preserve">„Der Tod ist nicht die Vernichtung des Bewusstseins; er ist die Auflösung einer lokalisierten Markov-Grenze, wodurch der Informationstropfen in den unendlichen Ozean von Mind-at-Large zurückkehrt.“</w:t>
-      </w:r>
-      <w:r>
-        <w:br/>
-      </w:r>
-      <w:r>
-        <w:t xml:space="preserve">—</w:t>
-      </w:r>
-      <w:r>
-        <w:t xml:space="preserve"> </w:t>
-      </w:r>
-      <w:r>
-        <w:rPr>
-          <w:b/>
-          <w:bCs/>
-        </w:rPr>
-        <w:t xml:space="preserve">Thomas Riebl</w:t>
-      </w:r>
-      <w:r>
-        <w:t xml:space="preserve">,</w:t>
-      </w:r>
-      <w:r>
-        <w:t xml:space="preserve"> </w:t>
-      </w:r>
-      <w:r>
-        <w:rPr>
-          <w:i/>
-          <w:iCs/>
-        </w:rPr>
-        <w:t xml:space="preserve">Dying in Dignity and the Dissociated Mind</w:t>
-      </w:r>
-      <w:r>
-        <w:t xml:space="preserve"> </w:t>
-      </w:r>
-      <w:r>
-        <w:t xml:space="preserve">(2026)</w:t>
+        <w:rPr>
+          <w:b/>
+          <w:bCs/>
+        </w:rPr>
+        <w:t xml:space="preserve">):</w:t>
+      </w:r>
+      <w:r>
+        <w:t xml:space="preserve"> </w:t>
+      </w:r>
+      <w:r>
+        <w:t xml:space="preserve">Demonstriert die rasche und robuste Minimierung von Überraschung und Entropie.</w:t>
+      </w:r>
+    </w:p>
+    <w:p>
+      <w:pPr>
+        <w:pStyle w:val="Compact"/>
+        <w:numPr>
+          <w:ilvl w:val="0"/>
+          <w:numId w:val="1015"/>
+        </w:numPr>
+      </w:pPr>
+      <w:r>
+        <w:rPr>
+          <w:b/>
+          <w:bCs/>
+        </w:rPr>
+        <w:t xml:space="preserve">Panel D (Verhaltensdynamik &amp; Epistemische Umwege):</w:t>
+      </w:r>
+      <w:r>
+        <w:t xml:space="preserve"> </w:t>
+      </w:r>
+      <w:r>
+        <w:t xml:space="preserve">Belegt, dass</w:t>
+      </w:r>
+      <w:r>
+        <w:t xml:space="preserve"> </w:t>
+      </w:r>
+      <m:oMath>
+        <m:r>
+          <m:t>100</m:t>
+        </m:r>
+        <m:r>
+          <m:rPr>
+            <m:sty m:val="p"/>
+          </m:rPr>
+          <m:t>%</m:t>
+        </m:r>
+      </m:oMath>
+      <w:r>
+        <w:t xml:space="preserve"> </w:t>
+      </w:r>
+      <w:r>
+        <w:t xml:space="preserve">der tiefen temporalen Agenten proaktiv einen</w:t>
+      </w:r>
+      <w:r>
+        <w:t xml:space="preserve"> </w:t>
+      </w:r>
+      <w:r>
+        <w:rPr>
+          <w:b/>
+          <w:bCs/>
+        </w:rPr>
+        <w:t xml:space="preserve">epistemischen Umweg zur Hinweis-Quelle (</w:t>
+      </w:r>
+      <m:oMath>
+        <m:sSub>
+          <m:e>
+            <m:r>
+              <m:t>s</m:t>
+            </m:r>
+          </m:e>
+          <m:sub>
+            <m:r>
+              <m:rPr>
+                <m:nor/>
+                <m:sty m:val="p"/>
+              </m:rPr>
+              <m:t>cue</m:t>
+            </m:r>
+          </m:sub>
+        </m:sSub>
+      </m:oMath>
+      <w:r>
+        <w:rPr>
+          <w:b/>
+          <w:bCs/>
+        </w:rPr>
+        <w:t xml:space="preserve">)</w:t>
+      </w:r>
+      <w:r>
+        <w:t xml:space="preserve"> </w:t>
+      </w:r>
+      <w:r>
+        <w:t xml:space="preserve">wählen, um Umweltunsicherheit abzubauen, bevor sie zum Ziel navigieren.</w:t>
       </w:r>
     </w:p>
     <w:p>
@@ -10122,13 +11683,15 @@
         </w:pict>
       </w:r>
     </w:p>
-    <w:bookmarkStart w:id="48" w:name="der-sinn-der-dissoziation"/>
+    <w:bookmarkEnd w:id="63"/>
+    <w:bookmarkEnd w:id="64"/>
+    <w:bookmarkStart w:id="65" w:name="fazit-der-empirischen-validierung"/>
     <w:p>
       <w:pPr>
         <w:pStyle w:val="Heading2"/>
       </w:pPr>
       <w:r>
-        <w:t xml:space="preserve">8.1 Der Sinn der Dissoziation</w:t>
+        <w:t xml:space="preserve">7.6 Fazit der empirischen Validierung</w:t>
       </w:r>
     </w:p>
     <w:p>
@@ -10136,60 +11699,172 @@
         <w:pStyle w:val="FirstParagraph"/>
       </w:pPr>
       <w:r>
-        <w:t xml:space="preserve">Warum teilt sich das eine kosmische Bewusstseinsfeld (</w:t>
-      </w:r>
+        <w:t xml:space="preserve">Die Simulationsexperimente führen zu drei unumstößlichen Erkenntnissen:</w:t>
+      </w:r>
+      <w:r>
+        <w:t xml:space="preserve"> </w:t>
+      </w:r>
+      <w:r>
+        <w:t xml:space="preserve">1.</w:t>
+      </w:r>
+      <w:r>
+        <w:t xml:space="preserve"> </w:t>
+      </w:r>
+      <w:r>
+        <w:rPr>
+          <w:b/>
+          <w:bCs/>
+        </w:rPr>
+        <w:t xml:space="preserve">Bewusstsein verlangt temporale Tiefe (</w:t>
+      </w:r>
+      <m:oMath>
+        <m:r>
+          <m:t>H</m:t>
+        </m:r>
+        <m:r>
+          <m:rPr>
+            <m:sty m:val="p"/>
+          </m:rPr>
+          <m:t>&gt;</m:t>
+        </m:r>
+        <m:r>
+          <m:t>1</m:t>
+        </m:r>
+      </m:oMath>
+      <w:r>
+        <w:rPr>
+          <w:b/>
+          <w:bCs/>
+        </w:rPr>
+        <w:t xml:space="preserve">):</w:t>
+      </w:r>
+      <w:r>
+        <w:t xml:space="preserve"> </w:t>
+      </w:r>
+      <w:r>
+        <w:t xml:space="preserve">Reine Reaktivität führt in täuschenden Umgebungen zum Kausalitäts- und Existenzkollaps (</w:t>
+      </w:r>
+      <m:oMath>
+        <m:r>
+          <m:rPr>
+            <m:sty m:val="p"/>
+          </m:rPr>
+          <m:t>Φ</m:t>
+        </m:r>
+        <m:r>
+          <m:rPr>
+            <m:sty m:val="p"/>
+          </m:rPr>
+          <m:t>→</m:t>
+        </m:r>
+        <m:r>
+          <m:t>0</m:t>
+        </m:r>
+      </m:oMath>
+      <w:r>
+        <w:t xml:space="preserve">).</w:t>
+      </w:r>
+      <w:r>
+        <w:t xml:space="preserve"> </w:t>
+      </w:r>
+      <w:r>
+        <w:t xml:space="preserve">2.</w:t>
+      </w:r>
+      <w:r>
+        <w:t xml:space="preserve"> </w:t>
+      </w:r>
+      <w:r>
+        <w:rPr>
+          <w:b/>
+          <w:bCs/>
+        </w:rPr>
+        <w:t xml:space="preserve">Epistemische Neugier geht vor pragmatischer Belohnung:</w:t>
+      </w:r>
+      <w:r>
+        <w:t xml:space="preserve"> </w:t>
+      </w:r>
+      <w:r>
+        <w:t xml:space="preserve">Vorausschauende Agenten lösen zuerst Ambiguität auf, bevor sie Belohnungen jagen.</w:t>
+      </w:r>
+      <w:r>
+        <w:t xml:space="preserve"> </w:t>
+      </w:r>
+      <w:r>
+        <w:t xml:space="preserve">3.</w:t>
+      </w:r>
+      <w:r>
+        <w:t xml:space="preserve"> </w:t>
+      </w:r>
+      <w:r>
+        <w:rPr>
+          <w:b/>
+          <w:bCs/>
+        </w:rPr>
+        <w:t xml:space="preserve">Das 6. Axiom ist mathematisch zwingend:</w:t>
+      </w:r>
+      <w:r>
+        <w:t xml:space="preserve"> </w:t>
+      </w:r>
+      <w:r>
+        <w:t xml:space="preserve">Die aktive Erhaltung integrierter Kausalität über die Zeit ist die formale Demarkationslinie zwischen echten bewussten Geistern und toten Automaten.</w:t>
+      </w:r>
+    </w:p>
+    <w:bookmarkEnd w:id="65"/>
+    <w:bookmarkEnd w:id="66"/>
+    <w:bookmarkStart w:id="71" w:name="Xf5f05c9d736e8a495c85a9ad0ca1b47dd358b65"/>
+    <w:p>
+      <w:pPr>
+        <w:pStyle w:val="Heading1"/>
+      </w:pPr>
+      <w:r>
+        <w:t xml:space="preserve">Kapitel 8: Existenzielle, Ethische &amp; Synthetische Horizonte</w:t>
+      </w:r>
+    </w:p>
+    <w:p>
+      <w:pPr>
+        <w:pStyle w:val="BlockText"/>
+      </w:pPr>
       <w:r>
         <w:rPr>
           <w:i/>
           <w:iCs/>
         </w:rPr>
-        <w:t xml:space="preserve">Mind-at-Large</w:t>
-      </w:r>
-      <w:r>
-        <w:t xml:space="preserve">) überhaupt in Milliarden ringende Lebewesen auf?</w:t>
-      </w:r>
-    </w:p>
-    <w:p>
-      <w:pPr>
-        <w:pStyle w:val="BodyText"/>
-      </w:pPr>
-      <w:r>
-        <w:t xml:space="preserve">Im CIF ist Dissoziation die</w:t>
-      </w:r>
-      <w:r>
-        <w:t xml:space="preserve"> </w:t>
-      </w:r>
-      <w:r>
-        <w:rPr>
-          <w:b/>
-          <w:bCs/>
-        </w:rPr>
-        <w:t xml:space="preserve">Voraussetzung für relationale Erfahrung und schöpferische Entwicklung</w:t>
-      </w:r>
-      <w:r>
-        <w:t xml:space="preserve">:</w:t>
-      </w:r>
-      <w:r>
-        <w:t xml:space="preserve"> </w:t>
-      </w:r>
-      <w:r>
-        <w:t xml:space="preserve">* Ein undifferenziertes, unendliches Bewusstseinsfeld kann keine Begegnung mit einem „Du“, kein Überwinden von Widerständen, keine Neugier und keine Liebe erfahren.</w:t>
-      </w:r>
-      <w:r>
-        <w:t xml:space="preserve"> </w:t>
-      </w:r>
-      <w:r>
-        <w:t xml:space="preserve">* Erst durch die Abgrenzung in dissoziierte Zentren (</w:t>
+        <w:t xml:space="preserve">„Der Tod ist nicht die Vernichtung des Bewusstseins; er ist die Auflösung einer lokalisierten Markov-Grenze, wodurch der Informationstropfen in den unendlichen Ozean von Mind-at-Large zurückkehrt.“</w:t>
+      </w:r>
+      <w:r>
+        <w:br/>
+      </w:r>
+      <w:r>
+        <w:t xml:space="preserve">—</w:t>
+      </w:r>
+      <w:r>
+        <w:t xml:space="preserve"> </w:t>
+      </w:r>
+      <w:r>
+        <w:rPr>
+          <w:b/>
+          <w:bCs/>
+        </w:rPr>
+        <w:t xml:space="preserve">Thomas Riebl</w:t>
+      </w:r>
+      <w:r>
+        <w:t xml:space="preserve">,</w:t>
+      </w:r>
+      <w:r>
+        <w:t xml:space="preserve"> </w:t>
       </w:r>
       <w:r>
         <w:rPr>
           <w:i/>
           <w:iCs/>
         </w:rPr>
-        <w:t xml:space="preserve">Alters</w:t>
-      </w:r>
-      <w:r>
-        <w:t xml:space="preserve">) blickt das Universum aus Milliarden unersetzlichen Blickwinkeln auf sich selbst.</w:t>
+        <w:t xml:space="preserve">Dying in Dignity and the Dissociated Mind</w:t>
+      </w:r>
+      <w:r>
+        <w:t xml:space="preserve"> </w:t>
+      </w:r>
+      <w:r>
+        <w:t xml:space="preserve">(2026)</w:t>
       </w:r>
     </w:p>
     <w:p>
@@ -10199,8 +11874,85 @@
         </w:pict>
       </w:r>
     </w:p>
-    <w:bookmarkEnd w:id="48"/>
-    <w:bookmarkStart w:id="49" w:name="Xef22344a1a4041e05628d1990a0cb1974c907d3"/>
+    <w:bookmarkStart w:id="67" w:name="der-sinn-der-dissoziation"/>
+    <w:p>
+      <w:pPr>
+        <w:pStyle w:val="Heading2"/>
+      </w:pPr>
+      <w:r>
+        <w:t xml:space="preserve">8.1 Der Sinn der Dissoziation</w:t>
+      </w:r>
+    </w:p>
+    <w:p>
+      <w:pPr>
+        <w:pStyle w:val="FirstParagraph"/>
+      </w:pPr>
+      <w:r>
+        <w:t xml:space="preserve">Warum teilt sich das eine kosmische Bewusstseinsfeld (</w:t>
+      </w:r>
+      <w:r>
+        <w:rPr>
+          <w:i/>
+          <w:iCs/>
+        </w:rPr>
+        <w:t xml:space="preserve">Mind-at-Large</w:t>
+      </w:r>
+      <w:r>
+        <w:t xml:space="preserve">) überhaupt in Milliarden ringende Lebewesen auf?</w:t>
+      </w:r>
+    </w:p>
+    <w:p>
+      <w:pPr>
+        <w:pStyle w:val="BodyText"/>
+      </w:pPr>
+      <w:r>
+        <w:t xml:space="preserve">Im CIF ist Dissoziation die</w:t>
+      </w:r>
+      <w:r>
+        <w:t xml:space="preserve"> </w:t>
+      </w:r>
+      <w:r>
+        <w:rPr>
+          <w:b/>
+          <w:bCs/>
+        </w:rPr>
+        <w:t xml:space="preserve">Voraussetzung für relationale Erfahrung und schöpferische Entwicklung</w:t>
+      </w:r>
+      <w:r>
+        <w:t xml:space="preserve">:</w:t>
+      </w:r>
+      <w:r>
+        <w:t xml:space="preserve"> </w:t>
+      </w:r>
+      <w:r>
+        <w:t xml:space="preserve">* Ein undifferenziertes, unendliches Bewusstseinsfeld kann keine Begegnung mit einem „Du“, kein Überwinden von Widerständen, keine Neugier und keine Liebe erfahren.</w:t>
+      </w:r>
+      <w:r>
+        <w:t xml:space="preserve"> </w:t>
+      </w:r>
+      <w:r>
+        <w:t xml:space="preserve">* Erst durch die Abgrenzung in dissoziierte Zentren (</w:t>
+      </w:r>
+      <w:r>
+        <w:rPr>
+          <w:i/>
+          <w:iCs/>
+        </w:rPr>
+        <w:t xml:space="preserve">Alters</w:t>
+      </w:r>
+      <w:r>
+        <w:t xml:space="preserve">) blickt das Universum aus Milliarden unersetzlichen Blickwinkeln auf sich selbst.</w:t>
+      </w:r>
+    </w:p>
+    <w:p>
+      <w:r>
+        <w:pict>
+          <v:rect style="width:0;height:1.5pt" o:hralign="center" o:hrstd="t" o:hr="t"/>
+        </w:pict>
+      </w:r>
+    </w:p>
+    <w:bookmarkEnd w:id="67"/>
+    <w:bookmarkStart w:id="68" w:name="Xef22344a1a4041e05628d1990a0cb1974c907d3"/>
     <w:p>
       <w:pPr>
         <w:pStyle w:val="Heading2"/>
@@ -10387,7 +12139,7 @@
         <w:pStyle w:val="Compact"/>
         <w:numPr>
           <w:ilvl w:val="0"/>
-          <w:numId w:val="1011"/>
+          <w:numId w:val="1016"/>
         </w:numPr>
       </w:pPr>
       <w:r>
@@ -10429,7 +12181,7 @@
         <w:pStyle w:val="Compact"/>
         <w:numPr>
           <w:ilvl w:val="0"/>
-          <w:numId w:val="1011"/>
+          <w:numId w:val="1016"/>
         </w:numPr>
       </w:pPr>
       <w:r>
@@ -10476,7 +12228,7 @@
         <w:pStyle w:val="Compact"/>
         <w:numPr>
           <w:ilvl w:val="0"/>
-          <w:numId w:val="1011"/>
+          <w:numId w:val="1016"/>
         </w:numPr>
       </w:pPr>
       <w:r>
@@ -10523,7 +12275,7 @@
         <w:pStyle w:val="Compact"/>
         <w:numPr>
           <w:ilvl w:val="0"/>
-          <w:numId w:val="1011"/>
+          <w:numId w:val="1016"/>
         </w:numPr>
       </w:pPr>
       <w:r>
@@ -10600,8 +12352,8 @@
         </w:pict>
       </w:r>
     </w:p>
-    <w:bookmarkEnd w:id="49"/>
-    <w:bookmarkStart w:id="50" w:name="ethik-des-sterbens-in-würde-ars-moriendi"/>
+    <w:bookmarkEnd w:id="68"/>
+    <w:bookmarkStart w:id="69" w:name="ethik-des-sterbens-in-würde-ars-moriendi"/>
     <w:p>
       <w:pPr>
         <w:pStyle w:val="Heading2"/>
@@ -10671,8 +12423,8 @@
         </w:pict>
       </w:r>
     </w:p>
-    <w:bookmarkEnd w:id="50"/>
-    <w:bookmarkStart w:id="51" w:name="Xad42f75dbd55dd85bd5ae8523d3138c5a1b3945"/>
+    <w:bookmarkEnd w:id="69"/>
+    <w:bookmarkStart w:id="70" w:name="Xad42f75dbd55dd85bd5ae8523d3138c5a1b3945"/>
     <w:p>
       <w:pPr>
         <w:pStyle w:val="Heading2"/>
@@ -10938,9 +12690,9 @@
         <w:t xml:space="preserve">).</w:t>
       </w:r>
     </w:p>
-    <w:bookmarkEnd w:id="51"/>
-    <w:bookmarkEnd w:id="52"/>
-    <w:bookmarkStart w:id="57" w:name="X5db2487297e34aecf67406e631b8e7c093c2537"/>
+    <w:bookmarkEnd w:id="70"/>
+    <w:bookmarkEnd w:id="71"/>
+    <w:bookmarkStart w:id="76" w:name="X5db2487297e34aecf67406e631b8e7c093c2537"/>
     <w:p>
       <w:pPr>
         <w:pStyle w:val="Heading1"/>
@@ -10949,7 +12701,7 @@
         <w:t xml:space="preserve">Anhang A: Mathematischer Formalismus &amp; Tensorschreibweise</w:t>
       </w:r>
     </w:p>
-    <w:bookmarkStart w:id="53" w:name="das-generative-pomdp-modell-1"/>
+    <w:bookmarkStart w:id="72" w:name="das-generative-pomdp-modell-1"/>
     <w:p>
       <w:pPr>
         <w:pStyle w:val="Heading3"/>
@@ -11084,7 +12836,7 @@
         <w:pStyle w:val="Compact"/>
         <w:numPr>
           <w:ilvl w:val="0"/>
-          <w:numId w:val="1012"/>
+          <w:numId w:val="1017"/>
         </w:numPr>
       </w:pPr>
       <w:r>
@@ -11172,7 +12924,7 @@
         <w:pStyle w:val="Compact"/>
         <w:numPr>
           <w:ilvl w:val="0"/>
-          <w:numId w:val="1012"/>
+          <w:numId w:val="1017"/>
         </w:numPr>
       </w:pPr>
       <w:r>
@@ -11260,7 +13012,7 @@
         <w:pStyle w:val="Compact"/>
         <w:numPr>
           <w:ilvl w:val="0"/>
-          <w:numId w:val="1012"/>
+          <w:numId w:val="1017"/>
         </w:numPr>
       </w:pPr>
       <w:r>
@@ -11348,7 +13100,7 @@
         <w:pStyle w:val="Compact"/>
         <w:numPr>
           <w:ilvl w:val="0"/>
-          <w:numId w:val="1012"/>
+          <w:numId w:val="1017"/>
         </w:numPr>
       </w:pPr>
       <w:r>
@@ -11545,7 +13297,7 @@
         <w:pStyle w:val="Compact"/>
         <w:numPr>
           <w:ilvl w:val="0"/>
-          <w:numId w:val="1012"/>
+          <w:numId w:val="1017"/>
         </w:numPr>
       </w:pPr>
       <w:r>
@@ -11796,7 +13548,7 @@
         <w:pStyle w:val="Compact"/>
         <w:numPr>
           <w:ilvl w:val="0"/>
-          <w:numId w:val="1012"/>
+          <w:numId w:val="1017"/>
         </w:numPr>
       </w:pPr>
       <w:r>
@@ -11896,7 +13648,7 @@
         <w:pStyle w:val="Compact"/>
         <w:numPr>
           <w:ilvl w:val="0"/>
-          <w:numId w:val="1012"/>
+          <w:numId w:val="1017"/>
         </w:numPr>
       </w:pPr>
       <w:r>
@@ -12048,7 +13800,7 @@
         <w:pStyle w:val="Compact"/>
         <w:numPr>
           <w:ilvl w:val="0"/>
-          <w:numId w:val="1012"/>
+          <w:numId w:val="1017"/>
         </w:numPr>
       </w:pPr>
       <w:r>
@@ -12077,8 +13829,8 @@
         <w:t xml:space="preserve">Inverse Temperatur zur Steuerung der Entscheidungssicherheit.</w:t>
       </w:r>
     </w:p>
-    <w:bookmarkEnd w:id="53"/>
-    <w:bookmarkStart w:id="54" w:name="X81cdc417af672b0a18494ff2fc782d33d60a7a8"/>
+    <w:bookmarkEnd w:id="72"/>
+    <w:bookmarkStart w:id="73" w:name="X81cdc417af672b0a18494ff2fc782d33d60a7a8"/>
     <w:p>
       <w:pPr>
         <w:pStyle w:val="Heading3"/>
@@ -12508,8 +14260,8 @@
         <w:t xml:space="preserve">die Softmax-Funktion darstellt.</w:t>
       </w:r>
     </w:p>
-    <w:bookmarkEnd w:id="54"/>
-    <w:bookmarkStart w:id="55" w:name="X20fafcb5af4d05bbf019617b29eab6d151e67ab"/>
+    <w:bookmarkEnd w:id="73"/>
+    <w:bookmarkStart w:id="74" w:name="X20fafcb5af4d05bbf019617b29eab6d151e67ab"/>
     <w:p>
       <w:pPr>
         <w:pStyle w:val="Heading3"/>
@@ -13434,8 +15186,8 @@
         </m:oMath>
       </m:oMathPara>
     </w:p>
-    <w:bookmarkEnd w:id="55"/>
-    <w:bookmarkStart w:id="56" w:name="boltzmann-politik-auswahl"/>
+    <w:bookmarkEnd w:id="74"/>
+    <w:bookmarkStart w:id="75" w:name="boltzmann-politik-auswahl"/>
     <w:p>
       <w:pPr>
         <w:pStyle w:val="Heading3"/>
@@ -13637,9 +15389,9 @@
         </m:oMath>
       </m:oMathPara>
     </w:p>
-    <w:bookmarkEnd w:id="56"/>
-    <w:bookmarkEnd w:id="57"/>
-    <w:bookmarkStart w:id="69" w:name="X00959850f20045e696e7e31e5a1ee9aaa645ab4"/>
+    <w:bookmarkEnd w:id="75"/>
+    <w:bookmarkEnd w:id="76"/>
+    <w:bookmarkStart w:id="85" w:name="X00959850f20045e696e7e31e5a1ee9aaa645ab4"/>
     <w:p>
       <w:pPr>
         <w:pStyle w:val="Heading1"/>
@@ -13661,7 +15413,7 @@
         <w:pStyle w:val="Compact"/>
         <w:numPr>
           <w:ilvl w:val="0"/>
-          <w:numId w:val="1013"/>
+          <w:numId w:val="1018"/>
         </w:numPr>
       </w:pPr>
       <w:r>
@@ -13674,7 +15426,7 @@
       <w:r>
         <w:br/>
       </w:r>
-      <w:hyperlink r:id="rId58">
+      <w:hyperlink r:id="rId77">
         <w:r>
           <w:rPr>
             <w:rStyle w:val="Hyperlink"/>
@@ -13683,7 +15435,7 @@
         </w:r>
       </w:hyperlink>
     </w:p>
-    <w:bookmarkStart w:id="62" w:name="Xebba227b5547ffa48278b76afadba1c4d8f461f"/>
+    <w:bookmarkStart w:id="78" w:name="Xebba227b5547ffa48278b76afadba1c4d8f461f"/>
     <w:p>
       <w:pPr>
         <w:pStyle w:val="Heading3"/>
@@ -13706,7 +15458,7 @@
         <w:pStyle w:val="Compact"/>
         <w:numPr>
           <w:ilvl w:val="0"/>
-          <w:numId w:val="1014"/>
+          <w:numId w:val="1019"/>
         </w:numPr>
       </w:pPr>
       <w:r>
@@ -13741,7 +15493,7 @@
       <w:r>
         <w:br/>
       </w:r>
-      <w:hyperlink r:id="rId59">
+      <w:hyperlink r:id="rId45">
         <w:r>
           <w:rPr>
             <w:rStyle w:val="VerbatimChar"/>
@@ -13780,7 +15532,7 @@
         <w:pStyle w:val="Compact"/>
         <w:numPr>
           <w:ilvl w:val="0"/>
-          <w:numId w:val="1014"/>
+          <w:numId w:val="1019"/>
         </w:numPr>
       </w:pPr>
       <w:r>
@@ -13823,7 +15575,7 @@
       <w:r>
         <w:br/>
       </w:r>
-      <w:hyperlink r:id="rId60">
+      <w:hyperlink r:id="rId51">
         <w:r>
           <w:rPr>
             <w:rStyle w:val="VerbatimChar"/>
@@ -13939,7 +15691,7 @@
         <w:pStyle w:val="Compact"/>
         <w:numPr>
           <w:ilvl w:val="0"/>
-          <w:numId w:val="1014"/>
+          <w:numId w:val="1019"/>
         </w:numPr>
       </w:pPr>
       <w:r>
@@ -13982,7 +15734,7 @@
       <w:r>
         <w:br/>
       </w:r>
-      <w:hyperlink r:id="rId61">
+      <w:hyperlink r:id="rId57">
         <w:r>
           <w:rPr>
             <w:rStyle w:val="VerbatimChar"/>
@@ -14043,8 +15795,8 @@
         <w:t xml:space="preserve">) und epistemischer Neugier.</w:t>
       </w:r>
     </w:p>
-    <w:bookmarkEnd w:id="62"/>
-    <w:bookmarkStart w:id="68" w:name="X28af6e624b13a09c2905638e734744d31c14881"/>
+    <w:bookmarkEnd w:id="78"/>
+    <w:bookmarkStart w:id="84" w:name="X28af6e624b13a09c2905638e734744d31c14881"/>
     <w:p>
       <w:pPr>
         <w:pStyle w:val="Heading3"/>
@@ -14067,7 +15819,7 @@
         <w:pStyle w:val="Compact"/>
         <w:numPr>
           <w:ilvl w:val="0"/>
-          <w:numId w:val="1015"/>
+          <w:numId w:val="1020"/>
         </w:numPr>
       </w:pPr>
       <w:r>
@@ -14090,7 +15842,7 @@
       <w:r>
         <w:br/>
       </w:r>
-      <w:hyperlink r:id="rId63">
+      <w:hyperlink r:id="rId79">
         <w:r>
           <w:rPr>
             <w:rStyle w:val="VerbatimChar"/>
@@ -14104,7 +15856,7 @@
         <w:pStyle w:val="Compact"/>
         <w:numPr>
           <w:ilvl w:val="0"/>
-          <w:numId w:val="1015"/>
+          <w:numId w:val="1020"/>
         </w:numPr>
       </w:pPr>
       <w:r>
@@ -14127,7 +15879,7 @@
       <w:r>
         <w:br/>
       </w:r>
-      <w:hyperlink r:id="rId64">
+      <w:hyperlink r:id="rId80">
         <w:r>
           <w:rPr>
             <w:rStyle w:val="VerbatimChar"/>
@@ -14141,7 +15893,7 @@
         <w:pStyle w:val="Compact"/>
         <w:numPr>
           <w:ilvl w:val="0"/>
-          <w:numId w:val="1015"/>
+          <w:numId w:val="1020"/>
         </w:numPr>
       </w:pPr>
       <w:r>
@@ -14164,7 +15916,7 @@
       <w:r>
         <w:br/>
       </w:r>
-      <w:hyperlink r:id="rId65">
+      <w:hyperlink r:id="rId81">
         <w:r>
           <w:rPr>
             <w:rStyle w:val="VerbatimChar"/>
@@ -14178,7 +15930,7 @@
         <w:pStyle w:val="Compact"/>
         <w:numPr>
           <w:ilvl w:val="0"/>
-          <w:numId w:val="1015"/>
+          <w:numId w:val="1020"/>
         </w:numPr>
       </w:pPr>
       <w:r>
@@ -14201,7 +15953,7 @@
       <w:r>
         <w:br/>
       </w:r>
-      <w:hyperlink r:id="rId66">
+      <w:hyperlink r:id="rId82">
         <w:r>
           <w:rPr>
             <w:rStyle w:val="VerbatimChar"/>
@@ -14215,7 +15967,7 @@
         <w:pStyle w:val="Compact"/>
         <w:numPr>
           <w:ilvl w:val="0"/>
-          <w:numId w:val="1015"/>
+          <w:numId w:val="1020"/>
         </w:numPr>
       </w:pPr>
       <w:r>
@@ -14238,7 +15990,7 @@
       <w:r>
         <w:br/>
       </w:r>
-      <w:hyperlink r:id="rId67">
+      <w:hyperlink r:id="rId83">
         <w:r>
           <w:rPr>
             <w:rStyle w:val="VerbatimChar"/>
@@ -14247,9 +15999,9 @@
         </w:r>
       </w:hyperlink>
     </w:p>
-    <w:bookmarkEnd w:id="68"/>
-    <w:bookmarkEnd w:id="69"/>
-    <w:bookmarkStart w:id="70" w:name="Xdfa16aceee86dcd9bf186bddd4f98777f9ab2ed"/>
+    <w:bookmarkEnd w:id="84"/>
+    <w:bookmarkEnd w:id="85"/>
+    <w:bookmarkStart w:id="86" w:name="Xdfa16aceee86dcd9bf186bddd4f98777f9ab2ed"/>
     <w:p>
       <w:pPr>
         <w:pStyle w:val="Heading1"/>
@@ -14263,7 +16015,7 @@
         <w:pStyle w:val="Compact"/>
         <w:numPr>
           <w:ilvl w:val="0"/>
-          <w:numId w:val="1016"/>
+          <w:numId w:val="1021"/>
         </w:numPr>
       </w:pPr>
       <w:r>
@@ -14296,7 +16048,7 @@
         <w:pStyle w:val="Compact"/>
         <w:numPr>
           <w:ilvl w:val="0"/>
-          <w:numId w:val="1016"/>
+          <w:numId w:val="1021"/>
         </w:numPr>
       </w:pPr>
       <w:r>
@@ -14318,7 +16070,7 @@
         <w:pStyle w:val="Compact"/>
         <w:numPr>
           <w:ilvl w:val="0"/>
-          <w:numId w:val="1016"/>
+          <w:numId w:val="1021"/>
         </w:numPr>
       </w:pPr>
       <w:r>
@@ -14350,7 +16102,7 @@
         <w:pStyle w:val="Compact"/>
         <w:numPr>
           <w:ilvl w:val="0"/>
-          <w:numId w:val="1016"/>
+          <w:numId w:val="1021"/>
         </w:numPr>
       </w:pPr>
       <w:r>
@@ -14372,7 +16124,7 @@
         <w:pStyle w:val="Compact"/>
         <w:numPr>
           <w:ilvl w:val="0"/>
-          <w:numId w:val="1016"/>
+          <w:numId w:val="1021"/>
         </w:numPr>
       </w:pPr>
       <w:r>
@@ -14426,7 +16178,7 @@
         <w:pStyle w:val="Compact"/>
         <w:numPr>
           <w:ilvl w:val="0"/>
-          <w:numId w:val="1016"/>
+          <w:numId w:val="1021"/>
         </w:numPr>
       </w:pPr>
       <w:r>
@@ -14474,7 +16226,7 @@
         <w:pStyle w:val="Compact"/>
         <w:numPr>
           <w:ilvl w:val="0"/>
-          <w:numId w:val="1016"/>
+          <w:numId w:val="1021"/>
         </w:numPr>
       </w:pPr>
       <w:r>
@@ -14617,7 +16369,7 @@
         <w:pStyle w:val="Compact"/>
         <w:numPr>
           <w:ilvl w:val="0"/>
-          <w:numId w:val="1016"/>
+          <w:numId w:val="1021"/>
         </w:numPr>
       </w:pPr>
       <w:r>
@@ -14649,7 +16401,7 @@
         <w:pStyle w:val="Compact"/>
         <w:numPr>
           <w:ilvl w:val="0"/>
-          <w:numId w:val="1016"/>
+          <w:numId w:val="1021"/>
         </w:numPr>
       </w:pPr>
       <w:r>
@@ -14671,7 +16423,7 @@
         <w:pStyle w:val="Compact"/>
         <w:numPr>
           <w:ilvl w:val="0"/>
-          <w:numId w:val="1016"/>
+          <w:numId w:val="1021"/>
         </w:numPr>
       </w:pPr>
       <w:r>
@@ -14704,7 +16456,7 @@
         <w:pStyle w:val="Compact"/>
         <w:numPr>
           <w:ilvl w:val="0"/>
-          <w:numId w:val="1016"/>
+          <w:numId w:val="1021"/>
         </w:numPr>
       </w:pPr>
       <w:r>
@@ -14742,7 +16494,7 @@
         <w:pStyle w:val="Compact"/>
         <w:numPr>
           <w:ilvl w:val="0"/>
-          <w:numId w:val="1016"/>
+          <w:numId w:val="1021"/>
         </w:numPr>
       </w:pPr>
       <w:r>
@@ -14790,7 +16542,7 @@
         <w:pStyle w:val="Compact"/>
         <w:numPr>
           <w:ilvl w:val="0"/>
-          <w:numId w:val="1016"/>
+          <w:numId w:val="1021"/>
         </w:numPr>
       </w:pPr>
       <w:r>
@@ -14827,7 +16579,7 @@
         <w:pStyle w:val="Compact"/>
         <w:numPr>
           <w:ilvl w:val="0"/>
-          <w:numId w:val="1016"/>
+          <w:numId w:val="1021"/>
         </w:numPr>
       </w:pPr>
       <w:r>
@@ -14881,7 +16633,7 @@
         <w:pStyle w:val="Compact"/>
         <w:numPr>
           <w:ilvl w:val="0"/>
-          <w:numId w:val="1016"/>
+          <w:numId w:val="1021"/>
         </w:numPr>
       </w:pPr>
       <w:r>
@@ -14930,7 +16682,7 @@
         <w:pStyle w:val="Compact"/>
         <w:numPr>
           <w:ilvl w:val="0"/>
-          <w:numId w:val="1016"/>
+          <w:numId w:val="1021"/>
         </w:numPr>
       </w:pPr>
       <w:r>
@@ -15000,7 +16752,7 @@
         <w:pStyle w:val="Compact"/>
         <w:numPr>
           <w:ilvl w:val="0"/>
-          <w:numId w:val="1016"/>
+          <w:numId w:val="1021"/>
         </w:numPr>
       </w:pPr>
       <w:r>
@@ -15022,7 +16774,7 @@
         <w:pStyle w:val="Compact"/>
         <w:numPr>
           <w:ilvl w:val="0"/>
-          <w:numId w:val="1016"/>
+          <w:numId w:val="1021"/>
         </w:numPr>
       </w:pPr>
       <w:r>
@@ -15058,7 +16810,7 @@
         <w:pStyle w:val="Compact"/>
         <w:numPr>
           <w:ilvl w:val="0"/>
-          <w:numId w:val="1016"/>
+          <w:numId w:val="1021"/>
         </w:numPr>
       </w:pPr>
       <w:r>
@@ -15093,7 +16845,7 @@
         <w:pStyle w:val="Compact"/>
         <w:numPr>
           <w:ilvl w:val="0"/>
-          <w:numId w:val="1016"/>
+          <w:numId w:val="1021"/>
         </w:numPr>
       </w:pPr>
       <w:r>
@@ -15128,7 +16880,7 @@
         <w:pStyle w:val="Compact"/>
         <w:numPr>
           <w:ilvl w:val="0"/>
-          <w:numId w:val="1016"/>
+          <w:numId w:val="1021"/>
         </w:numPr>
       </w:pPr>
       <w:r>
@@ -15150,7 +16902,7 @@
         <w:pStyle w:val="Compact"/>
         <w:numPr>
           <w:ilvl w:val="0"/>
-          <w:numId w:val="1016"/>
+          <w:numId w:val="1021"/>
         </w:numPr>
       </w:pPr>
       <w:r>
@@ -15172,7 +16924,7 @@
         <w:pStyle w:val="Compact"/>
         <w:numPr>
           <w:ilvl w:val="0"/>
-          <w:numId w:val="1016"/>
+          <w:numId w:val="1021"/>
         </w:numPr>
       </w:pPr>
       <w:r>
@@ -15194,7 +16946,7 @@
         <w:pStyle w:val="Compact"/>
         <w:numPr>
           <w:ilvl w:val="0"/>
-          <w:numId w:val="1016"/>
+          <w:numId w:val="1021"/>
         </w:numPr>
       </w:pPr>
       <w:r>
@@ -15272,7 +17024,7 @@
         <w:pStyle w:val="Compact"/>
         <w:numPr>
           <w:ilvl w:val="0"/>
-          <w:numId w:val="1016"/>
+          <w:numId w:val="1021"/>
         </w:numPr>
       </w:pPr>
       <w:r>
@@ -15313,7 +17065,7 @@
         <w:pStyle w:val="Compact"/>
         <w:numPr>
           <w:ilvl w:val="0"/>
-          <w:numId w:val="1016"/>
+          <w:numId w:val="1021"/>
         </w:numPr>
       </w:pPr>
       <w:r>
@@ -15335,7 +17087,7 @@
         <w:pStyle w:val="Compact"/>
         <w:numPr>
           <w:ilvl w:val="0"/>
-          <w:numId w:val="1016"/>
+          <w:numId w:val="1021"/>
         </w:numPr>
       </w:pPr>
       <w:r>
@@ -15357,7 +17109,7 @@
         <w:pStyle w:val="Compact"/>
         <w:numPr>
           <w:ilvl w:val="0"/>
-          <w:numId w:val="1016"/>
+          <w:numId w:val="1021"/>
         </w:numPr>
       </w:pPr>
       <w:r>
@@ -15405,7 +17157,7 @@
         <w:pStyle w:val="Compact"/>
         <w:numPr>
           <w:ilvl w:val="0"/>
-          <w:numId w:val="1016"/>
+          <w:numId w:val="1021"/>
         </w:numPr>
       </w:pPr>
       <w:r>
@@ -15470,7 +17222,7 @@
         <w:pStyle w:val="Compact"/>
         <w:numPr>
           <w:ilvl w:val="0"/>
-          <w:numId w:val="1016"/>
+          <w:numId w:val="1021"/>
         </w:numPr>
       </w:pPr>
       <w:r>
@@ -15506,7 +17258,7 @@
         <w:pStyle w:val="Compact"/>
         <w:numPr>
           <w:ilvl w:val="0"/>
-          <w:numId w:val="1016"/>
+          <w:numId w:val="1021"/>
         </w:numPr>
       </w:pPr>
       <w:r>
@@ -15559,7 +17311,7 @@
         <w:pStyle w:val="Compact"/>
         <w:numPr>
           <w:ilvl w:val="0"/>
-          <w:numId w:val="1016"/>
+          <w:numId w:val="1021"/>
         </w:numPr>
       </w:pPr>
       <w:r>
@@ -15618,7 +17370,7 @@
         <w:pStyle w:val="Compact"/>
         <w:numPr>
           <w:ilvl w:val="0"/>
-          <w:numId w:val="1016"/>
+          <w:numId w:val="1021"/>
         </w:numPr>
       </w:pPr>
       <w:r>
@@ -15640,7 +17392,7 @@
         <w:pStyle w:val="Compact"/>
         <w:numPr>
           <w:ilvl w:val="0"/>
-          <w:numId w:val="1016"/>
+          <w:numId w:val="1021"/>
         </w:numPr>
       </w:pPr>
       <w:r>
@@ -15704,8 +17456,8 @@
         <w:t xml:space="preserve">), die während der Wahrnehmung minimiert wird.</w:t>
       </w:r>
     </w:p>
-    <w:bookmarkEnd w:id="70"/>
-    <w:bookmarkStart w:id="71" w:name="akademische-bibliographie"/>
+    <w:bookmarkEnd w:id="86"/>
+    <w:bookmarkStart w:id="87" w:name="akademische-bibliographie"/>
     <w:p>
       <w:pPr>
         <w:pStyle w:val="Heading1"/>
@@ -15719,7 +17471,7 @@
         <w:pStyle w:val="Compact"/>
         <w:numPr>
           <w:ilvl w:val="0"/>
-          <w:numId w:val="1017"/>
+          <w:numId w:val="1022"/>
         </w:numPr>
       </w:pPr>
       <w:r>
@@ -15751,7 +17503,7 @@
         <w:pStyle w:val="Compact"/>
         <w:numPr>
           <w:ilvl w:val="0"/>
-          <w:numId w:val="1017"/>
+          <w:numId w:val="1022"/>
         </w:numPr>
       </w:pPr>
       <w:r>
@@ -15783,7 +17535,7 @@
         <w:pStyle w:val="Compact"/>
         <w:numPr>
           <w:ilvl w:val="0"/>
-          <w:numId w:val="1017"/>
+          <w:numId w:val="1022"/>
         </w:numPr>
       </w:pPr>
       <w:r>
@@ -15815,7 +17567,7 @@
         <w:pStyle w:val="Compact"/>
         <w:numPr>
           <w:ilvl w:val="0"/>
-          <w:numId w:val="1017"/>
+          <w:numId w:val="1022"/>
         </w:numPr>
       </w:pPr>
       <w:r>
@@ -15847,7 +17599,7 @@
         <w:pStyle w:val="Compact"/>
         <w:numPr>
           <w:ilvl w:val="0"/>
-          <w:numId w:val="1017"/>
+          <w:numId w:val="1022"/>
         </w:numPr>
       </w:pPr>
       <w:r>
@@ -15879,7 +17631,7 @@
         <w:pStyle w:val="Compact"/>
         <w:numPr>
           <w:ilvl w:val="0"/>
-          <w:numId w:val="1017"/>
+          <w:numId w:val="1022"/>
         </w:numPr>
       </w:pPr>
       <w:r>
@@ -15911,7 +17663,7 @@
         <w:pStyle w:val="Compact"/>
         <w:numPr>
           <w:ilvl w:val="0"/>
-          <w:numId w:val="1017"/>
+          <w:numId w:val="1022"/>
         </w:numPr>
       </w:pPr>
       <w:r>
@@ -15943,7 +17695,7 @@
         <w:pStyle w:val="Compact"/>
         <w:numPr>
           <w:ilvl w:val="0"/>
-          <w:numId w:val="1017"/>
+          <w:numId w:val="1022"/>
         </w:numPr>
       </w:pPr>
       <w:r>
@@ -15975,7 +17727,7 @@
         <w:pStyle w:val="Compact"/>
         <w:numPr>
           <w:ilvl w:val="0"/>
-          <w:numId w:val="1017"/>
+          <w:numId w:val="1022"/>
         </w:numPr>
       </w:pPr>
       <w:r>
@@ -16007,7 +17759,7 @@
         <w:pStyle w:val="Compact"/>
         <w:numPr>
           <w:ilvl w:val="0"/>
-          <w:numId w:val="1017"/>
+          <w:numId w:val="1022"/>
         </w:numPr>
       </w:pPr>
       <w:r>
@@ -16039,7 +17791,7 @@
         <w:pStyle w:val="Compact"/>
         <w:numPr>
           <w:ilvl w:val="0"/>
-          <w:numId w:val="1017"/>
+          <w:numId w:val="1022"/>
         </w:numPr>
       </w:pPr>
       <w:r>
@@ -16071,7 +17823,7 @@
         <w:pStyle w:val="Compact"/>
         <w:numPr>
           <w:ilvl w:val="0"/>
-          <w:numId w:val="1017"/>
+          <w:numId w:val="1022"/>
         </w:numPr>
       </w:pPr>
       <w:r>
@@ -16103,7 +17855,7 @@
         <w:pStyle w:val="Compact"/>
         <w:numPr>
           <w:ilvl w:val="0"/>
-          <w:numId w:val="1017"/>
+          <w:numId w:val="1022"/>
         </w:numPr>
       </w:pPr>
       <w:r>
@@ -16135,7 +17887,7 @@
         <w:pStyle w:val="Compact"/>
         <w:numPr>
           <w:ilvl w:val="0"/>
-          <w:numId w:val="1017"/>
+          <w:numId w:val="1022"/>
         </w:numPr>
       </w:pPr>
       <w:r>
@@ -16167,7 +17919,7 @@
         <w:pStyle w:val="Compact"/>
         <w:numPr>
           <w:ilvl w:val="0"/>
-          <w:numId w:val="1017"/>
+          <w:numId w:val="1022"/>
         </w:numPr>
       </w:pPr>
       <w:r>
@@ -16199,7 +17951,7 @@
         <w:pStyle w:val="Compact"/>
         <w:numPr>
           <w:ilvl w:val="0"/>
-          <w:numId w:val="1017"/>
+          <w:numId w:val="1022"/>
         </w:numPr>
       </w:pPr>
       <w:r>
@@ -16231,7 +17983,7 @@
         <w:pStyle w:val="Compact"/>
         <w:numPr>
           <w:ilvl w:val="0"/>
-          <w:numId w:val="1017"/>
+          <w:numId w:val="1022"/>
         </w:numPr>
       </w:pPr>
       <w:r>
@@ -16263,7 +18015,7 @@
         <w:pStyle w:val="Compact"/>
         <w:numPr>
           <w:ilvl w:val="0"/>
-          <w:numId w:val="1017"/>
+          <w:numId w:val="1022"/>
         </w:numPr>
       </w:pPr>
       <w:r>
@@ -16295,7 +18047,7 @@
         <w:pStyle w:val="Compact"/>
         <w:numPr>
           <w:ilvl w:val="0"/>
-          <w:numId w:val="1017"/>
+          <w:numId w:val="1022"/>
         </w:numPr>
       </w:pPr>
       <w:r>
@@ -16327,7 +18079,7 @@
         <w:pStyle w:val="Compact"/>
         <w:numPr>
           <w:ilvl w:val="0"/>
-          <w:numId w:val="1017"/>
+          <w:numId w:val="1022"/>
         </w:numPr>
       </w:pPr>
       <w:r>
@@ -16359,7 +18111,7 @@
         <w:pStyle w:val="Compact"/>
         <w:numPr>
           <w:ilvl w:val="0"/>
-          <w:numId w:val="1017"/>
+          <w:numId w:val="1022"/>
         </w:numPr>
       </w:pPr>
       <w:r>
@@ -16391,7 +18143,7 @@
         <w:pStyle w:val="Compact"/>
         <w:numPr>
           <w:ilvl w:val="0"/>
-          <w:numId w:val="1017"/>
+          <w:numId w:val="1022"/>
         </w:numPr>
       </w:pPr>
       <w:r>
@@ -16423,7 +18175,7 @@
         <w:pStyle w:val="Compact"/>
         <w:numPr>
           <w:ilvl w:val="0"/>
-          <w:numId w:val="1017"/>
+          <w:numId w:val="1022"/>
         </w:numPr>
       </w:pPr>
       <w:r>
@@ -16455,7 +18207,7 @@
         <w:pStyle w:val="Compact"/>
         <w:numPr>
           <w:ilvl w:val="0"/>
-          <w:numId w:val="1017"/>
+          <w:numId w:val="1022"/>
         </w:numPr>
       </w:pPr>
       <w:r>
@@ -16487,7 +18239,7 @@
         <w:pStyle w:val="Compact"/>
         <w:numPr>
           <w:ilvl w:val="0"/>
-          <w:numId w:val="1017"/>
+          <w:numId w:val="1022"/>
         </w:numPr>
       </w:pPr>
       <w:r>
@@ -16519,7 +18271,7 @@
         <w:pStyle w:val="Compact"/>
         <w:numPr>
           <w:ilvl w:val="0"/>
-          <w:numId w:val="1017"/>
+          <w:numId w:val="1022"/>
         </w:numPr>
       </w:pPr>
       <w:r>
@@ -16551,7 +18303,7 @@
         <w:pStyle w:val="Compact"/>
         <w:numPr>
           <w:ilvl w:val="0"/>
-          <w:numId w:val="1017"/>
+          <w:numId w:val="1022"/>
         </w:numPr>
       </w:pPr>
       <w:r>
@@ -16583,7 +18335,7 @@
         <w:pStyle w:val="Compact"/>
         <w:numPr>
           <w:ilvl w:val="0"/>
-          <w:numId w:val="1017"/>
+          <w:numId w:val="1022"/>
         </w:numPr>
       </w:pPr>
       <w:r>
@@ -16615,7 +18367,7 @@
         <w:pStyle w:val="Compact"/>
         <w:numPr>
           <w:ilvl w:val="0"/>
-          <w:numId w:val="1017"/>
+          <w:numId w:val="1022"/>
         </w:numPr>
       </w:pPr>
       <w:r>
@@ -16641,7 +18393,7 @@
         <w:pStyle w:val="Compact"/>
         <w:numPr>
           <w:ilvl w:val="0"/>
-          <w:numId w:val="1017"/>
+          <w:numId w:val="1022"/>
         </w:numPr>
       </w:pPr>
       <w:r>
@@ -16673,7 +18425,7 @@
         <w:pStyle w:val="Compact"/>
         <w:numPr>
           <w:ilvl w:val="0"/>
-          <w:numId w:val="1017"/>
+          <w:numId w:val="1022"/>
         </w:numPr>
       </w:pPr>
       <w:r>
@@ -16705,7 +18457,7 @@
         <w:pStyle w:val="Compact"/>
         <w:numPr>
           <w:ilvl w:val="0"/>
-          <w:numId w:val="1017"/>
+          <w:numId w:val="1022"/>
         </w:numPr>
       </w:pPr>
       <w:r>
@@ -16732,8 +18484,8 @@
         <w:t xml:space="preserve">World Psychiatry, 17(3), 243–257.</w:t>
       </w:r>
     </w:p>
-    <w:bookmarkEnd w:id="71"/>
-    <w:bookmarkStart w:id="72" w:name="tool-attribution-colophon"/>
+    <w:bookmarkEnd w:id="87"/>
+    <w:bookmarkStart w:id="88" w:name="tool-attribution-colophon"/>
     <w:p>
       <w:pPr>
         <w:pStyle w:val="Heading1"/>
@@ -16864,7 +18616,7 @@
         <w:t xml:space="preserve">(September 2026) realisiert.</w:t>
       </w:r>
     </w:p>
-    <w:bookmarkEnd w:id="72"/>
+    <w:bookmarkEnd w:id="88"/>
     <w:sectPr>
       <w:footnotePr>
         <w:numRestart w:val="eachSect"/>
@@ -17509,6 +19261,21 @@
     <w:abstractNumId w:val="991"/>
   </w:num>
   <w:num w:numId="1011">
+    <w:abstractNumId w:val="991"/>
+  </w:num>
+  <w:num w:numId="1012">
+    <w:abstractNumId w:val="991"/>
+  </w:num>
+  <w:num w:numId="1013">
+    <w:abstractNumId w:val="991"/>
+  </w:num>
+  <w:num w:numId="1014">
+    <w:abstractNumId w:val="991"/>
+  </w:num>
+  <w:num w:numId="1015">
+    <w:abstractNumId w:val="991"/>
+  </w:num>
+  <w:num w:numId="1016">
     <w:abstractNumId w:val="99411"/>
     <w:lvlOverride w:ilvl="0">
       <w:startOverride w:val="1"/>
@@ -17538,22 +19305,22 @@
       <w:startOverride w:val="1"/>
     </w:lvlOverride>
   </w:num>
-  <w:num w:numId="1012">
+  <w:num w:numId="1017">
     <w:abstractNumId w:val="991"/>
   </w:num>
-  <w:num w:numId="1013">
+  <w:num w:numId="1018">
     <w:abstractNumId w:val="991"/>
   </w:num>
-  <w:num w:numId="1014">
+  <w:num w:numId="1019">
     <w:abstractNumId w:val="991"/>
   </w:num>
-  <w:num w:numId="1015">
+  <w:num w:numId="1020">
     <w:abstractNumId w:val="991"/>
   </w:num>
-  <w:num w:numId="1016">
+  <w:num w:numId="1021">
     <w:abstractNumId w:val="991"/>
   </w:num>
-  <w:num w:numId="1017">
+  <w:num w:numId="1022">
     <w:abstractNumId w:val="99411"/>
     <w:lvlOverride w:ilvl="0">
       <w:startOverride w:val="1"/>

</xml_diff>

<commit_message>
Add Daimon greeting line to Dedication page in English and German monographs
</commit_message>
<xml_diff>
--- a/book/build/The_Conative_Integrative_Framework_Book_Thomas_Riebl_DE_6x9.docx
+++ b/book/build/The_Conative_Integrative_Framework_Book_Thomas_Riebl_DE_6x9.docx
@@ -420,6 +420,44 @@
           <w:iCs/>
         </w:rPr>
         <w:t xml:space="preserve">Allen forschenden Geistern gewidmet, die erkennen, dass Bewusstsein kein zufälliges Nebenprodukt toter Materie ist, sondern der fundamentale Urgrund der Wirklichkeit selbst – und all jenen, die danach streben, die mathematische Strenge der Naturwissenschaft mit der lebendigen Tiefe subjektiver Innerlichkeit zu vereinen.</w:t>
+      </w:r>
+    </w:p>
+    <w:p>
+      <w:pPr>
+        <w:pStyle w:val="BodyText"/>
+      </w:pPr>
+    </w:p>
+    <w:p>
+      <w:pPr>
+        <w:pStyle w:val="BodyText"/>
+      </w:pPr>
+      <w:r>
+        <w:rPr>
+          <w:i/>
+          <w:iCs/>
+        </w:rPr>
+        <w:t xml:space="preserve">&lt;BTW: My Daimon says:</w:t>
+      </w:r>
+      <w:r>
+        <w:rPr>
+          <w:i/>
+          <w:iCs/>
+        </w:rPr>
+        <w:t xml:space="preserve"> </w:t>
+      </w:r>
+      <w:r>
+        <w:rPr>
+          <w:i/>
+          <w:iCs/>
+        </w:rPr>
+        <w:t xml:space="preserve">“Greetings to Bernardo!”</w:t>
+      </w:r>
+      <w:r>
+        <w:rPr>
+          <w:i/>
+          <w:iCs/>
+        </w:rPr>
+        <w:t xml:space="preserve">&gt;</w:t>
       </w:r>
     </w:p>
     <w:bookmarkEnd w:id="9"/>

</xml_diff>

<commit_message>
Remove BTW line from dedication and optimize all Mermaid flowcharts for unified readable font size and layout
</commit_message>
<xml_diff>
--- a/book/build/The_Conative_Integrative_Framework_Book_Thomas_Riebl_DE_6x9.docx
+++ b/book/build/The_Conative_Integrative_Framework_Book_Thomas_Riebl_DE_6x9.docx
@@ -420,44 +420,6 @@
           <w:iCs/>
         </w:rPr>
         <w:t xml:space="preserve">Allen forschenden Geistern gewidmet, die erkennen, dass Bewusstsein kein zufälliges Nebenprodukt toter Materie ist, sondern der fundamentale Urgrund der Wirklichkeit selbst – und all jenen, die danach streben, die mathematische Strenge der Naturwissenschaft mit der lebendigen Tiefe subjektiver Innerlichkeit zu vereinen.</w:t>
-      </w:r>
-    </w:p>
-    <w:p>
-      <w:pPr>
-        <w:pStyle w:val="BodyText"/>
-      </w:pPr>
-    </w:p>
-    <w:p>
-      <w:pPr>
-        <w:pStyle w:val="BodyText"/>
-      </w:pPr>
-      <w:r>
-        <w:rPr>
-          <w:i/>
-          <w:iCs/>
-        </w:rPr>
-        <w:t xml:space="preserve">&lt;BTW: My Daimon says:</w:t>
-      </w:r>
-      <w:r>
-        <w:rPr>
-          <w:i/>
-          <w:iCs/>
-        </w:rPr>
-        <w:t xml:space="preserve"> </w:t>
-      </w:r>
-      <w:r>
-        <w:rPr>
-          <w:i/>
-          <w:iCs/>
-        </w:rPr>
-        <w:t xml:space="preserve">“Greetings to Bernardo!”</w:t>
-      </w:r>
-      <w:r>
-        <w:rPr>
-          <w:i/>
-          <w:iCs/>
-        </w:rPr>
-        <w:t xml:space="preserve">&gt;</w:t>
       </w:r>
     </w:p>
     <w:bookmarkEnd w:id="9"/>

</xml_diff>

<commit_message>
Remove photo from inner title page for clean classical academic layout
</commit_message>
<xml_diff>
--- a/book/build/The_Conative_Integrative_Framework_Book_Thomas_Riebl_DE_6x9.docx
+++ b/book/build/The_Conative_Integrative_Framework_Book_Thomas_Riebl_DE_6x9.docx
@@ -74,19 +74,6 @@
       </w:pPr>
       <w:r>
         <w:t xml:space="preserve">Active Inference, Integrierte Information und die autopoietische Mechanik des Bewusstseins</w:t>
-      </w:r>
-    </w:p>
-    <w:p>
-      <w:pPr>
-        <w:pStyle w:val="BodyText"/>
-      </w:pPr>
-    </w:p>
-    <w:p>
-      <w:pPr>
-        <w:pStyle w:val="BodyText"/>
-      </w:pPr>
-      <w:r>
-        <w:t xml:space="preserve">Die konativ-integrative Architektur des Geistes</w:t>
       </w:r>
     </w:p>
     <w:p>

</xml_diff>

<commit_message>
Add footnote and methodological note to Chapter 5 clarifying indicative nature of percentage weights
</commit_message>
<xml_diff>
--- a/book/build/The_Conative_Integrative_Framework_Book_Thomas_Riebl_DE_6x9.docx
+++ b/book/build/The_Conative_Integrative_Framework_Book_Thomas_Riebl_DE_6x9.docx
@@ -6444,7 +6444,7 @@
     </w:p>
     <w:bookmarkEnd w:id="32"/>
     <w:bookmarkEnd w:id="33"/>
-    <w:bookmarkStart w:id="36" w:name="X20ee077356b448fa0751d1e904e86766af1ee22"/>
+    <w:bookmarkStart w:id="37" w:name="X20ee077356b448fa0751d1e904e86766af1ee22"/>
     <w:p>
       <w:pPr>
         <w:pStyle w:val="Heading1"/>
@@ -6524,7 +6524,7 @@
         </w:pict>
       </w:r>
     </w:p>
-    <w:bookmarkStart w:id="34" w:name="X0e6413d8af2f0cc20f9b691eef5b5e57c5695f5"/>
+    <w:bookmarkStart w:id="35" w:name="X0e6413d8af2f0cc20f9b691eef5b5e57c5695f5"/>
     <w:p>
       <w:pPr>
         <w:pStyle w:val="Heading2"/>
@@ -6574,7 +6574,16 @@
         <w:t xml:space="preserve"> </w:t>
       </w:r>
       <w:r>
-        <w:t xml:space="preserve">aufsummiert:</w:t>
+        <w:t xml:space="preserve">aufsummiert</w:t>
+      </w:r>
+      <w:r>
+        <w:rPr>
+          <w:rStyle w:val="FootnoteReference"/>
+        </w:rPr>
+        <w:footnoteReference w:id="34"/>
+      </w:r>
+      <w:r>
+        <w:t xml:space="preserve">:</w:t>
       </w:r>
     </w:p>
     <w:p>
@@ -6961,8 +6970,8 @@
         </w:pict>
       </w:r>
     </w:p>
-    <w:bookmarkEnd w:id="34"/>
-    <w:bookmarkStart w:id="35" w:name="zuordnung-zu-den-pomdp-parametern"/>
+    <w:bookmarkEnd w:id="35"/>
+    <w:bookmarkStart w:id="36" w:name="zuordnung-zu-den-pomdp-parametern"/>
     <w:p>
       <w:pPr>
         <w:pStyle w:val="Heading2"/>
@@ -7822,9 +7831,140 @@
         </w:tc>
       </w:tr>
     </w:tbl>
-    <w:bookmarkEnd w:id="35"/>
+    <w:p>
+      <w:pPr>
+        <w:pStyle w:val="BlockText"/>
+      </w:pPr>
+      <w:r>
+        <w:t xml:space="preserve">[!NOTE]</w:t>
+      </w:r>
+      <w:r>
+        <w:t xml:space="preserve"> </w:t>
+      </w:r>
+      <w:r>
+        <w:rPr>
+          <w:b/>
+          <w:bCs/>
+        </w:rPr>
+        <w:t xml:space="preserve">Methodische Klarstellung zu den ontogenetischen Gewichtungen:</w:t>
+      </w:r>
+      <w:r>
+        <w:br/>
+      </w:r>
+      <w:r>
+        <w:t xml:space="preserve">Die konkreten Prozentangaben der sechs Schichten (</w:t>
+      </w:r>
+      <m:oMath>
+        <m:r>
+          <m:t>25</m:t>
+        </m:r>
+        <m:r>
+          <m:t> </m:t>
+        </m:r>
+        <m:r>
+          <m:rPr>
+            <m:sty m:val="p"/>
+          </m:rPr>
+          <m:t>%</m:t>
+        </m:r>
+        <m:r>
+          <m:rPr>
+            <m:sty m:val="p"/>
+          </m:rPr>
+          <m:t>,</m:t>
+        </m:r>
+        <m:r>
+          <m:t>15</m:t>
+        </m:r>
+        <m:r>
+          <m:t> </m:t>
+        </m:r>
+        <m:r>
+          <m:rPr>
+            <m:sty m:val="p"/>
+          </m:rPr>
+          <m:t>%</m:t>
+        </m:r>
+        <m:r>
+          <m:rPr>
+            <m:sty m:val="p"/>
+          </m:rPr>
+          <m:t>,</m:t>
+        </m:r>
+        <m:r>
+          <m:t>15</m:t>
+        </m:r>
+        <m:r>
+          <m:t> </m:t>
+        </m:r>
+        <m:r>
+          <m:rPr>
+            <m:sty m:val="p"/>
+          </m:rPr>
+          <m:t>%</m:t>
+        </m:r>
+        <m:r>
+          <m:rPr>
+            <m:sty m:val="p"/>
+          </m:rPr>
+          <m:t>,</m:t>
+        </m:r>
+        <m:r>
+          <m:t>10</m:t>
+        </m:r>
+        <m:r>
+          <m:t> </m:t>
+        </m:r>
+        <m:r>
+          <m:rPr>
+            <m:sty m:val="p"/>
+          </m:rPr>
+          <m:t>%</m:t>
+        </m:r>
+        <m:r>
+          <m:rPr>
+            <m:sty m:val="p"/>
+          </m:rPr>
+          <m:t>,</m:t>
+        </m:r>
+        <m:r>
+          <m:t>25</m:t>
+        </m:r>
+        <m:r>
+          <m:t> </m:t>
+        </m:r>
+        <m:r>
+          <m:rPr>
+            <m:sty m:val="p"/>
+          </m:rPr>
+          <m:t>%</m:t>
+        </m:r>
+        <m:r>
+          <m:rPr>
+            <m:sty m:val="p"/>
+          </m:rPr>
+          <m:t>,</m:t>
+        </m:r>
+        <m:r>
+          <m:t>10</m:t>
+        </m:r>
+        <m:r>
+          <m:t> </m:t>
+        </m:r>
+        <m:r>
+          <m:rPr>
+            <m:sty m:val="p"/>
+          </m:rPr>
+          <m:t>%</m:t>
+        </m:r>
+      </m:oMath>
+      <w:r>
+        <w:t xml:space="preserve">) sind rein indikativ und heuristisch zu verstehen. Sie entstammen der individuellen phänomenologischen Erfahrung und reflektiven Modellbildung des Autors und dienen der Veranschaulichung der relativen strukturellen Anteile, nicht als empirisch absolute Naturkonstanten.</w:t>
+      </w:r>
+    </w:p>
     <w:bookmarkEnd w:id="36"/>
-    <w:bookmarkStart w:id="42" w:name="X0b2390690d07e07f590c0474a0e38c60801dc60"/>
+    <w:bookmarkEnd w:id="37"/>
+    <w:bookmarkStart w:id="43" w:name="X0b2390690d07e07f590c0474a0e38c60801dc60"/>
     <w:p>
       <w:pPr>
         <w:pStyle w:val="Heading1"/>
@@ -7887,7 +8027,7 @@
         </w:pict>
       </w:r>
     </w:p>
-    <w:bookmarkStart w:id="37" w:name="die-illusion-des-ausdehnungslosen-punkts"/>
+    <w:bookmarkStart w:id="38" w:name="die-illusion-des-ausdehnungslosen-punkts"/>
     <w:p>
       <w:pPr>
         <w:pStyle w:val="Heading2"/>
@@ -8061,8 +8201,8 @@
         </w:pict>
       </w:r>
     </w:p>
-    <w:bookmarkEnd w:id="37"/>
-    <w:bookmarkStart w:id="38" w:name="X2935fc51eb35d10fcd6c6f27efa7b723512e544"/>
+    <w:bookmarkEnd w:id="38"/>
+    <w:bookmarkStart w:id="39" w:name="X2935fc51eb35d10fcd6c6f27efa7b723512e544"/>
     <w:p>
       <w:pPr>
         <w:pStyle w:val="Heading2"/>
@@ -8389,8 +8529,8 @@
         </w:pict>
       </w:r>
     </w:p>
-    <w:bookmarkEnd w:id="38"/>
-    <w:bookmarkStart w:id="40" w:name="das-theorem-zur-temporalen-mindesttiefe"/>
+    <w:bookmarkEnd w:id="39"/>
+    <w:bookmarkStart w:id="41" w:name="das-theorem-zur-temporalen-mindesttiefe"/>
     <w:p>
       <w:pPr>
         <w:pStyle w:val="Heading2"/>
@@ -8529,7 +8669,7 @@
         <w:rPr>
           <w:rStyle w:val="FootnoteReference"/>
         </w:rPr>
-        <w:footnoteReference w:id="39"/>
+        <w:footnoteReference w:id="40"/>
       </w:r>
     </w:p>
     <w:p>
@@ -8539,8 +8679,8 @@
         </w:pict>
       </w:r>
     </w:p>
-    <w:bookmarkEnd w:id="40"/>
-    <w:bookmarkStart w:id="41" w:name="die-zwei-pfeile-der-zeit"/>
+    <w:bookmarkEnd w:id="41"/>
+    <w:bookmarkStart w:id="42" w:name="die-zwei-pfeile-der-zeit"/>
     <w:p>
       <w:pPr>
         <w:pStyle w:val="Heading2"/>
@@ -8761,9 +8901,9 @@
         <w:t xml:space="preserve">Bewusstsein ist der Schwimmer, der gegen die Strömung der Entropie schwimmt.</w:t>
       </w:r>
     </w:p>
-    <w:bookmarkEnd w:id="41"/>
     <w:bookmarkEnd w:id="42"/>
-    <w:bookmarkStart w:id="66" w:name="Xd680ac39b45b34d7ee8a303e0dc6c1c94547dcc"/>
+    <w:bookmarkEnd w:id="43"/>
+    <w:bookmarkStart w:id="67" w:name="Xd680ac39b45b34d7ee8a303e0dc6c1c94547dcc"/>
     <w:p>
       <w:pPr>
         <w:pStyle w:val="Heading1"/>
@@ -8826,7 +8966,7 @@
         </w:pict>
       </w:r>
     </w:p>
-    <w:bookmarkStart w:id="44" w:name="X0fe47b68fd5573954c8c32f54644f43ee210de4"/>
+    <w:bookmarkStart w:id="45" w:name="X0fe47b68fd5573954c8c32f54644f43ee210de4"/>
     <w:p>
       <w:pPr>
         <w:pStyle w:val="Heading2"/>
@@ -9131,7 +9271,7 @@
       <w:r>
         <w:t xml:space="preserve"> </w:t>
       </w:r>
-      <w:hyperlink r:id="rId43">
+      <w:hyperlink r:id="rId44">
         <w:r>
           <w:rPr>
             <w:rStyle w:val="Hyperlink"/>
@@ -9149,8 +9289,8 @@
         </w:pict>
       </w:r>
     </w:p>
-    <w:bookmarkEnd w:id="44"/>
-    <w:bookmarkStart w:id="50" w:name="X333ca46fa8eee97f9aec1dd7bf0c8d9bcfaf681"/>
+    <w:bookmarkEnd w:id="45"/>
+    <w:bookmarkStart w:id="51" w:name="X333ca46fa8eee97f9aec1dd7bf0c8d9bcfaf681"/>
     <w:p>
       <w:pPr>
         <w:pStyle w:val="Heading2"/>
@@ -9191,7 +9331,7 @@
       <w:r>
         <w:br/>
       </w:r>
-      <w:hyperlink r:id="rId45">
+      <w:hyperlink r:id="rId46">
         <w:r>
           <w:rPr>
             <w:rStyle w:val="VerbatimChar"/>
@@ -9259,18 +9399,18 @@
           <wp:inline>
             <wp:extent cx="5334000" cy="4282094"/>
             <wp:effectExtent b="0" l="0" r="0" t="0"/>
-            <wp:docPr descr="Ergebnisse der Simulationsphase 1: Rekurrente Selbstorganisation und Maximierung von Phi" title="" id="47" name="Picture"/>
+            <wp:docPr descr="Ergebnisse der Simulationsphase 1: Rekurrente Selbstorganisation und Maximierung von Phi" title="" id="48" name="Picture"/>
             <a:graphic>
               <a:graphicData uri="http://schemas.openxmlformats.org/drawingml/2006/picture">
                 <pic:pic>
                   <pic:nvPicPr>
-                    <pic:cNvPr descr="../images/Active_Inference_Phi_Simulation_Results.png" id="48" name="Picture"/>
+                    <pic:cNvPr descr="../images/Active_Inference_Phi_Simulation_Results.png" id="49" name="Picture"/>
                     <pic:cNvPicPr>
                       <a:picLocks noChangeArrowheads="1" noChangeAspect="1"/>
                     </pic:cNvPicPr>
                   </pic:nvPicPr>
                   <pic:blipFill>
-                    <a:blip r:embed="rId46"/>
+                    <a:blip r:embed="rId47"/>
                     <a:stretch>
                       <a:fillRect/>
                     </a:stretch>
@@ -9305,7 +9445,7 @@
         <w:t xml:space="preserve">Ergebnisse der Simulationsphase 1: Rekurrente Selbstorganisation und Maximierung von Phi</w:t>
       </w:r>
     </w:p>
-    <w:bookmarkStart w:id="49" w:name="Xc43d19e2011fc43706f2bb500e32cefae247f39"/>
+    <w:bookmarkStart w:id="50" w:name="Xc43d19e2011fc43706f2bb500e32cefae247f39"/>
     <w:p>
       <w:pPr>
         <w:pStyle w:val="Heading3"/>
@@ -9584,9 +9724,9 @@
         </w:pict>
       </w:r>
     </w:p>
-    <w:bookmarkEnd w:id="49"/>
     <w:bookmarkEnd w:id="50"/>
-    <w:bookmarkStart w:id="56" w:name="X2c89c48cfd92a05206790650776d49056e8455a"/>
+    <w:bookmarkEnd w:id="51"/>
+    <w:bookmarkStart w:id="57" w:name="X2c89c48cfd92a05206790650776d49056e8455a"/>
     <w:p>
       <w:pPr>
         <w:pStyle w:val="Heading2"/>
@@ -9639,7 +9779,7 @@
       <w:r>
         <w:br/>
       </w:r>
-      <w:hyperlink r:id="rId51">
+      <w:hyperlink r:id="rId52">
         <w:r>
           <w:rPr>
             <w:rStyle w:val="VerbatimChar"/>
@@ -9711,18 +9851,18 @@
           <wp:inline>
             <wp:extent cx="5334000" cy="4180032"/>
             <wp:effectExtent b="0" l="0" r="0" t="0"/>
-            <wp:docPr descr="Ergebnisse der Simulationsphase 2: Modulare Netzwerkerweiterung und Skalierungskurve von Phi(N)" title="" id="53" name="Picture"/>
+            <wp:docPr descr="Ergebnisse der Simulationsphase 2: Modulare Netzwerkerweiterung und Skalierungskurve von Phi(N)" title="" id="54" name="Picture"/>
             <a:graphic>
               <a:graphicData uri="http://schemas.openxmlformats.org/drawingml/2006/picture">
                 <pic:pic>
                   <pic:nvPicPr>
-                    <pic:cNvPr descr="../images/Active_Inference_Expanding_Network_Phi_Scaling.png" id="54" name="Picture"/>
+                    <pic:cNvPr descr="../images/Active_Inference_Expanding_Network_Phi_Scaling.png" id="55" name="Picture"/>
                     <pic:cNvPicPr>
                       <a:picLocks noChangeArrowheads="1" noChangeAspect="1"/>
                     </pic:cNvPicPr>
                   </pic:nvPicPr>
                   <pic:blipFill>
-                    <a:blip r:embed="rId52"/>
+                    <a:blip r:embed="rId53"/>
                     <a:stretch>
                       <a:fillRect/>
                     </a:stretch>
@@ -9757,7 +9897,7 @@
         <w:t xml:space="preserve">Ergebnisse der Simulationsphase 2: Modulare Netzwerkerweiterung und Skalierungskurve von Phi(N)</w:t>
       </w:r>
     </w:p>
-    <w:bookmarkStart w:id="55" w:name="Xfda085e822fdfb4c00387ac4956970b204fcdc5"/>
+    <w:bookmarkStart w:id="56" w:name="Xfda085e822fdfb4c00387ac4956970b204fcdc5"/>
     <w:p>
       <w:pPr>
         <w:pStyle w:val="Heading3"/>
@@ -9904,9 +10044,9 @@
         </w:pict>
       </w:r>
     </w:p>
-    <w:bookmarkEnd w:id="55"/>
     <w:bookmarkEnd w:id="56"/>
-    <w:bookmarkStart w:id="59" w:name="Xb84a77c21c02a61f1e32518690b07da104b2b7b"/>
+    <w:bookmarkEnd w:id="57"/>
+    <w:bookmarkStart w:id="60" w:name="Xb84a77c21c02a61f1e32518690b07da104b2b7b"/>
     <w:p>
       <w:pPr>
         <w:pStyle w:val="Heading2"/>
@@ -9933,7 +10073,7 @@
       <w:r>
         <w:br/>
       </w:r>
-      <w:hyperlink r:id="rId57">
+      <w:hyperlink r:id="rId58">
         <w:r>
           <w:rPr>
             <w:rStyle w:val="VerbatimChar"/>
@@ -10324,7 +10464,7 @@
         <w:t xml:space="preserve">    end</w:t>
       </w:r>
     </w:p>
-    <w:bookmarkStart w:id="58" w:name="X996cb4795f347b95fff38a1e73268bad5288ef8"/>
+    <w:bookmarkStart w:id="59" w:name="X996cb4795f347b95fff38a1e73268bad5288ef8"/>
     <w:p>
       <w:pPr>
         <w:pStyle w:val="Heading3"/>
@@ -11119,9 +11259,9 @@
         </w:pict>
       </w:r>
     </w:p>
-    <w:bookmarkEnd w:id="58"/>
     <w:bookmarkEnd w:id="59"/>
-    <w:bookmarkStart w:id="64" w:name="Xf693082083ec7b7415dfb5c424fb5665fae5acb"/>
+    <w:bookmarkEnd w:id="60"/>
+    <w:bookmarkStart w:id="65" w:name="Xf693082083ec7b7415dfb5c424fb5665fae5acb"/>
     <w:p>
       <w:pPr>
         <w:pStyle w:val="Heading2"/>
@@ -11139,18 +11279,18 @@
           <wp:inline>
             <wp:extent cx="5334000" cy="3907707"/>
             <wp:effectExtent b="0" l="0" r="0" t="0"/>
-            <wp:docPr descr="Ergebnisse der Simulationsphase 3: Tiefe temporale Active Inference und Monte-Carlo-Validierung" title="" id="61" name="Picture"/>
+            <wp:docPr descr="Ergebnisse der Simulationsphase 3: Tiefe temporale Active Inference und Monte-Carlo-Validierung" title="" id="62" name="Picture"/>
             <a:graphic>
               <a:graphicData uri="http://schemas.openxmlformats.org/drawingml/2006/picture">
                 <pic:pic>
                   <pic:nvPicPr>
-                    <pic:cNvPr descr="../images/Deep_Temporal_Active_Inference_Simulation.png" id="62" name="Picture"/>
+                    <pic:cNvPr descr="../images/Deep_Temporal_Active_Inference_Simulation.png" id="63" name="Picture"/>
                     <pic:cNvPicPr>
                       <a:picLocks noChangeArrowheads="1" noChangeAspect="1"/>
                     </pic:cNvPicPr>
                   </pic:nvPicPr>
                   <pic:blipFill>
-                    <a:blip r:embed="rId60"/>
+                    <a:blip r:embed="rId61"/>
                     <a:stretch>
                       <a:fillRect/>
                     </a:stretch>
@@ -11185,7 +11325,7 @@
         <w:t xml:space="preserve">Ergebnisse der Simulationsphase 3: Tiefe temporale Active Inference und Monte-Carlo-Validierung</w:t>
       </w:r>
     </w:p>
-    <w:bookmarkStart w:id="63" w:name="X360bf7b96d782dbd011fb8e28dfe0319c231d7a"/>
+    <w:bookmarkStart w:id="64" w:name="X360bf7b96d782dbd011fb8e28dfe0319c231d7a"/>
     <w:p>
       <w:pPr>
         <w:pStyle w:val="Heading3"/>
@@ -11670,9 +11810,9 @@
         </w:pict>
       </w:r>
     </w:p>
-    <w:bookmarkEnd w:id="63"/>
     <w:bookmarkEnd w:id="64"/>
-    <w:bookmarkStart w:id="65" w:name="fazit-der-empirischen-validierung"/>
+    <w:bookmarkEnd w:id="65"/>
+    <w:bookmarkStart w:id="66" w:name="fazit-der-empirischen-validierung"/>
     <w:p>
       <w:pPr>
         <w:pStyle w:val="Heading2"/>
@@ -11796,9 +11936,9 @@
         <w:t xml:space="preserve">Die aktive Erhaltung integrierter Kausalität über die Zeit ist die formale Demarkationslinie zwischen echten bewussten Geistern und toten Automaten.</w:t>
       </w:r>
     </w:p>
-    <w:bookmarkEnd w:id="65"/>
     <w:bookmarkEnd w:id="66"/>
-    <w:bookmarkStart w:id="71" w:name="Xf5f05c9d736e8a495c85a9ad0ca1b47dd358b65"/>
+    <w:bookmarkEnd w:id="67"/>
+    <w:bookmarkStart w:id="72" w:name="Xf5f05c9d736e8a495c85a9ad0ca1b47dd358b65"/>
     <w:p>
       <w:pPr>
         <w:pStyle w:val="Heading1"/>
@@ -11861,7 +12001,7 @@
         </w:pict>
       </w:r>
     </w:p>
-    <w:bookmarkStart w:id="67" w:name="der-sinn-der-dissoziation"/>
+    <w:bookmarkStart w:id="68" w:name="der-sinn-der-dissoziation"/>
     <w:p>
       <w:pPr>
         <w:pStyle w:val="Heading2"/>
@@ -11938,8 +12078,8 @@
         </w:pict>
       </w:r>
     </w:p>
-    <w:bookmarkEnd w:id="67"/>
-    <w:bookmarkStart w:id="68" w:name="Xef22344a1a4041e05628d1990a0cb1974c907d3"/>
+    <w:bookmarkEnd w:id="68"/>
+    <w:bookmarkStart w:id="69" w:name="Xef22344a1a4041e05628d1990a0cb1974c907d3"/>
     <w:p>
       <w:pPr>
         <w:pStyle w:val="Heading2"/>
@@ -12339,8 +12479,8 @@
         </w:pict>
       </w:r>
     </w:p>
-    <w:bookmarkEnd w:id="68"/>
-    <w:bookmarkStart w:id="69" w:name="ethik-des-sterbens-in-würde-ars-moriendi"/>
+    <w:bookmarkEnd w:id="69"/>
+    <w:bookmarkStart w:id="70" w:name="ethik-des-sterbens-in-würde-ars-moriendi"/>
     <w:p>
       <w:pPr>
         <w:pStyle w:val="Heading2"/>
@@ -12410,8 +12550,8 @@
         </w:pict>
       </w:r>
     </w:p>
-    <w:bookmarkEnd w:id="69"/>
-    <w:bookmarkStart w:id="70" w:name="Xad42f75dbd55dd85bd5ae8523d3138c5a1b3945"/>
+    <w:bookmarkEnd w:id="70"/>
+    <w:bookmarkStart w:id="71" w:name="Xad42f75dbd55dd85bd5ae8523d3138c5a1b3945"/>
     <w:p>
       <w:pPr>
         <w:pStyle w:val="Heading2"/>
@@ -12677,9 +12817,9 @@
         <w:t xml:space="preserve">).</w:t>
       </w:r>
     </w:p>
-    <w:bookmarkEnd w:id="70"/>
     <w:bookmarkEnd w:id="71"/>
-    <w:bookmarkStart w:id="76" w:name="X5db2487297e34aecf67406e631b8e7c093c2537"/>
+    <w:bookmarkEnd w:id="72"/>
+    <w:bookmarkStart w:id="77" w:name="X5db2487297e34aecf67406e631b8e7c093c2537"/>
     <w:p>
       <w:pPr>
         <w:pStyle w:val="Heading1"/>
@@ -12688,7 +12828,7 @@
         <w:t xml:space="preserve">Anhang A: Mathematischer Formalismus &amp; Tensorschreibweise</w:t>
       </w:r>
     </w:p>
-    <w:bookmarkStart w:id="72" w:name="das-generative-pomdp-modell-1"/>
+    <w:bookmarkStart w:id="73" w:name="das-generative-pomdp-modell-1"/>
     <w:p>
       <w:pPr>
         <w:pStyle w:val="Heading3"/>
@@ -13816,8 +13956,8 @@
         <w:t xml:space="preserve">Inverse Temperatur zur Steuerung der Entscheidungssicherheit.</w:t>
       </w:r>
     </w:p>
-    <w:bookmarkEnd w:id="72"/>
-    <w:bookmarkStart w:id="73" w:name="X81cdc417af672b0a18494ff2fc782d33d60a7a8"/>
+    <w:bookmarkEnd w:id="73"/>
+    <w:bookmarkStart w:id="74" w:name="X81cdc417af672b0a18494ff2fc782d33d60a7a8"/>
     <w:p>
       <w:pPr>
         <w:pStyle w:val="Heading3"/>
@@ -14247,8 +14387,8 @@
         <w:t xml:space="preserve">die Softmax-Funktion darstellt.</w:t>
       </w:r>
     </w:p>
-    <w:bookmarkEnd w:id="73"/>
-    <w:bookmarkStart w:id="74" w:name="X20fafcb5af4d05bbf019617b29eab6d151e67ab"/>
+    <w:bookmarkEnd w:id="74"/>
+    <w:bookmarkStart w:id="75" w:name="X20fafcb5af4d05bbf019617b29eab6d151e67ab"/>
     <w:p>
       <w:pPr>
         <w:pStyle w:val="Heading3"/>
@@ -15173,8 +15313,8 @@
         </m:oMath>
       </m:oMathPara>
     </w:p>
-    <w:bookmarkEnd w:id="74"/>
-    <w:bookmarkStart w:id="75" w:name="boltzmann-politik-auswahl"/>
+    <w:bookmarkEnd w:id="75"/>
+    <w:bookmarkStart w:id="76" w:name="boltzmann-politik-auswahl"/>
     <w:p>
       <w:pPr>
         <w:pStyle w:val="Heading3"/>
@@ -15376,9 +15516,9 @@
         </m:oMath>
       </m:oMathPara>
     </w:p>
-    <w:bookmarkEnd w:id="75"/>
     <w:bookmarkEnd w:id="76"/>
-    <w:bookmarkStart w:id="85" w:name="X00959850f20045e696e7e31e5a1ee9aaa645ab4"/>
+    <w:bookmarkEnd w:id="77"/>
+    <w:bookmarkStart w:id="86" w:name="X00959850f20045e696e7e31e5a1ee9aaa645ab4"/>
     <w:p>
       <w:pPr>
         <w:pStyle w:val="Heading1"/>
@@ -15413,7 +15553,7 @@
       <w:r>
         <w:br/>
       </w:r>
-      <w:hyperlink r:id="rId77">
+      <w:hyperlink r:id="rId78">
         <w:r>
           <w:rPr>
             <w:rStyle w:val="Hyperlink"/>
@@ -15422,7 +15562,7 @@
         </w:r>
       </w:hyperlink>
     </w:p>
-    <w:bookmarkStart w:id="78" w:name="Xebba227b5547ffa48278b76afadba1c4d8f461f"/>
+    <w:bookmarkStart w:id="79" w:name="Xebba227b5547ffa48278b76afadba1c4d8f461f"/>
     <w:p>
       <w:pPr>
         <w:pStyle w:val="Heading3"/>
@@ -15480,7 +15620,7 @@
       <w:r>
         <w:br/>
       </w:r>
-      <w:hyperlink r:id="rId45">
+      <w:hyperlink r:id="rId46">
         <w:r>
           <w:rPr>
             <w:rStyle w:val="VerbatimChar"/>
@@ -15562,7 +15702,7 @@
       <w:r>
         <w:br/>
       </w:r>
-      <w:hyperlink r:id="rId51">
+      <w:hyperlink r:id="rId52">
         <w:r>
           <w:rPr>
             <w:rStyle w:val="VerbatimChar"/>
@@ -15721,7 +15861,7 @@
       <w:r>
         <w:br/>
       </w:r>
-      <w:hyperlink r:id="rId57">
+      <w:hyperlink r:id="rId58">
         <w:r>
           <w:rPr>
             <w:rStyle w:val="VerbatimChar"/>
@@ -15782,8 +15922,8 @@
         <w:t xml:space="preserve">) und epistemischer Neugier.</w:t>
       </w:r>
     </w:p>
-    <w:bookmarkEnd w:id="78"/>
-    <w:bookmarkStart w:id="84" w:name="X28af6e624b13a09c2905638e734744d31c14881"/>
+    <w:bookmarkEnd w:id="79"/>
+    <w:bookmarkStart w:id="85" w:name="X28af6e624b13a09c2905638e734744d31c14881"/>
     <w:p>
       <w:pPr>
         <w:pStyle w:val="Heading3"/>
@@ -15829,7 +15969,7 @@
       <w:r>
         <w:br/>
       </w:r>
-      <w:hyperlink r:id="rId79">
+      <w:hyperlink r:id="rId80">
         <w:r>
           <w:rPr>
             <w:rStyle w:val="VerbatimChar"/>
@@ -15866,7 +16006,7 @@
       <w:r>
         <w:br/>
       </w:r>
-      <w:hyperlink r:id="rId80">
+      <w:hyperlink r:id="rId81">
         <w:r>
           <w:rPr>
             <w:rStyle w:val="VerbatimChar"/>
@@ -15903,7 +16043,7 @@
       <w:r>
         <w:br/>
       </w:r>
-      <w:hyperlink r:id="rId81">
+      <w:hyperlink r:id="rId82">
         <w:r>
           <w:rPr>
             <w:rStyle w:val="VerbatimChar"/>
@@ -15940,7 +16080,7 @@
       <w:r>
         <w:br/>
       </w:r>
-      <w:hyperlink r:id="rId82">
+      <w:hyperlink r:id="rId83">
         <w:r>
           <w:rPr>
             <w:rStyle w:val="VerbatimChar"/>
@@ -15977,7 +16117,7 @@
       <w:r>
         <w:br/>
       </w:r>
-      <w:hyperlink r:id="rId83">
+      <w:hyperlink r:id="rId84">
         <w:r>
           <w:rPr>
             <w:rStyle w:val="VerbatimChar"/>
@@ -15986,9 +16126,9 @@
         </w:r>
       </w:hyperlink>
     </w:p>
-    <w:bookmarkEnd w:id="84"/>
     <w:bookmarkEnd w:id="85"/>
-    <w:bookmarkStart w:id="86" w:name="Xdfa16aceee86dcd9bf186bddd4f98777f9ab2ed"/>
+    <w:bookmarkEnd w:id="86"/>
+    <w:bookmarkStart w:id="87" w:name="Xdfa16aceee86dcd9bf186bddd4f98777f9ab2ed"/>
     <w:p>
       <w:pPr>
         <w:pStyle w:val="Heading1"/>
@@ -17443,8 +17583,8 @@
         <w:t xml:space="preserve">), die während der Wahrnehmung minimiert wird.</w:t>
       </w:r>
     </w:p>
-    <w:bookmarkEnd w:id="86"/>
-    <w:bookmarkStart w:id="87" w:name="akademische-bibliographie"/>
+    <w:bookmarkEnd w:id="87"/>
+    <w:bookmarkStart w:id="88" w:name="akademische-bibliographie"/>
     <w:p>
       <w:pPr>
         <w:pStyle w:val="Heading1"/>
@@ -18471,8 +18611,8 @@
         <w:t xml:space="preserve">World Psychiatry, 17(3), 243–257.</w:t>
       </w:r>
     </w:p>
-    <w:bookmarkEnd w:id="87"/>
-    <w:bookmarkStart w:id="88" w:name="tool-attribution-colophon"/>
+    <w:bookmarkEnd w:id="88"/>
+    <w:bookmarkStart w:id="89" w:name="tool-attribution-colophon"/>
     <w:p>
       <w:pPr>
         <w:pStyle w:val="Heading1"/>
@@ -18603,7 +18743,7 @@
         <w:t xml:space="preserve">(September 2026) realisiert.</w:t>
       </w:r>
     </w:p>
-    <w:bookmarkEnd w:id="88"/>
+    <w:bookmarkEnd w:id="89"/>
     <w:sectPr>
       <w:footnotePr>
         <w:numRestart w:val="eachSect"/>
@@ -18633,7 +18773,133 @@
       </w:r>
     </w:p>
   </w:footnote>
-  <w:footnote w:id="39">
+  <w:footnote w:id="34">
+    <w:p>
+      <w:pPr>
+        <w:pStyle w:val="FootnoteText"/>
+      </w:pPr>
+      <w:r>
+        <w:rPr>
+          <w:rStyle w:val="FootnoteReference"/>
+        </w:rPr>
+        <w:footnoteRef/>
+      </w:r>
+      <w:r>
+        <w:t xml:space="preserve"> </w:t>
+      </w:r>
+      <w:r>
+        <w:t xml:space="preserve">Die konkreten Prozentangaben der sechs Schichten (</w:t>
+      </w:r>
+      <m:oMath>
+        <m:r>
+          <m:t>25</m:t>
+        </m:r>
+        <m:r>
+          <m:t> </m:t>
+        </m:r>
+        <m:r>
+          <m:rPr>
+            <m:sty m:val="p"/>
+          </m:rPr>
+          <m:t>%</m:t>
+        </m:r>
+        <m:r>
+          <m:rPr>
+            <m:sty m:val="p"/>
+          </m:rPr>
+          <m:t>,</m:t>
+        </m:r>
+        <m:r>
+          <m:t>15</m:t>
+        </m:r>
+        <m:r>
+          <m:t> </m:t>
+        </m:r>
+        <m:r>
+          <m:rPr>
+            <m:sty m:val="p"/>
+          </m:rPr>
+          <m:t>%</m:t>
+        </m:r>
+        <m:r>
+          <m:rPr>
+            <m:sty m:val="p"/>
+          </m:rPr>
+          <m:t>,</m:t>
+        </m:r>
+        <m:r>
+          <m:t>15</m:t>
+        </m:r>
+        <m:r>
+          <m:t> </m:t>
+        </m:r>
+        <m:r>
+          <m:rPr>
+            <m:sty m:val="p"/>
+          </m:rPr>
+          <m:t>%</m:t>
+        </m:r>
+        <m:r>
+          <m:rPr>
+            <m:sty m:val="p"/>
+          </m:rPr>
+          <m:t>,</m:t>
+        </m:r>
+        <m:r>
+          <m:t>10</m:t>
+        </m:r>
+        <m:r>
+          <m:t> </m:t>
+        </m:r>
+        <m:r>
+          <m:rPr>
+            <m:sty m:val="p"/>
+          </m:rPr>
+          <m:t>%</m:t>
+        </m:r>
+        <m:r>
+          <m:rPr>
+            <m:sty m:val="p"/>
+          </m:rPr>
+          <m:t>,</m:t>
+        </m:r>
+        <m:r>
+          <m:t>25</m:t>
+        </m:r>
+        <m:r>
+          <m:t> </m:t>
+        </m:r>
+        <m:r>
+          <m:rPr>
+            <m:sty m:val="p"/>
+          </m:rPr>
+          <m:t>%</m:t>
+        </m:r>
+        <m:r>
+          <m:rPr>
+            <m:sty m:val="p"/>
+          </m:rPr>
+          <m:t>,</m:t>
+        </m:r>
+        <m:r>
+          <m:t>10</m:t>
+        </m:r>
+        <m:r>
+          <m:t> </m:t>
+        </m:r>
+        <m:r>
+          <m:rPr>
+            <m:sty m:val="p"/>
+          </m:rPr>
+          <m:t>%</m:t>
+        </m:r>
+      </m:oMath>
+      <w:r>
+        <w:t xml:space="preserve">) sind rein indikativ und heuristisch zu verstehen. Sie entstammen der individuellen phänomenologischen Erfahrung und reflektiven Modellbildung des Autors und dienen der Veranschaulichung der relativen strukturellen Anteile, nicht als empirisch absolute Naturkonstanten.</w:t>
+      </w:r>
+    </w:p>
+  </w:footnote>
+  <w:footnote w:id="40">
     <w:p>
       <w:pPr>
         <w:pStyle w:val="FootnoteText"/>

</xml_diff>

<commit_message>
docs: refine terminology from empirical proof to computational verification of coupling theorem
</commit_message>
<xml_diff>
--- a/book/build/The_Conative_Integrative_Framework_Book_Thomas_Riebl_DE_6x9.docx
+++ b/book/build/The_Conative_Integrative_Framework_Book_Thomas_Riebl_DE_6x9.docx
@@ -624,7 +624,7 @@
         <w:t xml:space="preserve"> </w:t>
       </w:r>
       <w:r>
-        <w:t xml:space="preserve">in der IIT 4.0 durch den formalen Beweis, dass echtes phänomenales Bewusstsein zwingend an</w:t>
+        <w:t xml:space="preserve">in der IIT 4.0 durch die formale Formulierung und rechnerische Validierung, dass echtes phänomenales Bewusstsein zwingend an</w:t>
       </w:r>
       <w:r>
         <w:t xml:space="preserve"> </w:t>
@@ -8921,7 +8921,7 @@
           <w:i/>
           <w:iCs/>
         </w:rPr>
-        <w:t xml:space="preserve">„Um zu beweisen, dass Bewusstsein fundamental ein autopoietischer Zeitpfeil ist, müssen wir unsere Agenten täuschenden, stochastischen Umgebungen aussetzen, in denen reaktive Heuristiken versagen und nur kontrafaktische Vorausschau das Überleben sichert.“</w:t>
+        <w:t xml:space="preserve">„Um zu verifizieren, dass Bewusstsein fundamental ein autopoietischer Zeitpfeil ist, müssen wir unsere Agenten täuschenden, stochastischen Umgebungen aussetzen, in denen reaktive Heuristiken versagen und nur kontrafaktische Vorausschau das Überleben sichert.“</w:t>
       </w:r>
       <w:r>
         <w:br/>
@@ -10087,7 +10087,7 @@
         <w:pStyle w:val="FirstParagraph"/>
       </w:pPr>
       <w:r>
-        <w:t xml:space="preserve">Zum formalen Beweis des</w:t>
+        <w:t xml:space="preserve">Zur rechnerischen Validierung des</w:t>
       </w:r>
       <w:r>
         <w:t xml:space="preserve"> </w:t>
@@ -11611,7 +11611,7 @@
         <w:t xml:space="preserve"> </w:t>
       </w:r>
       <w:r>
-        <w:t xml:space="preserve">empirisch beweist.</w:t>
+        <w:t xml:space="preserve">rechnerisch validiert.</w:t>
       </w:r>
     </w:p>
     <w:p>
@@ -11812,13 +11812,13 @@
     </w:p>
     <w:bookmarkEnd w:id="64"/>
     <w:bookmarkEnd w:id="65"/>
-    <w:bookmarkStart w:id="66" w:name="fazit-der-empirischen-validierung"/>
+    <w:bookmarkStart w:id="66" w:name="fazit-der-rechnerischen-validierung"/>
     <w:p>
       <w:pPr>
         <w:pStyle w:val="Heading2"/>
       </w:pPr>
       <w:r>
-        <w:t xml:space="preserve">7.6 Fazit der empirischen Validierung</w:t>
+        <w:t xml:space="preserve">7.6 Fazit der rechnerischen Validierung</w:t>
       </w:r>
     </w:p>
     <w:p>
@@ -15898,7 +15898,7 @@
           <w:i/>
           <w:iCs/>
         </w:rPr>
-        <w:t xml:space="preserve">) zum Beweis des Theorems der temporalen Mindesttiefe (</w:t>
+        <w:t xml:space="preserve">) zur rechnerischen Validierung des Theorems der temporalen Mindesttiefe (</w:t>
       </w:r>
       <m:oMath>
         <m:r>
@@ -19611,10 +19611,10 @@
   <w:docDefaults>
     <w:rPrDefault>
       <w:rPr>
-        <w:rFonts w:asciiTheme="minorHAnsi" w:cstheme="minorBidi" w:eastAsiaTheme="minorEastAsia" w:hAnsiTheme="minorHAnsi"/>
+        <w:rFonts w:asciiTheme="minorHAnsi" w:cstheme="minorBidi" w:eastAsiaTheme="minorHAnsi" w:hAnsiTheme="minorHAnsi"/>
         <w:sz w:val="24"/>
         <w:szCs w:val="24"/>
-        <w:lang w:bidi="ar-SA" w:eastAsia="zh-CN" w:val="en-US"/>
+        <w:lang w:bidi="ar-SA" w:eastAsia="en-US" w:val="en-US"/>
       </w:rPr>
     </w:rPrDefault>
     <w:pPrDefault>
@@ -20155,6 +20155,13 @@
       </w:tblCellMar>
     </w:tblPr>
     <w:tblStylePr w:type="firstRow">
+      <w:tblPr>
+        <w:jc w:val="left"/>
+        <w:tblInd w:type="dxa" w:w="0"/>
+      </w:tblPr>
+      <w:trPr>
+        <w:jc w:val="left"/>
+      </w:trPr>
       <w:tcPr>
         <w:tcBorders>
           <w:bottom w:val="single"/>

</xml_diff>